<commit_message>
Smart quotes in Word doc, straight quotes in markdown
- Add smartify() function to generator: converts straight quotes to
  typographic curly quotes before writing to Word paragraphs and tables
- Strip all smart quotes from skillable-intelligence-platform.md
- Regenerate Skillable-Intelligence-Platform.docx with proper typography

Co-Authored-By: Claude Sonnet 4.6 <noreply@anthropic.com>
</commit_message>
<xml_diff>
--- a/docs/Skillable-Intelligence-Platform.docx
+++ b/docs/Skillable-Intelligence-Platform.docx
@@ -107,7 +107,7 @@
           <w:color w:val="1A1A1A"/>
           <w:sz w:val="20"/>
         </w:rPr>
-        <w:t>We are not asking whether a company values training. We are asking whether a company's products can be orchestrated into hands-on labs — whether Skillable can technically deliver for them, whether their products are complex enough that labs create genuine skill-building value, and whether their organization has the maturity to build and sustain a lab program.</w:t>
+        <w:t>We are not asking whether a company values training. We are asking whether a company’s products can be orchestrated into hands-on labs — whether Skillable can technically deliver for them, whether their products are complex enough that labs create genuine skill-building value, and whether their organization has the maturity to build and sustain a lab program.</w:t>
       </w:r>
     </w:p>
     <w:p>
@@ -213,7 +213,7 @@
           <w:color w:val="1A1A1A"/>
           <w:sz w:val="20"/>
         </w:rPr>
-        <w:t>Can Skillable deliver a lab for this company's products? This is the primary gate. If the answer is no, the composite score is limited regardless of everything else. Gate 1 failure means the company is not a Skillable prospect — period.</w:t>
+        <w:t>Can Skillable deliver a lab for this company’s products? This is the primary gate. If the answer is no, the composite score is limited regardless of everything else. Gate 1 failure means the company is not a Skillable prospect — period.</w:t>
       </w:r>
     </w:p>
     <w:p>
@@ -239,7 +239,7 @@
           <w:color w:val="1A1A1A"/>
           <w:sz w:val="20"/>
         </w:rPr>
-        <w:t>Is the product technically rich enough that hands-on labs create genuine skill-building value? Simple products with shallow workflows don't benefit enough from labs to justify the investment. High Gate 2 scores mean learners get dramatically better at something that matters — and they can prove it.</w:t>
+        <w:t>Is the product technically rich enough that hands-on labs create genuine skill-building value? Simple products with shallow workflows don’t benefit enough from labs to justify the investment. High Gate 2 scores mean learners get dramatically better at something that matters — and they can prove it.</w:t>
       </w:r>
     </w:p>
     <w:p>
@@ -280,7 +280,7 @@
           <w:color w:val="1A1A1A"/>
           <w:sz w:val="20"/>
         </w:rPr>
-        <w:t>A company must clear all three gates for a successful lab program to be achievable. Intelligence flags what's missing — and surfaces what it would take to get there.</w:t>
+        <w:t>A company must clear all three gates for a successful lab program to be achievable. Intelligence flags what’s missing — and surfaces what it would take to get there.</w:t>
       </w:r>
     </w:p>
     <w:p>
@@ -325,7 +325,7 @@
           <w:color w:val="1A1A1A"/>
           <w:sz w:val="20"/>
         </w:rPr>
-        <w:t>Workday is the clearest illustration. On every traditional marketing signal, Workday looks like an ideal prospect: world-class training organization, deep content ecosystem, strong technical enablement culture, massive install base. Gate 3 passes with distinction. Gate 2 passes too — configuring Workday HCM or Financials is genuinely complex. Workday's own content teams wanted to build labs.</w:t>
+        <w:t>Workday is the clearest illustration. On every traditional marketing signal, Workday looks like an ideal prospect: world-class training organization, deep content ecosystem, strong technical enablement culture, massive install base. Gate 3 passes with distinction. Gate 2 passes too — configuring Workday HCM or Financials is genuinely complex. Workday’s own content teams wanted to build labs.</w:t>
       </w:r>
     </w:p>
     <w:p>
@@ -392,7 +392,7 @@
           <w:color w:val="1A1A1A"/>
           <w:sz w:val="20"/>
         </w:rPr>
-        <w:t>no mechanism to spin up an individual environment programmatically. Skillable's entire delivery model depends on this capability.</w:t>
+        <w:t>no mechanism to spin up an individual environment programmatically. Skillable’s entire delivery model depends on this capability.</w:t>
       </w:r>
     </w:p>
     <w:p>
@@ -418,7 +418,7 @@
           <w:color w:val="1A1A1A"/>
           <w:sz w:val="20"/>
         </w:rPr>
-        <w:t>nothing to install, nothing to containerize, nothing to slice. The product lives entirely in Workday's cloud and cannot be replicated outside it.</w:t>
+        <w:t>nothing to install, nothing to containerize, nothing to slice. The product lives entirely in Workday’s cloud and cannot be replicated outside it.</w:t>
       </w:r>
     </w:p>
     <w:p>
@@ -448,7 +448,7 @@
           <w:color w:val="1A1A1A"/>
           <w:sz w:val="20"/>
         </w:rPr>
-        <w:t>The most important version of this story: Workday wasn't a bad lead. It was motivated, capable people inside a well-run organization who invested significant time before hitting a wall that was always there — because Gate 1 was never evaluated before the pursuit began.</w:t>
+        <w:t>The most important version of this story: Workday wasn’t a bad lead. It was motivated, capable people inside a well-run organization who invested significant time before hitting a wall that was always there — because Gate 1 was never evaluated before the pursuit began.</w:t>
       </w:r>
     </w:p>
     <w:p>
@@ -533,7 +533,7 @@
           <w:color w:val="1A1A1A"/>
           <w:sz w:val="20"/>
         </w:rPr>
-        <w:t>When Fortinet is a strong fit, it is not because Fortinet resembles other good customers as a company. It is because Fortinet's products have specific technical characteristics — multi-VM topology, deep admin workflows, real consequence of error, strong API surface — that make them labable. Those characteristics are determined by what Fortinet sells, not by how large they are.</w:t>
+        <w:t>When Fortinet is a strong fit, it is not because Fortinet resembles other good customers as a company. It is because Fortinet’s products have specific technical characteristics — multi-VM topology, deep admin workflows, real consequence of error, strong API surface — that make them labable. Those characteristics are determined by what Fortinet sells, not by how large they are.</w:t>
       </w:r>
     </w:p>
     <w:p>
@@ -631,7 +631,7 @@
           <w:color w:val="1A1A1A"/>
           <w:sz w:val="20"/>
         </w:rPr>
-        <w:t>Every time Intelligence analyzes a strong-fit customer, it surfaces that company's direct competitors — pre-qualified lookalike candidates, identified automatically, without additional research. And it compounds: every new Skillable customer proves another product category.</w:t>
+        <w:t>Every time Intelligence analyzes a strong-fit customer, it surfaces that company’s direct competitors — pre-qualified lookalike candidates, identified automatically, without additional research. And it compounds: every new Skillable customer proves another product category.</w:t>
       </w:r>
     </w:p>
     <w:p>
@@ -656,7 +656,7 @@
           <w:color w:val="1A1A1A"/>
           <w:sz w:val="20"/>
         </w:rPr>
-        <w:t>We are looking for companies whose products behave like our customers' products.</w:t>
+        <w:t>We are looking for companies whose products behave like our customers’ products.</w:t>
       </w:r>
       <w:r>
         <w:rPr>
@@ -721,7 +721,7 @@
           <w:color w:val="1A1A1A"/>
           <w:sz w:val="20"/>
         </w:rPr>
-        <w:t>Assessing whether a company's products have the deployment model, API surface, marketplace presence, and technical architecture that Skillable can orchestrate takes an experienced SE hours per company. Intelligence does it in minutes, across a list of hundreds — researching marketplace listings, API documentation, GitHub repositories, Docker images, and partner ecosystem signals automatically. Every company on a ZoomInfo list gets a real technical evaluation, not just a firmographic score.</w:t>
+        <w:t>Assessing whether a company’s products have the deployment model, API surface, marketplace presence, and technical architecture that Skillable can orchestrate takes an experienced SE hours per company. Intelligence does it in minutes, across a list of hundreds — researching marketplace listings, API documentation, GitHub repositories, Docker images, and partner ecosystem signals automatically. Every company on a ZoomInfo list gets a real technical evaluation, not just a firmographic score.</w:t>
       </w:r>
     </w:p>
     <w:p>
@@ -736,7 +736,7 @@
           <w:color w:val="1A1A1A"/>
           <w:sz w:val="20"/>
         </w:rPr>
-        <w:t xml:space="preserve">AI Moment: Applying Skillable's platform knowledge to every product it touches. </w:t>
+        <w:t xml:space="preserve">AI Moment: Applying Skillable’s platform knowledge to every product it touches. </w:t>
       </w:r>
       <w:r>
         <w:rPr>
@@ -904,7 +904,7 @@
           <w:color w:val="1A1A1A"/>
           <w:sz w:val="20"/>
         </w:rPr>
-        <w:t>Prospector is the go-to-market tool for Marketing and RevOps. It takes a list of companies and returns a ranked assessment of how well each one fits Skillable's ICP — with product-level evidence, composite scores, verdicts, delivery path signals, and key contacts for every company on the list.</w:t>
+        <w:t>Prospector is the go-to-market tool for Marketing and RevOps. It takes a list of companies and returns a ranked assessment of how well each one fits Skillable’s ICP — with product-level evidence, composite scores, verdicts, delivery path signals, and key contacts for every company on the list.</w:t>
       </w:r>
     </w:p>
     <w:p>
@@ -1000,7 +1000,7 @@
           <w:color w:val="1A1A1A"/>
           <w:sz w:val="20"/>
         </w:rPr>
-        <w:t>A broad scan that surfaces all of the company's products, ranked by labability, with competitive pairings, company-level signals, and an overall fit score. The foundation document for any seller or SE entering a conversation with this account. Also the output of Prospector's Customer Expansion pass — the same research, stored once per company, shared across both tools.</w:t>
+        <w:t>A broad scan that surfaces all of the company’s products, ranked by labability, with competitive pairings, company-level signals, and an overall fit score. The foundation document for any seller or SE entering a conversation with this account. Also the output of Prospector’s Customer Expansion pass — the same research, stored once per company, shared across both tools.</w:t>
       </w:r>
     </w:p>
     <w:p>
@@ -1051,7 +1051,7 @@
           <w:color w:val="1A1A1A"/>
           <w:sz w:val="20"/>
         </w:rPr>
-        <w:t>A seller walking into a conversation with a Stage 2 Inspector report knows what the customer's products can and cannot do on the Skillable platform, which delivery path makes sense and why, and what the estimated consumption potential is. That is not a discovery conversation — it is a solution conversation. A level of pre-call preparation that was previously impossible at scale is now standard.</w:t>
+        <w:t>A seller walking into a conversation with a Stage 2 Inspector report knows what the customer’s products can and cannot do on the Skillable platform, which delivery path makes sense and why, and what the estimated consumption potential is. That is not a discovery conversation — it is a solution conversation. A level of pre-call preparation that was previously impossible at scale is now standard.</w:t>
       </w:r>
     </w:p>
     <w:p>
@@ -1081,7 +1081,7 @@
           <w:color w:val="1A1A1A"/>
           <w:sz w:val="20"/>
         </w:rPr>
-        <w:t>Designer takes Inspector's output and guides program owners, instructional designers, and subject matter experts through the full process of designing a lab program — from goals and audience through a complete approved outline, draft instructions, and a Skillable Studio-ready export package.</w:t>
+        <w:t>Designer takes Inspector’s output and guides program owners, instructional designers, and subject matter experts through the full process of designing a lab program — from goals and audience through a complete approved outline, draft instructions, and a Skillable Studio-ready export package.</w:t>
       </w:r>
     </w:p>
     <w:p>
@@ -1106,7 +1106,7 @@
           <w:color w:val="1A1A1A"/>
           <w:sz w:val="20"/>
         </w:rPr>
-        <w:t>Customers who don't know how to design a lab program won't build one. And if they don't build one, they don't adopt Skillable. Designer is the adoption engine — the tool that gives a new customer something concrete to do on day one, before the technical environment is ready, and produces a complete program architecture that a contracted lab developer can build against immediately.</w:t>
+        <w:t>Customers who don’t know how to design a lab program won’t build one. And if they don’t build one, they don’t adopt Skillable. Designer is the adoption engine — the tool that gives a new customer something concrete to do on day one, before the technical environment is ready, and produces a complete program architecture that a contracted lab developer can build against immediately.</w:t>
       </w:r>
     </w:p>
     <w:p>
@@ -1199,7 +1199,7 @@
           <w:color w:val="1A1A1A"/>
           <w:sz w:val="20"/>
         </w:rPr>
-        <w:t>HubSpot is the seller and marketer's workspace. Intelligence is the specialist workspace. The integration surfaces the right intelligence in the right place — without requiring sellers to live in another tool or RevOps to build a parallel system.</w:t>
+        <w:t>HubSpot is the seller and marketer’s workspace. Intelligence is the specialist workspace. The integration surfaces the right intelligence in the right place — without requiring sellers to live in another tool or RevOps to build a parallel system.</w:t>
       </w:r>
     </w:p>
     <w:p>
@@ -1244,7 +1244,7 @@
           <w:color w:val="1A1A1A"/>
           <w:sz w:val="20"/>
         </w:rPr>
-        <w:t>Marketing triggers Prospector from inside HubSpot — selecting a ZoomInfo list or defining ICP criteria and sending them to Prospector for analysis. Prospector writes enriched data back to HubSpot Company records, Contact records, and Deals. HubSpot is Prospector's primary output destination.</w:t>
+        <w:t>Marketing triggers Prospector from inside HubSpot — selecting a ZoomInfo list or defining ICP criteria and sending them to Prospector for analysis. Prospector writes enriched data back to HubSpot Company records, Contact records, and Deals. HubSpot is Prospector’s primary output destination.</w:t>
       </w:r>
     </w:p>
     <w:p>
@@ -1826,7 +1826,7 @@
           <w:color w:val="1A1A1A"/>
           <w:sz w:val="20"/>
         </w:rPr>
-        <w:t>Company and Deal records in HubSpot surface a 'Run Inspector' link. Clicking it opens Inspector in a new browser window at the Stage 1 Company Report. The full Inspector experience runs in Intelligence — HubSpot is only the trigger.</w:t>
+        <w:t>Company and Deal records in HubSpot surface a ‘Run Inspector’ link. Clicking it opens Inspector in a new browser window at the Stage 1 Company Report. The full Inspector experience runs in Intelligence — HubSpot is only the trigger.</w:t>
       </w:r>
     </w:p>
     <w:p>
@@ -2332,7 +2332,7 @@
                 <w:color w:val="1A1A1A"/>
                 <w:sz w:val="20"/>
               </w:rPr>
-              <w:t>What path, and why — the SE's talking point</w:t>
+              <w:t>What path, and why — the SE’s talking point</w:t>
             </w:r>
           </w:p>
         </w:tc>
@@ -2650,7 +2650,7 @@
           <w:color w:val="1A1A1A"/>
           <w:sz w:val="20"/>
         </w:rPr>
-        <w:t>Program owners, IDs, and SMEs go directly to Designer. HubSpot plays no role in triggering Designer's workflow.</w:t>
+        <w:t>Program owners, IDs, and SMEs go directly to Designer. HubSpot plays no role in triggering Designer’s workflow.</w:t>
       </w:r>
     </w:p>
     <w:p>
@@ -2665,7 +2665,7 @@
           <w:color w:val="1A1A1A"/>
           <w:sz w:val="20"/>
         </w:rPr>
-        <w:t>Designer-created Lab Programs surface in HubSpot as read-only links and summary data on the Company record — giving sellers and CSMs visibility into what programs have been designed, what's in progress, and what has been delivered. Critical context for renewal and expansion conversations before a QBR.</w:t>
+        <w:t>Designer-created Lab Programs surface in HubSpot as read-only links and summary data on the Company record — giving sellers and CSMs visibility into what programs have been designed, what’s in progress, and what has been delivered. Critical context for renewal and expansion conversations before a QBR.</w:t>
       </w:r>
     </w:p>
     <w:p>
@@ -2747,7 +2747,7 @@
           <w:color w:val="1A1A1A"/>
           <w:sz w:val="20"/>
         </w:rPr>
-        <w:t>The 'Run Inspector' link on every Company and Deal record makes it a one-click motion. Stage 1 output on the Company record gives every seller account intelligence they currently don't have.</w:t>
+        <w:t>The ‘Run Inspector’ link on every Company and Deal record makes it a one-click motion. Stage 1 output on the Company record gives every seller account intelligence they currently don’t have.</w:t>
       </w:r>
     </w:p>
     <w:p>
@@ -3261,7 +3261,7 @@
                 <w:color w:val="1A1A1A"/>
                 <w:sz w:val="20"/>
               </w:rPr>
-              <w:t>Which columns are in Marketing's standard export? Minimum: Company Name + Domain. High value: Industry, LinkedIn URL, Employee Count, Technologies Used.</w:t>
+              <w:t>Which columns are in Marketing’s standard export? Minimum: Company Name + Domain. High value: Industry, LinkedIn URL, Employee Count, Technologies Used.</w:t>
             </w:r>
           </w:p>
         </w:tc>

</xml_diff>

<commit_message>
Add Skillable Intelligence Platform exec briefing doc with AI moment callouts
New platform-level Word doc (Skillable-Intelligence-Platform.docx) replacing
both the original exec briefing and HubSpot integration doc. Contextual AI
moment callouts throughout WHY and WHAT sections using Skillable purple icon
and brand colors. Generator updated with ai_moment() helper, correct #136945
green and #7000FF purple palette, and fixed remove_table_borders() XML method.
Includes recolored AI chip icon (ai-moment-icon.png) and icon generator script.

Co-Authored-By: Claude Sonnet 4.6 <noreply@anthropic.com>
</commit_message>
<xml_diff>
--- a/docs/Skillable-Intelligence-Platform.docx
+++ b/docs/Skillable-Intelligence-Platform.docx
@@ -11,7 +11,7 @@
           <w:rFonts w:ascii="Calibri" w:hAnsi="Calibri"/>
           <w:b/>
           <w:i w:val="0"/>
-          <w:color w:val="1A4D35"/>
+          <w:color w:val="136945"/>
           <w:sz w:val="36"/>
         </w:rPr>
         <w:t>Skillable Intelligence Platform</w:t>
@@ -21,7 +21,7 @@
       <w:pPr>
         <w:spacing w:before="0" w:after="80"/>
         <w:pBdr>
-          <w:bottom w:val="single" w:sz="8" w:space="1" w:color="1A4D35"/>
+          <w:bottom w:val="single" w:sz="8" w:space="1" w:color="136945"/>
         </w:pBdr>
       </w:pPr>
       <w:r>
@@ -44,7 +44,7 @@
           <w:rFonts w:ascii="Calibri" w:hAnsi="Calibri"/>
           <w:b/>
           <w:i w:val="0"/>
-          <w:color w:val="1A4D35"/>
+          <w:color w:val="136945"/>
           <w:sz w:val="26"/>
         </w:rPr>
         <w:t>WHY — The Problem No Other Tool Solves</w:t>
@@ -59,7 +59,7 @@
           <w:rFonts w:ascii="Calibri" w:hAnsi="Calibri"/>
           <w:b/>
           <w:i w:val="0"/>
-          <w:color w:val="1A4D35"/>
+          <w:color w:val="136945"/>
           <w:sz w:val="22"/>
         </w:rPr>
         <w:t>We Are a Platform, Not a Product</w:t>
@@ -162,6 +162,135 @@
     </w:p>
     <w:p>
       <w:pPr>
+        <w:spacing w:before="50" w:after="0"/>
+      </w:pPr>
+    </w:p>
+    <w:tbl>
+      <w:tblPr>
+        <w:tblW w:type="auto" w:w="0"/>
+        <w:tblLook w:firstColumn="1" w:firstRow="1" w:lastColumn="0" w:lastRow="0" w:noHBand="0" w:noVBand="1" w:val="04A0"/>
+        <w:tblBorders>
+          <w:top w:val="none"/>
+          <w:left w:val="none"/>
+          <w:bottom w:val="none"/>
+          <w:right w:val="none"/>
+          <w:insideH w:val="none"/>
+          <w:insideV w:val="none"/>
+        </w:tblBorders>
+      </w:tblPr>
+      <w:tblGrid>
+        <w:gridCol w:w="4896"/>
+        <w:gridCol w:w="4896"/>
+      </w:tblGrid>
+      <w:tr>
+        <w:tc>
+          <w:tcPr>
+            <w:tcW w:type="dxa" w:w="4896"/>
+            <w:shd w:val="clear" w:color="auto" w:fill="F0E8FF"/>
+            <w:tcW w:w="504" w:type="dxa"/>
+            <w:tcBorders>
+              <w:left w:val="single" w:sz="18" w:space="0" w:color="7000FF"/>
+            </w:tcBorders>
+            <w:tcMar>
+              <w:top w:w="60" w:type="dxa"/>
+              <w:left w:w="60" w:type="dxa"/>
+              <w:bottom w:w="60" w:type="dxa"/>
+              <w:right w:w="60" w:type="dxa"/>
+            </w:tcMar>
+          </w:tcPr>
+          <w:p>
+            <w:pPr>
+              <w:jc w:val="center"/>
+              <w:spacing w:before="20" w:after="0"/>
+            </w:pPr>
+            <w:r>
+              <w:drawing>
+                <wp:inline xmlns:a="http://schemas.openxmlformats.org/drawingml/2006/main" xmlns:pic="http://schemas.openxmlformats.org/drawingml/2006/picture">
+                  <wp:extent cx="237744" cy="237744"/>
+                  <wp:docPr id="1" name="Picture 1"/>
+                  <wp:cNvGraphicFramePr>
+                    <a:graphicFrameLocks noChangeAspect="1"/>
+                  </wp:cNvGraphicFramePr>
+                  <a:graphic>
+                    <a:graphicData uri="http://schemas.openxmlformats.org/drawingml/2006/picture">
+                      <pic:pic>
+                        <pic:nvPicPr>
+                          <pic:cNvPr id="0" name="ai-moment-icon.png"/>
+                          <pic:cNvPicPr/>
+                        </pic:nvPicPr>
+                        <pic:blipFill>
+                          <a:blip r:embed="rId11"/>
+                          <a:stretch>
+                            <a:fillRect/>
+                          </a:stretch>
+                        </pic:blipFill>
+                        <pic:spPr>
+                          <a:xfrm>
+                            <a:off x="0" y="0"/>
+                            <a:ext cx="237744" cy="237744"/>
+                          </a:xfrm>
+                          <a:prstGeom prst="rect"/>
+                        </pic:spPr>
+                      </pic:pic>
+                    </a:graphicData>
+                  </a:graphic>
+                </wp:inline>
+              </w:drawing>
+            </w:r>
+          </w:p>
+        </w:tc>
+        <w:tc>
+          <w:tcPr>
+            <w:tcW w:type="dxa" w:w="4896"/>
+            <w:shd w:val="clear" w:color="auto" w:fill="F0E8FF"/>
+            <w:tcW w:w="9288" w:type="dxa"/>
+            <w:tcMar>
+              <w:top w:w="80" w:type="dxa"/>
+              <w:left w:w="80" w:type="dxa"/>
+              <w:bottom w:w="80" w:type="dxa"/>
+              <w:right w:w="80" w:type="dxa"/>
+            </w:tcMar>
+          </w:tcPr>
+          <w:p>
+            <w:pPr>
+              <w:spacing w:before="10" w:after="8"/>
+            </w:pPr>
+            <w:r>
+              <w:rPr>
+                <w:rFonts w:ascii="Calibri" w:hAnsi="Calibri"/>
+                <w:b/>
+                <w:i w:val="0"/>
+                <w:color w:val="7000FF"/>
+                <w:sz w:val="16"/>
+              </w:rPr>
+              <w:t>AI Moment</w:t>
+            </w:r>
+          </w:p>
+          <w:p>
+            <w:pPr>
+              <w:spacing w:before="0" w:after="10"/>
+            </w:pPr>
+            <w:r>
+              <w:rPr>
+                <w:rFonts w:ascii="Calibri" w:hAnsi="Calibri"/>
+                <w:b w:val="0"/>
+                <w:i/>
+                <w:color w:val="7000FF"/>
+                <w:sz w:val="19"/>
+              </w:rPr>
+              <w:t>Assessing whether a company’s products have the deployment model, API surface, marketplace presence, and technical architecture that Skillable can orchestrate takes an experienced SE hours per company. Intelligence does it in minutes, across a list of hundreds — researching marketplace listings, API documentation, GitHub repositories, Docker images, and partner ecosystem signals automatically. Every company on a ZoomInfo list gets a real technical evaluation, not just a firmographic score.</w:t>
+            </w:r>
+          </w:p>
+        </w:tc>
+      </w:tr>
+    </w:tbl>
+    <w:p>
+      <w:pPr>
+        <w:spacing w:before="0" w:after="60"/>
+      </w:pPr>
+    </w:p>
+    <w:p>
+      <w:pPr>
         <w:spacing w:before="100" w:after="30"/>
       </w:pPr>
       <w:r>
@@ -169,7 +298,7 @@
           <w:rFonts w:ascii="Calibri" w:hAnsi="Calibri"/>
           <w:b/>
           <w:i w:val="0"/>
-          <w:color w:val="1A4D35"/>
+          <w:color w:val="136945"/>
           <w:sz w:val="22"/>
         </w:rPr>
         <w:t>The Three Gates</w:t>
@@ -285,6 +414,135 @@
     </w:p>
     <w:p>
       <w:pPr>
+        <w:spacing w:before="50" w:after="0"/>
+      </w:pPr>
+    </w:p>
+    <w:tbl>
+      <w:tblPr>
+        <w:tblW w:type="auto" w:w="0"/>
+        <w:tblLook w:firstColumn="1" w:firstRow="1" w:lastColumn="0" w:lastRow="0" w:noHBand="0" w:noVBand="1" w:val="04A0"/>
+        <w:tblBorders>
+          <w:top w:val="none"/>
+          <w:left w:val="none"/>
+          <w:bottom w:val="none"/>
+          <w:right w:val="none"/>
+          <w:insideH w:val="none"/>
+          <w:insideV w:val="none"/>
+        </w:tblBorders>
+      </w:tblPr>
+      <w:tblGrid>
+        <w:gridCol w:w="4896"/>
+        <w:gridCol w:w="4896"/>
+      </w:tblGrid>
+      <w:tr>
+        <w:tc>
+          <w:tcPr>
+            <w:tcW w:type="dxa" w:w="4896"/>
+            <w:shd w:val="clear" w:color="auto" w:fill="F0E8FF"/>
+            <w:tcW w:w="504" w:type="dxa"/>
+            <w:tcBorders>
+              <w:left w:val="single" w:sz="18" w:space="0" w:color="7000FF"/>
+            </w:tcBorders>
+            <w:tcMar>
+              <w:top w:w="60" w:type="dxa"/>
+              <w:left w:w="60" w:type="dxa"/>
+              <w:bottom w:w="60" w:type="dxa"/>
+              <w:right w:w="60" w:type="dxa"/>
+            </w:tcMar>
+          </w:tcPr>
+          <w:p>
+            <w:pPr>
+              <w:jc w:val="center"/>
+              <w:spacing w:before="20" w:after="0"/>
+            </w:pPr>
+            <w:r>
+              <w:drawing>
+                <wp:inline xmlns:a="http://schemas.openxmlformats.org/drawingml/2006/main" xmlns:pic="http://schemas.openxmlformats.org/drawingml/2006/picture">
+                  <wp:extent cx="237744" cy="237744"/>
+                  <wp:docPr id="2" name="Picture 2"/>
+                  <wp:cNvGraphicFramePr>
+                    <a:graphicFrameLocks noChangeAspect="1"/>
+                  </wp:cNvGraphicFramePr>
+                  <a:graphic>
+                    <a:graphicData uri="http://schemas.openxmlformats.org/drawingml/2006/picture">
+                      <pic:pic>
+                        <pic:nvPicPr>
+                          <pic:cNvPr id="0" name="ai-moment-icon.png"/>
+                          <pic:cNvPicPr/>
+                        </pic:nvPicPr>
+                        <pic:blipFill>
+                          <a:blip r:embed="rId11"/>
+                          <a:stretch>
+                            <a:fillRect/>
+                          </a:stretch>
+                        </pic:blipFill>
+                        <pic:spPr>
+                          <a:xfrm>
+                            <a:off x="0" y="0"/>
+                            <a:ext cx="237744" cy="237744"/>
+                          </a:xfrm>
+                          <a:prstGeom prst="rect"/>
+                        </pic:spPr>
+                      </pic:pic>
+                    </a:graphicData>
+                  </a:graphic>
+                </wp:inline>
+              </w:drawing>
+            </w:r>
+          </w:p>
+        </w:tc>
+        <w:tc>
+          <w:tcPr>
+            <w:tcW w:type="dxa" w:w="4896"/>
+            <w:shd w:val="clear" w:color="auto" w:fill="F0E8FF"/>
+            <w:tcW w:w="9288" w:type="dxa"/>
+            <w:tcMar>
+              <w:top w:w="80" w:type="dxa"/>
+              <w:left w:w="80" w:type="dxa"/>
+              <w:bottom w:w="80" w:type="dxa"/>
+              <w:right w:w="80" w:type="dxa"/>
+            </w:tcMar>
+          </w:tcPr>
+          <w:p>
+            <w:pPr>
+              <w:spacing w:before="10" w:after="8"/>
+            </w:pPr>
+            <w:r>
+              <w:rPr>
+                <w:rFonts w:ascii="Calibri" w:hAnsi="Calibri"/>
+                <w:b/>
+                <w:i w:val="0"/>
+                <w:color w:val="7000FF"/>
+                <w:sz w:val="16"/>
+              </w:rPr>
+              <w:t>AI Moment</w:t>
+            </w:r>
+          </w:p>
+          <w:p>
+            <w:pPr>
+              <w:spacing w:before="0" w:after="10"/>
+            </w:pPr>
+            <w:r>
+              <w:rPr>
+                <w:rFonts w:ascii="Calibri" w:hAnsi="Calibri"/>
+                <w:b w:val="0"/>
+                <w:i/>
+                <w:color w:val="7000FF"/>
+                <w:sz w:val="19"/>
+              </w:rPr>
+              <w:t>Skillable has deep, specific knowledge about how its platform works — delivery paths, technical blockers, feature availability, Gate 1 disqualifiers, scoring feasibility signals. A human SE applies that knowledge to one company at a time, in a live conversation. Intelligence applies it to every product it researches, automatically — reasoning through the specific technical characteristics of a product against the specific capabilities and constraints of the Skillable platform, and producing a judgment that reflects reality rather than optimism. Intelligence knows Skillable as well as your best SE, and applies that knowledge to every company it touches.</w:t>
+            </w:r>
+          </w:p>
+        </w:tc>
+      </w:tr>
+    </w:tbl>
+    <w:p>
+      <w:pPr>
+        <w:spacing w:before="0" w:after="60"/>
+      </w:pPr>
+    </w:p>
+    <w:p>
+      <w:pPr>
         <w:spacing w:before="100" w:after="30"/>
       </w:pPr>
       <w:r>
@@ -292,7 +550,7 @@
           <w:rFonts w:ascii="Calibri" w:hAnsi="Calibri"/>
           <w:b/>
           <w:i w:val="0"/>
-          <w:color w:val="1A4D35"/>
+          <w:color w:val="136945"/>
           <w:sz w:val="22"/>
         </w:rPr>
         <w:t>The Workday Pattern — Knowing When to Stop Before We Start</w:t>
@@ -478,6 +736,135 @@
     </w:p>
     <w:p>
       <w:pPr>
+        <w:spacing w:before="50" w:after="0"/>
+      </w:pPr>
+    </w:p>
+    <w:tbl>
+      <w:tblPr>
+        <w:tblW w:type="auto" w:w="0"/>
+        <w:tblLook w:firstColumn="1" w:firstRow="1" w:lastColumn="0" w:lastRow="0" w:noHBand="0" w:noVBand="1" w:val="04A0"/>
+        <w:tblBorders>
+          <w:top w:val="none"/>
+          <w:left w:val="none"/>
+          <w:bottom w:val="none"/>
+          <w:right w:val="none"/>
+          <w:insideH w:val="none"/>
+          <w:insideV w:val="none"/>
+        </w:tblBorders>
+      </w:tblPr>
+      <w:tblGrid>
+        <w:gridCol w:w="4896"/>
+        <w:gridCol w:w="4896"/>
+      </w:tblGrid>
+      <w:tr>
+        <w:tc>
+          <w:tcPr>
+            <w:tcW w:type="dxa" w:w="4896"/>
+            <w:shd w:val="clear" w:color="auto" w:fill="F0E8FF"/>
+            <w:tcW w:w="504" w:type="dxa"/>
+            <w:tcBorders>
+              <w:left w:val="single" w:sz="18" w:space="0" w:color="7000FF"/>
+            </w:tcBorders>
+            <w:tcMar>
+              <w:top w:w="60" w:type="dxa"/>
+              <w:left w:w="60" w:type="dxa"/>
+              <w:bottom w:w="60" w:type="dxa"/>
+              <w:right w:w="60" w:type="dxa"/>
+            </w:tcMar>
+          </w:tcPr>
+          <w:p>
+            <w:pPr>
+              <w:jc w:val="center"/>
+              <w:spacing w:before="20" w:after="0"/>
+            </w:pPr>
+            <w:r>
+              <w:drawing>
+                <wp:inline xmlns:a="http://schemas.openxmlformats.org/drawingml/2006/main" xmlns:pic="http://schemas.openxmlformats.org/drawingml/2006/picture">
+                  <wp:extent cx="237744" cy="237744"/>
+                  <wp:docPr id="3" name="Picture 3"/>
+                  <wp:cNvGraphicFramePr>
+                    <a:graphicFrameLocks noChangeAspect="1"/>
+                  </wp:cNvGraphicFramePr>
+                  <a:graphic>
+                    <a:graphicData uri="http://schemas.openxmlformats.org/drawingml/2006/picture">
+                      <pic:pic>
+                        <pic:nvPicPr>
+                          <pic:cNvPr id="0" name="ai-moment-icon.png"/>
+                          <pic:cNvPicPr/>
+                        </pic:nvPicPr>
+                        <pic:blipFill>
+                          <a:blip r:embed="rId11"/>
+                          <a:stretch>
+                            <a:fillRect/>
+                          </a:stretch>
+                        </pic:blipFill>
+                        <pic:spPr>
+                          <a:xfrm>
+                            <a:off x="0" y="0"/>
+                            <a:ext cx="237744" cy="237744"/>
+                          </a:xfrm>
+                          <a:prstGeom prst="rect"/>
+                        </pic:spPr>
+                      </pic:pic>
+                    </a:graphicData>
+                  </a:graphic>
+                </wp:inline>
+              </w:drawing>
+            </w:r>
+          </w:p>
+        </w:tc>
+        <w:tc>
+          <w:tcPr>
+            <w:tcW w:type="dxa" w:w="4896"/>
+            <w:shd w:val="clear" w:color="auto" w:fill="F0E8FF"/>
+            <w:tcW w:w="9288" w:type="dxa"/>
+            <w:tcMar>
+              <w:top w:w="80" w:type="dxa"/>
+              <w:left w:w="80" w:type="dxa"/>
+              <w:bottom w:w="80" w:type="dxa"/>
+              <w:right w:w="80" w:type="dxa"/>
+            </w:tcMar>
+          </w:tcPr>
+          <w:p>
+            <w:pPr>
+              <w:spacing w:before="10" w:after="8"/>
+            </w:pPr>
+            <w:r>
+              <w:rPr>
+                <w:rFonts w:ascii="Calibri" w:hAnsi="Calibri"/>
+                <w:b/>
+                <w:i w:val="0"/>
+                <w:color w:val="7000FF"/>
+                <w:sz w:val="16"/>
+              </w:rPr>
+              <w:t>AI Moment</w:t>
+            </w:r>
+          </w:p>
+          <w:p>
+            <w:pPr>
+              <w:spacing w:before="0" w:after="10"/>
+            </w:pPr>
+            <w:r>
+              <w:rPr>
+                <w:rFonts w:ascii="Calibri" w:hAnsi="Calibri"/>
+                <w:b w:val="0"/>
+                <w:i/>
+                <w:color w:val="7000FF"/>
+                <w:sz w:val="19"/>
+              </w:rPr>
+              <w:t>Identifying that a product has no provisioning API, no deployment model, and pure multi-tenant architecture — from public documentation, before any human conversation — is not a filter. It is a research and reasoning task. The technical reasons a company cannot be a Skillable customer are documented before the first marketing dollar is spent.</w:t>
+            </w:r>
+          </w:p>
+        </w:tc>
+      </w:tr>
+    </w:tbl>
+    <w:p>
+      <w:pPr>
+        <w:spacing w:before="0" w:after="60"/>
+      </w:pPr>
+    </w:p>
+    <w:p>
+      <w:pPr>
         <w:spacing w:before="100" w:after="30"/>
       </w:pPr>
       <w:r>
@@ -485,7 +872,7 @@
           <w:rFonts w:ascii="Calibri" w:hAnsi="Calibri"/>
           <w:b/>
           <w:i w:val="0"/>
-          <w:color w:val="1A4D35"/>
+          <w:color w:val="136945"/>
           <w:sz w:val="22"/>
         </w:rPr>
         <w:t>Lookalike Is Causation, Not Correlation</w:t>
@@ -671,133 +1058,132 @@
     </w:p>
     <w:p>
       <w:pPr>
-        <w:spacing w:before="100" w:after="30"/>
+        <w:spacing w:before="50" w:after="0"/>
       </w:pPr>
-      <w:r>
-        <w:rPr>
-          <w:rFonts w:ascii="Calibri" w:hAnsi="Calibri"/>
-          <w:b/>
-          <w:i w:val="0"/>
-          <w:color w:val="1A4D35"/>
-          <w:sz w:val="22"/>
-        </w:rPr>
-        <w:t>AI Moments — Capability Unlocks, Not Efficiency Gains</w:t>
-      </w:r>
     </w:p>
+    <w:tbl>
+      <w:tblPr>
+        <w:tblW w:type="auto" w:w="0"/>
+        <w:tblLook w:firstColumn="1" w:firstRow="1" w:lastColumn="0" w:lastRow="0" w:noHBand="0" w:noVBand="1" w:val="04A0"/>
+        <w:tblBorders>
+          <w:top w:val="none"/>
+          <w:left w:val="none"/>
+          <w:bottom w:val="none"/>
+          <w:right w:val="none"/>
+          <w:insideH w:val="none"/>
+          <w:insideV w:val="none"/>
+        </w:tblBorders>
+      </w:tblPr>
+      <w:tblGrid>
+        <w:gridCol w:w="4896"/>
+        <w:gridCol w:w="4896"/>
+      </w:tblGrid>
+      <w:tr>
+        <w:tc>
+          <w:tcPr>
+            <w:tcW w:type="dxa" w:w="4896"/>
+            <w:shd w:val="clear" w:color="auto" w:fill="F0E8FF"/>
+            <w:tcW w:w="504" w:type="dxa"/>
+            <w:tcBorders>
+              <w:left w:val="single" w:sz="18" w:space="0" w:color="7000FF"/>
+            </w:tcBorders>
+            <w:tcMar>
+              <w:top w:w="60" w:type="dxa"/>
+              <w:left w:w="60" w:type="dxa"/>
+              <w:bottom w:w="60" w:type="dxa"/>
+              <w:right w:w="60" w:type="dxa"/>
+            </w:tcMar>
+          </w:tcPr>
+          <w:p>
+            <w:pPr>
+              <w:jc w:val="center"/>
+              <w:spacing w:before="20" w:after="0"/>
+            </w:pPr>
+            <w:r>
+              <w:drawing>
+                <wp:inline xmlns:a="http://schemas.openxmlformats.org/drawingml/2006/main" xmlns:pic="http://schemas.openxmlformats.org/drawingml/2006/picture">
+                  <wp:extent cx="237744" cy="237744"/>
+                  <wp:docPr id="4" name="Picture 4"/>
+                  <wp:cNvGraphicFramePr>
+                    <a:graphicFrameLocks noChangeAspect="1"/>
+                  </wp:cNvGraphicFramePr>
+                  <a:graphic>
+                    <a:graphicData uri="http://schemas.openxmlformats.org/drawingml/2006/picture">
+                      <pic:pic>
+                        <pic:nvPicPr>
+                          <pic:cNvPr id="0" name="ai-moment-icon.png"/>
+                          <pic:cNvPicPr/>
+                        </pic:nvPicPr>
+                        <pic:blipFill>
+                          <a:blip r:embed="rId11"/>
+                          <a:stretch>
+                            <a:fillRect/>
+                          </a:stretch>
+                        </pic:blipFill>
+                        <pic:spPr>
+                          <a:xfrm>
+                            <a:off x="0" y="0"/>
+                            <a:ext cx="237744" cy="237744"/>
+                          </a:xfrm>
+                          <a:prstGeom prst="rect"/>
+                        </pic:spPr>
+                      </pic:pic>
+                    </a:graphicData>
+                  </a:graphic>
+                </wp:inline>
+              </w:drawing>
+            </w:r>
+          </w:p>
+        </w:tc>
+        <w:tc>
+          <w:tcPr>
+            <w:tcW w:type="dxa" w:w="4896"/>
+            <w:shd w:val="clear" w:color="auto" w:fill="F0E8FF"/>
+            <w:tcW w:w="9288" w:type="dxa"/>
+            <w:tcMar>
+              <w:top w:w="80" w:type="dxa"/>
+              <w:left w:w="80" w:type="dxa"/>
+              <w:bottom w:w="80" w:type="dxa"/>
+              <w:right w:w="80" w:type="dxa"/>
+            </w:tcMar>
+          </w:tcPr>
+          <w:p>
+            <w:pPr>
+              <w:spacing w:before="10" w:after="8"/>
+            </w:pPr>
+            <w:r>
+              <w:rPr>
+                <w:rFonts w:ascii="Calibri" w:hAnsi="Calibri"/>
+                <w:b/>
+                <w:i w:val="0"/>
+                <w:color w:val="7000FF"/>
+                <w:sz w:val="16"/>
+              </w:rPr>
+              <w:t>AI Moment</w:t>
+            </w:r>
+          </w:p>
+          <w:p>
+            <w:pPr>
+              <w:spacing w:before="0" w:after="10"/>
+            </w:pPr>
+            <w:r>
+              <w:rPr>
+                <w:rFonts w:ascii="Calibri" w:hAnsi="Calibri"/>
+                <w:b w:val="0"/>
+                <w:i/>
+                <w:color w:val="7000FF"/>
+                <w:sz w:val="19"/>
+              </w:rPr>
+              <w:t>Finding companies whose products behave like known strong-fit customers requires understanding what makes a product technically orchestrable and applying that reasoning across the internet. The competitive map of every analyzed customer becomes an automatically updated list of pre-qualified lookalike candidates — identified without additional research, compounding with every new customer.</w:t>
+            </w:r>
+          </w:p>
+        </w:tc>
+      </w:tr>
+    </w:tbl>
     <w:p>
       <w:pPr>
         <w:spacing w:before="0" w:after="60"/>
       </w:pPr>
-      <w:r>
-        <w:rPr>
-          <w:rFonts w:ascii="Calibri" w:hAnsi="Calibri"/>
-          <w:b w:val="0"/>
-          <w:i w:val="0"/>
-          <w:color w:val="1A1A1A"/>
-          <w:sz w:val="20"/>
-        </w:rPr>
-        <w:t>Intelligence uses AI to do things that were not previously possible — not faster versions of existing work, but work that simply did not happen before because the human cost made it impractical.</w:t>
-      </w:r>
-    </w:p>
-    <w:p>
-      <w:pPr>
-        <w:spacing w:before="0" w:after="60"/>
-      </w:pPr>
-      <w:r>
-        <w:rPr>
-          <w:rFonts w:ascii="Calibri" w:hAnsi="Calibri"/>
-          <w:b/>
-          <w:i w:val="0"/>
-          <w:color w:val="1A1A1A"/>
-          <w:sz w:val="20"/>
-        </w:rPr>
-        <w:t xml:space="preserve">AI Moment: Product-level research at scale. </w:t>
-      </w:r>
-      <w:r>
-        <w:rPr>
-          <w:rFonts w:ascii="Calibri" w:hAnsi="Calibri"/>
-          <w:b w:val="0"/>
-          <w:i w:val="0"/>
-          <w:color w:val="1A1A1A"/>
-          <w:sz w:val="20"/>
-        </w:rPr>
-        <w:t>Assessing whether a company’s products have the deployment model, API surface, marketplace presence, and technical architecture that Skillable can orchestrate takes an experienced SE hours per company. Intelligence does it in minutes, across a list of hundreds — researching marketplace listings, API documentation, GitHub repositories, Docker images, and partner ecosystem signals automatically. Every company on a ZoomInfo list gets a real technical evaluation, not just a firmographic score.</w:t>
-      </w:r>
-    </w:p>
-    <w:p>
-      <w:pPr>
-        <w:spacing w:before="0" w:after="60"/>
-      </w:pPr>
-      <w:r>
-        <w:rPr>
-          <w:rFonts w:ascii="Calibri" w:hAnsi="Calibri"/>
-          <w:b/>
-          <w:i w:val="0"/>
-          <w:color w:val="1A1A1A"/>
-          <w:sz w:val="20"/>
-        </w:rPr>
-        <w:t xml:space="preserve">AI Moment: Applying Skillable’s platform knowledge to every product it touches. </w:t>
-      </w:r>
-      <w:r>
-        <w:rPr>
-          <w:rFonts w:ascii="Calibri" w:hAnsi="Calibri"/>
-          <w:b w:val="0"/>
-          <w:i w:val="0"/>
-          <w:color w:val="1A1A1A"/>
-          <w:sz w:val="20"/>
-        </w:rPr>
-        <w:t>Skillable has deep, specific knowledge about how its platform works — delivery paths, technical blockers, feature availability, Gate 1 disqualifiers, scoring feasibility signals. A human SE applies it to one company at a time, in a live conversation. Intelligence applies that entire body of knowledge to every product it researches, automatically — reasoning through the specific technical characteristics of a product against the specific capabilities and constraints of the Skillable platform, and producing a judgment that reflects reality rather than optimism. Intelligence knows Skillable as well as your best SE, and applies that knowledge to every company it touches.</w:t>
-      </w:r>
-    </w:p>
-    <w:p>
-      <w:pPr>
-        <w:spacing w:before="0" w:after="60"/>
-      </w:pPr>
-      <w:r>
-        <w:rPr>
-          <w:rFonts w:ascii="Calibri" w:hAnsi="Calibri"/>
-          <w:b/>
-          <w:i w:val="0"/>
-          <w:color w:val="1A1A1A"/>
-          <w:sz w:val="20"/>
-        </w:rPr>
-        <w:t xml:space="preserve">AI Moment: Surfacing the Workday pattern before the pursuit begins. </w:t>
-      </w:r>
-      <w:r>
-        <w:rPr>
-          <w:rFonts w:ascii="Calibri" w:hAnsi="Calibri"/>
-          <w:b w:val="0"/>
-          <w:i w:val="0"/>
-          <w:color w:val="1A1A1A"/>
-          <w:sz w:val="20"/>
-        </w:rPr>
-        <w:t>Identifying that a product has no provisioning API, no deployment model, and pure multi-tenant architecture — from public documentation, before any human conversation — is not a filter. It is a research and reasoning task. The technical reasons a company cannot be a Skillable customer are documented before the first marketing dollar is spent.</w:t>
-      </w:r>
-    </w:p>
-    <w:p>
-      <w:pPr>
-        <w:spacing w:before="0" w:after="60"/>
-      </w:pPr>
-      <w:r>
-        <w:rPr>
-          <w:rFonts w:ascii="Calibri" w:hAnsi="Calibri"/>
-          <w:b/>
-          <w:i w:val="0"/>
-          <w:color w:val="1A1A1A"/>
-          <w:sz w:val="20"/>
-        </w:rPr>
-        <w:t xml:space="preserve">AI Moment: Lookalike by product behavior, not firmographic resemblance. </w:t>
-      </w:r>
-      <w:r>
-        <w:rPr>
-          <w:rFonts w:ascii="Calibri" w:hAnsi="Calibri"/>
-          <w:b w:val="0"/>
-          <w:i w:val="0"/>
-          <w:color w:val="1A1A1A"/>
-          <w:sz w:val="20"/>
-        </w:rPr>
-        <w:t>Finding companies whose products behave like known strong-fit customers requires understanding what makes a product technically orchestrable and applying that reasoning across the internet. The competitive map of every analyzed customer becomes an automatically updated list of pre-qualified lookalike candidates.</w:t>
-      </w:r>
     </w:p>
     <w:p>
       <w:pPr>
@@ -816,7 +1202,7 @@
           <w:rFonts w:ascii="Calibri" w:hAnsi="Calibri"/>
           <w:b/>
           <w:i w:val="0"/>
-          <w:color w:val="1A4D35"/>
+          <w:color w:val="136945"/>
           <w:sz w:val="26"/>
         </w:rPr>
         <w:t>WHAT — The Intelligence Platform</w:t>
@@ -831,7 +1217,7 @@
           <w:rFonts w:ascii="Calibri" w:hAnsi="Calibri"/>
           <w:b/>
           <w:i w:val="0"/>
-          <w:color w:val="1A4D35"/>
+          <w:color w:val="136945"/>
           <w:sz w:val="22"/>
         </w:rPr>
         <w:t>Three Tools, One Intelligence Layer</w:t>
@@ -886,7 +1272,7 @@
           <w:rFonts w:ascii="Calibri" w:hAnsi="Calibri"/>
           <w:b/>
           <w:i w:val="0"/>
-          <w:color w:val="1A4D35"/>
+          <w:color w:val="136945"/>
           <w:sz w:val="22"/>
         </w:rPr>
         <w:t>Prospector — ICP Outbound at Scale</w:t>
@@ -956,7 +1342,7 @@
           <w:rFonts w:ascii="Calibri" w:hAnsi="Calibri"/>
           <w:b/>
           <w:i w:val="0"/>
-          <w:color w:val="1A4D35"/>
+          <w:color w:val="136945"/>
           <w:sz w:val="22"/>
         </w:rPr>
         <w:t>Inspector — Deep Analysis for Sellers and SEs</w:t>
@@ -1031,28 +1417,132 @@
     </w:p>
     <w:p>
       <w:pPr>
+        <w:spacing w:before="50" w:after="0"/>
+      </w:pPr>
+    </w:p>
+    <w:tbl>
+      <w:tblPr>
+        <w:tblW w:type="auto" w:w="0"/>
+        <w:tblLook w:firstColumn="1" w:firstRow="1" w:lastColumn="0" w:lastRow="0" w:noHBand="0" w:noVBand="1" w:val="04A0"/>
+        <w:tblBorders>
+          <w:top w:val="none"/>
+          <w:left w:val="none"/>
+          <w:bottom w:val="none"/>
+          <w:right w:val="none"/>
+          <w:insideH w:val="none"/>
+          <w:insideV w:val="none"/>
+        </w:tblBorders>
+      </w:tblPr>
+      <w:tblGrid>
+        <w:gridCol w:w="4896"/>
+        <w:gridCol w:w="4896"/>
+      </w:tblGrid>
+      <w:tr>
+        <w:tc>
+          <w:tcPr>
+            <w:tcW w:type="dxa" w:w="4896"/>
+            <w:shd w:val="clear" w:color="auto" w:fill="F0E8FF"/>
+            <w:tcW w:w="504" w:type="dxa"/>
+            <w:tcBorders>
+              <w:left w:val="single" w:sz="18" w:space="0" w:color="7000FF"/>
+            </w:tcBorders>
+            <w:tcMar>
+              <w:top w:w="60" w:type="dxa"/>
+              <w:left w:w="60" w:type="dxa"/>
+              <w:bottom w:w="60" w:type="dxa"/>
+              <w:right w:w="60" w:type="dxa"/>
+            </w:tcMar>
+          </w:tcPr>
+          <w:p>
+            <w:pPr>
+              <w:jc w:val="center"/>
+              <w:spacing w:before="20" w:after="0"/>
+            </w:pPr>
+            <w:r>
+              <w:drawing>
+                <wp:inline xmlns:a="http://schemas.openxmlformats.org/drawingml/2006/main" xmlns:pic="http://schemas.openxmlformats.org/drawingml/2006/picture">
+                  <wp:extent cx="237744" cy="237744"/>
+                  <wp:docPr id="5" name="Picture 5"/>
+                  <wp:cNvGraphicFramePr>
+                    <a:graphicFrameLocks noChangeAspect="1"/>
+                  </wp:cNvGraphicFramePr>
+                  <a:graphic>
+                    <a:graphicData uri="http://schemas.openxmlformats.org/drawingml/2006/picture">
+                      <pic:pic>
+                        <pic:nvPicPr>
+                          <pic:cNvPr id="0" name="ai-moment-icon.png"/>
+                          <pic:cNvPicPr/>
+                        </pic:nvPicPr>
+                        <pic:blipFill>
+                          <a:blip r:embed="rId11"/>
+                          <a:stretch>
+                            <a:fillRect/>
+                          </a:stretch>
+                        </pic:blipFill>
+                        <pic:spPr>
+                          <a:xfrm>
+                            <a:off x="0" y="0"/>
+                            <a:ext cx="237744" cy="237744"/>
+                          </a:xfrm>
+                          <a:prstGeom prst="rect"/>
+                        </pic:spPr>
+                      </pic:pic>
+                    </a:graphicData>
+                  </a:graphic>
+                </wp:inline>
+              </w:drawing>
+            </w:r>
+          </w:p>
+        </w:tc>
+        <w:tc>
+          <w:tcPr>
+            <w:tcW w:type="dxa" w:w="4896"/>
+            <w:shd w:val="clear" w:color="auto" w:fill="F0E8FF"/>
+            <w:tcW w:w="9288" w:type="dxa"/>
+            <w:tcMar>
+              <w:top w:w="80" w:type="dxa"/>
+              <w:left w:w="80" w:type="dxa"/>
+              <w:bottom w:w="80" w:type="dxa"/>
+              <w:right w:w="80" w:type="dxa"/>
+            </w:tcMar>
+          </w:tcPr>
+          <w:p>
+            <w:pPr>
+              <w:spacing w:before="10" w:after="8"/>
+            </w:pPr>
+            <w:r>
+              <w:rPr>
+                <w:rFonts w:ascii="Calibri" w:hAnsi="Calibri"/>
+                <w:b/>
+                <w:i w:val="0"/>
+                <w:color w:val="7000FF"/>
+                <w:sz w:val="16"/>
+              </w:rPr>
+              <w:t>AI Moment</w:t>
+            </w:r>
+          </w:p>
+          <w:p>
+            <w:pPr>
+              <w:spacing w:before="0" w:after="10"/>
+            </w:pPr>
+            <w:r>
+              <w:rPr>
+                <w:rFonts w:ascii="Calibri" w:hAnsi="Calibri"/>
+                <w:b w:val="0"/>
+                <w:i/>
+                <w:color w:val="7000FF"/>
+                <w:sz w:val="19"/>
+              </w:rPr>
+              <w:t>A seller walking into a conversation with a Stage 2 Inspector report knows what the customer’s products can and cannot do on the Skillable platform, which delivery path makes sense and why, and what the estimated consumption potential is. That is not a discovery conversation — it is a solution conversation. A level of pre-call preparation that was previously impossible at scale is now standard.</w:t>
+            </w:r>
+          </w:p>
+        </w:tc>
+      </w:tr>
+    </w:tbl>
+    <w:p>
+      <w:pPr>
         <w:spacing w:before="0" w:after="60"/>
       </w:pPr>
-      <w:r>
-        <w:rPr>
-          <w:rFonts w:ascii="Calibri" w:hAnsi="Calibri"/>
-          <w:b/>
-          <w:i w:val="0"/>
-          <w:color w:val="1A1A1A"/>
-          <w:sz w:val="20"/>
-        </w:rPr>
-        <w:t xml:space="preserve">AI Moment: </w:t>
-      </w:r>
-      <w:r>
-        <w:rPr>
-          <w:rFonts w:ascii="Calibri" w:hAnsi="Calibri"/>
-          <w:b w:val="0"/>
-          <w:i w:val="0"/>
-          <w:color w:val="1A1A1A"/>
-          <w:sz w:val="20"/>
-        </w:rPr>
-        <w:t>A seller walking into a conversation with a Stage 2 Inspector report knows what the customer’s products can and cannot do on the Skillable platform, which delivery path makes sense and why, and what the estimated consumption potential is. That is not a discovery conversation — it is a solution conversation. A level of pre-call preparation that was previously impossible at scale is now standard.</w:t>
-      </w:r>
     </w:p>
     <w:p>
       <w:pPr>
@@ -1063,7 +1553,7 @@
           <w:rFonts w:ascii="Calibri" w:hAnsi="Calibri"/>
           <w:b/>
           <w:i w:val="0"/>
-          <w:color w:val="1A4D35"/>
+          <w:color w:val="136945"/>
           <w:sz w:val="22"/>
         </w:rPr>
         <w:t>Designer — From Analysis to Program</w:t>
@@ -1111,28 +1601,132 @@
     </w:p>
     <w:p>
       <w:pPr>
+        <w:spacing w:before="50" w:after="0"/>
+      </w:pPr>
+    </w:p>
+    <w:tbl>
+      <w:tblPr>
+        <w:tblW w:type="auto" w:w="0"/>
+        <w:tblLook w:firstColumn="1" w:firstRow="1" w:lastColumn="0" w:lastRow="0" w:noHBand="0" w:noVBand="1" w:val="04A0"/>
+        <w:tblBorders>
+          <w:top w:val="none"/>
+          <w:left w:val="none"/>
+          <w:bottom w:val="none"/>
+          <w:right w:val="none"/>
+          <w:insideH w:val="none"/>
+          <w:insideV w:val="none"/>
+        </w:tblBorders>
+      </w:tblPr>
+      <w:tblGrid>
+        <w:gridCol w:w="4896"/>
+        <w:gridCol w:w="4896"/>
+      </w:tblGrid>
+      <w:tr>
+        <w:tc>
+          <w:tcPr>
+            <w:tcW w:type="dxa" w:w="4896"/>
+            <w:shd w:val="clear" w:color="auto" w:fill="F0E8FF"/>
+            <w:tcW w:w="504" w:type="dxa"/>
+            <w:tcBorders>
+              <w:left w:val="single" w:sz="18" w:space="0" w:color="7000FF"/>
+            </w:tcBorders>
+            <w:tcMar>
+              <w:top w:w="60" w:type="dxa"/>
+              <w:left w:w="60" w:type="dxa"/>
+              <w:bottom w:w="60" w:type="dxa"/>
+              <w:right w:w="60" w:type="dxa"/>
+            </w:tcMar>
+          </w:tcPr>
+          <w:p>
+            <w:pPr>
+              <w:jc w:val="center"/>
+              <w:spacing w:before="20" w:after="0"/>
+            </w:pPr>
+            <w:r>
+              <w:drawing>
+                <wp:inline xmlns:a="http://schemas.openxmlformats.org/drawingml/2006/main" xmlns:pic="http://schemas.openxmlformats.org/drawingml/2006/picture">
+                  <wp:extent cx="237744" cy="237744"/>
+                  <wp:docPr id="6" name="Picture 6"/>
+                  <wp:cNvGraphicFramePr>
+                    <a:graphicFrameLocks noChangeAspect="1"/>
+                  </wp:cNvGraphicFramePr>
+                  <a:graphic>
+                    <a:graphicData uri="http://schemas.openxmlformats.org/drawingml/2006/picture">
+                      <pic:pic>
+                        <pic:nvPicPr>
+                          <pic:cNvPr id="0" name="ai-moment-icon.png"/>
+                          <pic:cNvPicPr/>
+                        </pic:nvPicPr>
+                        <pic:blipFill>
+                          <a:blip r:embed="rId11"/>
+                          <a:stretch>
+                            <a:fillRect/>
+                          </a:stretch>
+                        </pic:blipFill>
+                        <pic:spPr>
+                          <a:xfrm>
+                            <a:off x="0" y="0"/>
+                            <a:ext cx="237744" cy="237744"/>
+                          </a:xfrm>
+                          <a:prstGeom prst="rect"/>
+                        </pic:spPr>
+                      </pic:pic>
+                    </a:graphicData>
+                  </a:graphic>
+                </wp:inline>
+              </w:drawing>
+            </w:r>
+          </w:p>
+        </w:tc>
+        <w:tc>
+          <w:tcPr>
+            <w:tcW w:type="dxa" w:w="4896"/>
+            <w:shd w:val="clear" w:color="auto" w:fill="F0E8FF"/>
+            <w:tcW w:w="9288" w:type="dxa"/>
+            <w:tcMar>
+              <w:top w:w="80" w:type="dxa"/>
+              <w:left w:w="80" w:type="dxa"/>
+              <w:bottom w:w="80" w:type="dxa"/>
+              <w:right w:w="80" w:type="dxa"/>
+            </w:tcMar>
+          </w:tcPr>
+          <w:p>
+            <w:pPr>
+              <w:spacing w:before="10" w:after="8"/>
+            </w:pPr>
+            <w:r>
+              <w:rPr>
+                <w:rFonts w:ascii="Calibri" w:hAnsi="Calibri"/>
+                <w:b/>
+                <w:i w:val="0"/>
+                <w:color w:val="7000FF"/>
+                <w:sz w:val="16"/>
+              </w:rPr>
+              <w:t>AI Moment</w:t>
+            </w:r>
+          </w:p>
+          <w:p>
+            <w:pPr>
+              <w:spacing w:before="0" w:after="10"/>
+            </w:pPr>
+            <w:r>
+              <w:rPr>
+                <w:rFonts w:ascii="Calibri" w:hAnsi="Calibri"/>
+                <w:b w:val="0"/>
+                <w:i/>
+                <w:color w:val="7000FF"/>
+                <w:sz w:val="19"/>
+              </w:rPr>
+              <w:t>Designer generates a complete Bill of Materials — PowerShell scripts, Bicep templates, CloudFormation templates, lifecycle action scripts, credential pool configuration, scoring validation stubs — from everything it knows about the program. Hours of SE and lab developer work, generated in the same session where the program was designed.</w:t>
+            </w:r>
+          </w:p>
+        </w:tc>
+      </w:tr>
+    </w:tbl>
+    <w:p>
+      <w:pPr>
         <w:spacing w:before="0" w:after="60"/>
       </w:pPr>
-      <w:r>
-        <w:rPr>
-          <w:rFonts w:ascii="Calibri" w:hAnsi="Calibri"/>
-          <w:b/>
-          <w:i w:val="0"/>
-          <w:color w:val="1A1A1A"/>
-          <w:sz w:val="20"/>
-        </w:rPr>
-        <w:t xml:space="preserve">AI Moment: </w:t>
-      </w:r>
-      <w:r>
-        <w:rPr>
-          <w:rFonts w:ascii="Calibri" w:hAnsi="Calibri"/>
-          <w:b w:val="0"/>
-          <w:i w:val="0"/>
-          <w:color w:val="1A1A1A"/>
-          <w:sz w:val="20"/>
-        </w:rPr>
-        <w:t>Designer generates a complete Bill of Materials — PowerShell scripts, Bicep templates, CloudFormation templates, lifecycle action scripts, credential pool configuration, scoring validation stubs — from everything it knows about the program. Hours of SE and lab developer work, generated in the same session where the program was designed.</w:t>
-      </w:r>
     </w:p>
     <w:p>
       <w:pPr>
@@ -1151,7 +1745,7 @@
           <w:rFonts w:ascii="Calibri" w:hAnsi="Calibri"/>
           <w:b/>
           <w:i w:val="0"/>
-          <w:color w:val="1A4D35"/>
+          <w:color w:val="136945"/>
           <w:sz w:val="26"/>
         </w:rPr>
         <w:t>HOW — Integration with HubSpot and Revenue Operations</w:t>
@@ -1181,7 +1775,7 @@
           <w:rFonts w:ascii="Calibri" w:hAnsi="Calibri"/>
           <w:b/>
           <w:i w:val="0"/>
-          <w:color w:val="1A4D35"/>
+          <w:color w:val="136945"/>
           <w:sz w:val="22"/>
         </w:rPr>
         <w:t>The Integration Principle</w:t>
@@ -1226,7 +1820,7 @@
           <w:rFonts w:ascii="Calibri" w:hAnsi="Calibri"/>
           <w:b/>
           <w:i w:val="0"/>
-          <w:color w:val="1A4D35"/>
+          <w:color w:val="136945"/>
           <w:sz w:val="22"/>
         </w:rPr>
         <w:t>Prospector ↔ HubSpot — Bidirectional, Marketing-Driven</w:t>
@@ -1276,7 +1870,7 @@
         <w:tc>
           <w:tcPr>
             <w:tcW w:type="dxa" w:w="4896"/>
-            <w:shd w:val="clear" w:color="auto" w:fill="1A4D35"/>
+            <w:shd w:val="clear" w:color="auto" w:fill="136945"/>
             <w:tcMar>
               <w:top w:w="50" w:type="dxa"/>
               <w:left w:w="50" w:type="dxa"/>
@@ -1304,7 +1898,7 @@
         <w:tc>
           <w:tcPr>
             <w:tcW w:type="dxa" w:w="4896"/>
-            <w:shd w:val="clear" w:color="auto" w:fill="1A4D35"/>
+            <w:shd w:val="clear" w:color="auto" w:fill="136945"/>
             <w:tcMar>
               <w:top w:w="50" w:type="dxa"/>
               <w:left w:w="50" w:type="dxa"/>
@@ -1808,7 +2402,7 @@
           <w:rFonts w:ascii="Calibri" w:hAnsi="Calibri"/>
           <w:b/>
           <w:i w:val="0"/>
-          <w:color w:val="1A4D35"/>
+          <w:color w:val="136945"/>
           <w:sz w:val="22"/>
         </w:rPr>
         <w:t>HubSpot → Inspector — One-Way Trigger, Seller and SE-Driven</w:t>
@@ -1858,7 +2452,7 @@
         <w:tc>
           <w:tcPr>
             <w:tcW w:type="dxa" w:w="4896"/>
-            <w:shd w:val="clear" w:color="auto" w:fill="1A4D35"/>
+            <w:shd w:val="clear" w:color="auto" w:fill="136945"/>
             <w:tcMar>
               <w:top w:w="50" w:type="dxa"/>
               <w:left w:w="50" w:type="dxa"/>
@@ -1886,7 +2480,7 @@
         <w:tc>
           <w:tcPr>
             <w:tcW w:type="dxa" w:w="4896"/>
-            <w:shd w:val="clear" w:color="auto" w:fill="1A4D35"/>
+            <w:shd w:val="clear" w:color="auto" w:fill="136945"/>
             <w:tcMar>
               <w:top w:w="50" w:type="dxa"/>
               <w:left w:w="50" w:type="dxa"/>
@@ -2227,7 +2821,7 @@
         <w:tc>
           <w:tcPr>
             <w:tcW w:type="dxa" w:w="4896"/>
-            <w:shd w:val="clear" w:color="auto" w:fill="1A4D35"/>
+            <w:shd w:val="clear" w:color="auto" w:fill="136945"/>
             <w:tcMar>
               <w:top w:w="50" w:type="dxa"/>
               <w:left w:w="50" w:type="dxa"/>
@@ -2255,7 +2849,7 @@
         <w:tc>
           <w:tcPr>
             <w:tcW w:type="dxa" w:w="4896"/>
-            <w:shd w:val="clear" w:color="auto" w:fill="1A4D35"/>
+            <w:shd w:val="clear" w:color="auto" w:fill="136945"/>
             <w:tcMar>
               <w:top w:w="50" w:type="dxa"/>
               <w:left w:w="50" w:type="dxa"/>
@@ -2632,7 +3226,7 @@
           <w:rFonts w:ascii="Calibri" w:hAnsi="Calibri"/>
           <w:b/>
           <w:i w:val="0"/>
-          <w:color w:val="1A4D35"/>
+          <w:color w:val="136945"/>
           <w:sz w:val="22"/>
         </w:rPr>
         <w:t>Designer → HubSpot — Read-Only Visibility</w:t>
@@ -2677,7 +3271,7 @@
           <w:rFonts w:ascii="Calibri" w:hAnsi="Calibri"/>
           <w:b/>
           <w:i w:val="0"/>
-          <w:color w:val="1A4D35"/>
+          <w:color w:val="136945"/>
           <w:sz w:val="26"/>
         </w:rPr>
         <w:t>Recommendations and Open Decisions</w:t>
@@ -2692,7 +3286,7 @@
           <w:rFonts w:ascii="Calibri" w:hAnsi="Calibri"/>
           <w:b/>
           <w:i w:val="0"/>
-          <w:color w:val="1A4D35"/>
+          <w:color w:val="136945"/>
           <w:sz w:val="22"/>
         </w:rPr>
         <w:t>What We Are Recommending</w:t>
@@ -2785,7 +3379,7 @@
           <w:rFonts w:ascii="Calibri" w:hAnsi="Calibri"/>
           <w:b/>
           <w:i w:val="0"/>
-          <w:color w:val="1A4D35"/>
+          <w:color w:val="136945"/>
           <w:sz w:val="22"/>
         </w:rPr>
         <w:t>Decisions Required from RevOps and Marketing</w:t>
@@ -2820,7 +3414,7 @@
         <w:tc>
           <w:tcPr>
             <w:tcW w:type="dxa" w:w="4896"/>
-            <w:shd w:val="clear" w:color="auto" w:fill="1A4D35"/>
+            <w:shd w:val="clear" w:color="auto" w:fill="136945"/>
             <w:tcMar>
               <w:top w:w="50" w:type="dxa"/>
               <w:left w:w="50" w:type="dxa"/>
@@ -2848,7 +3442,7 @@
         <w:tc>
           <w:tcPr>
             <w:tcW w:type="dxa" w:w="4896"/>
-            <w:shd w:val="clear" w:color="auto" w:fill="1A4D35"/>
+            <w:shd w:val="clear" w:color="auto" w:fill="136945"/>
             <w:tcMar>
               <w:top w:w="50" w:type="dxa"/>
               <w:left w:w="50" w:type="dxa"/>
@@ -3422,7 +4016,7 @@
       <w:jc w:val="right"/>
       <w:spacing w:before="0" w:after="0"/>
       <w:pBdr>
-        <w:bottom w:val="single" w:sz="8" w:space="1" w:color="1A4D35"/>
+        <w:bottom w:val="single" w:sz="8" w:space="1" w:color="136945"/>
       </w:pBdr>
     </w:pPr>
     <w:r>

</xml_diff>

<commit_message>
Restructure platform doc: three problems → three tools, inline AI moments
Complete rewrite of exec briefing. New structure: Three Problems Worth Solving
(PaaS vs SaaS framing, Marketing/Revenue/ProServ challenges) → Three Tools.
One Platform. (Designer→Inspector→Prospector, inverted order). AI moments now
inline purple words with floating margin icon rather than callout boxes.
Tables narrowed col1 to reduce word wrap. Header border removed.

Co-Authored-By: Claude Sonnet 4.6 <noreply@anthropic.com>
</commit_message>
<xml_diff>
--- a/docs/Skillable-Intelligence-Platform.docx
+++ b/docs/Skillable-Intelligence-Platform.docx
@@ -47,22 +47,7 @@
           <w:color w:val="136945"/>
           <w:sz w:val="26"/>
         </w:rPr>
-        <w:t>WHY — The Problem No Other Tool Solves</w:t>
-      </w:r>
-    </w:p>
-    <w:p>
-      <w:pPr>
-        <w:spacing w:before="100" w:after="30"/>
-      </w:pPr>
-      <w:r>
-        <w:rPr>
-          <w:rFonts w:ascii="Calibri" w:hAnsi="Calibri"/>
-          <w:b/>
-          <w:i w:val="0"/>
-          <w:color w:val="136945"/>
-          <w:sz w:val="22"/>
-        </w:rPr>
-        <w:t>We Are a Platform, Not a Product</w:t>
+        <w:t>Three Problems Worth Solving</w:t>
       </w:r>
     </w:p>
     <w:p>
@@ -77,246 +62,7 @@
           <w:color w:val="1A1A1A"/>
           <w:sz w:val="20"/>
         </w:rPr>
-        <w:t>Most B2B companies sell a product. Their go-to-market challenge is identifying organizations that have the budget, the pain point, and the authority to buy. Firmographic signals — company size, industry, growth stage, technology stack — are meaningful proxies. A company that fits the profile is a prospect.</w:t>
-      </w:r>
-    </w:p>
-    <w:p>
-      <w:pPr>
-        <w:spacing w:before="0" w:after="60"/>
-      </w:pPr>
-      <w:r>
-        <w:rPr>
-          <w:rFonts w:ascii="Calibri" w:hAnsi="Calibri"/>
-          <w:b w:val="0"/>
-          <w:i w:val="0"/>
-          <w:color w:val="1A1A1A"/>
-          <w:sz w:val="20"/>
-        </w:rPr>
-        <w:t>Skillable sells a platform. That changes the qualification question entirely.</w:t>
-      </w:r>
-    </w:p>
-    <w:p>
-      <w:pPr>
-        <w:spacing w:before="0" w:after="60"/>
-      </w:pPr>
-      <w:r>
-        <w:rPr>
-          <w:rFonts w:ascii="Calibri" w:hAnsi="Calibri"/>
-          <w:b w:val="0"/>
-          <w:i w:val="0"/>
-          <w:color w:val="1A1A1A"/>
-          <w:sz w:val="20"/>
-        </w:rPr>
-        <w:t>We are not asking whether a company values training. We are asking whether a company’s products can be orchestrated into hands-on labs — whether Skillable can technically deliver for them, whether their products are complex enough that labs create genuine skill-building value, and whether their organization has the maturity to build and sustain a lab program.</w:t>
-      </w:r>
-    </w:p>
-    <w:p>
-      <w:pPr>
-        <w:spacing w:before="0" w:after="60"/>
-      </w:pPr>
-      <w:r>
-        <w:rPr>
-          <w:rFonts w:ascii="Calibri" w:hAnsi="Calibri"/>
-          <w:b w:val="0"/>
-          <w:i w:val="0"/>
-          <w:color w:val="1A1A1A"/>
-          <w:sz w:val="20"/>
-        </w:rPr>
-        <w:t>These are not questions about the company. They are questions about the product. And they cannot be answered with firmographic data.</w:t>
-      </w:r>
-    </w:p>
-    <w:p>
-      <w:pPr>
-        <w:spacing w:before="0" w:after="60"/>
-      </w:pPr>
-      <w:r>
-        <w:rPr>
-          <w:rFonts w:ascii="Calibri" w:hAnsi="Calibri"/>
-          <w:b w:val="0"/>
-          <w:i w:val="0"/>
-          <w:color w:val="1A1A1A"/>
-          <w:sz w:val="20"/>
-        </w:rPr>
-        <w:t xml:space="preserve">This is the gap Intelligence fills. Every other tool in our stack — ZoomInfo, 6sense, HubSpot, LinkedIn Sales Navigator — evaluates companies. </w:t>
-      </w:r>
-      <w:r>
-        <w:rPr>
-          <w:rFonts w:ascii="Calibri" w:hAnsi="Calibri"/>
-          <w:b/>
-          <w:i w:val="0"/>
-          <w:color w:val="1A1A1A"/>
-          <w:sz w:val="20"/>
-        </w:rPr>
-        <w:t>Intelligence evaluates products.</w:t>
-      </w:r>
-      <w:r>
-        <w:rPr>
-          <w:rFonts w:ascii="Calibri" w:hAnsi="Calibri"/>
-          <w:b w:val="0"/>
-          <w:i w:val="0"/>
-          <w:color w:val="1A1A1A"/>
-          <w:sz w:val="20"/>
-        </w:rPr>
-        <w:t xml:space="preserve"> It is the only platform in our stack capable of answering the question that actually determines whether a prospect can become a Skillable customer.</w:t>
-      </w:r>
-    </w:p>
-    <w:p>
-      <w:pPr>
-        <w:spacing w:before="50" w:after="0"/>
-      </w:pPr>
-    </w:p>
-    <w:tbl>
-      <w:tblPr>
-        <w:tblW w:type="auto" w:w="0"/>
-        <w:tblLook w:firstColumn="1" w:firstRow="1" w:lastColumn="0" w:lastRow="0" w:noHBand="0" w:noVBand="1" w:val="04A0"/>
-        <w:tblBorders>
-          <w:top w:val="none"/>
-          <w:left w:val="none"/>
-          <w:bottom w:val="none"/>
-          <w:right w:val="none"/>
-          <w:insideH w:val="none"/>
-          <w:insideV w:val="none"/>
-        </w:tblBorders>
-      </w:tblPr>
-      <w:tblGrid>
-        <w:gridCol w:w="4896"/>
-        <w:gridCol w:w="4896"/>
-      </w:tblGrid>
-      <w:tr>
-        <w:tc>
-          <w:tcPr>
-            <w:tcW w:type="dxa" w:w="4896"/>
-            <w:shd w:val="clear" w:color="auto" w:fill="F0E8FF"/>
-            <w:tcW w:w="504" w:type="dxa"/>
-            <w:tcBorders>
-              <w:left w:val="single" w:sz="18" w:space="0" w:color="7000FF"/>
-            </w:tcBorders>
-            <w:tcMar>
-              <w:top w:w="60" w:type="dxa"/>
-              <w:left w:w="60" w:type="dxa"/>
-              <w:bottom w:w="60" w:type="dxa"/>
-              <w:right w:w="60" w:type="dxa"/>
-            </w:tcMar>
-          </w:tcPr>
-          <w:p>
-            <w:pPr>
-              <w:jc w:val="center"/>
-              <w:spacing w:before="20" w:after="0"/>
-            </w:pPr>
-            <w:r>
-              <w:drawing>
-                <wp:inline xmlns:a="http://schemas.openxmlformats.org/drawingml/2006/main" xmlns:pic="http://schemas.openxmlformats.org/drawingml/2006/picture">
-                  <wp:extent cx="237744" cy="237744"/>
-                  <wp:docPr id="1" name="Picture 1"/>
-                  <wp:cNvGraphicFramePr>
-                    <a:graphicFrameLocks noChangeAspect="1"/>
-                  </wp:cNvGraphicFramePr>
-                  <a:graphic>
-                    <a:graphicData uri="http://schemas.openxmlformats.org/drawingml/2006/picture">
-                      <pic:pic>
-                        <pic:nvPicPr>
-                          <pic:cNvPr id="0" name="ai-moment-icon.png"/>
-                          <pic:cNvPicPr/>
-                        </pic:nvPicPr>
-                        <pic:blipFill>
-                          <a:blip r:embed="rId11"/>
-                          <a:stretch>
-                            <a:fillRect/>
-                          </a:stretch>
-                        </pic:blipFill>
-                        <pic:spPr>
-                          <a:xfrm>
-                            <a:off x="0" y="0"/>
-                            <a:ext cx="237744" cy="237744"/>
-                          </a:xfrm>
-                          <a:prstGeom prst="rect"/>
-                        </pic:spPr>
-                      </pic:pic>
-                    </a:graphicData>
-                  </a:graphic>
-                </wp:inline>
-              </w:drawing>
-            </w:r>
-          </w:p>
-        </w:tc>
-        <w:tc>
-          <w:tcPr>
-            <w:tcW w:type="dxa" w:w="4896"/>
-            <w:shd w:val="clear" w:color="auto" w:fill="F0E8FF"/>
-            <w:tcW w:w="9288" w:type="dxa"/>
-            <w:tcMar>
-              <w:top w:w="80" w:type="dxa"/>
-              <w:left w:w="80" w:type="dxa"/>
-              <w:bottom w:w="80" w:type="dxa"/>
-              <w:right w:w="80" w:type="dxa"/>
-            </w:tcMar>
-          </w:tcPr>
-          <w:p>
-            <w:pPr>
-              <w:spacing w:before="10" w:after="8"/>
-            </w:pPr>
-            <w:r>
-              <w:rPr>
-                <w:rFonts w:ascii="Calibri" w:hAnsi="Calibri"/>
-                <w:b/>
-                <w:i w:val="0"/>
-                <w:color w:val="7000FF"/>
-                <w:sz w:val="16"/>
-              </w:rPr>
-              <w:t>AI Moment</w:t>
-            </w:r>
-          </w:p>
-          <w:p>
-            <w:pPr>
-              <w:spacing w:before="0" w:after="10"/>
-            </w:pPr>
-            <w:r>
-              <w:rPr>
-                <w:rFonts w:ascii="Calibri" w:hAnsi="Calibri"/>
-                <w:b w:val="0"/>
-                <w:i/>
-                <w:color w:val="7000FF"/>
-                <w:sz w:val="19"/>
-              </w:rPr>
-              <w:t>Assessing whether a company’s products have the deployment model, API surface, marketplace presence, and technical architecture that Skillable can orchestrate takes an experienced SE hours per company. Intelligence does it in minutes, across a list of hundreds — researching marketplace listings, API documentation, GitHub repositories, Docker images, and partner ecosystem signals automatically. Every company on a ZoomInfo list gets a real technical evaluation, not just a firmographic score.</w:t>
-            </w:r>
-          </w:p>
-        </w:tc>
-      </w:tr>
-    </w:tbl>
-    <w:p>
-      <w:pPr>
-        <w:spacing w:before="0" w:after="60"/>
-      </w:pPr>
-    </w:p>
-    <w:p>
-      <w:pPr>
-        <w:spacing w:before="100" w:after="30"/>
-      </w:pPr>
-      <w:r>
-        <w:rPr>
-          <w:rFonts w:ascii="Calibri" w:hAnsi="Calibri"/>
-          <w:b/>
-          <w:i w:val="0"/>
-          <w:color w:val="136945"/>
-          <w:sz w:val="22"/>
-        </w:rPr>
-        <w:t>The Three Gates</w:t>
-      </w:r>
-    </w:p>
-    <w:p>
-      <w:pPr>
-        <w:spacing w:before="0" w:after="60"/>
-      </w:pPr>
-      <w:r>
-        <w:rPr>
-          <w:rFonts w:ascii="Calibri" w:hAnsi="Calibri"/>
-          <w:b w:val="0"/>
-          <w:i w:val="0"/>
-          <w:color w:val="1A1A1A"/>
-          <w:sz w:val="20"/>
-        </w:rPr>
-        <w:t>Intelligence evaluates every company and product against three qualification gates. All three must clear for a prospect to be genuinely purseable.</w:t>
+        <w:t>Skillable is a platform company. Not a software product — an orchestration platform that enables software companies to deliver hands-on learning experiences at scale. That distinction is more than positioning. It is the root cause of three hard problems that no standard sales or marketing tool was ever designed to solve.</w:t>
       </w:r>
     </w:p>
     <w:p>
@@ -332,7 +78,7 @@
           <w:color w:val="1A1A1A"/>
           <w:sz w:val="20"/>
         </w:rPr>
-        <w:t xml:space="preserve">Gate 1 — Technical Orchestrability: </w:t>
+        <w:t xml:space="preserve">Marketing: </w:t>
       </w:r>
       <w:r>
         <w:rPr>
@@ -342,7 +88,7 @@
           <w:color w:val="1A1A1A"/>
           <w:sz w:val="20"/>
         </w:rPr>
-        <w:t>Can Skillable deliver a lab for this company’s products? This is the primary gate. If the answer is no, the composite score is limited regardless of everything else. Gate 1 failure means the company is not a Skillable prospect — period.</w:t>
+        <w:t>Identifying companies in our ICP</w:t>
       </w:r>
     </w:p>
     <w:p>
@@ -358,7 +104,7 @@
           <w:color w:val="1A1A1A"/>
           <w:sz w:val="20"/>
         </w:rPr>
-        <w:t xml:space="preserve">Gate 2 — Product Complexity: </w:t>
+        <w:t xml:space="preserve">Revenue: </w:t>
       </w:r>
       <w:r>
         <w:rPr>
@@ -368,7 +114,168 @@
           <w:color w:val="1A1A1A"/>
           <w:sz w:val="20"/>
         </w:rPr>
-        <w:t>Is the product technically rich enough that hands-on labs create genuine skill-building value? Simple products with shallow workflows don’t benefit enough from labs to justify the investment. High Gate 2 scores mean learners get dramatically better at something that matters — and they can prove it.</w:t>
+        <w:t>Proving labability and lab impact</w:t>
+      </w:r>
+    </w:p>
+    <w:p>
+      <w:pPr>
+        <w:pStyle w:val="ListBullet"/>
+        <w:spacing w:before="0" w:after="60"/>
+      </w:pPr>
+      <w:r>
+        <w:rPr>
+          <w:rFonts w:ascii="Calibri" w:hAnsi="Calibri"/>
+          <w:b/>
+          <w:i w:val="0"/>
+          <w:color w:val="1A1A1A"/>
+          <w:sz w:val="20"/>
+        </w:rPr>
+        <w:t xml:space="preserve">ProServ &amp; Product: </w:t>
+      </w:r>
+      <w:r>
+        <w:rPr>
+          <w:rFonts w:ascii="Calibri" w:hAnsi="Calibri"/>
+          <w:b w:val="0"/>
+          <w:i w:val="0"/>
+          <w:color w:val="1A1A1A"/>
+          <w:sz w:val="20"/>
+        </w:rPr>
+        <w:t>Enabling bought-in customers to adopt labs</w:t>
+      </w:r>
+    </w:p>
+    <w:p>
+      <w:pPr>
+        <w:spacing w:before="0" w:after="60"/>
+      </w:pPr>
+      <w:r>
+        <w:rPr>
+          <w:rFonts w:ascii="Calibri" w:hAnsi="Calibri"/>
+          <w:b w:val="0"/>
+          <w:i w:val="0"/>
+          <w:color w:val="1A1A1A"/>
+          <w:sz w:val="20"/>
+        </w:rPr>
+        <w:t>Each problem is structural — a natural consequence of the sophistication of what we do, not a gap in any team’s execution. And each one requires a different kind of intelligence than any existing tool provides.</w:t>
+      </w:r>
+    </w:p>
+    <w:p>
+      <w:pPr>
+        <w:spacing w:before="100" w:after="30"/>
+      </w:pPr>
+      <w:r>
+        <w:rPr>
+          <w:rFonts w:ascii="Calibri" w:hAnsi="Calibri"/>
+          <w:b/>
+          <w:i w:val="0"/>
+          <w:color w:val="136945"/>
+          <w:sz w:val="22"/>
+        </w:rPr>
+        <w:t>The Platform Difference</w:t>
+      </w:r>
+    </w:p>
+    <w:p>
+      <w:pPr>
+        <w:spacing w:before="0" w:after="60"/>
+      </w:pPr>
+      <w:r>
+        <w:rPr>
+          <w:rFonts w:ascii="Calibri" w:hAnsi="Calibri"/>
+          <w:b w:val="0"/>
+          <w:i w:val="0"/>
+          <w:color w:val="1A1A1A"/>
+          <w:sz w:val="20"/>
+        </w:rPr>
+        <w:t>Most B2B software companies sell a product that runs in their cloud. Their buyers interact with it through a browser. The product is the same for every customer. Qualifying a prospect means finding buyers who fit the profile: the right size, the right industry, the right pain point, the right budget.</w:t>
+      </w:r>
+    </w:p>
+    <w:p>
+      <w:pPr>
+        <w:spacing w:before="0" w:after="60"/>
+      </w:pPr>
+      <w:r>
+        <w:rPr>
+          <w:rFonts w:ascii="Calibri" w:hAnsi="Calibri"/>
+          <w:b w:val="0"/>
+          <w:i w:val="0"/>
+          <w:color w:val="1A1A1A"/>
+          <w:sz w:val="20"/>
+        </w:rPr>
+        <w:t>Skillable is different. We do not deliver our own software. We orchestrate other companies’ software into hands-on lab environments — real products, real interfaces, real consequence of error, accessible to a learner anywhere. What we sell is the infrastructure that makes that possible.</w:t>
+      </w:r>
+    </w:p>
+    <w:p>
+      <w:pPr>
+        <w:spacing w:before="0" w:after="60"/>
+      </w:pPr>
+      <w:r>
+        <w:rPr>
+          <w:rFonts w:ascii="Calibri" w:hAnsi="Calibri"/>
+          <w:b w:val="0"/>
+          <w:i w:val="0"/>
+          <w:color w:val="1A1A1A"/>
+          <w:sz w:val="20"/>
+        </w:rPr>
+        <w:t>This creates a fundamentally different go-to-market challenge. The buyer profile question — does this company value training? — is necessary but not sufficient. The deeper question is whether their products can be orchestrated into a Skillable environment at all. Whether those products are technically complex enough that hands-on practice creates real value. Whether the company can build and sustain a lab program once they are a customer.</w:t>
+      </w:r>
+    </w:p>
+    <w:p>
+      <w:pPr>
+        <w:spacing w:before="0" w:after="60"/>
+      </w:pPr>
+      <w:r>
+        <w:rPr>
+          <w:rFonts w:ascii="Calibri" w:hAnsi="Calibri"/>
+          <w:b w:val="0"/>
+          <w:i w:val="0"/>
+          <w:color w:val="1A1A1A"/>
+          <w:sz w:val="20"/>
+        </w:rPr>
+        <w:t>These questions cannot be answered with firmographic data. They require a different kind of analysis entirely. That is what Intelligence provides.</w:t>
+      </w:r>
+    </w:p>
+    <w:p>
+      <w:pPr>
+        <w:spacing w:before="100" w:after="30"/>
+      </w:pPr>
+      <w:r>
+        <w:rPr>
+          <w:rFonts w:ascii="Calibri" w:hAnsi="Calibri"/>
+          <w:b/>
+          <w:i w:val="0"/>
+          <w:color w:val="136945"/>
+          <w:sz w:val="22"/>
+        </w:rPr>
+        <w:t>Marketing Challenge: Identifying Companies in Our ICP</w:t>
+      </w:r>
+    </w:p>
+    <w:p>
+      <w:pPr>
+        <w:spacing w:before="0" w:after="60"/>
+      </w:pPr>
+      <w:r>
+        <w:rPr>
+          <w:rFonts w:ascii="Calibri" w:hAnsi="Calibri"/>
+          <w:b w:val="0"/>
+          <w:i w:val="0"/>
+          <w:color w:val="1A1A1A"/>
+          <w:sz w:val="20"/>
+        </w:rPr>
+        <w:t>Platform companies cannot qualify prospects the way product companies do. The tools Marketing uses — ZoomInfo, 6sense, HubSpot, LinkedIn Sales Navigator — are built to identify buyers who match a profile. For Skillable, that is the wrong question. The right question is whether a company’s products can be delivered as hands-on lab experiences. That is a technical assessment, not a firmographic one.</w:t>
+      </w:r>
+    </w:p>
+    <w:p>
+      <w:pPr>
+        <w:spacing w:before="0" w:after="60"/>
+      </w:pPr>
+      <w:r>
+        <w:rPr>
+          <w:rFonts w:ascii="Calibri" w:hAnsi="Calibri"/>
+          <w:b w:val="0"/>
+          <w:i w:val="0"/>
+          <w:color w:val="1A1A1A"/>
+          <w:sz w:val="20"/>
+        </w:rPr>
+        <w:t>We evaluate every prospect across three dimensions:</w:t>
       </w:r>
     </w:p>
     <w:p>
@@ -384,7 +291,7 @@
           <w:color w:val="1A1A1A"/>
           <w:sz w:val="20"/>
         </w:rPr>
-        <w:t xml:space="preserve">Gate 3 — Organizational Readiness: </w:t>
+        <w:t xml:space="preserve">Can we deliver a lab for this company’s products? </w:t>
       </w:r>
       <w:r>
         <w:rPr>
@@ -394,7 +301,59 @@
           <w:color w:val="1A1A1A"/>
           <w:sz w:val="20"/>
         </w:rPr>
-        <w:t>Does the company have the content team skills, technical enablement maturity, and program leadership to build and sustain a lab program? Gate 3 uses a two-question model: does the organization have this capability today, and do they have the organizational DNA to build it if absent?</w:t>
+        <w:t>This is the primary filter. If the answer is no, nothing else matters — not the size of their training organization, not the depth of their content team, not their enthusiasm for hands-on learning. A company whose products cannot be orchestrated into a Skillable environment is not a prospect.</w:t>
+      </w:r>
+    </w:p>
+    <w:p>
+      <w:pPr>
+        <w:pStyle w:val="ListBullet"/>
+        <w:spacing w:before="0" w:after="40"/>
+      </w:pPr>
+      <w:r>
+        <w:rPr>
+          <w:rFonts w:ascii="Calibri" w:hAnsi="Calibri"/>
+          <w:b/>
+          <w:i w:val="0"/>
+          <w:color w:val="1A1A1A"/>
+          <w:sz w:val="20"/>
+        </w:rPr>
+        <w:t xml:space="preserve">Is the product technically complex enough for labs to create real value? </w:t>
+      </w:r>
+      <w:r>
+        <w:rPr>
+          <w:rFonts w:ascii="Calibri" w:hAnsi="Calibri"/>
+          <w:b w:val="0"/>
+          <w:i w:val="0"/>
+          <w:color w:val="1A1A1A"/>
+          <w:sz w:val="20"/>
+        </w:rPr>
+        <w:t>Simple products with shallow workflows do not benefit enough from hands-on practice to justify the investment. Products with deep administrative workflows, meaningful configuration decisions, and real consequence of error — those are where labs change what learners can actually do.</w:t>
+      </w:r>
+    </w:p>
+    <w:p>
+      <w:pPr>
+        <w:pStyle w:val="ListBullet"/>
+        <w:spacing w:before="0" w:after="60"/>
+      </w:pPr>
+      <w:r>
+        <w:rPr>
+          <w:rFonts w:ascii="Calibri" w:hAnsi="Calibri"/>
+          <w:b/>
+          <w:i w:val="0"/>
+          <w:color w:val="1A1A1A"/>
+          <w:sz w:val="20"/>
+        </w:rPr>
+        <w:t xml:space="preserve">Does the organization have what it takes to build and sustain a program? </w:t>
+      </w:r>
+      <w:r>
+        <w:rPr>
+          <w:rFonts w:ascii="Calibri" w:hAnsi="Calibri"/>
+          <w:b w:val="0"/>
+          <w:i w:val="0"/>
+          <w:color w:val="1A1A1A"/>
+          <w:sz w:val="20"/>
+        </w:rPr>
+        <w:t>Content team skills, technical enablement maturity, program leadership. Some companies have it today. Others have the organizational DNA to build it. Either can become a strong customer. Companies with neither are high-risk programs regardless of product fit.</w:t>
       </w:r>
     </w:p>
     <w:p>
@@ -409,196 +368,7 @@
           <w:color w:val="1A1A1A"/>
           <w:sz w:val="20"/>
         </w:rPr>
-        <w:t>A company must clear all three gates for a successful lab program to be achievable. Intelligence flags what’s missing — and surfaces what it would take to get there.</w:t>
-      </w:r>
-    </w:p>
-    <w:p>
-      <w:pPr>
-        <w:spacing w:before="50" w:after="0"/>
-      </w:pPr>
-    </w:p>
-    <w:tbl>
-      <w:tblPr>
-        <w:tblW w:type="auto" w:w="0"/>
-        <w:tblLook w:firstColumn="1" w:firstRow="1" w:lastColumn="0" w:lastRow="0" w:noHBand="0" w:noVBand="1" w:val="04A0"/>
-        <w:tblBorders>
-          <w:top w:val="none"/>
-          <w:left w:val="none"/>
-          <w:bottom w:val="none"/>
-          <w:right w:val="none"/>
-          <w:insideH w:val="none"/>
-          <w:insideV w:val="none"/>
-        </w:tblBorders>
-      </w:tblPr>
-      <w:tblGrid>
-        <w:gridCol w:w="4896"/>
-        <w:gridCol w:w="4896"/>
-      </w:tblGrid>
-      <w:tr>
-        <w:tc>
-          <w:tcPr>
-            <w:tcW w:type="dxa" w:w="4896"/>
-            <w:shd w:val="clear" w:color="auto" w:fill="F0E8FF"/>
-            <w:tcW w:w="504" w:type="dxa"/>
-            <w:tcBorders>
-              <w:left w:val="single" w:sz="18" w:space="0" w:color="7000FF"/>
-            </w:tcBorders>
-            <w:tcMar>
-              <w:top w:w="60" w:type="dxa"/>
-              <w:left w:w="60" w:type="dxa"/>
-              <w:bottom w:w="60" w:type="dxa"/>
-              <w:right w:w="60" w:type="dxa"/>
-            </w:tcMar>
-          </w:tcPr>
-          <w:p>
-            <w:pPr>
-              <w:jc w:val="center"/>
-              <w:spacing w:before="20" w:after="0"/>
-            </w:pPr>
-            <w:r>
-              <w:drawing>
-                <wp:inline xmlns:a="http://schemas.openxmlformats.org/drawingml/2006/main" xmlns:pic="http://schemas.openxmlformats.org/drawingml/2006/picture">
-                  <wp:extent cx="237744" cy="237744"/>
-                  <wp:docPr id="2" name="Picture 2"/>
-                  <wp:cNvGraphicFramePr>
-                    <a:graphicFrameLocks noChangeAspect="1"/>
-                  </wp:cNvGraphicFramePr>
-                  <a:graphic>
-                    <a:graphicData uri="http://schemas.openxmlformats.org/drawingml/2006/picture">
-                      <pic:pic>
-                        <pic:nvPicPr>
-                          <pic:cNvPr id="0" name="ai-moment-icon.png"/>
-                          <pic:cNvPicPr/>
-                        </pic:nvPicPr>
-                        <pic:blipFill>
-                          <a:blip r:embed="rId11"/>
-                          <a:stretch>
-                            <a:fillRect/>
-                          </a:stretch>
-                        </pic:blipFill>
-                        <pic:spPr>
-                          <a:xfrm>
-                            <a:off x="0" y="0"/>
-                            <a:ext cx="237744" cy="237744"/>
-                          </a:xfrm>
-                          <a:prstGeom prst="rect"/>
-                        </pic:spPr>
-                      </pic:pic>
-                    </a:graphicData>
-                  </a:graphic>
-                </wp:inline>
-              </w:drawing>
-            </w:r>
-          </w:p>
-        </w:tc>
-        <w:tc>
-          <w:tcPr>
-            <w:tcW w:type="dxa" w:w="4896"/>
-            <w:shd w:val="clear" w:color="auto" w:fill="F0E8FF"/>
-            <w:tcW w:w="9288" w:type="dxa"/>
-            <w:tcMar>
-              <w:top w:w="80" w:type="dxa"/>
-              <w:left w:w="80" w:type="dxa"/>
-              <w:bottom w:w="80" w:type="dxa"/>
-              <w:right w:w="80" w:type="dxa"/>
-            </w:tcMar>
-          </w:tcPr>
-          <w:p>
-            <w:pPr>
-              <w:spacing w:before="10" w:after="8"/>
-            </w:pPr>
-            <w:r>
-              <w:rPr>
-                <w:rFonts w:ascii="Calibri" w:hAnsi="Calibri"/>
-                <w:b/>
-                <w:i w:val="0"/>
-                <w:color w:val="7000FF"/>
-                <w:sz w:val="16"/>
-              </w:rPr>
-              <w:t>AI Moment</w:t>
-            </w:r>
-          </w:p>
-          <w:p>
-            <w:pPr>
-              <w:spacing w:before="0" w:after="10"/>
-            </w:pPr>
-            <w:r>
-              <w:rPr>
-                <w:rFonts w:ascii="Calibri" w:hAnsi="Calibri"/>
-                <w:b w:val="0"/>
-                <w:i/>
-                <w:color w:val="7000FF"/>
-                <w:sz w:val="19"/>
-              </w:rPr>
-              <w:t>Skillable has deep, specific knowledge about how its platform works — delivery paths, technical blockers, feature availability, Gate 1 disqualifiers, scoring feasibility signals. A human SE applies that knowledge to one company at a time, in a live conversation. Intelligence applies it to every product it researches, automatically — reasoning through the specific technical characteristics of a product against the specific capabilities and constraints of the Skillable platform, and producing a judgment that reflects reality rather than optimism. Intelligence knows Skillable as well as your best SE, and applies that knowledge to every company it touches.</w:t>
-            </w:r>
-          </w:p>
-        </w:tc>
-      </w:tr>
-    </w:tbl>
-    <w:p>
-      <w:pPr>
-        <w:spacing w:before="0" w:after="60"/>
-      </w:pPr>
-    </w:p>
-    <w:p>
-      <w:pPr>
-        <w:spacing w:before="100" w:after="30"/>
-      </w:pPr>
-      <w:r>
-        <w:rPr>
-          <w:rFonts w:ascii="Calibri" w:hAnsi="Calibri"/>
-          <w:b/>
-          <w:i w:val="0"/>
-          <w:color w:val="136945"/>
-          <w:sz w:val="22"/>
-        </w:rPr>
-        <w:t>The Workday Pattern — Knowing When to Stop Before We Start</w:t>
-      </w:r>
-    </w:p>
-    <w:p>
-      <w:pPr>
-        <w:spacing w:before="0" w:after="60"/>
-      </w:pPr>
-      <w:r>
-        <w:rPr>
-          <w:rFonts w:ascii="Calibri" w:hAnsi="Calibri"/>
-          <w:b/>
-          <w:i w:val="0"/>
-          <w:color w:val="1A1A1A"/>
-          <w:sz w:val="20"/>
-        </w:rPr>
-        <w:t>The goal of Intelligence is to surface the specific technical reasons a company cannot be a Skillable customer — before we spend a single dollar marketing to them.</w:t>
-      </w:r>
-    </w:p>
-    <w:p>
-      <w:pPr>
-        <w:spacing w:before="0" w:after="60"/>
-      </w:pPr>
-      <w:r>
-        <w:rPr>
-          <w:rFonts w:ascii="Calibri" w:hAnsi="Calibri"/>
-          <w:b w:val="0"/>
-          <w:i w:val="0"/>
-          <w:color w:val="1A1A1A"/>
-          <w:sz w:val="20"/>
-        </w:rPr>
-        <w:t>Workday is the clearest illustration. On every traditional marketing signal, Workday looks like an ideal prospect: world-class training organization, deep content ecosystem, strong technical enablement culture, massive install base. Gate 3 passes with distinction. Gate 2 passes too — configuring Workday HCM or Financials is genuinely complex. Workday’s own content teams wanted to build labs.</w:t>
-      </w:r>
-    </w:p>
-    <w:p>
-      <w:pPr>
-        <w:spacing w:before="0" w:after="60"/>
-      </w:pPr>
-      <w:r>
-        <w:rPr>
-          <w:rFonts w:ascii="Calibri" w:hAnsi="Calibri"/>
-          <w:b w:val="0"/>
-          <w:i w:val="0"/>
-          <w:color w:val="1A1A1A"/>
-          <w:sz w:val="20"/>
-        </w:rPr>
-        <w:t>Gate 1 is where the analysis ends. The specific technical reasons are articulable and discoverable from public documentation:</w:t>
+        <w:t>The Workday pattern illustrates what happens when this analysis does not happen early. On every traditional marketing signal, Workday is an ideal prospect: world-class training organization, dedicated learning division, deep technical enablement culture, massive install base. Two of the three dimensions are strong. The third ends the conversation.</w:t>
       </w:r>
     </w:p>
     <w:p>
@@ -624,7 +394,7 @@
           <w:color w:val="1A1A1A"/>
           <w:sz w:val="20"/>
         </w:rPr>
-        <w:t>every Workday customer shares the same cloud environment. There is no Workday instance to give a learner. The product is architecturally incapable of per-learner isolation.</w:t>
+        <w:t>every customer shares the same cloud environment. There is no Workday instance to give a learner. The product is architecturally incapable of per-learner isolation.</w:t>
       </w:r>
     </w:p>
     <w:p>
@@ -656,7 +426,7 @@
     <w:p>
       <w:pPr>
         <w:pStyle w:val="ListBullet"/>
-        <w:spacing w:before="0" w:after="40"/>
+        <w:spacing w:before="0" w:after="60"/>
       </w:pPr>
       <w:r>
         <w:rPr>
@@ -676,7 +446,7 @@
           <w:color w:val="1A1A1A"/>
           <w:sz w:val="20"/>
         </w:rPr>
-        <w:t>nothing to install, nothing to containerize, nothing to slice. The product lives entirely in Workday’s cloud and cannot be replicated outside it.</w:t>
+        <w:t>nothing to install, containerize, or slice.</w:t>
       </w:r>
     </w:p>
     <w:p>
@@ -691,7 +461,7 @@
           <w:color w:val="1A1A1A"/>
           <w:sz w:val="20"/>
         </w:rPr>
-        <w:t>These are not hunches. They are specific, technical facts — findable in public documentation before a single sales conversation begins.</w:t>
+        <w:t>That fact is findable in public documentation before a single sales conversation begins. Workday was not a bad lead. It was motivated, capable people who invested significant time before hitting a wall that was always there. The Workday pattern repeats whenever product-level technical fit is evaluated late — or not at all.</w:t>
       </w:r>
     </w:p>
     <w:p>
@@ -706,162 +476,8 @@
           <w:color w:val="1A1A1A"/>
           <w:sz w:val="20"/>
         </w:rPr>
-        <w:t>The most important version of this story: Workday wasn’t a bad lead. It was motivated, capable people inside a well-run organization who invested significant time before hitting a wall that was always there — because Gate 1 was never evaluated before the pursuit began.</w:t>
+        <w:t>The same logic runs in the other direction. When Fortinet is a strong fit, it is not because Fortinet resembles other good customers as a company. It is because Fortinet’s products have specific technical characteristics — multi-VM topology, deep administrative workflows, strong API surface, real consequence of misconfiguration — that make them ideal for hands-on labs. Every company selling products with those same characteristics is a strong fit for the same reasons. The competitive map of a strong-fit customer is a pre-qualified prospect list.</w:t>
       </w:r>
-    </w:p>
-    <w:p>
-      <w:pPr>
-        <w:spacing w:before="0" w:after="60"/>
-      </w:pPr>
-      <w:r>
-        <w:rPr>
-          <w:rFonts w:ascii="Calibri" w:hAnsi="Calibri"/>
-          <w:b/>
-          <w:i w:val="0"/>
-          <w:color w:val="1A1A1A"/>
-          <w:sz w:val="20"/>
-        </w:rPr>
-        <w:t xml:space="preserve">Products that work like Workday are not a fit — and Intelligence surfaces that before any marketing motion begins. </w:t>
-      </w:r>
-      <w:r>
-        <w:rPr>
-          <w:rFonts w:ascii="Calibri" w:hAnsi="Calibri"/>
-          <w:b w:val="0"/>
-          <w:i w:val="0"/>
-          <w:color w:val="1A1A1A"/>
-          <w:sz w:val="20"/>
-        </w:rPr>
-        <w:t>The HubSpot verdict is Do Not Pursue — with the specific technical reasons documented on the Company record so any seller or marketer who asks gets a clear, defensible answer.</w:t>
-      </w:r>
-    </w:p>
-    <w:p>
-      <w:pPr>
-        <w:spacing w:before="50" w:after="0"/>
-      </w:pPr>
-    </w:p>
-    <w:tbl>
-      <w:tblPr>
-        <w:tblW w:type="auto" w:w="0"/>
-        <w:tblLook w:firstColumn="1" w:firstRow="1" w:lastColumn="0" w:lastRow="0" w:noHBand="0" w:noVBand="1" w:val="04A0"/>
-        <w:tblBorders>
-          <w:top w:val="none"/>
-          <w:left w:val="none"/>
-          <w:bottom w:val="none"/>
-          <w:right w:val="none"/>
-          <w:insideH w:val="none"/>
-          <w:insideV w:val="none"/>
-        </w:tblBorders>
-      </w:tblPr>
-      <w:tblGrid>
-        <w:gridCol w:w="4896"/>
-        <w:gridCol w:w="4896"/>
-      </w:tblGrid>
-      <w:tr>
-        <w:tc>
-          <w:tcPr>
-            <w:tcW w:type="dxa" w:w="4896"/>
-            <w:shd w:val="clear" w:color="auto" w:fill="F0E8FF"/>
-            <w:tcW w:w="504" w:type="dxa"/>
-            <w:tcBorders>
-              <w:left w:val="single" w:sz="18" w:space="0" w:color="7000FF"/>
-            </w:tcBorders>
-            <w:tcMar>
-              <w:top w:w="60" w:type="dxa"/>
-              <w:left w:w="60" w:type="dxa"/>
-              <w:bottom w:w="60" w:type="dxa"/>
-              <w:right w:w="60" w:type="dxa"/>
-            </w:tcMar>
-          </w:tcPr>
-          <w:p>
-            <w:pPr>
-              <w:jc w:val="center"/>
-              <w:spacing w:before="20" w:after="0"/>
-            </w:pPr>
-            <w:r>
-              <w:drawing>
-                <wp:inline xmlns:a="http://schemas.openxmlformats.org/drawingml/2006/main" xmlns:pic="http://schemas.openxmlformats.org/drawingml/2006/picture">
-                  <wp:extent cx="237744" cy="237744"/>
-                  <wp:docPr id="3" name="Picture 3"/>
-                  <wp:cNvGraphicFramePr>
-                    <a:graphicFrameLocks noChangeAspect="1"/>
-                  </wp:cNvGraphicFramePr>
-                  <a:graphic>
-                    <a:graphicData uri="http://schemas.openxmlformats.org/drawingml/2006/picture">
-                      <pic:pic>
-                        <pic:nvPicPr>
-                          <pic:cNvPr id="0" name="ai-moment-icon.png"/>
-                          <pic:cNvPicPr/>
-                        </pic:nvPicPr>
-                        <pic:blipFill>
-                          <a:blip r:embed="rId11"/>
-                          <a:stretch>
-                            <a:fillRect/>
-                          </a:stretch>
-                        </pic:blipFill>
-                        <pic:spPr>
-                          <a:xfrm>
-                            <a:off x="0" y="0"/>
-                            <a:ext cx="237744" cy="237744"/>
-                          </a:xfrm>
-                          <a:prstGeom prst="rect"/>
-                        </pic:spPr>
-                      </pic:pic>
-                    </a:graphicData>
-                  </a:graphic>
-                </wp:inline>
-              </w:drawing>
-            </w:r>
-          </w:p>
-        </w:tc>
-        <w:tc>
-          <w:tcPr>
-            <w:tcW w:type="dxa" w:w="4896"/>
-            <w:shd w:val="clear" w:color="auto" w:fill="F0E8FF"/>
-            <w:tcW w:w="9288" w:type="dxa"/>
-            <w:tcMar>
-              <w:top w:w="80" w:type="dxa"/>
-              <w:left w:w="80" w:type="dxa"/>
-              <w:bottom w:w="80" w:type="dxa"/>
-              <w:right w:w="80" w:type="dxa"/>
-            </w:tcMar>
-          </w:tcPr>
-          <w:p>
-            <w:pPr>
-              <w:spacing w:before="10" w:after="8"/>
-            </w:pPr>
-            <w:r>
-              <w:rPr>
-                <w:rFonts w:ascii="Calibri" w:hAnsi="Calibri"/>
-                <w:b/>
-                <w:i w:val="0"/>
-                <w:color w:val="7000FF"/>
-                <w:sz w:val="16"/>
-              </w:rPr>
-              <w:t>AI Moment</w:t>
-            </w:r>
-          </w:p>
-          <w:p>
-            <w:pPr>
-              <w:spacing w:before="0" w:after="10"/>
-            </w:pPr>
-            <w:r>
-              <w:rPr>
-                <w:rFonts w:ascii="Calibri" w:hAnsi="Calibri"/>
-                <w:b w:val="0"/>
-                <w:i/>
-                <w:color w:val="7000FF"/>
-                <w:sz w:val="19"/>
-              </w:rPr>
-              <w:t>Identifying that a product has no provisioning API, no deployment model, and pure multi-tenant architecture — from public documentation, before any human conversation — is not a filter. It is a research and reasoning task. The technical reasons a company cannot be a Skillable customer are documented before the first marketing dollar is spent.</w:t>
-            </w:r>
-          </w:p>
-        </w:tc>
-      </w:tr>
-    </w:tbl>
-    <w:p>
-      <w:pPr>
-        <w:spacing w:before="0" w:after="60"/>
-      </w:pPr>
     </w:p>
     <w:p>
       <w:pPr>
@@ -875,7 +491,7 @@
           <w:color w:val="136945"/>
           <w:sz w:val="22"/>
         </w:rPr>
-        <w:t>Lookalike Is Causation, Not Correlation</w:t>
+        <w:t>Revenue Challenge: Proving Labability and Lab Impact</w:t>
       </w:r>
     </w:p>
     <w:p>
@@ -890,7 +506,7 @@
           <w:color w:val="1A1A1A"/>
           <w:sz w:val="20"/>
         </w:rPr>
-        <w:t>Standard lookalike analysis finds companies that resemble existing customers — same size, same industry, same growth profile. That is firmographic correlation. It is useful, and it has limits.</w:t>
+        <w:t>Proving that a Skillable lab program will work for a specific customer’s products requires deep technical analysis. Which delivery path is right for this product — standard virtual machine, cloud environment slice, containerized workload, custom integration? What are the architectural constraints? What would a realistic program look like in terms of scope, seat time, and scoring approach? What is the estimated consumption potential?</w:t>
       </w:r>
     </w:p>
     <w:p>
@@ -905,7 +521,7 @@
           <w:color w:val="1A1A1A"/>
           <w:sz w:val="20"/>
         </w:rPr>
-        <w:t>For Skillable, lookalike analysis works differently — and more powerfully.</w:t>
+        <w:t>This is exactly the kind of work a skilled Solutions Engineer does well. It requires knowing Skillable’s platform deeply — delivery paths, technical constraints, feature availability, scoring feasibility — and applying that knowledge to a specific product’s architecture and deployment model. That synthesis takes hours per company, in a live conversation, with access to documentation and a customer contact who can fill in the gaps.</w:t>
       </w:r>
     </w:p>
     <w:p>
@@ -920,105 +536,22 @@
           <w:color w:val="1A1A1A"/>
           <w:sz w:val="20"/>
         </w:rPr>
-        <w:t>When Fortinet is a strong fit, it is not because Fortinet resembles other good customers as a company. It is because Fortinet’s products have specific technical characteristics — multi-VM topology, deep admin workflows, real consequence of error, strong API surface — that make them labable. Those characteristics are determined by what Fortinet sells, not by how large they are.</w:t>
+        <w:t>The result is that qualification depth is rationed. It flows to deals already far enough along to justify the time. Early-stage prospects get a general conversation. The technical questions that would surface a Workday pattern early — before marketing dollars are spent, before SE time is committed — often go unasked until it is too late.</w:t>
       </w:r>
     </w:p>
     <w:p>
       <w:pPr>
-        <w:spacing w:before="0" w:after="60"/>
+        <w:spacing w:before="100" w:after="30"/>
       </w:pPr>
       <w:r>
         <w:rPr>
           <w:rFonts w:ascii="Calibri" w:hAnsi="Calibri"/>
           <w:b/>
           <w:i w:val="0"/>
-          <w:color w:val="1A1A1A"/>
-          <w:sz w:val="20"/>
+          <w:color w:val="136945"/>
+          <w:sz w:val="22"/>
         </w:rPr>
-        <w:t>Every company selling products with those same technical characteristics is labable for the same reasons.</w:t>
-      </w:r>
-      <w:r>
-        <w:rPr>
-          <w:rFonts w:ascii="Calibri" w:hAnsi="Calibri"/>
-          <w:b w:val="0"/>
-          <w:i w:val="0"/>
-          <w:color w:val="1A1A1A"/>
-          <w:sz w:val="20"/>
-        </w:rPr>
-        <w:t xml:space="preserve"> The fit is not approximate. It transfers directly.</w:t>
-      </w:r>
-    </w:p>
-    <w:p>
-      <w:pPr>
-        <w:pStyle w:val="ListBullet"/>
-        <w:spacing w:before="0" w:after="40"/>
-      </w:pPr>
-      <w:r>
-        <w:rPr>
-          <w:rFonts w:ascii="Calibri" w:hAnsi="Calibri"/>
-          <w:b w:val="0"/>
-          <w:i w:val="0"/>
-          <w:color w:val="1A1A1A"/>
-          <w:sz w:val="20"/>
-        </w:rPr>
-        <w:t>A company selling network security products will almost always clear Gates 1 and 2 — for the same reasons Fortinet, Palo Alto, and Cisco do.</w:t>
-      </w:r>
-    </w:p>
-    <w:p>
-      <w:pPr>
-        <w:pStyle w:val="ListBullet"/>
-        <w:spacing w:before="0" w:after="40"/>
-      </w:pPr>
-      <w:r>
-        <w:rPr>
-          <w:rFonts w:ascii="Calibri" w:hAnsi="Calibri"/>
-          <w:b w:val="0"/>
-          <w:i w:val="0"/>
-          <w:color w:val="1A1A1A"/>
-          <w:sz w:val="20"/>
-        </w:rPr>
-        <w:t>A company selling SIEM, EDR, or identity management will almost always clear Gates 1 and 2 — for the same reasons CrowdStrike, Splunk, and SentinelOne do.</w:t>
-      </w:r>
-    </w:p>
-    <w:p>
-      <w:pPr>
-        <w:pStyle w:val="ListBullet"/>
-        <w:spacing w:before="0" w:after="40"/>
-      </w:pPr>
-      <w:r>
-        <w:rPr>
-          <w:rFonts w:ascii="Calibri" w:hAnsi="Calibri"/>
-          <w:b w:val="0"/>
-          <w:i w:val="0"/>
-          <w:color w:val="1A1A1A"/>
-          <w:sz w:val="20"/>
-        </w:rPr>
-        <w:t>A company selling data pipeline or ML infrastructure will almost always clear Gates 1 and 2 — for the same reasons Databricks, dbt Labs, and Snowflake do.</w:t>
-      </w:r>
-    </w:p>
-    <w:p>
-      <w:pPr>
-        <w:spacing w:before="0" w:after="60"/>
-      </w:pPr>
-      <w:r>
-        <w:rPr>
-          <w:rFonts w:ascii="Calibri" w:hAnsi="Calibri"/>
-          <w:b/>
-          <w:i w:val="0"/>
-          <w:color w:val="1A1A1A"/>
-          <w:sz w:val="20"/>
-        </w:rPr>
-        <w:t xml:space="preserve">The competitive map is the lookalike list. </w:t>
-      </w:r>
-      <w:r>
-        <w:rPr>
-          <w:rFonts w:ascii="Calibri" w:hAnsi="Calibri"/>
-          <w:b w:val="0"/>
-          <w:i w:val="0"/>
-          <w:color w:val="1A1A1A"/>
-          <w:sz w:val="20"/>
-        </w:rPr>
-        <w:t>Every time Intelligence analyzes a strong-fit customer, it surfaces that company’s direct competitors — pre-qualified lookalike candidates, identified automatically, without additional research. And it compounds: every new Skillable customer proves another product category.</w:t>
+        <w:t>ProServ &amp; Product Challenge: Enabling Bought-In Customers to Adopt Labs</w:t>
       </w:r>
     </w:p>
     <w:p>
@@ -1033,18 +566,13 @@
           <w:color w:val="1A1A1A"/>
           <w:sz w:val="20"/>
         </w:rPr>
-        <w:t xml:space="preserve">We are not looking for companies that look like our customers. </w:t>
+        <w:t>A signed contract is not an adopted customer. The gap between ‘we want to build labs’ and ‘we have a running program’ is wide, and most customers cannot cross it without structured guidance.</w:t>
       </w:r>
-      <w:r>
-        <w:rPr>
-          <w:rFonts w:ascii="Calibri" w:hAnsi="Calibri"/>
-          <w:b/>
-          <w:i w:val="0"/>
-          <w:color w:val="1A1A1A"/>
-          <w:sz w:val="20"/>
-        </w:rPr>
-        <w:t>We are looking for companies whose products behave like our customers’ products.</w:t>
-      </w:r>
+    </w:p>
+    <w:p>
+      <w:pPr>
+        <w:spacing w:before="0" w:after="60"/>
+      </w:pPr>
       <w:r>
         <w:rPr>
           <w:rFonts w:ascii="Calibri" w:hAnsi="Calibri"/>
@@ -1053,137 +581,23 @@
           <w:color w:val="1A1A1A"/>
           <w:sz w:val="20"/>
         </w:rPr>
-        <w:t xml:space="preserve"> That is a fundamentally more defensible, more precise, and more scalable approach to ICP targeting.</w:t>
+        <w:t>Program design is a specialized skill. Most buyers — even technically sophisticated ones with strong content teams — have never designed a hands-on lab curriculum. They have built documentation, recorded videos, written certification exams. They have not mapped a product’s administrative workflows to a sequence of learner activities, defined scoring logic for hands-on tasks, or produced a structured brief that a lab developer can build against without extensive back-and-forth.</w:t>
       </w:r>
     </w:p>
     <w:p>
       <w:pPr>
-        <w:spacing w:before="50" w:after="0"/>
-      </w:pPr>
-    </w:p>
-    <w:tbl>
-      <w:tblPr>
-        <w:tblW w:type="auto" w:w="0"/>
-        <w:tblLook w:firstColumn="1" w:firstRow="1" w:lastColumn="0" w:lastRow="0" w:noHBand="0" w:noVBand="1" w:val="04A0"/>
-        <w:tblBorders>
-          <w:top w:val="none"/>
-          <w:left w:val="none"/>
-          <w:bottom w:val="none"/>
-          <w:right w:val="none"/>
-          <w:insideH w:val="none"/>
-          <w:insideV w:val="none"/>
-        </w:tblBorders>
-      </w:tblPr>
-      <w:tblGrid>
-        <w:gridCol w:w="4896"/>
-        <w:gridCol w:w="4896"/>
-      </w:tblGrid>
-      <w:tr>
-        <w:tc>
-          <w:tcPr>
-            <w:tcW w:type="dxa" w:w="4896"/>
-            <w:shd w:val="clear" w:color="auto" w:fill="F0E8FF"/>
-            <w:tcW w:w="504" w:type="dxa"/>
-            <w:tcBorders>
-              <w:left w:val="single" w:sz="18" w:space="0" w:color="7000FF"/>
-            </w:tcBorders>
-            <w:tcMar>
-              <w:top w:w="60" w:type="dxa"/>
-              <w:left w:w="60" w:type="dxa"/>
-              <w:bottom w:w="60" w:type="dxa"/>
-              <w:right w:w="60" w:type="dxa"/>
-            </w:tcMar>
-          </w:tcPr>
-          <w:p>
-            <w:pPr>
-              <w:jc w:val="center"/>
-              <w:spacing w:before="20" w:after="0"/>
-            </w:pPr>
-            <w:r>
-              <w:drawing>
-                <wp:inline xmlns:a="http://schemas.openxmlformats.org/drawingml/2006/main" xmlns:pic="http://schemas.openxmlformats.org/drawingml/2006/picture">
-                  <wp:extent cx="237744" cy="237744"/>
-                  <wp:docPr id="4" name="Picture 4"/>
-                  <wp:cNvGraphicFramePr>
-                    <a:graphicFrameLocks noChangeAspect="1"/>
-                  </wp:cNvGraphicFramePr>
-                  <a:graphic>
-                    <a:graphicData uri="http://schemas.openxmlformats.org/drawingml/2006/picture">
-                      <pic:pic>
-                        <pic:nvPicPr>
-                          <pic:cNvPr id="0" name="ai-moment-icon.png"/>
-                          <pic:cNvPicPr/>
-                        </pic:nvPicPr>
-                        <pic:blipFill>
-                          <a:blip r:embed="rId11"/>
-                          <a:stretch>
-                            <a:fillRect/>
-                          </a:stretch>
-                        </pic:blipFill>
-                        <pic:spPr>
-                          <a:xfrm>
-                            <a:off x="0" y="0"/>
-                            <a:ext cx="237744" cy="237744"/>
-                          </a:xfrm>
-                          <a:prstGeom prst="rect"/>
-                        </pic:spPr>
-                      </pic:pic>
-                    </a:graphicData>
-                  </a:graphic>
-                </wp:inline>
-              </w:drawing>
-            </w:r>
-          </w:p>
-        </w:tc>
-        <w:tc>
-          <w:tcPr>
-            <w:tcW w:type="dxa" w:w="4896"/>
-            <w:shd w:val="clear" w:color="auto" w:fill="F0E8FF"/>
-            <w:tcW w:w="9288" w:type="dxa"/>
-            <w:tcMar>
-              <w:top w:w="80" w:type="dxa"/>
-              <w:left w:w="80" w:type="dxa"/>
-              <w:bottom w:w="80" w:type="dxa"/>
-              <w:right w:w="80" w:type="dxa"/>
-            </w:tcMar>
-          </w:tcPr>
-          <w:p>
-            <w:pPr>
-              <w:spacing w:before="10" w:after="8"/>
-            </w:pPr>
-            <w:r>
-              <w:rPr>
-                <w:rFonts w:ascii="Calibri" w:hAnsi="Calibri"/>
-                <w:b/>
-                <w:i w:val="0"/>
-                <w:color w:val="7000FF"/>
-                <w:sz w:val="16"/>
-              </w:rPr>
-              <w:t>AI Moment</w:t>
-            </w:r>
-          </w:p>
-          <w:p>
-            <w:pPr>
-              <w:spacing w:before="0" w:after="10"/>
-            </w:pPr>
-            <w:r>
-              <w:rPr>
-                <w:rFonts w:ascii="Calibri" w:hAnsi="Calibri"/>
-                <w:b w:val="0"/>
-                <w:i/>
-                <w:color w:val="7000FF"/>
-                <w:sz w:val="19"/>
-              </w:rPr>
-              <w:t>Finding companies whose products behave like known strong-fit customers requires understanding what makes a product technically orchestrable and applying that reasoning across the internet. The competitive map of every analyzed customer becomes an automatically updated list of pre-qualified lookalike candidates — identified without additional research, compounding with every new customer.</w:t>
-            </w:r>
-          </w:p>
-        </w:tc>
-      </w:tr>
-    </w:tbl>
-    <w:p>
-      <w:pPr>
         <w:spacing w:before="0" w:after="60"/>
       </w:pPr>
+      <w:r>
+        <w:rPr>
+          <w:rFonts w:ascii="Calibri" w:hAnsi="Calibri"/>
+          <w:b w:val="0"/>
+          <w:i w:val="0"/>
+          <w:color w:val="1A1A1A"/>
+          <w:sz w:val="20"/>
+        </w:rPr>
+        <w:t>Without a process that takes them from goals and audience to a complete, buildable program architecture, customers stall at the design phase. In a consumption model, a stalled customer is not just a missed upsell opportunity — it is a churn risk. A customer who has not built a program has not realized value. A customer who has not realized value does not renew.</w:t>
+      </w:r>
     </w:p>
     <w:p>
       <w:pPr>
@@ -1205,7 +619,22 @@
           <w:color w:val="136945"/>
           <w:sz w:val="26"/>
         </w:rPr>
-        <w:t>WHAT — The Intelligence Platform</w:t>
+        <w:t>Three Tools. One Platform.</w:t>
+      </w:r>
+    </w:p>
+    <w:p>
+      <w:pPr>
+        <w:spacing w:before="0" w:after="60"/>
+      </w:pPr>
+      <w:r>
+        <w:rPr>
+          <w:rFonts w:ascii="Calibri" w:hAnsi="Calibri"/>
+          <w:b w:val="0"/>
+          <w:i w:val="0"/>
+          <w:color w:val="1A1A1A"/>
+          <w:sz w:val="20"/>
+        </w:rPr>
+        <w:t>Each tool in Skillable Intelligence addresses one of the three challenges directly. All three share the same research and scoring engine — which means every analysis makes the entire platform smarter. A company Prospector evaluates is available to Inspector without re-running research. An Inspector analysis seeds Designer with the product context it needs from day one. The intelligence compounds with every use.</w:t>
       </w:r>
     </w:p>
     <w:p>
@@ -1220,7 +649,7 @@
           <w:color w:val="136945"/>
           <w:sz w:val="22"/>
         </w:rPr>
-        <w:t>Three Tools, One Intelligence Layer</w:t>
+        <w:t>Designer — Closing the Adoption Gap</w:t>
       </w:r>
     </w:p>
     <w:p>
@@ -1235,47 +664,7 @@
           <w:color w:val="1A1A1A"/>
           <w:sz w:val="20"/>
         </w:rPr>
-        <w:t>Skillable Intelligence is a platform of three connected tools — Prospector, Inspector, and Designer — all powered by a shared research and scoring engine. The intelligence layer accumulates, stores, and maintains company and product knowledge. Each tool contextualizes that intelligence for a specific person doing a specific job.</w:t>
-      </w:r>
-    </w:p>
-    <w:p>
-      <w:pPr>
-        <w:spacing w:before="0" w:after="60"/>
-      </w:pPr>
-      <w:r>
-        <w:rPr>
-          <w:rFonts w:ascii="Calibri" w:hAnsi="Calibri"/>
-          <w:b/>
-          <w:i w:val="0"/>
-          <w:color w:val="1A1A1A"/>
-          <w:sz w:val="20"/>
-        </w:rPr>
-        <w:t xml:space="preserve">Improving the intelligence layer improves all three tools simultaneously. </w:t>
-      </w:r>
-      <w:r>
-        <w:rPr>
-          <w:rFonts w:ascii="Calibri" w:hAnsi="Calibri"/>
-          <w:b w:val="0"/>
-          <w:i w:val="0"/>
-          <w:color w:val="1A1A1A"/>
-          <w:sz w:val="20"/>
-        </w:rPr>
-        <w:t>Every research improvement makes Prospector rankings more accurate, Inspector analyses more complete, and Designer recommendations more specific — at the same time. The platform gets smarter with every analysis, and every tool benefits.</w:t>
-      </w:r>
-    </w:p>
-    <w:p>
-      <w:pPr>
-        <w:spacing w:before="100" w:after="30"/>
-      </w:pPr>
-      <w:r>
-        <w:rPr>
-          <w:rFonts w:ascii="Calibri" w:hAnsi="Calibri"/>
-          <w:b/>
-          <w:i w:val="0"/>
-          <w:color w:val="136945"/>
-          <w:sz w:val="22"/>
-        </w:rPr>
-        <w:t>Prospector — ICP Outbound at Scale</w:t>
+        <w:t>Designer takes an Inspector analysis and guides program owners, instructional designers, and subject matter experts through the full process of designing a lab program. From goals and audience definition through a complete approved outline, activity-level content, and a Skillable Studio-ready export package.</w:t>
       </w:r>
     </w:p>
     <w:p>
@@ -1290,7 +679,79 @@
           <w:color w:val="1A1A1A"/>
           <w:sz w:val="20"/>
         </w:rPr>
-        <w:t>Prospector is the go-to-market tool for Marketing and RevOps. It takes a list of companies and returns a ranked assessment of how well each one fits Skillable’s ICP — with product-level evidence, composite scores, verdicts, delivery path signals, and key contacts for every company on the list.</w:t>
+        <w:t>The process is structured. It does not require the customer to know how to design a lab program — that is the point. Designer asks the right questions, sequences the decisions correctly, and generates a complete program architecture that a contracted lab developer can build against immediately.</w:t>
+      </w:r>
+    </w:p>
+    <w:p>
+      <w:pPr>
+        <w:spacing w:before="0" w:after="60"/>
+      </w:pPr>
+      <w:r>
+        <w:rPr>
+          <w:rFonts w:ascii="Calibri" w:hAnsi="Calibri"/>
+          <w:color w:val="1A1A1A"/>
+          <w:sz w:val="20"/>
+        </w:rPr>
+        <w:t xml:space="preserve">The output is not just a plan. Designer generates a </w:t>
+      </w:r>
+      <w:r>
+        <w:rPr>
+          <w:rFonts w:ascii="Calibri" w:hAnsi="Calibri"/>
+          <w:color w:val="7000FF"/>
+          <w:sz w:val="20"/>
+        </w:rPr>
+        <w:t>complete Bill of Materials</w:t>
+      </w:r>
+      <w:r>
+        <w:rPr>
+          <w:rFonts w:ascii="Calibri" w:hAnsi="Calibri"/>
+          <w:color w:val="1A1A1A"/>
+          <w:sz w:val="20"/>
+        </w:rPr>
+        <w:t xml:space="preserve"> from everything it knows about the program and the product: environment templates, PowerShell and Bash scripts, Bicep and CloudFormation templates, lifecycle action scripts, credential pool configuration, scoring validation stubs. What previously required hours of Solutions Engineering and lab developer work is produced in the same session where the program was designed.</w:t>
+      </w:r>
+      <w:r>
+        <w:drawing>
+          <wp:anchor distT="0" distB="0" distL="114300" distR="114300" simplePos="0" relativeHeight="251658240" behindDoc="0" locked="0" layoutInCell="1" allowOverlap="1">
+            <wp:simplePos x="0" y="0"/>
+            <wp:positionH relativeFrom="page">
+              <wp:posOffset>7068312</wp:posOffset>
+            </wp:positionH>
+            <wp:positionV relativeFrom="paragraph">
+              <wp:posOffset>9144</wp:posOffset>
+            </wp:positionV>
+            <wp:extent cx="164592" cy="164592"/>
+            <wp:effectExtent l="0" t="0" r="0" b="0"/>
+            <wp:wrapNone/>
+            <wp:docPr id="1" name="Picture 1"/>
+            <wp:cNvGraphicFramePr xmlns:a="http://schemas.openxmlformats.org/drawingml/2006/main">
+              <a:graphicFrameLocks noChangeAspect="1"/>
+            </wp:cNvGraphicFramePr>
+            <a:graphic xmlns:a="http://schemas.openxmlformats.org/drawingml/2006/main" xmlns:pic="http://schemas.openxmlformats.org/drawingml/2006/picture">
+              <a:graphicData uri="http://schemas.openxmlformats.org/drawingml/2006/picture">
+                <pic:pic>
+                  <pic:nvPicPr>
+                    <pic:cNvPr id="0" name="ai-moment-icon.png"/>
+                    <pic:cNvPicPr/>
+                  </pic:nvPicPr>
+                  <pic:blipFill>
+                    <a:blip r:embed="rId11"/>
+                    <a:stretch>
+                      <a:fillRect/>
+                    </a:stretch>
+                  </pic:blipFill>
+                  <pic:spPr>
+                    <a:xfrm>
+                      <a:off x="0" y="0"/>
+                      <a:ext cx="164592" cy="164592"/>
+                    </a:xfrm>
+                    <a:prstGeom prst="rect"/>
+                  </pic:spPr>
+                </pic:pic>
+              </a:graphicData>
+            </a:graphic>
+          </wp:anchor>
+        </w:drawing>
       </w:r>
     </w:p>
     <w:p>
@@ -1315,22 +776,7 @@
           <w:color w:val="1A1A1A"/>
           <w:sz w:val="20"/>
         </w:rPr>
-        <w:t>Marketing has never had access to product-level qualification data at the point of list building. Prospector makes it possible to screen a ZoomInfo export of 500 companies for Gate 1/2/3 compatibility before a sequence is written, a dollar is spent, or an SDR makes a call. Companies that clear all three gates go into outreach. The Workday patterns come off the list — with documented reasons.</w:t>
-      </w:r>
-    </w:p>
-    <w:p>
-      <w:pPr>
-        <w:spacing w:before="0" w:after="60"/>
-      </w:pPr>
-      <w:r>
-        <w:rPr>
-          <w:rFonts w:ascii="Calibri" w:hAnsi="Calibri"/>
-          <w:b w:val="0"/>
-          <w:i w:val="0"/>
-          <w:color w:val="1A1A1A"/>
-          <w:sz w:val="20"/>
-        </w:rPr>
-        <w:t>Prospector also surfaces customer expansion opportunities — mapping the department landscape of existing accounts to identify adoption opportunities for existing labs, greenfield departments, and existing buyers ready to expand.</w:t>
+        <w:t>Every new customer engagement starts with Designer in the first week — before the technical environment is ready. Program design and environment build run as parallel workstreams. Day one is productive for the program owner. The adoption gap closes before it has a chance to form.</w:t>
       </w:r>
     </w:p>
     <w:p>
@@ -1345,7 +791,7 @@
           <w:color w:val="136945"/>
           <w:sz w:val="22"/>
         </w:rPr>
-        <w:t>Inspector — Deep Analysis for Sellers and SEs</w:t>
+        <w:t>Inspector — Proving Labability and Impact</w:t>
       </w:r>
     </w:p>
     <w:p>
@@ -1386,13 +832,13 @@
           <w:color w:val="1A1A1A"/>
           <w:sz w:val="20"/>
         </w:rPr>
-        <w:t>A broad scan that surfaces all of the company’s products, ranked by labability, with competitive pairings, company-level signals, and an overall fit score. The foundation document for any seller or SE entering a conversation with this account. Also the output of Prospector’s Customer Expansion pass — the same research, stored once per company, shared across both tools.</w:t>
+        <w:t>A broad scan that surfaces all of a company’s products, ranked by labability, with competitive pairings, company-level signals, and an overall fit score. The foundation document for any seller or SE entering a conversation with this account.</w:t>
       </w:r>
     </w:p>
     <w:p>
       <w:pPr>
         <w:pStyle w:val="ListBullet"/>
-        <w:spacing w:before="0" w:after="40"/>
+        <w:spacing w:before="0" w:after="60"/>
       </w:pPr>
       <w:r>
         <w:rPr>
@@ -1412,151 +858,71 @@
           <w:color w:val="1A1A1A"/>
           <w:sz w:val="20"/>
         </w:rPr>
-        <w:t>The seller or SE selects three to four products from Stage 1 for exhaustive analysis — full Gate 1/2/3 evidence, delivery path recommendation with rationale, scoring approach, consumption potential estimate, and program scope. This is the document that goes into a deal conversation.</w:t>
+        <w:t>The seller or SE selects three to four products from Stage 1 for exhaustive analysis — full technical orchestrability evidence, delivery path recommendation with rationale, scoring approach, consumption potential estimate, and program scope.</w:t>
       </w:r>
     </w:p>
     <w:p>
       <w:pPr>
-        <w:spacing w:before="50" w:after="0"/>
-      </w:pPr>
-    </w:p>
-    <w:tbl>
-      <w:tblPr>
-        <w:tblW w:type="auto" w:w="0"/>
-        <w:tblLook w:firstColumn="1" w:firstRow="1" w:lastColumn="0" w:lastRow="0" w:noHBand="0" w:noVBand="1" w:val="04A0"/>
-        <w:tblBorders>
-          <w:top w:val="none"/>
-          <w:left w:val="none"/>
-          <w:bottom w:val="none"/>
-          <w:right w:val="none"/>
-          <w:insideH w:val="none"/>
-          <w:insideV w:val="none"/>
-        </w:tblBorders>
-      </w:tblPr>
-      <w:tblGrid>
-        <w:gridCol w:w="4896"/>
-        <w:gridCol w:w="4896"/>
-      </w:tblGrid>
-      <w:tr>
-        <w:tc>
-          <w:tcPr>
-            <w:tcW w:type="dxa" w:w="4896"/>
-            <w:shd w:val="clear" w:color="auto" w:fill="F0E8FF"/>
-            <w:tcW w:w="504" w:type="dxa"/>
-            <w:tcBorders>
-              <w:left w:val="single" w:sz="18" w:space="0" w:color="7000FF"/>
-            </w:tcBorders>
-            <w:tcMar>
-              <w:top w:w="60" w:type="dxa"/>
-              <w:left w:w="60" w:type="dxa"/>
-              <w:bottom w:w="60" w:type="dxa"/>
-              <w:right w:w="60" w:type="dxa"/>
-            </w:tcMar>
-          </w:tcPr>
-          <w:p>
-            <w:pPr>
-              <w:jc w:val="center"/>
-              <w:spacing w:before="20" w:after="0"/>
-            </w:pPr>
-            <w:r>
-              <w:drawing>
-                <wp:inline xmlns:a="http://schemas.openxmlformats.org/drawingml/2006/main" xmlns:pic="http://schemas.openxmlformats.org/drawingml/2006/picture">
-                  <wp:extent cx="237744" cy="237744"/>
-                  <wp:docPr id="5" name="Picture 5"/>
-                  <wp:cNvGraphicFramePr>
-                    <a:graphicFrameLocks noChangeAspect="1"/>
-                  </wp:cNvGraphicFramePr>
-                  <a:graphic>
-                    <a:graphicData uri="http://schemas.openxmlformats.org/drawingml/2006/picture">
-                      <pic:pic>
-                        <pic:nvPicPr>
-                          <pic:cNvPr id="0" name="ai-moment-icon.png"/>
-                          <pic:cNvPicPr/>
-                        </pic:nvPicPr>
-                        <pic:blipFill>
-                          <a:blip r:embed="rId11"/>
-                          <a:stretch>
-                            <a:fillRect/>
-                          </a:stretch>
-                        </pic:blipFill>
-                        <pic:spPr>
-                          <a:xfrm>
-                            <a:off x="0" y="0"/>
-                            <a:ext cx="237744" cy="237744"/>
-                          </a:xfrm>
-                          <a:prstGeom prst="rect"/>
-                        </pic:spPr>
-                      </pic:pic>
-                    </a:graphicData>
-                  </a:graphic>
-                </wp:inline>
-              </w:drawing>
-            </w:r>
-          </w:p>
-        </w:tc>
-        <w:tc>
-          <w:tcPr>
-            <w:tcW w:type="dxa" w:w="4896"/>
-            <w:shd w:val="clear" w:color="auto" w:fill="F0E8FF"/>
-            <w:tcW w:w="9288" w:type="dxa"/>
-            <w:tcMar>
-              <w:top w:w="80" w:type="dxa"/>
-              <w:left w:w="80" w:type="dxa"/>
-              <w:bottom w:w="80" w:type="dxa"/>
-              <w:right w:w="80" w:type="dxa"/>
-            </w:tcMar>
-          </w:tcPr>
-          <w:p>
-            <w:pPr>
-              <w:spacing w:before="10" w:after="8"/>
-            </w:pPr>
-            <w:r>
-              <w:rPr>
-                <w:rFonts w:ascii="Calibri" w:hAnsi="Calibri"/>
-                <w:b/>
-                <w:i w:val="0"/>
-                <w:color w:val="7000FF"/>
-                <w:sz w:val="16"/>
-              </w:rPr>
-              <w:t>AI Moment</w:t>
-            </w:r>
-          </w:p>
-          <w:p>
-            <w:pPr>
-              <w:spacing w:before="0" w:after="10"/>
-            </w:pPr>
-            <w:r>
-              <w:rPr>
-                <w:rFonts w:ascii="Calibri" w:hAnsi="Calibri"/>
-                <w:b w:val="0"/>
-                <w:i/>
-                <w:color w:val="7000FF"/>
-                <w:sz w:val="19"/>
-              </w:rPr>
-              <w:t>A seller walking into a conversation with a Stage 2 Inspector report knows what the customer’s products can and cannot do on the Skillable platform, which delivery path makes sense and why, and what the estimated consumption potential is. That is not a discovery conversation — it is a solution conversation. A level of pre-call preparation that was previously impossible at scale is now standard.</w:t>
-            </w:r>
-          </w:p>
-        </w:tc>
-      </w:tr>
-    </w:tbl>
-    <w:p>
-      <w:pPr>
         <w:spacing w:before="0" w:after="60"/>
-      </w:pPr>
-    </w:p>
-    <w:p>
-      <w:pPr>
-        <w:spacing w:before="100" w:after="30"/>
       </w:pPr>
       <w:r>
         <w:rPr>
           <w:rFonts w:ascii="Calibri" w:hAnsi="Calibri"/>
-          <w:b/>
-          <w:i w:val="0"/>
-          <w:color w:val="136945"/>
-          <w:sz w:val="22"/>
+          <w:color w:val="1A1A1A"/>
+          <w:sz w:val="20"/>
         </w:rPr>
-        <w:t>Designer — From Analysis to Program</w:t>
+        <w:t xml:space="preserve">A seller walking into a conversation with a Stage 2 Inspector report knows what the customer’s products can and cannot do on the Skillable platform, which delivery path makes sense and why, and what the estimated consumption potential is. That is not a discovery conversation. It is a </w:t>
+      </w:r>
+      <w:r>
+        <w:rPr>
+          <w:rFonts w:ascii="Calibri" w:hAnsi="Calibri"/>
+          <w:color w:val="7000FF"/>
+          <w:sz w:val="20"/>
+        </w:rPr>
+        <w:t>solution conversation.</w:t>
+      </w:r>
+      <w:r>
+        <w:drawing>
+          <wp:anchor distT="0" distB="0" distL="114300" distR="114300" simplePos="0" relativeHeight="251658240" behindDoc="0" locked="0" layoutInCell="1" allowOverlap="1">
+            <wp:simplePos x="0" y="0"/>
+            <wp:positionH relativeFrom="page">
+              <wp:posOffset>7068312</wp:posOffset>
+            </wp:positionH>
+            <wp:positionV relativeFrom="paragraph">
+              <wp:posOffset>9144</wp:posOffset>
+            </wp:positionV>
+            <wp:extent cx="164592" cy="164592"/>
+            <wp:effectExtent l="0" t="0" r="0" b="0"/>
+            <wp:wrapNone/>
+            <wp:docPr id="2" name="Picture 2"/>
+            <wp:cNvGraphicFramePr xmlns:a="http://schemas.openxmlformats.org/drawingml/2006/main">
+              <a:graphicFrameLocks noChangeAspect="1"/>
+            </wp:cNvGraphicFramePr>
+            <a:graphic xmlns:a="http://schemas.openxmlformats.org/drawingml/2006/main" xmlns:pic="http://schemas.openxmlformats.org/drawingml/2006/picture">
+              <a:graphicData uri="http://schemas.openxmlformats.org/drawingml/2006/picture">
+                <pic:pic>
+                  <pic:nvPicPr>
+                    <pic:cNvPr id="0" name="ai-moment-icon.png"/>
+                    <pic:cNvPicPr/>
+                  </pic:nvPicPr>
+                  <pic:blipFill>
+                    <a:blip r:embed="rId11"/>
+                    <a:stretch>
+                      <a:fillRect/>
+                    </a:stretch>
+                  </pic:blipFill>
+                  <pic:spPr>
+                    <a:xfrm>
+                      <a:off x="0" y="0"/>
+                      <a:ext cx="164592" cy="164592"/>
+                    </a:xfrm>
+                    <a:prstGeom prst="rect"/>
+                  </pic:spPr>
+                </pic:pic>
+              </a:graphicData>
+            </a:graphic>
+          </wp:anchor>
+        </w:drawing>
       </w:r>
     </w:p>
     <w:p>
@@ -1571,7 +937,7 @@
           <w:color w:val="1A1A1A"/>
           <w:sz w:val="20"/>
         </w:rPr>
-        <w:t>Designer takes Inspector’s output and guides program owners, instructional designers, and subject matter experts through the full process of designing a lab program — from goals and audience through a complete approved outline, draft instructions, and a Skillable Studio-ready export package.</w:t>
+        <w:t>Inspector also surfaces the competitive map for every analyzed company — which feeds directly into Prospector’s lookalike targeting.</w:t>
       </w:r>
     </w:p>
     <w:p>
@@ -1596,137 +962,150 @@
           <w:color w:val="1A1A1A"/>
           <w:sz w:val="20"/>
         </w:rPr>
-        <w:t>Customers who don’t know how to design a lab program won’t build one. And if they don’t build one, they don’t adopt Skillable. Designer is the adoption engine — the tool that gives a new customer something concrete to do on day one, before the technical environment is ready, and produces a complete program architecture that a contracted lab developer can build against immediately.</w:t>
+        <w:t>Pre-call preparation that was previously impossible at scale is now standard. Every seller and SE enters every conversation with the technical depth that used to require hours of individual research — applied automatically, to every product, before the first meeting.</w:t>
       </w:r>
     </w:p>
     <w:p>
       <w:pPr>
-        <w:spacing w:before="50" w:after="0"/>
+        <w:spacing w:before="100" w:after="30"/>
       </w:pPr>
+      <w:r>
+        <w:rPr>
+          <w:rFonts w:ascii="Calibri" w:hAnsi="Calibri"/>
+          <w:b/>
+          <w:i w:val="0"/>
+          <w:color w:val="136945"/>
+          <w:sz w:val="22"/>
+        </w:rPr>
+        <w:t>Prospector — Finding the Right Companies</w:t>
+      </w:r>
     </w:p>
-    <w:tbl>
-      <w:tblPr>
-        <w:tblW w:type="auto" w:w="0"/>
-        <w:tblLook w:firstColumn="1" w:firstRow="1" w:lastColumn="0" w:lastRow="0" w:noHBand="0" w:noVBand="1" w:val="04A0"/>
-        <w:tblBorders>
-          <w:top w:val="none"/>
-          <w:left w:val="none"/>
-          <w:bottom w:val="none"/>
-          <w:right w:val="none"/>
-          <w:insideH w:val="none"/>
-          <w:insideV w:val="none"/>
-        </w:tblBorders>
-      </w:tblPr>
-      <w:tblGrid>
-        <w:gridCol w:w="4896"/>
-        <w:gridCol w:w="4896"/>
-      </w:tblGrid>
-      <w:tr>
-        <w:tc>
-          <w:tcPr>
-            <w:tcW w:type="dxa" w:w="4896"/>
-            <w:shd w:val="clear" w:color="auto" w:fill="F0E8FF"/>
-            <w:tcW w:w="504" w:type="dxa"/>
-            <w:tcBorders>
-              <w:left w:val="single" w:sz="18" w:space="0" w:color="7000FF"/>
-            </w:tcBorders>
-            <w:tcMar>
-              <w:top w:w="60" w:type="dxa"/>
-              <w:left w:w="60" w:type="dxa"/>
-              <w:bottom w:w="60" w:type="dxa"/>
-              <w:right w:w="60" w:type="dxa"/>
-            </w:tcMar>
-          </w:tcPr>
-          <w:p>
-            <w:pPr>
-              <w:jc w:val="center"/>
-              <w:spacing w:before="20" w:after="0"/>
-            </w:pPr>
-            <w:r>
-              <w:drawing>
-                <wp:inline xmlns:a="http://schemas.openxmlformats.org/drawingml/2006/main" xmlns:pic="http://schemas.openxmlformats.org/drawingml/2006/picture">
-                  <wp:extent cx="237744" cy="237744"/>
-                  <wp:docPr id="6" name="Picture 6"/>
-                  <wp:cNvGraphicFramePr>
-                    <a:graphicFrameLocks noChangeAspect="1"/>
-                  </wp:cNvGraphicFramePr>
-                  <a:graphic>
-                    <a:graphicData uri="http://schemas.openxmlformats.org/drawingml/2006/picture">
-                      <pic:pic>
-                        <pic:nvPicPr>
-                          <pic:cNvPr id="0" name="ai-moment-icon.png"/>
-                          <pic:cNvPicPr/>
-                        </pic:nvPicPr>
-                        <pic:blipFill>
-                          <a:blip r:embed="rId11"/>
-                          <a:stretch>
-                            <a:fillRect/>
-                          </a:stretch>
-                        </pic:blipFill>
-                        <pic:spPr>
-                          <a:xfrm>
-                            <a:off x="0" y="0"/>
-                            <a:ext cx="237744" cy="237744"/>
-                          </a:xfrm>
-                          <a:prstGeom prst="rect"/>
-                        </pic:spPr>
-                      </pic:pic>
-                    </a:graphicData>
-                  </a:graphic>
-                </wp:inline>
-              </w:drawing>
-            </w:r>
-          </w:p>
-        </w:tc>
-        <w:tc>
-          <w:tcPr>
-            <w:tcW w:type="dxa" w:w="4896"/>
-            <w:shd w:val="clear" w:color="auto" w:fill="F0E8FF"/>
-            <w:tcW w:w="9288" w:type="dxa"/>
-            <w:tcMar>
-              <w:top w:w="80" w:type="dxa"/>
-              <w:left w:w="80" w:type="dxa"/>
-              <w:bottom w:w="80" w:type="dxa"/>
-              <w:right w:w="80" w:type="dxa"/>
-            </w:tcMar>
-          </w:tcPr>
-          <w:p>
-            <w:pPr>
-              <w:spacing w:before="10" w:after="8"/>
-            </w:pPr>
-            <w:r>
-              <w:rPr>
-                <w:rFonts w:ascii="Calibri" w:hAnsi="Calibri"/>
-                <w:b/>
-                <w:i w:val="0"/>
-                <w:color w:val="7000FF"/>
-                <w:sz w:val="16"/>
-              </w:rPr>
-              <w:t>AI Moment</w:t>
-            </w:r>
-          </w:p>
-          <w:p>
-            <w:pPr>
-              <w:spacing w:before="0" w:after="10"/>
-            </w:pPr>
-            <w:r>
-              <w:rPr>
-                <w:rFonts w:ascii="Calibri" w:hAnsi="Calibri"/>
-                <w:b w:val="0"/>
-                <w:i/>
-                <w:color w:val="7000FF"/>
-                <w:sz w:val="19"/>
-              </w:rPr>
-              <w:t>Designer generates a complete Bill of Materials — PowerShell scripts, Bicep templates, CloudFormation templates, lifecycle action scripts, credential pool configuration, scoring validation stubs — from everything it knows about the program. Hours of SE and lab developer work, generated in the same session where the program was designed.</w:t>
-            </w:r>
-          </w:p>
-        </w:tc>
-      </w:tr>
-    </w:tbl>
     <w:p>
       <w:pPr>
         <w:spacing w:before="0" w:after="60"/>
       </w:pPr>
+      <w:r>
+        <w:rPr>
+          <w:rFonts w:ascii="Calibri" w:hAnsi="Calibri"/>
+          <w:b w:val="0"/>
+          <w:i w:val="0"/>
+          <w:color w:val="1A1A1A"/>
+          <w:sz w:val="20"/>
+        </w:rPr>
+        <w:t>Prospector is the go-to-market tool for Marketing and RevOps. It takes a list of companies and returns a ranked assessment of ICP fit — with product-level evidence, composite scores, verdicts, delivery path signals, and key contacts for every company on the list.</w:t>
+      </w:r>
+    </w:p>
+    <w:p>
+      <w:pPr>
+        <w:spacing w:before="0" w:after="60"/>
+      </w:pPr>
+      <w:r>
+        <w:rPr>
+          <w:rFonts w:ascii="Calibri" w:hAnsi="Calibri"/>
+          <w:color w:val="1A1A1A"/>
+          <w:sz w:val="20"/>
+        </w:rPr>
+        <w:t xml:space="preserve">Marketing has never had access to </w:t>
+      </w:r>
+      <w:r>
+        <w:rPr>
+          <w:rFonts w:ascii="Calibri" w:hAnsi="Calibri"/>
+          <w:color w:val="7000FF"/>
+          <w:sz w:val="20"/>
+        </w:rPr>
+        <w:t>product-level qualification</w:t>
+      </w:r>
+      <w:r>
+        <w:rPr>
+          <w:rFonts w:ascii="Calibri" w:hAnsi="Calibri"/>
+          <w:color w:val="1A1A1A"/>
+          <w:sz w:val="20"/>
+        </w:rPr>
+        <w:t xml:space="preserve"> data at the point of list building. Prospector makes it possible to screen a ZoomInfo export of 500 companies for technical orchestrability, product complexity, and organizational readiness before a sequence is written, a dollar is spent, or an SDR makes a call. Companies that clear all three dimensions go into outreach. Workday patterns come off the list — with specific, documented technical reasons on the Company record.</w:t>
+      </w:r>
+      <w:r>
+        <w:drawing>
+          <wp:anchor distT="0" distB="0" distL="114300" distR="114300" simplePos="0" relativeHeight="251658240" behindDoc="0" locked="0" layoutInCell="1" allowOverlap="1">
+            <wp:simplePos x="0" y="0"/>
+            <wp:positionH relativeFrom="page">
+              <wp:posOffset>7068312</wp:posOffset>
+            </wp:positionH>
+            <wp:positionV relativeFrom="paragraph">
+              <wp:posOffset>9144</wp:posOffset>
+            </wp:positionV>
+            <wp:extent cx="164592" cy="164592"/>
+            <wp:effectExtent l="0" t="0" r="0" b="0"/>
+            <wp:wrapNone/>
+            <wp:docPr id="3" name="Picture 3"/>
+            <wp:cNvGraphicFramePr xmlns:a="http://schemas.openxmlformats.org/drawingml/2006/main">
+              <a:graphicFrameLocks noChangeAspect="1"/>
+            </wp:cNvGraphicFramePr>
+            <a:graphic xmlns:a="http://schemas.openxmlformats.org/drawingml/2006/main" xmlns:pic="http://schemas.openxmlformats.org/drawingml/2006/picture">
+              <a:graphicData uri="http://schemas.openxmlformats.org/drawingml/2006/picture">
+                <pic:pic>
+                  <pic:nvPicPr>
+                    <pic:cNvPr id="0" name="ai-moment-icon.png"/>
+                    <pic:cNvPicPr/>
+                  </pic:nvPicPr>
+                  <pic:blipFill>
+                    <a:blip r:embed="rId11"/>
+                    <a:stretch>
+                      <a:fillRect/>
+                    </a:stretch>
+                  </pic:blipFill>
+                  <pic:spPr>
+                    <a:xfrm>
+                      <a:off x="0" y="0"/>
+                      <a:ext cx="164592" cy="164592"/>
+                    </a:xfrm>
+                    <a:prstGeom prst="rect"/>
+                  </pic:spPr>
+                </pic:pic>
+              </a:graphicData>
+            </a:graphic>
+          </wp:anchor>
+        </w:drawing>
+      </w:r>
+    </w:p>
+    <w:p>
+      <w:pPr>
+        <w:spacing w:before="0" w:after="60"/>
+      </w:pPr>
+      <w:r>
+        <w:rPr>
+          <w:rFonts w:ascii="Calibri" w:hAnsi="Calibri"/>
+          <w:b w:val="0"/>
+          <w:i w:val="0"/>
+          <w:color w:val="1A1A1A"/>
+          <w:sz w:val="20"/>
+        </w:rPr>
+        <w:t>Prospector also surfaces customer expansion opportunities — mapping the department landscape of existing accounts to identify adoption opportunities for existing labs, greenfield departments, and buyers ready to expand.</w:t>
+      </w:r>
+    </w:p>
+    <w:p>
+      <w:pPr>
+        <w:spacing w:before="0" w:after="60"/>
+      </w:pPr>
+      <w:r>
+        <w:rPr>
+          <w:rFonts w:ascii="Calibri" w:hAnsi="Calibri"/>
+          <w:b/>
+          <w:i w:val="0"/>
+          <w:color w:val="1A1A1A"/>
+          <w:sz w:val="20"/>
+        </w:rPr>
+        <w:t xml:space="preserve">What it unlocks: </w:t>
+      </w:r>
+      <w:r>
+        <w:rPr>
+          <w:rFonts w:ascii="Calibri" w:hAnsi="Calibri"/>
+          <w:b w:val="0"/>
+          <w:i w:val="0"/>
+          <w:color w:val="1A1A1A"/>
+          <w:sz w:val="20"/>
+        </w:rPr>
+        <w:t>The list that goes into outreach is the right list. Every company on it has been evaluated on the question that actually determines Skillable fit — not on firmographic proxies that have nothing to do with whether their products can be orchestrated into a lab.</w:t>
+      </w:r>
     </w:p>
     <w:p>
       <w:pPr>
@@ -1748,7 +1127,7 @@
           <w:color w:val="136945"/>
           <w:sz w:val="26"/>
         </w:rPr>
-        <w:t>HOW — Integration with HubSpot and Revenue Operations</w:t>
+        <w:t>HubSpot and Revenue Operations</w:t>
       </w:r>
     </w:p>
     <w:p>
@@ -1798,21 +1177,6 @@
     </w:p>
     <w:p>
       <w:pPr>
-        <w:spacing w:before="0" w:after="60"/>
-      </w:pPr>
-      <w:r>
-        <w:rPr>
-          <w:rFonts w:ascii="Calibri" w:hAnsi="Calibri"/>
-          <w:b w:val="0"/>
-          <w:i w:val="0"/>
-          <w:color w:val="1A1A1A"/>
-          <w:sz w:val="20"/>
-        </w:rPr>
-        <w:t>The three Intelligence tools have distinct integration models. Understanding the difference matters for RevOps configuration and for setting expectations with each user audience.</w:t>
-      </w:r>
-    </w:p>
-    <w:p>
-      <w:pPr>
         <w:spacing w:before="100" w:after="30"/>
       </w:pPr>
       <w:r>
@@ -1838,7 +1202,7 @@
           <w:color w:val="1A1A1A"/>
           <w:sz w:val="20"/>
         </w:rPr>
-        <w:t>Marketing triggers Prospector from inside HubSpot — selecting a ZoomInfo list or defining ICP criteria and sending them to Prospector for analysis. Prospector writes enriched data back to HubSpot Company records, Contact records, and Deals. HubSpot is Prospector’s primary output destination.</w:t>
+        <w:t>Marketing triggers Prospector from inside HubSpot — selecting a ZoomInfo list or defining criteria and sending them to Prospector for analysis. Prospector writes enriched data back to HubSpot Company records, Contact records, and Deals. HubSpot is Prospector’s primary output destination.</w:t>
       </w:r>
     </w:p>
     <w:p>
@@ -1877,7 +1241,7 @@
               <w:bottom w:w="50" w:type="dxa"/>
               <w:right w:w="50" w:type="dxa"/>
             </w:tcMar>
-            <w:tcW w:w="4896" w:type="dxa"/>
+            <w:tcW w:w="2600" w:type="dxa"/>
           </w:tcPr>
           <w:p>
             <w:pPr>
@@ -1905,7 +1269,7 @@
               <w:bottom w:w="50" w:type="dxa"/>
               <w:right w:w="50" w:type="dxa"/>
             </w:tcMar>
-            <w:tcW w:w="4896" w:type="dxa"/>
+            <w:tcW w:w="7192" w:type="dxa"/>
           </w:tcPr>
           <w:p>
             <w:pPr>
@@ -1935,6 +1299,7 @@
               <w:bottom w:w="50" w:type="dxa"/>
               <w:right w:w="50" w:type="dxa"/>
             </w:tcMar>
+            <w:tcW w:w="2600" w:type="dxa"/>
           </w:tcPr>
           <w:p>
             <w:pPr>
@@ -1962,6 +1327,7 @@
               <w:bottom w:w="50" w:type="dxa"/>
               <w:right w:w="50" w:type="dxa"/>
             </w:tcMar>
+            <w:tcW w:w="7192" w:type="dxa"/>
           </w:tcPr>
           <w:p>
             <w:pPr>
@@ -1991,6 +1357,7 @@
               <w:bottom w:w="50" w:type="dxa"/>
               <w:right w:w="50" w:type="dxa"/>
             </w:tcMar>
+            <w:tcW w:w="2600" w:type="dxa"/>
           </w:tcPr>
           <w:p>
             <w:pPr>
@@ -2018,6 +1385,7 @@
               <w:bottom w:w="50" w:type="dxa"/>
               <w:right w:w="50" w:type="dxa"/>
             </w:tcMar>
+            <w:tcW w:w="7192" w:type="dxa"/>
           </w:tcPr>
           <w:p>
             <w:pPr>
@@ -2047,6 +1415,7 @@
               <w:bottom w:w="50" w:type="dxa"/>
               <w:right w:w="50" w:type="dxa"/>
             </w:tcMar>
+            <w:tcW w:w="2600" w:type="dxa"/>
           </w:tcPr>
           <w:p>
             <w:pPr>
@@ -2074,6 +1443,7 @@
               <w:bottom w:w="50" w:type="dxa"/>
               <w:right w:w="50" w:type="dxa"/>
             </w:tcMar>
+            <w:tcW w:w="7192" w:type="dxa"/>
           </w:tcPr>
           <w:p>
             <w:pPr>
@@ -2087,7 +1457,7 @@
                 <w:color w:val="1A1A1A"/>
                 <w:sz w:val="20"/>
               </w:rPr>
-              <w:t>2–3 sentences for a seller: why this company scored well or poorly, which product drove the score, what the path looks like</w:t>
+              <w:t>2–3 sentences: why this company scored well or poorly, which product drove the score, what the path looks like</w:t>
             </w:r>
           </w:p>
         </w:tc>
@@ -2103,6 +1473,7 @@
               <w:bottom w:w="50" w:type="dxa"/>
               <w:right w:w="50" w:type="dxa"/>
             </w:tcMar>
+            <w:tcW w:w="2600" w:type="dxa"/>
           </w:tcPr>
           <w:p>
             <w:pPr>
@@ -2130,6 +1501,7 @@
               <w:bottom w:w="50" w:type="dxa"/>
               <w:right w:w="50" w:type="dxa"/>
             </w:tcMar>
+            <w:tcW w:w="7192" w:type="dxa"/>
           </w:tcPr>
           <w:p>
             <w:pPr>
@@ -2159,6 +1531,7 @@
               <w:bottom w:w="50" w:type="dxa"/>
               <w:right w:w="50" w:type="dxa"/>
             </w:tcMar>
+            <w:tcW w:w="2600" w:type="dxa"/>
           </w:tcPr>
           <w:p>
             <w:pPr>
@@ -2186,6 +1559,7 @@
               <w:bottom w:w="50" w:type="dxa"/>
               <w:right w:w="50" w:type="dxa"/>
             </w:tcMar>
+            <w:tcW w:w="7192" w:type="dxa"/>
           </w:tcPr>
           <w:p>
             <w:pPr>
@@ -2215,6 +1589,7 @@
               <w:bottom w:w="50" w:type="dxa"/>
               <w:right w:w="50" w:type="dxa"/>
             </w:tcMar>
+            <w:tcW w:w="2600" w:type="dxa"/>
           </w:tcPr>
           <w:p>
             <w:pPr>
@@ -2242,6 +1617,7 @@
               <w:bottom w:w="50" w:type="dxa"/>
               <w:right w:w="50" w:type="dxa"/>
             </w:tcMar>
+            <w:tcW w:w="7192" w:type="dxa"/>
           </w:tcPr>
           <w:p>
             <w:pPr>
@@ -2271,6 +1647,7 @@
               <w:bottom w:w="50" w:type="dxa"/>
               <w:right w:w="50" w:type="dxa"/>
             </w:tcMar>
+            <w:tcW w:w="2600" w:type="dxa"/>
           </w:tcPr>
           <w:p>
             <w:pPr>
@@ -2298,6 +1675,7 @@
               <w:bottom w:w="50" w:type="dxa"/>
               <w:right w:w="50" w:type="dxa"/>
             </w:tcMar>
+            <w:tcW w:w="7192" w:type="dxa"/>
           </w:tcPr>
           <w:p>
             <w:pPr>
@@ -2327,6 +1705,7 @@
               <w:bottom w:w="50" w:type="dxa"/>
               <w:right w:w="50" w:type="dxa"/>
             </w:tcMar>
+            <w:tcW w:w="2600" w:type="dxa"/>
           </w:tcPr>
           <w:p>
             <w:pPr>
@@ -2354,6 +1733,7 @@
               <w:bottom w:w="50" w:type="dxa"/>
               <w:right w:w="50" w:type="dxa"/>
             </w:tcMar>
+            <w:tcW w:w="7192" w:type="dxa"/>
           </w:tcPr>
           <w:p>
             <w:pPr>
@@ -2390,7 +1770,7 @@
           <w:color w:val="1A1A1A"/>
           <w:sz w:val="20"/>
         </w:rPr>
-        <w:t>Intelligence also surfaces up to two contacts per company — a decision maker and a day-to-day champion — extracted from public sources for ABM targeting.</w:t>
+        <w:t>Intelligence surfaces up to two contacts per company — a decision maker and a day-to-day champion — extracted from public sources for ABM targeting.</w:t>
       </w:r>
     </w:p>
     <w:p>
@@ -2405,7 +1785,7 @@
           <w:color w:val="136945"/>
           <w:sz w:val="22"/>
         </w:rPr>
-        <w:t>HubSpot → Inspector — One-Way Trigger, Seller and SE-Driven</w:t>
+        <w:t>Inspector → HubSpot — Seller and SE-Driven</w:t>
       </w:r>
     </w:p>
     <w:p>
@@ -2420,7 +1800,7 @@
           <w:color w:val="1A1A1A"/>
           <w:sz w:val="20"/>
         </w:rPr>
-        <w:t>Company and Deal records in HubSpot surface a ‘Run Inspector’ link. Clicking it opens Inspector in a new browser window at the Stage 1 Company Report. The full Inspector experience runs in Intelligence — HubSpot is only the trigger.</w:t>
+        <w:t>Company and Deal records in HubSpot surface a ‘Run Inspector’ link. Clicking it opens Inspector at the Stage 1 Company Report. The full Inspector experience runs in Intelligence — HubSpot is only the trigger.</w:t>
       </w:r>
     </w:p>
     <w:p>
@@ -2435,7 +1815,7 @@
           <w:color w:val="1A1A1A"/>
           <w:sz w:val="20"/>
         </w:rPr>
-        <w:t>Stage 1 data → Company Record (persistent account intelligence):</w:t>
+        <w:t>Stage 1 data written to the Company Record:</w:t>
       </w:r>
     </w:p>
     <w:tbl>
@@ -2459,7 +1839,7 @@
               <w:bottom w:w="50" w:type="dxa"/>
               <w:right w:w="50" w:type="dxa"/>
             </w:tcMar>
-            <w:tcW w:w="4896" w:type="dxa"/>
+            <w:tcW w:w="2800" w:type="dxa"/>
           </w:tcPr>
           <w:p>
             <w:pPr>
@@ -2487,7 +1867,7 @@
               <w:bottom w:w="50" w:type="dxa"/>
               <w:right w:w="50" w:type="dxa"/>
             </w:tcMar>
-            <w:tcW w:w="4896" w:type="dxa"/>
+            <w:tcW w:w="6992" w:type="dxa"/>
           </w:tcPr>
           <w:p>
             <w:pPr>
@@ -2517,6 +1897,7 @@
               <w:bottom w:w="50" w:type="dxa"/>
               <w:right w:w="50" w:type="dxa"/>
             </w:tcMar>
+            <w:tcW w:w="2800" w:type="dxa"/>
           </w:tcPr>
           <w:p>
             <w:pPr>
@@ -2544,6 +1925,7 @@
               <w:bottom w:w="50" w:type="dxa"/>
               <w:right w:w="50" w:type="dxa"/>
             </w:tcMar>
+            <w:tcW w:w="6992" w:type="dxa"/>
           </w:tcPr>
           <w:p>
             <w:pPr>
@@ -2557,7 +1939,7 @@
                 <w:color w:val="1A1A1A"/>
                 <w:sz w:val="20"/>
               </w:rPr>
-              <w:t>Account-level intelligence on what this company sells and how labable each product is</w:t>
+              <w:t>What this company sells and how labable each product is</w:t>
             </w:r>
           </w:p>
         </w:tc>
@@ -2573,6 +1955,7 @@
               <w:bottom w:w="50" w:type="dxa"/>
               <w:right w:w="50" w:type="dxa"/>
             </w:tcMar>
+            <w:tcW w:w="2800" w:type="dxa"/>
           </w:tcPr>
           <w:p>
             <w:pPr>
@@ -2600,6 +1983,7 @@
               <w:bottom w:w="50" w:type="dxa"/>
               <w:right w:w="50" w:type="dxa"/>
             </w:tcMar>
+            <w:tcW w:w="6992" w:type="dxa"/>
           </w:tcPr>
           <w:p>
             <w:pPr>
@@ -2613,7 +1997,7 @@
                 <w:color w:val="1A1A1A"/>
                 <w:sz w:val="20"/>
               </w:rPr>
-              <w:t>Quick read on how each product would be delivered</w:t>
+              <w:t>Quick read on delivery approach per product</w:t>
             </w:r>
           </w:p>
         </w:tc>
@@ -2629,6 +2013,7 @@
               <w:bottom w:w="50" w:type="dxa"/>
               <w:right w:w="50" w:type="dxa"/>
             </w:tcMar>
+            <w:tcW w:w="2800" w:type="dxa"/>
           </w:tcPr>
           <w:p>
             <w:pPr>
@@ -2656,6 +2041,7 @@
               <w:bottom w:w="50" w:type="dxa"/>
               <w:right w:w="50" w:type="dxa"/>
             </w:tcMar>
+            <w:tcW w:w="6992" w:type="dxa"/>
           </w:tcPr>
           <w:p>
             <w:pPr>
@@ -2685,6 +2071,7 @@
               <w:bottom w:w="50" w:type="dxa"/>
               <w:right w:w="50" w:type="dxa"/>
             </w:tcMar>
+            <w:tcW w:w="2800" w:type="dxa"/>
           </w:tcPr>
           <w:p>
             <w:pPr>
@@ -2712,6 +2099,7 @@
               <w:bottom w:w="50" w:type="dxa"/>
               <w:right w:w="50" w:type="dxa"/>
             </w:tcMar>
+            <w:tcW w:w="6992" w:type="dxa"/>
           </w:tcPr>
           <w:p>
             <w:pPr>
@@ -2741,6 +2129,7 @@
               <w:bottom w:w="50" w:type="dxa"/>
               <w:right w:w="50" w:type="dxa"/>
             </w:tcMar>
+            <w:tcW w:w="2800" w:type="dxa"/>
           </w:tcPr>
           <w:p>
             <w:pPr>
@@ -2768,6 +2157,7 @@
               <w:bottom w:w="50" w:type="dxa"/>
               <w:right w:w="50" w:type="dxa"/>
             </w:tcMar>
+            <w:tcW w:w="6992" w:type="dxa"/>
           </w:tcPr>
           <w:p>
             <w:pPr>
@@ -2804,7 +2194,7 @@
           <w:color w:val="1A1A1A"/>
           <w:sz w:val="20"/>
         </w:rPr>
-        <w:t>Stage 2 data → Deal Record (opportunity-specific):</w:t>
+        <w:t>Stage 2 data written to the Deal Record:</w:t>
       </w:r>
     </w:p>
     <w:tbl>
@@ -2828,7 +2218,7 @@
               <w:bottom w:w="50" w:type="dxa"/>
               <w:right w:w="50" w:type="dxa"/>
             </w:tcMar>
-            <w:tcW w:w="4896" w:type="dxa"/>
+            <w:tcW w:w="2800" w:type="dxa"/>
           </w:tcPr>
           <w:p>
             <w:pPr>
@@ -2856,7 +2246,7 @@
               <w:bottom w:w="50" w:type="dxa"/>
               <w:right w:w="50" w:type="dxa"/>
             </w:tcMar>
-            <w:tcW w:w="4896" w:type="dxa"/>
+            <w:tcW w:w="6992" w:type="dxa"/>
           </w:tcPr>
           <w:p>
             <w:pPr>
@@ -2886,6 +2276,7 @@
               <w:bottom w:w="50" w:type="dxa"/>
               <w:right w:w="50" w:type="dxa"/>
             </w:tcMar>
+            <w:tcW w:w="2800" w:type="dxa"/>
           </w:tcPr>
           <w:p>
             <w:pPr>
@@ -2913,6 +2304,7 @@
               <w:bottom w:w="50" w:type="dxa"/>
               <w:right w:w="50" w:type="dxa"/>
             </w:tcMar>
+            <w:tcW w:w="6992" w:type="dxa"/>
           </w:tcPr>
           <w:p>
             <w:pPr>
@@ -2926,7 +2318,7 @@
                 <w:color w:val="1A1A1A"/>
                 <w:sz w:val="20"/>
               </w:rPr>
-              <w:t>What path, and why — the SE’s talking point</w:t>
+              <w:t>What path, and why</w:t>
             </w:r>
           </w:p>
         </w:tc>
@@ -2942,6 +2334,7 @@
               <w:bottom w:w="50" w:type="dxa"/>
               <w:right w:w="50" w:type="dxa"/>
             </w:tcMar>
+            <w:tcW w:w="2800" w:type="dxa"/>
           </w:tcPr>
           <w:p>
             <w:pPr>
@@ -2969,6 +2362,7 @@
               <w:bottom w:w="50" w:type="dxa"/>
               <w:right w:w="50" w:type="dxa"/>
             </w:tcMar>
+            <w:tcW w:w="6992" w:type="dxa"/>
           </w:tcPr>
           <w:p>
             <w:pPr>
@@ -2998,6 +2392,7 @@
               <w:bottom w:w="50" w:type="dxa"/>
               <w:right w:w="50" w:type="dxa"/>
             </w:tcMar>
+            <w:tcW w:w="2800" w:type="dxa"/>
           </w:tcPr>
           <w:p>
             <w:pPr>
@@ -3025,6 +2420,7 @@
               <w:bottom w:w="50" w:type="dxa"/>
               <w:right w:w="50" w:type="dxa"/>
             </w:tcMar>
+            <w:tcW w:w="6992" w:type="dxa"/>
           </w:tcPr>
           <w:p>
             <w:pPr>
@@ -3054,6 +2450,7 @@
               <w:bottom w:w="50" w:type="dxa"/>
               <w:right w:w="50" w:type="dxa"/>
             </w:tcMar>
+            <w:tcW w:w="2800" w:type="dxa"/>
           </w:tcPr>
           <w:p>
             <w:pPr>
@@ -3067,7 +2464,7 @@
                 <w:color w:val="1A1A1A"/>
                 <w:sz w:val="20"/>
               </w:rPr>
-              <w:t>Gate scores summary</w:t>
+              <w:t>Technical orchestrability evidence</w:t>
             </w:r>
           </w:p>
         </w:tc>
@@ -3081,6 +2478,7 @@
               <w:bottom w:w="50" w:type="dxa"/>
               <w:right w:w="50" w:type="dxa"/>
             </w:tcMar>
+            <w:tcW w:w="6992" w:type="dxa"/>
           </w:tcPr>
           <w:p>
             <w:pPr>
@@ -3094,7 +2492,7 @@
                 <w:color w:val="1A1A1A"/>
                 <w:sz w:val="20"/>
               </w:rPr>
-              <w:t>Compressed evidence for the SE</w:t>
+              <w:t>Compressed analysis for the SE</w:t>
             </w:r>
           </w:p>
         </w:tc>
@@ -3110,6 +2508,7 @@
               <w:bottom w:w="50" w:type="dxa"/>
               <w:right w:w="50" w:type="dxa"/>
             </w:tcMar>
+            <w:tcW w:w="2800" w:type="dxa"/>
           </w:tcPr>
           <w:p>
             <w:pPr>
@@ -3137,6 +2536,7 @@
               <w:bottom w:w="50" w:type="dxa"/>
               <w:right w:w="50" w:type="dxa"/>
             </w:tcMar>
+            <w:tcW w:w="6992" w:type="dxa"/>
           </w:tcPr>
           <w:p>
             <w:pPr>
@@ -3166,6 +2566,7 @@
               <w:bottom w:w="50" w:type="dxa"/>
               <w:right w:w="50" w:type="dxa"/>
             </w:tcMar>
+            <w:tcW w:w="2800" w:type="dxa"/>
           </w:tcPr>
           <w:p>
             <w:pPr>
@@ -3193,6 +2594,7 @@
               <w:bottom w:w="50" w:type="dxa"/>
               <w:right w:w="50" w:type="dxa"/>
             </w:tcMar>
+            <w:tcW w:w="6992" w:type="dxa"/>
           </w:tcPr>
           <w:p>
             <w:pPr>
@@ -3244,7 +2646,7 @@
           <w:color w:val="1A1A1A"/>
           <w:sz w:val="20"/>
         </w:rPr>
-        <w:t>Program owners, IDs, and SMEs go directly to Designer. HubSpot plays no role in triggering Designer’s workflow.</w:t>
+        <w:t>Program owners and IDs go directly to Designer. HubSpot plays no role in triggering Designer’s workflow.</w:t>
       </w:r>
     </w:p>
     <w:p>
@@ -3259,7 +2661,7 @@
           <w:color w:val="1A1A1A"/>
           <w:sz w:val="20"/>
         </w:rPr>
-        <w:t>Designer-created Lab Programs surface in HubSpot as read-only links and summary data on the Company record — giving sellers and CSMs visibility into what programs have been designed, what’s in progress, and what has been delivered. Critical context for renewal and expansion conversations before a QBR.</w:t>
+        <w:t>Designer-created Lab Programs surface in HubSpot as read-only links and summary data on the Company record — giving sellers and CSMs visibility into what programs have been designed, what is in progress, and what has been delivered. Critical context for renewal and expansion conversations before a QBR.</w:t>
       </w:r>
     </w:p>
     <w:p>
@@ -3315,7 +2717,7 @@
           <w:color w:val="1A1A1A"/>
           <w:sz w:val="20"/>
         </w:rPr>
-        <w:t>Replace or supplement the current ZoomInfo-only scoring motion with Intelligence-qualified lists. Companies that fail Gate 1 come off the list before sequences are built. Companies that clear all three gates get prioritized outreach with seller-ready context already in HubSpot.</w:t>
+        <w:t>Replace or supplement the current ZoomInfo-only scoring motion with Intelligence-qualified lists. Companies that fail the technical orchestrability assessment come off the list before sequences are built. Companies that clear all three dimensions get prioritized outreach with seller-ready context already in HubSpot.</w:t>
       </w:r>
     </w:p>
     <w:p>
@@ -3341,13 +2743,13 @@
           <w:color w:val="1A1A1A"/>
           <w:sz w:val="20"/>
         </w:rPr>
-        <w:t>The ‘Run Inspector’ link on every Company and Deal record makes it a one-click motion. Stage 1 output on the Company record gives every seller account intelligence they currently don’t have.</w:t>
+        <w:t>The ‘Run Inspector’ link on every Company and Deal record makes it a one-click motion. Stage 1 output gives every seller account intelligence they currently do not have before the first conversation.</w:t>
       </w:r>
     </w:p>
     <w:p>
       <w:pPr>
         <w:pStyle w:val="ListBullet"/>
-        <w:spacing w:before="0" w:after="40"/>
+        <w:spacing w:before="0" w:after="60"/>
       </w:pPr>
       <w:r>
         <w:rPr>
@@ -3367,7 +2769,7 @@
           <w:color w:val="1A1A1A"/>
           <w:sz w:val="20"/>
         </w:rPr>
-        <w:t>Skillable LC and PS should run every new customer through Designer in the first week — before the technical environment is ready. Designer makes day one productive for the program owner.</w:t>
+        <w:t>Skillable LC and PS should run every new customer through Designer in the first week — before the technical environment is ready. Program design and environment build run as parallel workstreams.</w:t>
       </w:r>
     </w:p>
     <w:p>
@@ -3421,7 +2823,7 @@
               <w:bottom w:w="50" w:type="dxa"/>
               <w:right w:w="50" w:type="dxa"/>
             </w:tcMar>
-            <w:tcW w:w="4896" w:type="dxa"/>
+            <w:tcW w:w="2600" w:type="dxa"/>
           </w:tcPr>
           <w:p>
             <w:pPr>
@@ -3449,7 +2851,7 @@
               <w:bottom w:w="50" w:type="dxa"/>
               <w:right w:w="50" w:type="dxa"/>
             </w:tcMar>
-            <w:tcW w:w="4896" w:type="dxa"/>
+            <w:tcW w:w="7192" w:type="dxa"/>
           </w:tcPr>
           <w:p>
             <w:pPr>
@@ -3479,6 +2881,7 @@
               <w:bottom w:w="50" w:type="dxa"/>
               <w:right w:w="50" w:type="dxa"/>
             </w:tcMar>
+            <w:tcW w:w="2600" w:type="dxa"/>
           </w:tcPr>
           <w:p>
             <w:pPr>
@@ -3506,6 +2909,7 @@
               <w:bottom w:w="50" w:type="dxa"/>
               <w:right w:w="50" w:type="dxa"/>
             </w:tcMar>
+            <w:tcW w:w="7192" w:type="dxa"/>
           </w:tcPr>
           <w:p>
             <w:pPr>
@@ -3535,6 +2939,7 @@
               <w:bottom w:w="50" w:type="dxa"/>
               <w:right w:w="50" w:type="dxa"/>
             </w:tcMar>
+            <w:tcW w:w="2600" w:type="dxa"/>
           </w:tcPr>
           <w:p>
             <w:pPr>
@@ -3562,6 +2967,7 @@
               <w:bottom w:w="50" w:type="dxa"/>
               <w:right w:w="50" w:type="dxa"/>
             </w:tcMar>
+            <w:tcW w:w="7192" w:type="dxa"/>
           </w:tcPr>
           <w:p>
             <w:pPr>
@@ -3575,7 +2981,7 @@
                 <w:color w:val="1A1A1A"/>
                 <w:sz w:val="20"/>
               </w:rPr>
-              <w:t>Where does each recommended data element fit in the existing deal UX?</w:t>
+              <w:t>Where does each data element fit in the existing deal UX?</w:t>
             </w:r>
           </w:p>
         </w:tc>
@@ -3591,6 +2997,7 @@
               <w:bottom w:w="50" w:type="dxa"/>
               <w:right w:w="50" w:type="dxa"/>
             </w:tcMar>
+            <w:tcW w:w="2600" w:type="dxa"/>
           </w:tcPr>
           <w:p>
             <w:pPr>
@@ -3618,6 +3025,7 @@
               <w:bottom w:w="50" w:type="dxa"/>
               <w:right w:w="50" w:type="dxa"/>
             </w:tcMar>
+            <w:tcW w:w="7192" w:type="dxa"/>
           </w:tcPr>
           <w:p>
             <w:pPr>
@@ -3647,6 +3055,7 @@
               <w:bottom w:w="50" w:type="dxa"/>
               <w:right w:w="50" w:type="dxa"/>
             </w:tcMar>
+            <w:tcW w:w="2600" w:type="dxa"/>
           </w:tcPr>
           <w:p>
             <w:pPr>
@@ -3674,6 +3083,7 @@
               <w:bottom w:w="50" w:type="dxa"/>
               <w:right w:w="50" w:type="dxa"/>
             </w:tcMar>
+            <w:tcW w:w="7192" w:type="dxa"/>
           </w:tcPr>
           <w:p>
             <w:pPr>
@@ -3687,7 +3097,7 @@
                 <w:color w:val="1A1A1A"/>
                 <w:sz w:val="20"/>
               </w:rPr>
-              <w:t>If Inspector covers three products, do they generate three Deals or append to one?</w:t>
+              <w:t>Three products in one Inspector run — three Deals or one?</w:t>
             </w:r>
           </w:p>
         </w:tc>
@@ -3703,6 +3113,7 @@
               <w:bottom w:w="50" w:type="dxa"/>
               <w:right w:w="50" w:type="dxa"/>
             </w:tcMar>
+            <w:tcW w:w="2600" w:type="dxa"/>
           </w:tcPr>
           <w:p>
             <w:pPr>
@@ -3730,6 +3141,7 @@
               <w:bottom w:w="50" w:type="dxa"/>
               <w:right w:w="50" w:type="dxa"/>
             </w:tcMar>
+            <w:tcW w:w="7192" w:type="dxa"/>
           </w:tcPr>
           <w:p>
             <w:pPr>
@@ -3759,6 +3171,7 @@
               <w:bottom w:w="50" w:type="dxa"/>
               <w:right w:w="50" w:type="dxa"/>
             </w:tcMar>
+            <w:tcW w:w="2600" w:type="dxa"/>
           </w:tcPr>
           <w:p>
             <w:pPr>
@@ -3786,6 +3199,7 @@
               <w:bottom w:w="50" w:type="dxa"/>
               <w:right w:w="50" w:type="dxa"/>
             </w:tcMar>
+            <w:tcW w:w="7192" w:type="dxa"/>
           </w:tcPr>
           <w:p>
             <w:pPr>
@@ -3815,6 +3229,7 @@
               <w:bottom w:w="50" w:type="dxa"/>
               <w:right w:w="50" w:type="dxa"/>
             </w:tcMar>
+            <w:tcW w:w="2600" w:type="dxa"/>
           </w:tcPr>
           <w:p>
             <w:pPr>
@@ -3842,6 +3257,7 @@
               <w:bottom w:w="50" w:type="dxa"/>
               <w:right w:w="50" w:type="dxa"/>
             </w:tcMar>
+            <w:tcW w:w="7192" w:type="dxa"/>
           </w:tcPr>
           <w:p>
             <w:pPr>
@@ -3855,7 +3271,7 @@
                 <w:color w:val="1A1A1A"/>
                 <w:sz w:val="20"/>
               </w:rPr>
-              <w:t>Which columns are in Marketing’s standard export? Minimum: Company Name + Domain. High value: Industry, LinkedIn URL, Employee Count, Technologies Used.</w:t>
+              <w:t>Minimum: Company Name + Domain. High value: Industry, LinkedIn URL, Employee Count, Technologies Used.</w:t>
             </w:r>
           </w:p>
         </w:tc>
@@ -3871,6 +3287,7 @@
               <w:bottom w:w="50" w:type="dxa"/>
               <w:right w:w="50" w:type="dxa"/>
             </w:tcMar>
+            <w:tcW w:w="2600" w:type="dxa"/>
           </w:tcPr>
           <w:p>
             <w:pPr>
@@ -3898,6 +3315,7 @@
               <w:bottom w:w="50" w:type="dxa"/>
               <w:right w:w="50" w:type="dxa"/>
             </w:tcMar>
+            <w:tcW w:w="7192" w:type="dxa"/>
           </w:tcPr>
           <w:p>
             <w:pPr>
@@ -3911,7 +3329,7 @@
                 <w:color w:val="1A1A1A"/>
                 <w:sz w:val="20"/>
               </w:rPr>
-              <w:t>At what Intelligence Fit Score does a Company record automatically get enriched vs. queued for review?</w:t>
+              <w:t>At what fit score does a Company record get automatically enriched vs. queued for review?</w:t>
             </w:r>
           </w:p>
         </w:tc>
@@ -4015,9 +3433,6 @@
     <w:pPr>
       <w:jc w:val="right"/>
       <w:spacing w:before="0" w:after="0"/>
-      <w:pBdr>
-        <w:bottom w:val="single" w:sz="8" w:space="1" w:color="136945"/>
-      </w:pBdr>
     </w:pPr>
     <w:r>
       <w:drawing>

</xml_diff>

<commit_message>
Update opening: PaaS/SaaS framing, glass ceilings, bullets direct
Co-Authored-By: Claude Sonnet 4.6 <noreply@anthropic.com>
</commit_message>
<xml_diff>
--- a/docs/Skillable-Intelligence-Platform.docx
+++ b/docs/Skillable-Intelligence-Platform.docx
@@ -62,7 +62,7 @@
           <w:color w:val="1A1A1A"/>
           <w:sz w:val="20"/>
         </w:rPr>
-        <w:t>Skillable is a platform company. Not a software product — an orchestration platform that enables software companies to deliver hands-on learning experiences at scale. That distinction is more than positioning. It is the root cause of three hard problems that no standard sales or marketing tool was ever designed to solve.</w:t>
+        <w:t>We recently agreed that Skillable is PaaS and not SaaS. Does this distinction simply change some positioning — or does it signal our opportunity to shatter a few glass ceilings? It’s the latter.</w:t>
       </w:r>
     </w:p>
     <w:p>
@@ -141,21 +141,6 @@
           <w:sz w:val="20"/>
         </w:rPr>
         <w:t>Enabling bought-in customers to adopt labs</w:t>
-      </w:r>
-    </w:p>
-    <w:p>
-      <w:pPr>
-        <w:spacing w:before="0" w:after="60"/>
-      </w:pPr>
-      <w:r>
-        <w:rPr>
-          <w:rFonts w:ascii="Calibri" w:hAnsi="Calibri"/>
-          <w:b w:val="0"/>
-          <w:i w:val="0"/>
-          <w:color w:val="1A1A1A"/>
-          <w:sz w:val="20"/>
-        </w:rPr>
-        <w:t>Each problem is structural — a natural consequence of the sophistication of what we do, not a gap in any team’s execution. And each one requires a different kind of intelligence than any existing tool provides.</w:t>
       </w:r>
     </w:p>
     <w:p>

</xml_diff>

<commit_message>
Refine subsection titles: action-oriented, sentence case pending
Co-Authored-By: Claude Sonnet 4.6 <noreply@anthropic.com>
</commit_message>
<xml_diff>
--- a/docs/Skillable-Intelligence-Platform.docx
+++ b/docs/Skillable-Intelligence-Platform.docx
@@ -73,16 +73,6 @@
       <w:r>
         <w:rPr>
           <w:rFonts w:ascii="Calibri" w:hAnsi="Calibri"/>
-          <w:b/>
-          <w:i w:val="0"/>
-          <w:color w:val="1A1A1A"/>
-          <w:sz w:val="20"/>
-        </w:rPr>
-        <w:t xml:space="preserve">Marketing: </w:t>
-      </w:r>
-      <w:r>
-        <w:rPr>
-          <w:rFonts w:ascii="Calibri" w:hAnsi="Calibri"/>
           <w:b w:val="0"/>
           <w:i w:val="0"/>
           <w:color w:val="1A1A1A"/>
@@ -99,16 +89,6 @@
       <w:r>
         <w:rPr>
           <w:rFonts w:ascii="Calibri" w:hAnsi="Calibri"/>
-          <w:b/>
-          <w:i w:val="0"/>
-          <w:color w:val="1A1A1A"/>
-          <w:sz w:val="20"/>
-        </w:rPr>
-        <w:t xml:space="preserve">Revenue: </w:t>
-      </w:r>
-      <w:r>
-        <w:rPr>
-          <w:rFonts w:ascii="Calibri" w:hAnsi="Calibri"/>
           <w:b w:val="0"/>
           <w:i w:val="0"/>
           <w:color w:val="1A1A1A"/>
@@ -122,16 +102,6 @@
         <w:pStyle w:val="ListBullet"/>
         <w:spacing w:before="0" w:after="60"/>
       </w:pPr>
-      <w:r>
-        <w:rPr>
-          <w:rFonts w:ascii="Calibri" w:hAnsi="Calibri"/>
-          <w:b/>
-          <w:i w:val="0"/>
-          <w:color w:val="1A1A1A"/>
-          <w:sz w:val="20"/>
-        </w:rPr>
-        <w:t xml:space="preserve">ProServ &amp; Product: </w:t>
-      </w:r>
       <w:r>
         <w:rPr>
           <w:rFonts w:ascii="Calibri" w:hAnsi="Calibri"/>
@@ -230,7 +200,7 @@
           <w:color w:val="136945"/>
           <w:sz w:val="22"/>
         </w:rPr>
-        <w:t>Marketing Challenge: Identifying Companies in Our ICP</w:t>
+        <w:t>Knowing Exactly Who’s in Our ICP — Before We Spend a Dollar</w:t>
       </w:r>
     </w:p>
     <w:p>
@@ -476,7 +446,7 @@
           <w:color w:val="136945"/>
           <w:sz w:val="22"/>
         </w:rPr>
-        <w:t>Revenue Challenge: Proving Labability and Lab Impact</w:t>
+        <w:t>Proving Labability and Impact — with SE-Level Depth at Scale</w:t>
       </w:r>
     </w:p>
     <w:p>
@@ -536,7 +506,7 @@
           <w:color w:val="136945"/>
           <w:sz w:val="22"/>
         </w:rPr>
-        <w:t>ProServ &amp; Product Challenge: Enabling Bought-In Customers to Adopt Labs</w:t>
+        <w:t>Jump-Starting Customer Adoption — Accelerate the Shift to Expansion</w:t>
       </w:r>
     </w:p>
     <w:p>

</xml_diff>

<commit_message>
Apply sentence case to all headings throughout doc
Co-Authored-By: Claude Sonnet 4.6 <noreply@anthropic.com>
</commit_message>
<xml_diff>
--- a/docs/Skillable-Intelligence-Platform.docx
+++ b/docs/Skillable-Intelligence-Platform.docx
@@ -32,7 +32,7 @@
           <w:color w:val="606060"/>
           <w:sz w:val="22"/>
         </w:rPr>
-        <w:t>Briefing for Skillable Executive Leadership</w:t>
+        <w:t>Briefing for Skillable executive leadership</w:t>
       </w:r>
     </w:p>
     <w:p>
@@ -47,7 +47,7 @@
           <w:color w:val="136945"/>
           <w:sz w:val="26"/>
         </w:rPr>
-        <w:t>Three Problems Worth Solving</w:t>
+        <w:t>Three problems worth solving</w:t>
       </w:r>
     </w:p>
     <w:p>
@@ -125,7 +125,7 @@
           <w:color w:val="136945"/>
           <w:sz w:val="22"/>
         </w:rPr>
-        <w:t>The Platform Difference</w:t>
+        <w:t>The PaaS difference</w:t>
       </w:r>
     </w:p>
     <w:p>
@@ -200,7 +200,7 @@
           <w:color w:val="136945"/>
           <w:sz w:val="22"/>
         </w:rPr>
-        <w:t>Knowing Exactly Who’s in Our ICP — Before We Spend a Dollar</w:t>
+        <w:t>Knowing exactly who’s in our ICP — before we spend a dollar</w:t>
       </w:r>
     </w:p>
     <w:p>
@@ -446,7 +446,7 @@
           <w:color w:val="136945"/>
           <w:sz w:val="22"/>
         </w:rPr>
-        <w:t>Proving Labability and Impact — with SE-Level Depth at Scale</w:t>
+        <w:t>Proving labability and impact — with SE-level depth at scale</w:t>
       </w:r>
     </w:p>
     <w:p>
@@ -506,7 +506,7 @@
           <w:color w:val="136945"/>
           <w:sz w:val="22"/>
         </w:rPr>
-        <w:t>Jump-Starting Customer Adoption — Accelerate the Shift to Expansion</w:t>
+        <w:t>Jump-starting customer adoption — accelerate the shift to expansion</w:t>
       </w:r>
     </w:p>
     <w:p>
@@ -574,7 +574,7 @@
           <w:color w:val="136945"/>
           <w:sz w:val="26"/>
         </w:rPr>
-        <w:t>Three Tools. One Platform.</w:t>
+        <w:t>Three tools. One platform.</w:t>
       </w:r>
     </w:p>
     <w:p>
@@ -1082,7 +1082,7 @@
           <w:color w:val="136945"/>
           <w:sz w:val="26"/>
         </w:rPr>
-        <w:t>HubSpot and Revenue Operations</w:t>
+        <w:t>HubSpot and revenue operations</w:t>
       </w:r>
     </w:p>
     <w:p>
@@ -1112,7 +1112,7 @@
           <w:color w:val="136945"/>
           <w:sz w:val="22"/>
         </w:rPr>
-        <w:t>The Integration Principle</w:t>
+        <w:t>The integration principle</w:t>
       </w:r>
     </w:p>
     <w:p>
@@ -1142,7 +1142,7 @@
           <w:color w:val="136945"/>
           <w:sz w:val="22"/>
         </w:rPr>
-        <w:t>Prospector ↔ HubSpot — Bidirectional, Marketing-Driven</w:t>
+        <w:t>Prospector ↔ HubSpot — bidirectional, marketing-driven</w:t>
       </w:r>
     </w:p>
     <w:p>
@@ -1740,7 +1740,7 @@
           <w:color w:val="136945"/>
           <w:sz w:val="22"/>
         </w:rPr>
-        <w:t>Inspector → HubSpot — Seller and SE-Driven</w:t>
+        <w:t>Inspector → HubSpot — seller and SE-driven</w:t>
       </w:r>
     </w:p>
     <w:p>
@@ -2586,7 +2586,7 @@
           <w:color w:val="136945"/>
           <w:sz w:val="22"/>
         </w:rPr>
-        <w:t>Designer → HubSpot — Read-Only Visibility</w:t>
+        <w:t>Designer → HubSpot — read-only visibility</w:t>
       </w:r>
     </w:p>
     <w:p>
@@ -2631,7 +2631,7 @@
           <w:color w:val="136945"/>
           <w:sz w:val="26"/>
         </w:rPr>
-        <w:t>Recommendations and Open Decisions</w:t>
+        <w:t>Recommendations and open decisions</w:t>
       </w:r>
     </w:p>
     <w:p>
@@ -2646,7 +2646,7 @@
           <w:color w:val="136945"/>
           <w:sz w:val="22"/>
         </w:rPr>
-        <w:t>What We Are Recommending</w:t>
+        <w:t>What we are recommending</w:t>
       </w:r>
     </w:p>
     <w:p>
@@ -2739,7 +2739,7 @@
           <w:color w:val="136945"/>
           <w:sz w:val="22"/>
         </w:rPr>
-        <w:t>Decisions Required from RevOps and Marketing</w:t>
+        <w:t>Decisions required from RevOps and Marketing</w:t>
       </w:r>
     </w:p>
     <w:p>

</xml_diff>

<commit_message>
Sync generator to tightened markdown: sentence case h2s, PaaS para, Workday para
- write_what() h2s lowercased: Designer/Inspector/Prospector
- PaaS difference first paragraph rewritten to match md
- 'technically complex enough' → 'complex enough' in two places
- Post-Workday paragraph matches md ('These are specific technical facts...')
- Regenerate Word doc

Co-Authored-By: Claude Sonnet 4.6 <noreply@anthropic.com>
</commit_message>
<xml_diff>
--- a/docs/Skillable-Intelligence-Platform.docx
+++ b/docs/Skillable-Intelligence-Platform.docx
@@ -28,11 +28,11 @@
         <w:rPr>
           <w:rFonts w:ascii="Calibri" w:hAnsi="Calibri"/>
           <w:b w:val="0"/>
-          <w:i/>
+          <w:i w:val="0"/>
           <w:color w:val="606060"/>
-          <w:sz w:val="22"/>
+          <w:sz w:val="20"/>
         </w:rPr>
-        <w:t>Briefing for Skillable executive leadership</w:t>
+        <w:t>Executive Leadership Team Brief</w:t>
       </w:r>
     </w:p>
     <w:p>
@@ -62,7 +62,7 @@
           <w:color w:val="1A1A1A"/>
           <w:sz w:val="20"/>
         </w:rPr>
-        <w:t>We recently agreed that Skillable is PaaS and not SaaS. Does this distinction simply change some positioning — or does it signal our opportunity to shatter a few glass ceilings? It’s the latter.</w:t>
+        <w:t>We recently agreed that Skillable is PaaS and not SaaS. Does this distinction simply change some positioning or does it signal our opportunity to shatter a few glass ceilings? As the category creator for hands-on experience platforms, we find ourselves staring at three unique challenges.</w:t>
       </w:r>
     </w:p>
     <w:p>
@@ -140,7 +140,7 @@
           <w:color w:val="1A1A1A"/>
           <w:sz w:val="20"/>
         </w:rPr>
-        <w:t>Most B2B software companies sell a product that runs in their cloud. Their buyers interact with it through a browser. The product is the same for every customer. Qualifying a prospect means finding buyers who fit the profile: the right size, the right industry, the right pain point, the right budget.</w:t>
+        <w:t>Most B2B software companies sell products that run in a cloud, in a datacenter, on a computer, or on a phone. With a few customizations here and there, many of these products are roughly the same for every user. Qualifying a prospect means finding buyers who fit the profile: the right size, the right industry, the right pain point, the right budget.</w:t>
       </w:r>
     </w:p>
     <w:p>
@@ -170,7 +170,7 @@
           <w:color w:val="1A1A1A"/>
           <w:sz w:val="20"/>
         </w:rPr>
-        <w:t>This creates a fundamentally different go-to-market challenge. The buyer profile question — does this company value training? — is necessary but not sufficient. The deeper question is whether their products can be orchestrated into a Skillable environment at all. Whether those products are technically complex enough that hands-on practice creates real value. Whether the company can build and sustain a lab program once they are a customer.</w:t>
+        <w:t>This creates a fundamentally different go-to-market challenge. The buyer profile question — does this company value training? — is necessary but not sufficient. The deeper question is whether their products can be orchestrated into a Skillable environment at all. Whether those products are complex enough that hands-on practice creates real value. Whether the company can build and sustain a lab program once they are a customer.</w:t>
       </w:r>
     </w:p>
     <w:p>
@@ -272,7 +272,7 @@
           <w:color w:val="1A1A1A"/>
           <w:sz w:val="20"/>
         </w:rPr>
-        <w:t xml:space="preserve">Is the product technically complex enough for labs to create real value? </w:t>
+        <w:t xml:space="preserve">Is the product complex enough for labs to create real value? </w:t>
       </w:r>
       <w:r>
         <w:rPr>
@@ -282,7 +282,7 @@
           <w:color w:val="1A1A1A"/>
           <w:sz w:val="20"/>
         </w:rPr>
-        <w:t>Simple products with shallow workflows do not benefit enough from hands-on practice to justify the investment. Products with deep administrative workflows, meaningful configuration decisions, and real consequence of error — those are where labs change what learners can actually do.</w:t>
+        <w:t>Simple products with shallow workflows don’t benefit enough from hands-on practice to justify the investment. Products with deep administrative workflows, meaningful configuration decisions, and real consequence of error — those are where labs change what learners can actually do.</w:t>
       </w:r>
     </w:p>
     <w:p>
@@ -416,7 +416,7 @@
           <w:color w:val="1A1A1A"/>
           <w:sz w:val="20"/>
         </w:rPr>
-        <w:t>That fact is findable in public documentation before a single sales conversation begins. Workday was not a bad lead. It was motivated, capable people who invested significant time before hitting a wall that was always there. The Workday pattern repeats whenever product-level technical fit is evaluated late — or not at all.</w:t>
+        <w:t>These are specific technical facts findable in public documentation before a single sales conversation begins. Workday wasn’t a bad lead. It was motivated, capable people who invested significant time before hitting a wall that was always there — because product-level technical fit was never evaluated before the pursuit began.</w:t>
       </w:r>
     </w:p>
     <w:p>
@@ -604,7 +604,7 @@
           <w:color w:val="136945"/>
           <w:sz w:val="22"/>
         </w:rPr>
-        <w:t>Designer — Closing the Adoption Gap</w:t>
+        <w:t>Designer — closing the adoption gap</w:t>
       </w:r>
     </w:p>
     <w:p>
@@ -746,7 +746,7 @@
           <w:color w:val="136945"/>
           <w:sz w:val="22"/>
         </w:rPr>
-        <w:t>Inspector — Proving Labability and Impact</w:t>
+        <w:t>Inspector — proving labability and impact</w:t>
       </w:r>
     </w:p>
     <w:p>
@@ -932,7 +932,7 @@
           <w:color w:val="136945"/>
           <w:sz w:val="22"/>
         </w:rPr>
-        <w:t>Prospector — Finding the Right Companies</w:t>
+        <w:t>Prospector — finding the right companies</w:t>
       </w:r>
     </w:p>
     <w:p>

</xml_diff>

<commit_message>
Major structural refactor: problem-then-solution per tool, AI moments bold+purple
- Section 1 now ends after The PaaS Difference; three subsections removed
- Section 2 retitled 'Three challenges. Three tools. One platform.'
- Each tool section leads with the problem it solves, then the solution
- Tool order inverted: Designer → Inspector → Prospector
- AI moments now bold+purple, subject-verb-object (tool doing the thing)
- Prospector section transitions directly into HubSpot section
- 'firmographic' replaced with plain-language description
- The Integration Principle, The PaaS Difference: title case (3-word rule)
- Regenerate Word doc

Co-Authored-By: Claude Sonnet 4.6 <noreply@anthropic.com>
</commit_message>
<xml_diff>
--- a/docs/Skillable-Intelligence-Platform.docx
+++ b/docs/Skillable-Intelligence-Platform.docx
@@ -125,7 +125,7 @@
           <w:color w:val="136945"/>
           <w:sz w:val="22"/>
         </w:rPr>
-        <w:t>The PaaS difference</w:t>
+        <w:t>The PaaS Difference</w:t>
       </w:r>
     </w:p>
     <w:p>
@@ -155,7 +155,7 @@
           <w:color w:val="1A1A1A"/>
           <w:sz w:val="20"/>
         </w:rPr>
-        <w:t>Skillable is different. We do not deliver our own software. We orchestrate other companies’ software into hands-on lab environments — real products, real interfaces, real consequence of error, accessible to a learner anywhere. What we sell is the infrastructure that makes that possible.</w:t>
+        <w:t>Skillable is different. We do not deliver our own software. We orchestrate other companies’ software into hands-on lab environments — real products, real interfaces, real consequence of error, accessible to a learner anywhere. What we sell is the platform that makes so many different things possible at scale.</w:t>
       </w:r>
     </w:p>
     <w:p>
@@ -185,373 +185,7 @@
           <w:color w:val="1A1A1A"/>
           <w:sz w:val="20"/>
         </w:rPr>
-        <w:t>These questions cannot be answered with firmographic data. They require a different kind of analysis entirely. That is what Intelligence provides.</w:t>
-      </w:r>
-    </w:p>
-    <w:p>
-      <w:pPr>
-        <w:spacing w:before="100" w:after="30"/>
-      </w:pPr>
-      <w:r>
-        <w:rPr>
-          <w:rFonts w:ascii="Calibri" w:hAnsi="Calibri"/>
-          <w:b/>
-          <w:i w:val="0"/>
-          <w:color w:val="136945"/>
-          <w:sz w:val="22"/>
-        </w:rPr>
-        <w:t>Knowing exactly who’s in our ICP — before we spend a dollar</w:t>
-      </w:r>
-    </w:p>
-    <w:p>
-      <w:pPr>
-        <w:spacing w:before="0" w:after="60"/>
-      </w:pPr>
-      <w:r>
-        <w:rPr>
-          <w:rFonts w:ascii="Calibri" w:hAnsi="Calibri"/>
-          <w:b w:val="0"/>
-          <w:i w:val="0"/>
-          <w:color w:val="1A1A1A"/>
-          <w:sz w:val="20"/>
-        </w:rPr>
-        <w:t>Platform companies cannot qualify prospects the way product companies do. The tools Marketing uses — ZoomInfo, 6sense, HubSpot, LinkedIn Sales Navigator — are built to identify buyers who match a profile. For Skillable, that is the wrong question. The right question is whether a company’s products can be delivered as hands-on lab experiences. That is a technical assessment, not a firmographic one.</w:t>
-      </w:r>
-    </w:p>
-    <w:p>
-      <w:pPr>
-        <w:spacing w:before="0" w:after="60"/>
-      </w:pPr>
-      <w:r>
-        <w:rPr>
-          <w:rFonts w:ascii="Calibri" w:hAnsi="Calibri"/>
-          <w:b w:val="0"/>
-          <w:i w:val="0"/>
-          <w:color w:val="1A1A1A"/>
-          <w:sz w:val="20"/>
-        </w:rPr>
-        <w:t>We evaluate every prospect across three dimensions:</w:t>
-      </w:r>
-    </w:p>
-    <w:p>
-      <w:pPr>
-        <w:pStyle w:val="ListBullet"/>
-        <w:spacing w:before="0" w:after="40"/>
-      </w:pPr>
-      <w:r>
-        <w:rPr>
-          <w:rFonts w:ascii="Calibri" w:hAnsi="Calibri"/>
-          <w:b/>
-          <w:i w:val="0"/>
-          <w:color w:val="1A1A1A"/>
-          <w:sz w:val="20"/>
-        </w:rPr>
-        <w:t xml:space="preserve">Can we deliver a lab for this company’s products? </w:t>
-      </w:r>
-      <w:r>
-        <w:rPr>
-          <w:rFonts w:ascii="Calibri" w:hAnsi="Calibri"/>
-          <w:b w:val="0"/>
-          <w:i w:val="0"/>
-          <w:color w:val="1A1A1A"/>
-          <w:sz w:val="20"/>
-        </w:rPr>
-        <w:t>This is the primary filter. If the answer is no, nothing else matters — not the size of their training organization, not the depth of their content team, not their enthusiasm for hands-on learning. A company whose products cannot be orchestrated into a Skillable environment is not a prospect.</w:t>
-      </w:r>
-    </w:p>
-    <w:p>
-      <w:pPr>
-        <w:pStyle w:val="ListBullet"/>
-        <w:spacing w:before="0" w:after="40"/>
-      </w:pPr>
-      <w:r>
-        <w:rPr>
-          <w:rFonts w:ascii="Calibri" w:hAnsi="Calibri"/>
-          <w:b/>
-          <w:i w:val="0"/>
-          <w:color w:val="1A1A1A"/>
-          <w:sz w:val="20"/>
-        </w:rPr>
-        <w:t xml:space="preserve">Is the product complex enough for labs to create real value? </w:t>
-      </w:r>
-      <w:r>
-        <w:rPr>
-          <w:rFonts w:ascii="Calibri" w:hAnsi="Calibri"/>
-          <w:b w:val="0"/>
-          <w:i w:val="0"/>
-          <w:color w:val="1A1A1A"/>
-          <w:sz w:val="20"/>
-        </w:rPr>
-        <w:t>Simple products with shallow workflows don’t benefit enough from hands-on practice to justify the investment. Products with deep administrative workflows, meaningful configuration decisions, and real consequence of error — those are where labs change what learners can actually do.</w:t>
-      </w:r>
-    </w:p>
-    <w:p>
-      <w:pPr>
-        <w:pStyle w:val="ListBullet"/>
-        <w:spacing w:before="0" w:after="60"/>
-      </w:pPr>
-      <w:r>
-        <w:rPr>
-          <w:rFonts w:ascii="Calibri" w:hAnsi="Calibri"/>
-          <w:b/>
-          <w:i w:val="0"/>
-          <w:color w:val="1A1A1A"/>
-          <w:sz w:val="20"/>
-        </w:rPr>
-        <w:t xml:space="preserve">Does the organization have what it takes to build and sustain a program? </w:t>
-      </w:r>
-      <w:r>
-        <w:rPr>
-          <w:rFonts w:ascii="Calibri" w:hAnsi="Calibri"/>
-          <w:b w:val="0"/>
-          <w:i w:val="0"/>
-          <w:color w:val="1A1A1A"/>
-          <w:sz w:val="20"/>
-        </w:rPr>
-        <w:t>Content team skills, technical enablement maturity, program leadership. Some companies have it today. Others have the organizational DNA to build it. Either can become a strong customer. Companies with neither are high-risk programs regardless of product fit.</w:t>
-      </w:r>
-    </w:p>
-    <w:p>
-      <w:pPr>
-        <w:spacing w:before="0" w:after="60"/>
-      </w:pPr>
-      <w:r>
-        <w:rPr>
-          <w:rFonts w:ascii="Calibri" w:hAnsi="Calibri"/>
-          <w:b w:val="0"/>
-          <w:i w:val="0"/>
-          <w:color w:val="1A1A1A"/>
-          <w:sz w:val="20"/>
-        </w:rPr>
-        <w:t>The Workday pattern illustrates what happens when this analysis does not happen early. On every traditional marketing signal, Workday is an ideal prospect: world-class training organization, dedicated learning division, deep technical enablement culture, massive install base. Two of the three dimensions are strong. The third ends the conversation.</w:t>
-      </w:r>
-    </w:p>
-    <w:p>
-      <w:pPr>
-        <w:pStyle w:val="ListBullet"/>
-        <w:spacing w:before="0" w:after="40"/>
-      </w:pPr>
-      <w:r>
-        <w:rPr>
-          <w:rFonts w:ascii="Calibri" w:hAnsi="Calibri"/>
-          <w:b/>
-          <w:i w:val="0"/>
-          <w:color w:val="1A1A1A"/>
-          <w:sz w:val="20"/>
-        </w:rPr>
-        <w:t xml:space="preserve">Pure multi-tenant architecture — </w:t>
-      </w:r>
-      <w:r>
-        <w:rPr>
-          <w:rFonts w:ascii="Calibri" w:hAnsi="Calibri"/>
-          <w:b w:val="0"/>
-          <w:i w:val="0"/>
-          <w:color w:val="1A1A1A"/>
-          <w:sz w:val="20"/>
-        </w:rPr>
-        <w:t>every customer shares the same cloud environment. There is no Workday instance to give a learner. The product is architecturally incapable of per-learner isolation.</w:t>
-      </w:r>
-    </w:p>
-    <w:p>
-      <w:pPr>
-        <w:pStyle w:val="ListBullet"/>
-        <w:spacing w:before="0" w:after="40"/>
-      </w:pPr>
-      <w:r>
-        <w:rPr>
-          <w:rFonts w:ascii="Calibri" w:hAnsi="Calibri"/>
-          <w:b/>
-          <w:i w:val="0"/>
-          <w:color w:val="1A1A1A"/>
-          <w:sz w:val="20"/>
-        </w:rPr>
-        <w:t xml:space="preserve">No provisioning API — </w:t>
-      </w:r>
-      <w:r>
-        <w:rPr>
-          <w:rFonts w:ascii="Calibri" w:hAnsi="Calibri"/>
-          <w:b w:val="0"/>
-          <w:i w:val="0"/>
-          <w:color w:val="1A1A1A"/>
-          <w:sz w:val="20"/>
-        </w:rPr>
-        <w:t>no mechanism to spin up an individual environment programmatically. Skillable’s entire delivery model depends on this capability.</w:t>
-      </w:r>
-    </w:p>
-    <w:p>
-      <w:pPr>
-        <w:pStyle w:val="ListBullet"/>
-        <w:spacing w:before="0" w:after="60"/>
-      </w:pPr>
-      <w:r>
-        <w:rPr>
-          <w:rFonts w:ascii="Calibri" w:hAnsi="Calibri"/>
-          <w:b/>
-          <w:i w:val="0"/>
-          <w:color w:val="1A1A1A"/>
-          <w:sz w:val="20"/>
-        </w:rPr>
-        <w:t xml:space="preserve">No deployment model — </w:t>
-      </w:r>
-      <w:r>
-        <w:rPr>
-          <w:rFonts w:ascii="Calibri" w:hAnsi="Calibri"/>
-          <w:b w:val="0"/>
-          <w:i w:val="0"/>
-          <w:color w:val="1A1A1A"/>
-          <w:sz w:val="20"/>
-        </w:rPr>
-        <w:t>nothing to install, containerize, or slice.</w:t>
-      </w:r>
-    </w:p>
-    <w:p>
-      <w:pPr>
-        <w:spacing w:before="0" w:after="60"/>
-      </w:pPr>
-      <w:r>
-        <w:rPr>
-          <w:rFonts w:ascii="Calibri" w:hAnsi="Calibri"/>
-          <w:b w:val="0"/>
-          <w:i w:val="0"/>
-          <w:color w:val="1A1A1A"/>
-          <w:sz w:val="20"/>
-        </w:rPr>
-        <w:t>These are specific technical facts findable in public documentation before a single sales conversation begins. Workday wasn’t a bad lead. It was motivated, capable people who invested significant time before hitting a wall that was always there — because product-level technical fit was never evaluated before the pursuit began.</w:t>
-      </w:r>
-    </w:p>
-    <w:p>
-      <w:pPr>
-        <w:spacing w:before="0" w:after="60"/>
-      </w:pPr>
-      <w:r>
-        <w:rPr>
-          <w:rFonts w:ascii="Calibri" w:hAnsi="Calibri"/>
-          <w:b w:val="0"/>
-          <w:i w:val="0"/>
-          <w:color w:val="1A1A1A"/>
-          <w:sz w:val="20"/>
-        </w:rPr>
-        <w:t>The same logic runs in the other direction. When Fortinet is a strong fit, it is not because Fortinet resembles other good customers as a company. It is because Fortinet’s products have specific technical characteristics — multi-VM topology, deep administrative workflows, strong API surface, real consequence of misconfiguration — that make them ideal for hands-on labs. Every company selling products with those same characteristics is a strong fit for the same reasons. The competitive map of a strong-fit customer is a pre-qualified prospect list.</w:t>
-      </w:r>
-    </w:p>
-    <w:p>
-      <w:pPr>
-        <w:spacing w:before="100" w:after="30"/>
-      </w:pPr>
-      <w:r>
-        <w:rPr>
-          <w:rFonts w:ascii="Calibri" w:hAnsi="Calibri"/>
-          <w:b/>
-          <w:i w:val="0"/>
-          <w:color w:val="136945"/>
-          <w:sz w:val="22"/>
-        </w:rPr>
-        <w:t>Proving labability and impact — with SE-level depth at scale</w:t>
-      </w:r>
-    </w:p>
-    <w:p>
-      <w:pPr>
-        <w:spacing w:before="0" w:after="60"/>
-      </w:pPr>
-      <w:r>
-        <w:rPr>
-          <w:rFonts w:ascii="Calibri" w:hAnsi="Calibri"/>
-          <w:b w:val="0"/>
-          <w:i w:val="0"/>
-          <w:color w:val="1A1A1A"/>
-          <w:sz w:val="20"/>
-        </w:rPr>
-        <w:t>Proving that a Skillable lab program will work for a specific customer’s products requires deep technical analysis. Which delivery path is right for this product — standard virtual machine, cloud environment slice, containerized workload, custom integration? What are the architectural constraints? What would a realistic program look like in terms of scope, seat time, and scoring approach? What is the estimated consumption potential?</w:t>
-      </w:r>
-    </w:p>
-    <w:p>
-      <w:pPr>
-        <w:spacing w:before="0" w:after="60"/>
-      </w:pPr>
-      <w:r>
-        <w:rPr>
-          <w:rFonts w:ascii="Calibri" w:hAnsi="Calibri"/>
-          <w:b w:val="0"/>
-          <w:i w:val="0"/>
-          <w:color w:val="1A1A1A"/>
-          <w:sz w:val="20"/>
-        </w:rPr>
-        <w:t>This is exactly the kind of work a skilled Solutions Engineer does well. It requires knowing Skillable’s platform deeply — delivery paths, technical constraints, feature availability, scoring feasibility — and applying that knowledge to a specific product’s architecture and deployment model. That synthesis takes hours per company, in a live conversation, with access to documentation and a customer contact who can fill in the gaps.</w:t>
-      </w:r>
-    </w:p>
-    <w:p>
-      <w:pPr>
-        <w:spacing w:before="0" w:after="60"/>
-      </w:pPr>
-      <w:r>
-        <w:rPr>
-          <w:rFonts w:ascii="Calibri" w:hAnsi="Calibri"/>
-          <w:b w:val="0"/>
-          <w:i w:val="0"/>
-          <w:color w:val="1A1A1A"/>
-          <w:sz w:val="20"/>
-        </w:rPr>
-        <w:t>The result is that qualification depth is rationed. It flows to deals already far enough along to justify the time. Early-stage prospects get a general conversation. The technical questions that would surface a Workday pattern early — before marketing dollars are spent, before SE time is committed — often go unasked until it is too late.</w:t>
-      </w:r>
-    </w:p>
-    <w:p>
-      <w:pPr>
-        <w:spacing w:before="100" w:after="30"/>
-      </w:pPr>
-      <w:r>
-        <w:rPr>
-          <w:rFonts w:ascii="Calibri" w:hAnsi="Calibri"/>
-          <w:b/>
-          <w:i w:val="0"/>
-          <w:color w:val="136945"/>
-          <w:sz w:val="22"/>
-        </w:rPr>
-        <w:t>Jump-starting customer adoption — accelerate the shift to expansion</w:t>
-      </w:r>
-    </w:p>
-    <w:p>
-      <w:pPr>
-        <w:spacing w:before="0" w:after="60"/>
-      </w:pPr>
-      <w:r>
-        <w:rPr>
-          <w:rFonts w:ascii="Calibri" w:hAnsi="Calibri"/>
-          <w:b w:val="0"/>
-          <w:i w:val="0"/>
-          <w:color w:val="1A1A1A"/>
-          <w:sz w:val="20"/>
-        </w:rPr>
-        <w:t>A signed contract is not an adopted customer. The gap between ‘we want to build labs’ and ‘we have a running program’ is wide, and most customers cannot cross it without structured guidance.</w:t>
-      </w:r>
-    </w:p>
-    <w:p>
-      <w:pPr>
-        <w:spacing w:before="0" w:after="60"/>
-      </w:pPr>
-      <w:r>
-        <w:rPr>
-          <w:rFonts w:ascii="Calibri" w:hAnsi="Calibri"/>
-          <w:b w:val="0"/>
-          <w:i w:val="0"/>
-          <w:color w:val="1A1A1A"/>
-          <w:sz w:val="20"/>
-        </w:rPr>
-        <w:t>Program design is a specialized skill. Most buyers — even technically sophisticated ones with strong content teams — have never designed a hands-on lab curriculum. They have built documentation, recorded videos, written certification exams. They have not mapped a product’s administrative workflows to a sequence of learner activities, defined scoring logic for hands-on tasks, or produced a structured brief that a lab developer can build against without extensive back-and-forth.</w:t>
-      </w:r>
-    </w:p>
-    <w:p>
-      <w:pPr>
-        <w:spacing w:before="0" w:after="60"/>
-      </w:pPr>
-      <w:r>
-        <w:rPr>
-          <w:rFonts w:ascii="Calibri" w:hAnsi="Calibri"/>
-          <w:b w:val="0"/>
-          <w:i w:val="0"/>
-          <w:color w:val="1A1A1A"/>
-          <w:sz w:val="20"/>
-        </w:rPr>
-        <w:t>Without a process that takes them from goals and audience to a complete, buildable program architecture, customers stall at the design phase. In a consumption model, a stalled customer is not just a missed upsell opportunity — it is a churn risk. A customer who has not built a program has not realized value. A customer who has not realized value does not renew.</w:t>
+        <w:t>These questions cannot be answered with the exhaustive-but-typical data provided by leading Marketing account intelligence software. They require a different kind of analysis entirely. That is what Intelligence provides.</w:t>
       </w:r>
     </w:p>
     <w:p>
@@ -574,7 +208,7 @@
           <w:color w:val="136945"/>
           <w:sz w:val="26"/>
         </w:rPr>
-        <w:t>Three tools. One platform.</w:t>
+        <w:t>Three challenges. Three tools. One platform.</w:t>
       </w:r>
     </w:p>
     <w:p>
@@ -589,7 +223,7 @@
           <w:color w:val="1A1A1A"/>
           <w:sz w:val="20"/>
         </w:rPr>
-        <w:t>Each tool in Skillable Intelligence addresses one of the three challenges directly. All three share the same research and scoring engine — which means every analysis makes the entire platform smarter. A company Prospector evaluates is available to Inspector without re-running research. An Inspector analysis seeds Designer with the product context it needs from day one. The intelligence compounds with every use.</w:t>
+        <w:t>Each tool addresses one of the three challenges directly. All three share the same research and scoring engine — which means every analysis makes the entire platform smarter. A company Prospector evaluates is available to Inspector without re-running research. An Inspector analysis seeds Designer with the product context it needs from day one. The intelligence compounds with every use.</w:t>
       </w:r>
     </w:p>
     <w:p>
@@ -619,7 +253,7 @@
           <w:color w:val="1A1A1A"/>
           <w:sz w:val="20"/>
         </w:rPr>
-        <w:t>Designer takes an Inspector analysis and guides program owners, instructional designers, and subject matter experts through the full process of designing a lab program. From goals and audience definition through a complete approved outline, activity-level content, and a Skillable Studio-ready export package.</w:t>
+        <w:t>A signed contract is not an adopted customer. The gap between “we want to build labs” and “we have a running program” is wide, and most customers cannot cross it without structured guidance.</w:t>
       </w:r>
     </w:p>
     <w:p>
@@ -634,7 +268,7 @@
           <w:color w:val="1A1A1A"/>
           <w:sz w:val="20"/>
         </w:rPr>
-        <w:t>The process is structured. It does not require the customer to know how to design a lab program — that is the point. Designer asks the right questions, sequences the decisions correctly, and generates a complete program architecture that a contracted lab developer can build against immediately.</w:t>
+        <w:t>Program design is a specialized skill. Most buyers — even technically sophisticated ones with strong content teams — have never designed a hands-on lab curriculum. They’ve built documentation, recorded videos, written certification exams. They have not mapped a product’s administrative workflows to a sequence of learner activities, defined scoring logic for hands-on tasks, or produced a structured brief that a lab developer can build against without extensive back-and-forth.</w:t>
       </w:r>
     </w:p>
     <w:p>
@@ -644,22 +278,46 @@
       <w:r>
         <w:rPr>
           <w:rFonts w:ascii="Calibri" w:hAnsi="Calibri"/>
+          <w:b w:val="0"/>
+          <w:i w:val="0"/>
           <w:color w:val="1A1A1A"/>
           <w:sz w:val="20"/>
         </w:rPr>
-        <w:t xml:space="preserve">The output is not just a plan. Designer generates a </w:t>
+        <w:t>Without a process that takes them from goals and audience to a complete, buildable program architecture, customers stall at the design phase. In a consumption model, a stalled customer is not just a missed upsell opportunity — it is a churn risk. A customer who has not built a program has not realized value. A customer who has not realized value does not renew.</w:t>
+      </w:r>
+    </w:p>
+    <w:p>
+      <w:pPr>
+        <w:spacing w:before="0" w:after="60"/>
+      </w:pPr>
+      <w:r>
+        <w:rPr>
+          <w:rFonts w:ascii="Calibri" w:hAnsi="Calibri"/>
+          <w:b w:val="0"/>
+          <w:i w:val="0"/>
+          <w:color w:val="1A1A1A"/>
+          <w:sz w:val="20"/>
+        </w:rPr>
+        <w:t>Designer guides program owners, instructional designers, and subject matter experts through the full process — from goals and audience definition through a complete approved outline, activity-level content, and a Skillable Studio-ready export package. It doesn’t require the customer to know how to design a lab program. Designer asks the right questions, sequences the decisions correctly, and generates a complete program architecture that a contracted lab developer can build against immediately.</w:t>
+      </w:r>
+    </w:p>
+    <w:p>
+      <w:pPr>
+        <w:spacing w:before="0" w:after="60"/>
+      </w:pPr>
+      <w:r>
+        <w:rPr>
+          <w:rFonts w:ascii="Calibri" w:hAnsi="Calibri"/>
+          <w:b/>
+          <w:color w:val="7000FF"/>
+          <w:sz w:val="20"/>
+        </w:rPr>
+        <w:t>Designer generates a complete Bill of Materials</w:t>
       </w:r>
       <w:r>
         <w:rPr>
           <w:rFonts w:ascii="Calibri" w:hAnsi="Calibri"/>
-          <w:color w:val="7000FF"/>
-          <w:sz w:val="20"/>
-        </w:rPr>
-        <w:t>complete Bill of Materials</w:t>
-      </w:r>
-      <w:r>
-        <w:rPr>
-          <w:rFonts w:ascii="Calibri" w:hAnsi="Calibri"/>
+          <w:b w:val="0"/>
           <w:color w:val="1A1A1A"/>
           <w:sz w:val="20"/>
         </w:rPr>
@@ -761,6 +419,51 @@
           <w:color w:val="1A1A1A"/>
           <w:sz w:val="20"/>
         </w:rPr>
+        <w:t>Proving that a Skillable lab program will work for a specific customer’s products requires deep technical analysis. Which delivery path is right — standard virtual machine, cloud environment slice, containerized workload, custom integration? What are the architectural constraints? What would a realistic program look like in terms of scope, seat time, and scoring approach? What is the estimated consumption potential?</w:t>
+      </w:r>
+    </w:p>
+    <w:p>
+      <w:pPr>
+        <w:spacing w:before="0" w:after="60"/>
+      </w:pPr>
+      <w:r>
+        <w:rPr>
+          <w:rFonts w:ascii="Calibri" w:hAnsi="Calibri"/>
+          <w:b w:val="0"/>
+          <w:i w:val="0"/>
+          <w:color w:val="1A1A1A"/>
+          <w:sz w:val="20"/>
+        </w:rPr>
+        <w:t>This is exactly the kind of work a skilled Solutions Engineer does well. It requires knowing Skillable’s platform deeply — delivery paths, technical constraints, feature availability, scoring feasibility — and applying that knowledge to a specific product’s architecture. That synthesis takes hours per company, in a live conversation, with access to documentation and a customer contact who can fill in the gaps.</w:t>
+      </w:r>
+    </w:p>
+    <w:p>
+      <w:pPr>
+        <w:spacing w:before="0" w:after="60"/>
+      </w:pPr>
+      <w:r>
+        <w:rPr>
+          <w:rFonts w:ascii="Calibri" w:hAnsi="Calibri"/>
+          <w:b w:val="0"/>
+          <w:i w:val="0"/>
+          <w:color w:val="1A1A1A"/>
+          <w:sz w:val="20"/>
+        </w:rPr>
+        <w:t>The result is that qualification depth is rationed. It flows to deals already far enough along to justify the time. Early-stage prospects get a general conversation. The technical questions that would surface a Workday pattern early — before marketing dollars are spent, before SE time is committed — often go unasked until it is too late.</w:t>
+      </w:r>
+    </w:p>
+    <w:p>
+      <w:pPr>
+        <w:spacing w:before="0" w:after="60"/>
+      </w:pPr>
+      <w:r>
+        <w:rPr>
+          <w:rFonts w:ascii="Calibri" w:hAnsi="Calibri"/>
+          <w:b w:val="0"/>
+          <w:i w:val="0"/>
+          <w:color w:val="1A1A1A"/>
+          <w:sz w:val="20"/>
+        </w:rPr>
         <w:t>Inspector performs a deep product-level analysis of a specific company. It runs in two stages.</w:t>
       </w:r>
     </w:p>
@@ -777,7 +480,7 @@
           <w:color w:val="1A1A1A"/>
           <w:sz w:val="20"/>
         </w:rPr>
-        <w:t xml:space="preserve">Stage 1 — Company Report: </w:t>
+        <w:t xml:space="preserve">Stage 1 — Company report: </w:t>
       </w:r>
       <w:r>
         <w:rPr>
@@ -803,7 +506,7 @@
           <w:color w:val="1A1A1A"/>
           <w:sz w:val="20"/>
         </w:rPr>
-        <w:t xml:space="preserve">Stage 2 — Deep Dive: </w:t>
+        <w:t xml:space="preserve">Stage 2 — Deep dive: </w:t>
       </w:r>
       <w:r>
         <w:rPr>
@@ -823,18 +526,20 @@
       <w:r>
         <w:rPr>
           <w:rFonts w:ascii="Calibri" w:hAnsi="Calibri"/>
-          <w:color w:val="1A1A1A"/>
+          <w:b/>
+          <w:color w:val="7000FF"/>
           <w:sz w:val="20"/>
         </w:rPr>
-        <w:t xml:space="preserve">A seller walking into a conversation with a Stage 2 Inspector report knows what the customer’s products can and cannot do on the Skillable platform, which delivery path makes sense and why, and what the estimated consumption potential is. That is not a discovery conversation. It is a </w:t>
+        <w:t>Inspector turns every sales conversation into a solution conversation.</w:t>
       </w:r>
       <w:r>
         <w:rPr>
           <w:rFonts w:ascii="Calibri" w:hAnsi="Calibri"/>
-          <w:color w:val="7000FF"/>
+          <w:b w:val="0"/>
+          <w:color w:val="1A1A1A"/>
           <w:sz w:val="20"/>
         </w:rPr>
-        <w:t>solution conversation.</w:t>
+        <w:t xml:space="preserve"> A seller walking into a meeting with a Stage 2 report knows what the customer’s products can and cannot do on the Skillable platform, which delivery path makes sense and why, and what the estimated consumption potential is. That is not discovery. That is a standing start.</w:t>
       </w:r>
       <w:r>
         <w:drawing>
@@ -947,6 +652,237 @@
           <w:color w:val="1A1A1A"/>
           <w:sz w:val="20"/>
         </w:rPr>
+        <w:t>Platform companies cannot qualify prospects the way product companies do. The tools Marketing uses — ZoomInfo, 6sense, HubSpot, LinkedIn Sales Navigator — are built to identify buyers who match a profile. For Skillable, that is the wrong question. The right question is whether a company’s products can be delivered as hands-on lab experiences. That is a technical assessment, not a firmographic one.</w:t>
+      </w:r>
+    </w:p>
+    <w:p>
+      <w:pPr>
+        <w:spacing w:before="0" w:after="60"/>
+      </w:pPr>
+      <w:r>
+        <w:rPr>
+          <w:rFonts w:ascii="Calibri" w:hAnsi="Calibri"/>
+          <w:b w:val="0"/>
+          <w:i w:val="0"/>
+          <w:color w:val="1A1A1A"/>
+          <w:sz w:val="20"/>
+        </w:rPr>
+        <w:t>We evaluate every prospect across three dimensions:</w:t>
+      </w:r>
+    </w:p>
+    <w:p>
+      <w:pPr>
+        <w:pStyle w:val="ListBullet"/>
+        <w:spacing w:before="0" w:after="40"/>
+      </w:pPr>
+      <w:r>
+        <w:rPr>
+          <w:rFonts w:ascii="Calibri" w:hAnsi="Calibri"/>
+          <w:b/>
+          <w:i w:val="0"/>
+          <w:color w:val="1A1A1A"/>
+          <w:sz w:val="20"/>
+        </w:rPr>
+        <w:t xml:space="preserve">Can we deliver a lab for this company’s products? </w:t>
+      </w:r>
+      <w:r>
+        <w:rPr>
+          <w:rFonts w:ascii="Calibri" w:hAnsi="Calibri"/>
+          <w:b w:val="0"/>
+          <w:i w:val="0"/>
+          <w:color w:val="1A1A1A"/>
+          <w:sz w:val="20"/>
+        </w:rPr>
+        <w:t>This is the primary filter. If the answer is no, nothing else matters — not the size of their training organization, not the depth of their content team, not their enthusiasm for hands-on learning. A company whose products cannot be orchestrated into a Skillable environment is not a prospect.</w:t>
+      </w:r>
+    </w:p>
+    <w:p>
+      <w:pPr>
+        <w:pStyle w:val="ListBullet"/>
+        <w:spacing w:before="0" w:after="40"/>
+      </w:pPr>
+      <w:r>
+        <w:rPr>
+          <w:rFonts w:ascii="Calibri" w:hAnsi="Calibri"/>
+          <w:b/>
+          <w:i w:val="0"/>
+          <w:color w:val="1A1A1A"/>
+          <w:sz w:val="20"/>
+        </w:rPr>
+        <w:t xml:space="preserve">Is the product complex enough for labs to create real value? </w:t>
+      </w:r>
+      <w:r>
+        <w:rPr>
+          <w:rFonts w:ascii="Calibri" w:hAnsi="Calibri"/>
+          <w:b w:val="0"/>
+          <w:i w:val="0"/>
+          <w:color w:val="1A1A1A"/>
+          <w:sz w:val="20"/>
+        </w:rPr>
+        <w:t>Simple products with shallow workflows don’t benefit enough from hands-on practice to justify the investment. Products with deep administrative workflows, meaningful configuration decisions, and real consequence of error — those are where labs change what learners can actually do.</w:t>
+      </w:r>
+    </w:p>
+    <w:p>
+      <w:pPr>
+        <w:pStyle w:val="ListBullet"/>
+        <w:spacing w:before="0" w:after="60"/>
+      </w:pPr>
+      <w:r>
+        <w:rPr>
+          <w:rFonts w:ascii="Calibri" w:hAnsi="Calibri"/>
+          <w:b/>
+          <w:i w:val="0"/>
+          <w:color w:val="1A1A1A"/>
+          <w:sz w:val="20"/>
+        </w:rPr>
+        <w:t xml:space="preserve">Does the organization have what it takes to build and sustain a program? </w:t>
+      </w:r>
+      <w:r>
+        <w:rPr>
+          <w:rFonts w:ascii="Calibri" w:hAnsi="Calibri"/>
+          <w:b w:val="0"/>
+          <w:i w:val="0"/>
+          <w:color w:val="1A1A1A"/>
+          <w:sz w:val="20"/>
+        </w:rPr>
+        <w:t>Content team skills, technical enablement maturity, program leadership. Some companies have it today. Others have the organizational DNA to build it. Either can become a strong customer. Companies with neither are high-risk regardless of product fit.</w:t>
+      </w:r>
+    </w:p>
+    <w:p>
+      <w:pPr>
+        <w:spacing w:before="0" w:after="60"/>
+      </w:pPr>
+      <w:r>
+        <w:rPr>
+          <w:rFonts w:ascii="Calibri" w:hAnsi="Calibri"/>
+          <w:b w:val="0"/>
+          <w:i w:val="0"/>
+          <w:color w:val="1A1A1A"/>
+          <w:sz w:val="20"/>
+        </w:rPr>
+        <w:t>The Workday pattern illustrates what happens when this analysis doesn’t happen early. On every traditional marketing signal, Workday is an ideal prospect: world-class training organization, dedicated learning division, deep technical enablement culture, massive install base. Two of the three dimensions are strong. The third ends the conversation.</w:t>
+      </w:r>
+    </w:p>
+    <w:p>
+      <w:pPr>
+        <w:pStyle w:val="ListBullet"/>
+        <w:spacing w:before="0" w:after="40"/>
+      </w:pPr>
+      <w:r>
+        <w:rPr>
+          <w:rFonts w:ascii="Calibri" w:hAnsi="Calibri"/>
+          <w:b/>
+          <w:i w:val="0"/>
+          <w:color w:val="1A1A1A"/>
+          <w:sz w:val="20"/>
+        </w:rPr>
+        <w:t xml:space="preserve">Pure multi-tenant architecture — </w:t>
+      </w:r>
+      <w:r>
+        <w:rPr>
+          <w:rFonts w:ascii="Calibri" w:hAnsi="Calibri"/>
+          <w:b w:val="0"/>
+          <w:i w:val="0"/>
+          <w:color w:val="1A1A1A"/>
+          <w:sz w:val="20"/>
+        </w:rPr>
+        <w:t>every customer shares the same cloud environment. There is no Workday instance to give a learner.</w:t>
+      </w:r>
+    </w:p>
+    <w:p>
+      <w:pPr>
+        <w:pStyle w:val="ListBullet"/>
+        <w:spacing w:before="0" w:after="40"/>
+      </w:pPr>
+      <w:r>
+        <w:rPr>
+          <w:rFonts w:ascii="Calibri" w:hAnsi="Calibri"/>
+          <w:b/>
+          <w:i w:val="0"/>
+          <w:color w:val="1A1A1A"/>
+          <w:sz w:val="20"/>
+        </w:rPr>
+        <w:t xml:space="preserve">No provisioning API — </w:t>
+      </w:r>
+      <w:r>
+        <w:rPr>
+          <w:rFonts w:ascii="Calibri" w:hAnsi="Calibri"/>
+          <w:b w:val="0"/>
+          <w:i w:val="0"/>
+          <w:color w:val="1A1A1A"/>
+          <w:sz w:val="20"/>
+        </w:rPr>
+        <w:t>no mechanism to spin up an individual environment programmatically. Skillable’s entire delivery model depends on this capability.</w:t>
+      </w:r>
+    </w:p>
+    <w:p>
+      <w:pPr>
+        <w:pStyle w:val="ListBullet"/>
+        <w:spacing w:before="0" w:after="60"/>
+      </w:pPr>
+      <w:r>
+        <w:rPr>
+          <w:rFonts w:ascii="Calibri" w:hAnsi="Calibri"/>
+          <w:b/>
+          <w:i w:val="0"/>
+          <w:color w:val="1A1A1A"/>
+          <w:sz w:val="20"/>
+        </w:rPr>
+        <w:t xml:space="preserve">No deployment model — </w:t>
+      </w:r>
+      <w:r>
+        <w:rPr>
+          <w:rFonts w:ascii="Calibri" w:hAnsi="Calibri"/>
+          <w:b w:val="0"/>
+          <w:i w:val="0"/>
+          <w:color w:val="1A1A1A"/>
+          <w:sz w:val="20"/>
+        </w:rPr>
+        <w:t>nothing to install, containerize, or slice.</w:t>
+      </w:r>
+    </w:p>
+    <w:p>
+      <w:pPr>
+        <w:spacing w:before="0" w:after="60"/>
+      </w:pPr>
+      <w:r>
+        <w:rPr>
+          <w:rFonts w:ascii="Calibri" w:hAnsi="Calibri"/>
+          <w:b w:val="0"/>
+          <w:i w:val="0"/>
+          <w:color w:val="1A1A1A"/>
+          <w:sz w:val="20"/>
+        </w:rPr>
+        <w:t>These are specific technical facts findable in public documentation before a single sales conversation begins. Workday wasn’t a bad lead. It was motivated, capable people who invested significant time before hitting a wall that was always there — because product-level technical fit was never evaluated before the pursuit began.</w:t>
+      </w:r>
+    </w:p>
+    <w:p>
+      <w:pPr>
+        <w:spacing w:before="0" w:after="60"/>
+      </w:pPr>
+      <w:r>
+        <w:rPr>
+          <w:rFonts w:ascii="Calibri" w:hAnsi="Calibri"/>
+          <w:b w:val="0"/>
+          <w:i w:val="0"/>
+          <w:color w:val="1A1A1A"/>
+          <w:sz w:val="20"/>
+        </w:rPr>
+        <w:t>The same logic runs in the other direction. When Fortinet is a strong fit, it’s not because Fortinet resembles other good customers as a company. It’s because Fortinet’s products have specific technical characteristics — multi-VM topology, deep administrative workflows, strong API surface, real consequence of misconfiguration — that make them ideal for hands-on labs. Every company selling products with those same characteristics is a strong fit for the same reasons. The competitive map of a strong-fit customer is a pre-qualified prospect list.</w:t>
+      </w:r>
+    </w:p>
+    <w:p>
+      <w:pPr>
+        <w:spacing w:before="0" w:after="60"/>
+      </w:pPr>
+      <w:r>
+        <w:rPr>
+          <w:rFonts w:ascii="Calibri" w:hAnsi="Calibri"/>
+          <w:b w:val="0"/>
+          <w:i w:val="0"/>
+          <w:color w:val="1A1A1A"/>
+          <w:sz w:val="20"/>
+        </w:rPr>
         <w:t>Prospector is the go-to-market tool for Marketing and RevOps. It takes a list of companies and returns a ranked assessment of ICP fit — with product-level evidence, composite scores, verdicts, delivery path signals, and key contacts for every company on the list.</w:t>
       </w:r>
     </w:p>
@@ -957,26 +893,20 @@
       <w:r>
         <w:rPr>
           <w:rFonts w:ascii="Calibri" w:hAnsi="Calibri"/>
-          <w:color w:val="1A1A1A"/>
+          <w:b/>
+          <w:color w:val="7000FF"/>
           <w:sz w:val="20"/>
         </w:rPr>
-        <w:t xml:space="preserve">Marketing has never had access to </w:t>
+        <w:t>Prospector qualifies every company on product-level fit</w:t>
       </w:r>
       <w:r>
         <w:rPr>
           <w:rFonts w:ascii="Calibri" w:hAnsi="Calibri"/>
-          <w:color w:val="7000FF"/>
-          <w:sz w:val="20"/>
-        </w:rPr>
-        <w:t>product-level qualification</w:t>
-      </w:r>
-      <w:r>
-        <w:rPr>
-          <w:rFonts w:ascii="Calibri" w:hAnsi="Calibri"/>
+          <w:b w:val="0"/>
           <w:color w:val="1A1A1A"/>
           <w:sz w:val="20"/>
         </w:rPr>
-        <w:t xml:space="preserve"> data at the point of list building. Prospector makes it possible to screen a ZoomInfo export of 500 companies for technical orchestrability, product complexity, and organizational readiness before a sequence is written, a dollar is spent, or an SDR makes a call. Companies that clear all three dimensions go into outreach. Workday patterns come off the list — with specific, documented technical reasons on the Company record.</w:t>
+        <w:t xml:space="preserve"> before a sequence is written, a dollar is spent, or an SDR makes a call. Companies that clear all three dimensions go into outreach. Workday patterns come off the list — with specific, documented technical reasons on the Company record. Prospector also surfaces customer expansion opportunities — mapping the department landscape of existing accounts to identify adoption opportunities for existing labs, greenfield departments, and buyers ready to expand.</w:t>
       </w:r>
       <w:r>
         <w:drawing>
@@ -1029,21 +959,6 @@
       <w:r>
         <w:rPr>
           <w:rFonts w:ascii="Calibri" w:hAnsi="Calibri"/>
-          <w:b w:val="0"/>
-          <w:i w:val="0"/>
-          <w:color w:val="1A1A1A"/>
-          <w:sz w:val="20"/>
-        </w:rPr>
-        <w:t>Prospector also surfaces customer expansion opportunities — mapping the department landscape of existing accounts to identify adoption opportunities for existing labs, greenfield departments, and buyers ready to expand.</w:t>
-      </w:r>
-    </w:p>
-    <w:p>
-      <w:pPr>
-        <w:spacing w:before="0" w:after="60"/>
-      </w:pPr>
-      <w:r>
-        <w:rPr>
-          <w:rFonts w:ascii="Calibri" w:hAnsi="Calibri"/>
           <w:b/>
           <w:i w:val="0"/>
           <w:color w:val="1A1A1A"/>
@@ -1060,6 +975,21 @@
           <w:sz w:val="20"/>
         </w:rPr>
         <w:t>The list that goes into outreach is the right list. Every company on it has been evaluated on the question that actually determines Skillable fit — not on firmographic proxies that have nothing to do with whether their products can be orchestrated into a lab.</w:t>
+      </w:r>
+    </w:p>
+    <w:p>
+      <w:pPr>
+        <w:spacing w:before="0" w:after="60"/>
+      </w:pPr>
+      <w:r>
+        <w:rPr>
+          <w:rFonts w:ascii="Calibri" w:hAnsi="Calibri"/>
+          <w:b w:val="0"/>
+          <w:i w:val="0"/>
+          <w:color w:val="1A1A1A"/>
+          <w:sz w:val="20"/>
+        </w:rPr>
+        <w:t>All of this intelligence — fit scores, product signals, delivery path recommendations, key contacts — needs to reach the right people at the right moment. That is what the HubSpot integration is built to do.</w:t>
       </w:r>
     </w:p>
     <w:p>
@@ -1112,7 +1042,7 @@
           <w:color w:val="136945"/>
           <w:sz w:val="22"/>
         </w:rPr>
-        <w:t>The integration principle</w:t>
+        <w:t>The Integration Principle</w:t>
       </w:r>
     </w:p>
     <w:p>

</xml_diff>

<commit_message>
Full generator sync, content updates, regenerate
- Full sync of generator to markdown across all sections
- Designer: new opening sentences, discipline framing, bullet outputs, updated What it unlocks
- Inspector: new delivery path question, SE/TSM sentence, Case Board + Dossier terminology
- Prospector: parens for tools list, colon bullet labels, updated transition
- write_how(): new section title, normal body intro, updated headings (colons), Case Board/Dossier throughout
- write_recommendations(): Case Board terminology, updated Designer bullet
- Decisions table: Dossier multi-product question
- Remove page break between sections 1 and 2
- AI icon size increased to 0.23" (~28% larger)
- Smaller elegant bullet (7pt, manual indent)
- Regenerate Word doc

Co-Authored-By: Claude Sonnet 4.6 <noreply@anthropic.com>
</commit_message>
<xml_diff>
--- a/docs/Skillable-Intelligence-Platform.docx
+++ b/docs/Skillable-Intelligence-Platform.docx
@@ -67,9 +67,17 @@
     </w:p>
     <w:p>
       <w:pPr>
-        <w:pStyle w:val="ListBullet"/>
         <w:spacing w:before="0" w:after="40"/>
+        <w:ind w:left="432" w:hanging="216"/>
       </w:pPr>
+      <w:r>
+        <w:rPr>
+          <w:rFonts w:ascii="Calibri" w:hAnsi="Calibri"/>
+          <w:color w:val="1A1A1A"/>
+          <w:sz w:val="14"/>
+        </w:rPr>
+        <w:t xml:space="preserve">•  </w:t>
+      </w:r>
       <w:r>
         <w:rPr>
           <w:rFonts w:ascii="Calibri" w:hAnsi="Calibri"/>
@@ -83,9 +91,17 @@
     </w:p>
     <w:p>
       <w:pPr>
-        <w:pStyle w:val="ListBullet"/>
         <w:spacing w:before="0" w:after="40"/>
+        <w:ind w:left="432" w:hanging="216"/>
       </w:pPr>
+      <w:r>
+        <w:rPr>
+          <w:rFonts w:ascii="Calibri" w:hAnsi="Calibri"/>
+          <w:color w:val="1A1A1A"/>
+          <w:sz w:val="14"/>
+        </w:rPr>
+        <w:t xml:space="preserve">•  </w:t>
+      </w:r>
       <w:r>
         <w:rPr>
           <w:rFonts w:ascii="Calibri" w:hAnsi="Calibri"/>
@@ -99,9 +115,17 @@
     </w:p>
     <w:p>
       <w:pPr>
-        <w:pStyle w:val="ListBullet"/>
         <w:spacing w:before="0" w:after="60"/>
+        <w:ind w:left="432" w:hanging="216"/>
       </w:pPr>
+      <w:r>
+        <w:rPr>
+          <w:rFonts w:ascii="Calibri" w:hAnsi="Calibri"/>
+          <w:color w:val="1A1A1A"/>
+          <w:sz w:val="14"/>
+        </w:rPr>
+        <w:t xml:space="preserve">•  </w:t>
+      </w:r>
       <w:r>
         <w:rPr>
           <w:rFonts w:ascii="Calibri" w:hAnsi="Calibri"/>
@@ -190,14 +214,6 @@
     </w:p>
     <w:p>
       <w:pPr>
-        <w:spacing w:before="0" w:after="0"/>
-      </w:pPr>
-      <w:r>
-        <w:br w:type="page"/>
-      </w:r>
-    </w:p>
-    <w:p>
-      <w:pPr>
         <w:spacing w:before="120" w:after="40"/>
       </w:pPr>
       <w:r>
@@ -238,7 +254,7 @@
           <w:color w:val="136945"/>
           <w:sz w:val="22"/>
         </w:rPr>
-        <w:t>Designer — closing the adoption gap</w:t>
+        <w:t>Designer: Closing the adoption gap</w:t>
       </w:r>
     </w:p>
     <w:p>
@@ -253,7 +269,7 @@
           <w:color w:val="1A1A1A"/>
           <w:sz w:val="20"/>
         </w:rPr>
-        <w:t>A signed contract is not an adopted customer. The gap between “we want to build labs” and “we have a running program” is wide, and most customers cannot cross it without structured guidance.</w:t>
+        <w:t>A signed contract is not an adopted customer. The gap between “we want labs” and “we’re building and delivering labs embedded in a variety of learning journeys” is wide. And it’s crystal clear that most customers are not, and cannot, make the leap without significant and structured support.</w:t>
       </w:r>
     </w:p>
     <w:p>
@@ -268,7 +284,7 @@
           <w:color w:val="1A1A1A"/>
           <w:sz w:val="20"/>
         </w:rPr>
-        <w:t>Program design is a specialized skill. Most buyers — even technically sophisticated ones with strong content teams — have never designed a hands-on lab curriculum. They’ve built documentation, recorded videos, written certification exams. They have not mapped a product’s administrative workflows to a sequence of learner activities, defined scoring logic for hands-on tasks, or produced a structured brief that a lab developer can build against without extensive back-and-forth.</w:t>
+        <w:t>Program design is a specialized skill. Embedding a new modality like hands-on experiences into your overall content strategy and content development operation is not a decision. It’s a new discipline. They’ve built documentation, recorded videos, written certification exams. They have not mapped a product’s administrative workflows to a sequence of learner activities, defined scoring logic for hands-on tasks, or produced a structured brief that a lab developer can build against without extensive back-and-forth.</w:t>
       </w:r>
     </w:p>
     <w:p>
@@ -283,7 +299,7 @@
           <w:color w:val="1A1A1A"/>
           <w:sz w:val="20"/>
         </w:rPr>
-        <w:t>Without a process that takes them from goals and audience to a complete, buildable program architecture, customers stall at the design phase. In a consumption model, a stalled customer is not just a missed upsell opportunity — it is a churn risk. A customer who has not built a program has not realized value. A customer who has not realized value does not renew.</w:t>
+        <w:t>Without a process that takes them from goals and audience to a complete, buildable program architecture, customers stall at the design phase. In a consumption model, a stalled customer is not just a missed upsell opportunity; it is a churn risk. A customer who has not built a program has not realized value. A customer who has not realized value does not renew.</w:t>
       </w:r>
     </w:p>
     <w:p>
@@ -298,7 +314,103 @@
           <w:color w:val="1A1A1A"/>
           <w:sz w:val="20"/>
         </w:rPr>
-        <w:t>Designer guides program owners, instructional designers, and subject matter experts through the full process — from goals and audience definition through a complete approved outline, activity-level content, and a Skillable Studio-ready export package. It doesn’t require the customer to know how to design a lab program. Designer asks the right questions, sequences the decisions correctly, and generates a complete program architecture that a contracted lab developer can build against immediately.</w:t>
+        <w:t>Designer guides program owners, instructional designers, and subject matter experts through the full process — from learning objectives and intended audience through every decision a program requires. It doesn’t require the customer to know how to design a lab program. Designer asks the right questions and sequences the decisions correctly. Every program produces:</w:t>
+      </w:r>
+    </w:p>
+    <w:p>
+      <w:pPr>
+        <w:spacing w:before="0" w:after="40"/>
+        <w:ind w:left="432" w:hanging="216"/>
+      </w:pPr>
+      <w:r>
+        <w:rPr>
+          <w:rFonts w:ascii="Calibri" w:hAnsi="Calibri"/>
+          <w:color w:val="1A1A1A"/>
+          <w:sz w:val="14"/>
+        </w:rPr>
+        <w:t xml:space="preserve">•  </w:t>
+      </w:r>
+      <w:r>
+        <w:rPr>
+          <w:rFonts w:ascii="Calibri" w:hAnsi="Calibri"/>
+          <w:b w:val="0"/>
+          <w:i w:val="0"/>
+          <w:color w:val="1A1A1A"/>
+          <w:sz w:val="20"/>
+        </w:rPr>
+        <w:t>A structured program outline</w:t>
+      </w:r>
+    </w:p>
+    <w:p>
+      <w:pPr>
+        <w:spacing w:before="0" w:after="40"/>
+        <w:ind w:left="432" w:hanging="216"/>
+      </w:pPr>
+      <w:r>
+        <w:rPr>
+          <w:rFonts w:ascii="Calibri" w:hAnsi="Calibri"/>
+          <w:color w:val="1A1A1A"/>
+          <w:sz w:val="14"/>
+        </w:rPr>
+        <w:t xml:space="preserve">•  </w:t>
+      </w:r>
+      <w:r>
+        <w:rPr>
+          <w:rFonts w:ascii="Calibri" w:hAnsi="Calibri"/>
+          <w:b w:val="0"/>
+          <w:i w:val="0"/>
+          <w:color w:val="1A1A1A"/>
+          <w:sz w:val="20"/>
+        </w:rPr>
+        <w:t>Draft lab instructions for every lab in the program</w:t>
+      </w:r>
+    </w:p>
+    <w:p>
+      <w:pPr>
+        <w:spacing w:before="0" w:after="40"/>
+        <w:ind w:left="432" w:hanging="216"/>
+      </w:pPr>
+      <w:r>
+        <w:rPr>
+          <w:rFonts w:ascii="Calibri" w:hAnsi="Calibri"/>
+          <w:color w:val="1A1A1A"/>
+          <w:sz w:val="14"/>
+        </w:rPr>
+        <w:t xml:space="preserve">•  </w:t>
+      </w:r>
+      <w:r>
+        <w:rPr>
+          <w:rFonts w:ascii="Calibri" w:hAnsi="Calibri"/>
+          <w:b w:val="0"/>
+          <w:i w:val="0"/>
+          <w:color w:val="1A1A1A"/>
+          <w:sz w:val="20"/>
+        </w:rPr>
+        <w:t>Learner activities for progress tracking</w:t>
+      </w:r>
+    </w:p>
+    <w:p>
+      <w:pPr>
+        <w:spacing w:before="0" w:after="60"/>
+        <w:ind w:left="432" w:hanging="216"/>
+      </w:pPr>
+      <w:r>
+        <w:rPr>
+          <w:rFonts w:ascii="Calibri" w:hAnsi="Calibri"/>
+          <w:color w:val="1A1A1A"/>
+          <w:sz w:val="14"/>
+        </w:rPr>
+        <w:t xml:space="preserve">•  </w:t>
+      </w:r>
+      <w:r>
+        <w:rPr>
+          <w:rFonts w:ascii="Calibri" w:hAnsi="Calibri"/>
+          <w:b w:val="0"/>
+          <w:i w:val="0"/>
+          <w:color w:val="1A1A1A"/>
+          <w:sz w:val="20"/>
+        </w:rPr>
+        <w:t>Scoring methodology recommendations</w:t>
       </w:r>
     </w:p>
     <w:p>
@@ -333,7 +445,7 @@
             <wp:positionV relativeFrom="paragraph">
               <wp:posOffset>9144</wp:posOffset>
             </wp:positionV>
-            <wp:extent cx="164592" cy="164592"/>
+            <wp:extent cx="210312" cy="210312"/>
             <wp:effectExtent l="0" t="0" r="0" b="0"/>
             <wp:wrapNone/>
             <wp:docPr id="1" name="Picture 1"/>
@@ -356,7 +468,7 @@
                   <pic:spPr>
                     <a:xfrm>
                       <a:off x="0" y="0"/>
-                      <a:ext cx="164592" cy="164592"/>
+                      <a:ext cx="210312" cy="210312"/>
                     </a:xfrm>
                     <a:prstGeom prst="rect"/>
                   </pic:spPr>
@@ -389,7 +501,7 @@
           <w:color w:val="1A1A1A"/>
           <w:sz w:val="20"/>
         </w:rPr>
-        <w:t>Every new customer engagement starts with Designer in the first week — before the technical environment is ready. Program design and environment build run as parallel workstreams. Day one is productive for the program owner. The adoption gap closes before it has a chance to form.</w:t>
+        <w:t>Every new customer engagement starts with Designer in the first week — while the technical folks are working to get the technical details sorted. Program design and environment build run in parallel. Day one is productive for the program owner. The adoption gap closes before it has a chance to form.</w:t>
       </w:r>
     </w:p>
     <w:p>
@@ -404,7 +516,7 @@
           <w:color w:val="136945"/>
           <w:sz w:val="22"/>
         </w:rPr>
-        <w:t>Inspector — proving labability and impact</w:t>
+        <w:t>Inspector: Proving labability and impact</w:t>
       </w:r>
     </w:p>
     <w:p>
@@ -419,7 +531,7 @@
           <w:color w:val="1A1A1A"/>
           <w:sz w:val="20"/>
         </w:rPr>
-        <w:t>Proving that a Skillable lab program will work for a specific customer’s products requires deep technical analysis. Which delivery path is right — standard virtual machine, cloud environment slice, containerized workload, custom integration? What are the architectural constraints? What would a realistic program look like in terms of scope, seat time, and scoring approach? What is the estimated consumption potential?</w:t>
+        <w:t>Proving that a Skillable lab program will work for a specific customer’s products requires deep technical analysis. Which is the best delivery path for each software environment? A set of virtual machines or containers, leveraging Azure or AWS subscriptions, a custom API orchestration, or a hybrid setup? What are the architectural constraints? What would a realistic program look like in terms of scope, seat time, and scoring approach? What is the estimated consumption potential?</w:t>
       </w:r>
     </w:p>
     <w:p>
@@ -434,7 +546,7 @@
           <w:color w:val="1A1A1A"/>
           <w:sz w:val="20"/>
         </w:rPr>
-        <w:t>This is exactly the kind of work a skilled Solutions Engineer does well. It requires knowing Skillable’s platform deeply — delivery paths, technical constraints, feature availability, scoring feasibility — and applying that knowledge to a specific product’s architecture. That synthesis takes hours per company, in a live conversation, with access to documentation and a customer contact who can fill in the gaps.</w:t>
+        <w:t>This is the type of work that’s required for virtually every new lab program with every new and existing customer and demands substantial commitment from our Solution Engineers and TSMs. It takes hours of conversation, researching API documents, and plain old trial and error.</w:t>
       </w:r>
     </w:p>
     <w:p>
@@ -449,7 +561,7 @@
           <w:color w:val="1A1A1A"/>
           <w:sz w:val="20"/>
         </w:rPr>
-        <w:t>The result is that qualification depth is rationed. It flows to deals already far enough along to justify the time. Early-stage prospects get a general conversation. The technical questions that would surface a Workday pattern early — before marketing dollars are spent, before SE time is committed — often go unasked until it is too late.</w:t>
+        <w:t>The result is that qualification depth is rationed. It flows to deals already far enough along to justify the time. Early-stage prospects get a general conversation. The technical questions that would surface a Workday pattern early (before marketing dollars are spent, before SE time is committed) often go unasked until it is too late.</w:t>
       </w:r>
     </w:p>
     <w:p>
@@ -464,14 +576,22 @@
           <w:color w:val="1A1A1A"/>
           <w:sz w:val="20"/>
         </w:rPr>
-        <w:t>Inspector performs a deep product-level analysis of a specific company. It runs in two stages.</w:t>
+        <w:t>Inspector performs a deep product-level analysis of a specific company.</w:t>
       </w:r>
     </w:p>
     <w:p>
       <w:pPr>
-        <w:pStyle w:val="ListBullet"/>
         <w:spacing w:before="0" w:after="40"/>
+        <w:ind w:left="432" w:hanging="216"/>
       </w:pPr>
+      <w:r>
+        <w:rPr>
+          <w:rFonts w:ascii="Calibri" w:hAnsi="Calibri"/>
+          <w:color w:val="1A1A1A"/>
+          <w:sz w:val="14"/>
+        </w:rPr>
+        <w:t xml:space="preserve">•  </w:t>
+      </w:r>
       <w:r>
         <w:rPr>
           <w:rFonts w:ascii="Calibri" w:hAnsi="Calibri"/>
@@ -480,7 +600,7 @@
           <w:color w:val="1A1A1A"/>
           <w:sz w:val="20"/>
         </w:rPr>
-        <w:t xml:space="preserve">Stage 1 — Company report: </w:t>
+        <w:t xml:space="preserve">The Case Board. </w:t>
       </w:r>
       <w:r>
         <w:rPr>
@@ -490,14 +610,22 @@
           <w:color w:val="1A1A1A"/>
           <w:sz w:val="20"/>
         </w:rPr>
-        <w:t>A broad scan that surfaces all of a company’s products, ranked by labability, with competitive pairings, company-level signals, and an overall fit score. The foundation document for any seller or SE entering a conversation with this account.</w:t>
+        <w:t>A broad scan that surfaces all of a company’s products, ranked by labability, with competitive pairings, company-level signals, and an overall fit score. You walk in the room and get the picture at a glance.</w:t>
       </w:r>
     </w:p>
     <w:p>
       <w:pPr>
-        <w:pStyle w:val="ListBullet"/>
         <w:spacing w:before="0" w:after="60"/>
+        <w:ind w:left="432" w:hanging="216"/>
       </w:pPr>
+      <w:r>
+        <w:rPr>
+          <w:rFonts w:ascii="Calibri" w:hAnsi="Calibri"/>
+          <w:color w:val="1A1A1A"/>
+          <w:sz w:val="14"/>
+        </w:rPr>
+        <w:t xml:space="preserve">•  </w:t>
+      </w:r>
       <w:r>
         <w:rPr>
           <w:rFonts w:ascii="Calibri" w:hAnsi="Calibri"/>
@@ -506,7 +634,7 @@
           <w:color w:val="1A1A1A"/>
           <w:sz w:val="20"/>
         </w:rPr>
-        <w:t xml:space="preserve">Stage 2 — Deep dive: </w:t>
+        <w:t xml:space="preserve">The Dossier. </w:t>
       </w:r>
       <w:r>
         <w:rPr>
@@ -516,7 +644,7 @@
           <w:color w:val="1A1A1A"/>
           <w:sz w:val="20"/>
         </w:rPr>
-        <w:t>The seller or SE selects three to four products from Stage 1 for exhaustive analysis — full technical orchestrability evidence, delivery path recommendation with rationale, scoring approach, consumption potential estimate, and program scope.</w:t>
+        <w:t>The seller or SE selects three to four products from the Case Board for exhaustive analysis — full technical orchestrability evidence, delivery path recommendation with rationale, scoring approach, consumption potential estimate, and program scope.</w:t>
       </w:r>
     </w:p>
     <w:p>
@@ -539,7 +667,7 @@
           <w:color w:val="1A1A1A"/>
           <w:sz w:val="20"/>
         </w:rPr>
-        <w:t xml:space="preserve"> A seller walking into a meeting with a Stage 2 report knows what the customer’s products can and cannot do on the Skillable platform, which delivery path makes sense and why, and what the estimated consumption potential is. That is not discovery. That is a standing start.</w:t>
+        <w:t xml:space="preserve"> A seller walking into a meeting with a Dossier knows what the customer’s products can and cannot do on the Skillable platform, which delivery path makes sense and why, and what the estimated consumption potential is. That is not discovery. That is a standing start.</w:t>
       </w:r>
       <w:r>
         <w:drawing>
@@ -551,7 +679,7 @@
             <wp:positionV relativeFrom="paragraph">
               <wp:posOffset>9144</wp:posOffset>
             </wp:positionV>
-            <wp:extent cx="164592" cy="164592"/>
+            <wp:extent cx="210312" cy="210312"/>
             <wp:effectExtent l="0" t="0" r="0" b="0"/>
             <wp:wrapNone/>
             <wp:docPr id="2" name="Picture 2"/>
@@ -574,7 +702,7 @@
                   <pic:spPr>
                     <a:xfrm>
                       <a:off x="0" y="0"/>
-                      <a:ext cx="164592" cy="164592"/>
+                      <a:ext cx="210312" cy="210312"/>
                     </a:xfrm>
                     <a:prstGeom prst="rect"/>
                   </pic:spPr>
@@ -597,7 +725,7 @@
           <w:color w:val="1A1A1A"/>
           <w:sz w:val="20"/>
         </w:rPr>
-        <w:t>Inspector also surfaces the competitive map for every analyzed company — which feeds directly into Prospector’s lookalike targeting.</w:t>
+        <w:t>Inspector also surfaces the competitive map for every analyzed company, which feeds directly into Prospector’s lookalike targeting.</w:t>
       </w:r>
     </w:p>
     <w:p>
@@ -622,7 +750,7 @@
           <w:color w:val="1A1A1A"/>
           <w:sz w:val="20"/>
         </w:rPr>
-        <w:t>Pre-call preparation that was previously impossible at scale is now standard. Every seller and SE enters every conversation with the technical depth that used to require hours of individual research — applied automatically, to every product, before the first meeting.</w:t>
+        <w:t>Pre-call preparation that was previously impossible at scale is now standard. Every seller and SE enters every conversation with the technical depth that used to require hours of individual research, applied automatically to every product before the first meeting.</w:t>
       </w:r>
     </w:p>
     <w:p>
@@ -637,7 +765,7 @@
           <w:color w:val="136945"/>
           <w:sz w:val="22"/>
         </w:rPr>
-        <w:t>Prospector — finding the right companies</w:t>
+        <w:t>Prospector: Finding the right companies</w:t>
       </w:r>
     </w:p>
     <w:p>
@@ -652,7 +780,7 @@
           <w:color w:val="1A1A1A"/>
           <w:sz w:val="20"/>
         </w:rPr>
-        <w:t>Platform companies cannot qualify prospects the way product companies do. The tools Marketing uses — ZoomInfo, 6sense, HubSpot, LinkedIn Sales Navigator — are built to identify buyers who match a profile. For Skillable, that is the wrong question. The right question is whether a company’s products can be delivered as hands-on lab experiences. That is a technical assessment, not a firmographic one.</w:t>
+        <w:t>Platform companies cannot qualify prospects the way product companies do. The tools Marketing uses (ZoomInfo, 6sense, HubSpot, LinkedIn Sales Navigator) are built to identify buyers who match a profile. For Skillable, that is the wrong question. The right question is whether a company’s products can be delivered as hands-on lab experiences. That is a technical assessment, not a firmographic one.</w:t>
       </w:r>
     </w:p>
     <w:p>
@@ -672,9 +800,17 @@
     </w:p>
     <w:p>
       <w:pPr>
-        <w:pStyle w:val="ListBullet"/>
         <w:spacing w:before="0" w:after="40"/>
+        <w:ind w:left="432" w:hanging="216"/>
       </w:pPr>
+      <w:r>
+        <w:rPr>
+          <w:rFonts w:ascii="Calibri" w:hAnsi="Calibri"/>
+          <w:color w:val="1A1A1A"/>
+          <w:sz w:val="14"/>
+        </w:rPr>
+        <w:t xml:space="preserve">•  </w:t>
+      </w:r>
       <w:r>
         <w:rPr>
           <w:rFonts w:ascii="Calibri" w:hAnsi="Calibri"/>
@@ -698,9 +834,17 @@
     </w:p>
     <w:p>
       <w:pPr>
-        <w:pStyle w:val="ListBullet"/>
         <w:spacing w:before="0" w:after="40"/>
+        <w:ind w:left="432" w:hanging="216"/>
       </w:pPr>
+      <w:r>
+        <w:rPr>
+          <w:rFonts w:ascii="Calibri" w:hAnsi="Calibri"/>
+          <w:color w:val="1A1A1A"/>
+          <w:sz w:val="14"/>
+        </w:rPr>
+        <w:t xml:space="preserve">•  </w:t>
+      </w:r>
       <w:r>
         <w:rPr>
           <w:rFonts w:ascii="Calibri" w:hAnsi="Calibri"/>
@@ -724,9 +868,17 @@
     </w:p>
     <w:p>
       <w:pPr>
-        <w:pStyle w:val="ListBullet"/>
         <w:spacing w:before="0" w:after="60"/>
+        <w:ind w:left="432" w:hanging="216"/>
       </w:pPr>
+      <w:r>
+        <w:rPr>
+          <w:rFonts w:ascii="Calibri" w:hAnsi="Calibri"/>
+          <w:color w:val="1A1A1A"/>
+          <w:sz w:val="14"/>
+        </w:rPr>
+        <w:t xml:space="preserve">•  </w:t>
+      </w:r>
       <w:r>
         <w:rPr>
           <w:rFonts w:ascii="Calibri" w:hAnsi="Calibri"/>
@@ -765,9 +917,17 @@
     </w:p>
     <w:p>
       <w:pPr>
-        <w:pStyle w:val="ListBullet"/>
         <w:spacing w:before="0" w:after="40"/>
+        <w:ind w:left="432" w:hanging="216"/>
       </w:pPr>
+      <w:r>
+        <w:rPr>
+          <w:rFonts w:ascii="Calibri" w:hAnsi="Calibri"/>
+          <w:color w:val="1A1A1A"/>
+          <w:sz w:val="14"/>
+        </w:rPr>
+        <w:t xml:space="preserve">•  </w:t>
+      </w:r>
       <w:r>
         <w:rPr>
           <w:rFonts w:ascii="Calibri" w:hAnsi="Calibri"/>
@@ -776,7 +936,7 @@
           <w:color w:val="1A1A1A"/>
           <w:sz w:val="20"/>
         </w:rPr>
-        <w:t xml:space="preserve">Pure multi-tenant architecture — </w:t>
+        <w:t xml:space="preserve">Pure multi-tenant architecture: </w:t>
       </w:r>
       <w:r>
         <w:rPr>
@@ -786,14 +946,22 @@
           <w:color w:val="1A1A1A"/>
           <w:sz w:val="20"/>
         </w:rPr>
-        <w:t>every customer shares the same cloud environment. There is no Workday instance to give a learner.</w:t>
+        <w:t>Every customer shares the same cloud environment. There is no Workday instance to give a learner.</w:t>
       </w:r>
     </w:p>
     <w:p>
       <w:pPr>
-        <w:pStyle w:val="ListBullet"/>
         <w:spacing w:before="0" w:after="40"/>
+        <w:ind w:left="432" w:hanging="216"/>
       </w:pPr>
+      <w:r>
+        <w:rPr>
+          <w:rFonts w:ascii="Calibri" w:hAnsi="Calibri"/>
+          <w:color w:val="1A1A1A"/>
+          <w:sz w:val="14"/>
+        </w:rPr>
+        <w:t xml:space="preserve">•  </w:t>
+      </w:r>
       <w:r>
         <w:rPr>
           <w:rFonts w:ascii="Calibri" w:hAnsi="Calibri"/>
@@ -802,7 +970,7 @@
           <w:color w:val="1A1A1A"/>
           <w:sz w:val="20"/>
         </w:rPr>
-        <w:t xml:space="preserve">No provisioning API — </w:t>
+        <w:t xml:space="preserve">No provisioning API: </w:t>
       </w:r>
       <w:r>
         <w:rPr>
@@ -812,14 +980,22 @@
           <w:color w:val="1A1A1A"/>
           <w:sz w:val="20"/>
         </w:rPr>
-        <w:t>no mechanism to spin up an individual environment programmatically. Skillable’s entire delivery model depends on this capability.</w:t>
+        <w:t>No mechanism to spin up an individual environment programmatically. Skillable’s entire delivery model depends on this capability.</w:t>
       </w:r>
     </w:p>
     <w:p>
       <w:pPr>
-        <w:pStyle w:val="ListBullet"/>
         <w:spacing w:before="0" w:after="60"/>
+        <w:ind w:left="432" w:hanging="216"/>
       </w:pPr>
+      <w:r>
+        <w:rPr>
+          <w:rFonts w:ascii="Calibri" w:hAnsi="Calibri"/>
+          <w:color w:val="1A1A1A"/>
+          <w:sz w:val="14"/>
+        </w:rPr>
+        <w:t xml:space="preserve">•  </w:t>
+      </w:r>
       <w:r>
         <w:rPr>
           <w:rFonts w:ascii="Calibri" w:hAnsi="Calibri"/>
@@ -828,7 +1004,7 @@
           <w:color w:val="1A1A1A"/>
           <w:sz w:val="20"/>
         </w:rPr>
-        <w:t xml:space="preserve">No deployment model — </w:t>
+        <w:t xml:space="preserve">No deployment model: </w:t>
       </w:r>
       <w:r>
         <w:rPr>
@@ -838,7 +1014,7 @@
           <w:color w:val="1A1A1A"/>
           <w:sz w:val="20"/>
         </w:rPr>
-        <w:t>nothing to install, containerize, or slice.</w:t>
+        <w:t>Nothing to install, containerize, or slice.</w:t>
       </w:r>
     </w:p>
     <w:p>
@@ -906,7 +1082,7 @@
           <w:color w:val="1A1A1A"/>
           <w:sz w:val="20"/>
         </w:rPr>
-        <w:t xml:space="preserve"> before a sequence is written, a dollar is spent, or an SDR makes a call. Companies that clear all three dimensions go into outreach. Workday patterns come off the list — with specific, documented technical reasons on the Company record. Prospector also surfaces customer expansion opportunities — mapping the department landscape of existing accounts to identify adoption opportunities for existing labs, greenfield departments, and buyers ready to expand.</w:t>
+        <w:t xml:space="preserve"> before a sequence is written, a dollar is spent, or an SDR makes a call. Companies that clear all three dimensions go into outreach. Workday patterns come off the list — with specific, documented technical reasons on the Company record. Prospector also surfaces customer expansion opportunities, mapping the department landscape of existing accounts to identify adoption opportunities for existing labs, greenfield departments, and buyers ready to expand.</w:t>
       </w:r>
       <w:r>
         <w:drawing>
@@ -918,7 +1094,7 @@
             <wp:positionV relativeFrom="paragraph">
               <wp:posOffset>9144</wp:posOffset>
             </wp:positionV>
-            <wp:extent cx="164592" cy="164592"/>
+            <wp:extent cx="210312" cy="210312"/>
             <wp:effectExtent l="0" t="0" r="0" b="0"/>
             <wp:wrapNone/>
             <wp:docPr id="3" name="Picture 3"/>
@@ -941,7 +1117,7 @@
                   <pic:spPr>
                     <a:xfrm>
                       <a:off x="0" y="0"/>
-                      <a:ext cx="164592" cy="164592"/>
+                      <a:ext cx="210312" cy="210312"/>
                     </a:xfrm>
                     <a:prstGeom prst="rect"/>
                   </pic:spPr>
@@ -989,7 +1165,7 @@
           <w:color w:val="1A1A1A"/>
           <w:sz w:val="20"/>
         </w:rPr>
-        <w:t>All of this intelligence — fit scores, product signals, delivery path recommendations, key contacts — needs to reach the right people at the right moment. That is what the HubSpot integration is built to do.</w:t>
+        <w:t>Fit scores, product signals, delivery path recommendations, key contacts — all of it needs to reach the right people at the right moment. That is what the HubSpot integration is built to do.</w:t>
       </w:r>
     </w:p>
     <w:p>
@@ -1012,22 +1188,22 @@
           <w:color w:val="136945"/>
           <w:sz w:val="26"/>
         </w:rPr>
-        <w:t>HubSpot and revenue operations</w:t>
+        <w:t>Surfacing the data. Right place. Right time. Right context.</w:t>
       </w:r>
     </w:p>
     <w:p>
       <w:pPr>
-        <w:spacing w:before="40" w:after="60"/>
+        <w:spacing w:before="0" w:after="60"/>
       </w:pPr>
       <w:r>
         <w:rPr>
           <w:rFonts w:ascii="Calibri" w:hAnsi="Calibri"/>
           <w:b w:val="0"/>
-          <w:i/>
-          <w:color w:val="606060"/>
+          <w:i w:val="0"/>
+          <w:color w:val="1A1A1A"/>
           <w:sz w:val="20"/>
         </w:rPr>
-        <w:t>This section is written for RevOps and Marketing leadership. Executive readers who do not own HubSpot infrastructure may stop here.</w:t>
+        <w:t>The balance of this document outlines the decisions for RevOps to make with Marketing and Security. It includes more context, several recommendations, and a list of decisions to be made. If you’re not in one of those groups, feel free to stop reading if you so choose.</w:t>
       </w:r>
     </w:p>
     <w:p>
@@ -1057,7 +1233,7 @@
           <w:color w:val="1A1A1A"/>
           <w:sz w:val="20"/>
         </w:rPr>
-        <w:t>HubSpot is the seller and marketer’s workspace. Intelligence is the specialist workspace. The integration surfaces the right intelligence in the right place — without requiring sellers to live in another tool or RevOps to build a parallel system.</w:t>
+        <w:t>HubSpot is the seller and marketer’s workspace. Intelligence is the specialist workspace. The integration surfaces the right intelligence, to the right people, in the right places, with the right context — without requiring sellers to live in another tool or RevOps to build a parallel system.</w:t>
       </w:r>
     </w:p>
     <w:p>
@@ -1072,7 +1248,7 @@
           <w:color w:val="136945"/>
           <w:sz w:val="22"/>
         </w:rPr>
-        <w:t>Prospector ↔ HubSpot — bidirectional, marketing-driven</w:t>
+        <w:t>Prospector ↔ HubSpot: Bidirectional, marketing-driven</w:t>
       </w:r>
     </w:p>
     <w:p>
@@ -1670,7 +1846,7 @@
           <w:color w:val="136945"/>
           <w:sz w:val="22"/>
         </w:rPr>
-        <w:t>Inspector → HubSpot — seller and SE-driven</w:t>
+        <w:t>Inspector → HubSpot: Seller and SE-driven</w:t>
       </w:r>
     </w:p>
     <w:p>
@@ -1685,7 +1861,7 @@
           <w:color w:val="1A1A1A"/>
           <w:sz w:val="20"/>
         </w:rPr>
-        <w:t>Company and Deal records in HubSpot surface a ‘Run Inspector’ link. Clicking it opens Inspector at the Stage 1 Company Report. The full Inspector experience runs in Intelligence — HubSpot is only the trigger.</w:t>
+        <w:t>Company and Deal records in HubSpot surface a ‘Run Inspector’ link. Clicking it opens Inspector at the Case Board. The full Inspector experience runs in Intelligence — HubSpot is only the trigger.</w:t>
       </w:r>
     </w:p>
     <w:p>
@@ -1700,7 +1876,7 @@
           <w:color w:val="1A1A1A"/>
           <w:sz w:val="20"/>
         </w:rPr>
-        <w:t>Stage 1 data written to the Company Record:</w:t>
+        <w:t>Case Board data written to the Company record:</w:t>
       </w:r>
     </w:p>
     <w:tbl>
@@ -1724,7 +1900,7 @@
               <w:bottom w:w="50" w:type="dxa"/>
               <w:right w:w="50" w:type="dxa"/>
             </w:tcMar>
-            <w:tcW w:w="2800" w:type="dxa"/>
+            <w:tcW w:w="4800" w:type="dxa"/>
           </w:tcPr>
           <w:p>
             <w:pPr>
@@ -1752,7 +1928,7 @@
               <w:bottom w:w="50" w:type="dxa"/>
               <w:right w:w="50" w:type="dxa"/>
             </w:tcMar>
-            <w:tcW w:w="6992" w:type="dxa"/>
+            <w:tcW w:w="4992" w:type="dxa"/>
           </w:tcPr>
           <w:p>
             <w:pPr>
@@ -1782,7 +1958,7 @@
               <w:bottom w:w="50" w:type="dxa"/>
               <w:right w:w="50" w:type="dxa"/>
             </w:tcMar>
-            <w:tcW w:w="2800" w:type="dxa"/>
+            <w:tcW w:w="4800" w:type="dxa"/>
           </w:tcPr>
           <w:p>
             <w:pPr>
@@ -1810,7 +1986,7 @@
               <w:bottom w:w="50" w:type="dxa"/>
               <w:right w:w="50" w:type="dxa"/>
             </w:tcMar>
-            <w:tcW w:w="6992" w:type="dxa"/>
+            <w:tcW w:w="4992" w:type="dxa"/>
           </w:tcPr>
           <w:p>
             <w:pPr>
@@ -1840,7 +2016,7 @@
               <w:bottom w:w="50" w:type="dxa"/>
               <w:right w:w="50" w:type="dxa"/>
             </w:tcMar>
-            <w:tcW w:w="2800" w:type="dxa"/>
+            <w:tcW w:w="4800" w:type="dxa"/>
           </w:tcPr>
           <w:p>
             <w:pPr>
@@ -1868,7 +2044,7 @@
               <w:bottom w:w="50" w:type="dxa"/>
               <w:right w:w="50" w:type="dxa"/>
             </w:tcMar>
-            <w:tcW w:w="6992" w:type="dxa"/>
+            <w:tcW w:w="4992" w:type="dxa"/>
           </w:tcPr>
           <w:p>
             <w:pPr>
@@ -1898,7 +2074,7 @@
               <w:bottom w:w="50" w:type="dxa"/>
               <w:right w:w="50" w:type="dxa"/>
             </w:tcMar>
-            <w:tcW w:w="2800" w:type="dxa"/>
+            <w:tcW w:w="4800" w:type="dxa"/>
           </w:tcPr>
           <w:p>
             <w:pPr>
@@ -1926,7 +2102,7 @@
               <w:bottom w:w="50" w:type="dxa"/>
               <w:right w:w="50" w:type="dxa"/>
             </w:tcMar>
-            <w:tcW w:w="6992" w:type="dxa"/>
+            <w:tcW w:w="4992" w:type="dxa"/>
           </w:tcPr>
           <w:p>
             <w:pPr>
@@ -1956,7 +2132,7 @@
               <w:bottom w:w="50" w:type="dxa"/>
               <w:right w:w="50" w:type="dxa"/>
             </w:tcMar>
-            <w:tcW w:w="2800" w:type="dxa"/>
+            <w:tcW w:w="4800" w:type="dxa"/>
           </w:tcPr>
           <w:p>
             <w:pPr>
@@ -1984,7 +2160,7 @@
               <w:bottom w:w="50" w:type="dxa"/>
               <w:right w:w="50" w:type="dxa"/>
             </w:tcMar>
-            <w:tcW w:w="6992" w:type="dxa"/>
+            <w:tcW w:w="4992" w:type="dxa"/>
           </w:tcPr>
           <w:p>
             <w:pPr>
@@ -2014,7 +2190,7 @@
               <w:bottom w:w="50" w:type="dxa"/>
               <w:right w:w="50" w:type="dxa"/>
             </w:tcMar>
-            <w:tcW w:w="2800" w:type="dxa"/>
+            <w:tcW w:w="4800" w:type="dxa"/>
           </w:tcPr>
           <w:p>
             <w:pPr>
@@ -2042,7 +2218,7 @@
               <w:bottom w:w="50" w:type="dxa"/>
               <w:right w:w="50" w:type="dxa"/>
             </w:tcMar>
-            <w:tcW w:w="6992" w:type="dxa"/>
+            <w:tcW w:w="4992" w:type="dxa"/>
           </w:tcPr>
           <w:p>
             <w:pPr>
@@ -2079,7 +2255,7 @@
           <w:color w:val="1A1A1A"/>
           <w:sz w:val="20"/>
         </w:rPr>
-        <w:t>Stage 2 data written to the Deal Record:</w:t>
+        <w:t>Dossier data written to the Deal record:</w:t>
       </w:r>
     </w:p>
     <w:tbl>
@@ -2103,7 +2279,7 @@
               <w:bottom w:w="50" w:type="dxa"/>
               <w:right w:w="50" w:type="dxa"/>
             </w:tcMar>
-            <w:tcW w:w="2800" w:type="dxa"/>
+            <w:tcW w:w="4800" w:type="dxa"/>
           </w:tcPr>
           <w:p>
             <w:pPr>
@@ -2131,7 +2307,7 @@
               <w:bottom w:w="50" w:type="dxa"/>
               <w:right w:w="50" w:type="dxa"/>
             </w:tcMar>
-            <w:tcW w:w="6992" w:type="dxa"/>
+            <w:tcW w:w="4992" w:type="dxa"/>
           </w:tcPr>
           <w:p>
             <w:pPr>
@@ -2161,7 +2337,7 @@
               <w:bottom w:w="50" w:type="dxa"/>
               <w:right w:w="50" w:type="dxa"/>
             </w:tcMar>
-            <w:tcW w:w="2800" w:type="dxa"/>
+            <w:tcW w:w="4800" w:type="dxa"/>
           </w:tcPr>
           <w:p>
             <w:pPr>
@@ -2189,7 +2365,7 @@
               <w:bottom w:w="50" w:type="dxa"/>
               <w:right w:w="50" w:type="dxa"/>
             </w:tcMar>
-            <w:tcW w:w="6992" w:type="dxa"/>
+            <w:tcW w:w="4992" w:type="dxa"/>
           </w:tcPr>
           <w:p>
             <w:pPr>
@@ -2219,7 +2395,7 @@
               <w:bottom w:w="50" w:type="dxa"/>
               <w:right w:w="50" w:type="dxa"/>
             </w:tcMar>
-            <w:tcW w:w="2800" w:type="dxa"/>
+            <w:tcW w:w="4800" w:type="dxa"/>
           </w:tcPr>
           <w:p>
             <w:pPr>
@@ -2247,7 +2423,7 @@
               <w:bottom w:w="50" w:type="dxa"/>
               <w:right w:w="50" w:type="dxa"/>
             </w:tcMar>
-            <w:tcW w:w="6992" w:type="dxa"/>
+            <w:tcW w:w="4992" w:type="dxa"/>
           </w:tcPr>
           <w:p>
             <w:pPr>
@@ -2277,7 +2453,7 @@
               <w:bottom w:w="50" w:type="dxa"/>
               <w:right w:w="50" w:type="dxa"/>
             </w:tcMar>
-            <w:tcW w:w="2800" w:type="dxa"/>
+            <w:tcW w:w="4800" w:type="dxa"/>
           </w:tcPr>
           <w:p>
             <w:pPr>
@@ -2305,7 +2481,7 @@
               <w:bottom w:w="50" w:type="dxa"/>
               <w:right w:w="50" w:type="dxa"/>
             </w:tcMar>
-            <w:tcW w:w="6992" w:type="dxa"/>
+            <w:tcW w:w="4992" w:type="dxa"/>
           </w:tcPr>
           <w:p>
             <w:pPr>
@@ -2335,7 +2511,7 @@
               <w:bottom w:w="50" w:type="dxa"/>
               <w:right w:w="50" w:type="dxa"/>
             </w:tcMar>
-            <w:tcW w:w="2800" w:type="dxa"/>
+            <w:tcW w:w="4800" w:type="dxa"/>
           </w:tcPr>
           <w:p>
             <w:pPr>
@@ -2363,7 +2539,7 @@
               <w:bottom w:w="50" w:type="dxa"/>
               <w:right w:w="50" w:type="dxa"/>
             </w:tcMar>
-            <w:tcW w:w="6992" w:type="dxa"/>
+            <w:tcW w:w="4992" w:type="dxa"/>
           </w:tcPr>
           <w:p>
             <w:pPr>
@@ -2393,7 +2569,7 @@
               <w:bottom w:w="50" w:type="dxa"/>
               <w:right w:w="50" w:type="dxa"/>
             </w:tcMar>
-            <w:tcW w:w="2800" w:type="dxa"/>
+            <w:tcW w:w="4800" w:type="dxa"/>
           </w:tcPr>
           <w:p>
             <w:pPr>
@@ -2421,7 +2597,7 @@
               <w:bottom w:w="50" w:type="dxa"/>
               <w:right w:w="50" w:type="dxa"/>
             </w:tcMar>
-            <w:tcW w:w="6992" w:type="dxa"/>
+            <w:tcW w:w="4992" w:type="dxa"/>
           </w:tcPr>
           <w:p>
             <w:pPr>
@@ -2451,7 +2627,7 @@
               <w:bottom w:w="50" w:type="dxa"/>
               <w:right w:w="50" w:type="dxa"/>
             </w:tcMar>
-            <w:tcW w:w="2800" w:type="dxa"/>
+            <w:tcW w:w="4800" w:type="dxa"/>
           </w:tcPr>
           <w:p>
             <w:pPr>
@@ -2465,7 +2641,7 @@
                 <w:color w:val="1A1A1A"/>
                 <w:sz w:val="20"/>
               </w:rPr>
-              <w:t>Link to full Inspector Stage 2 report</w:t>
+              <w:t>Link to full Inspector Dossier</w:t>
             </w:r>
           </w:p>
         </w:tc>
@@ -2479,7 +2655,7 @@
               <w:bottom w:w="50" w:type="dxa"/>
               <w:right w:w="50" w:type="dxa"/>
             </w:tcMar>
-            <w:tcW w:w="6992" w:type="dxa"/>
+            <w:tcW w:w="4992" w:type="dxa"/>
           </w:tcPr>
           <w:p>
             <w:pPr>
@@ -2516,7 +2692,7 @@
           <w:color w:val="136945"/>
           <w:sz w:val="22"/>
         </w:rPr>
-        <w:t>Designer → HubSpot — read-only visibility</w:t>
+        <w:t>Designer → HubSpot: Read-only visibility</w:t>
       </w:r>
     </w:p>
     <w:p>
@@ -2561,7 +2737,7 @@
           <w:color w:val="136945"/>
           <w:sz w:val="26"/>
         </w:rPr>
-        <w:t>Recommendations and open decisions</w:t>
+        <w:t>Recommendations &amp; open decisions</w:t>
       </w:r>
     </w:p>
     <w:p>
@@ -2581,9 +2757,17 @@
     </w:p>
     <w:p>
       <w:pPr>
-        <w:pStyle w:val="ListBullet"/>
         <w:spacing w:before="0" w:after="40"/>
+        <w:ind w:left="432" w:hanging="216"/>
       </w:pPr>
+      <w:r>
+        <w:rPr>
+          <w:rFonts w:ascii="Calibri" w:hAnsi="Calibri"/>
+          <w:color w:val="1A1A1A"/>
+          <w:sz w:val="14"/>
+        </w:rPr>
+        <w:t xml:space="preserve">•  </w:t>
+      </w:r>
       <w:r>
         <w:rPr>
           <w:rFonts w:ascii="Calibri" w:hAnsi="Calibri"/>
@@ -2607,9 +2791,17 @@
     </w:p>
     <w:p>
       <w:pPr>
-        <w:pStyle w:val="ListBullet"/>
         <w:spacing w:before="0" w:after="40"/>
+        <w:ind w:left="432" w:hanging="216"/>
       </w:pPr>
+      <w:r>
+        <w:rPr>
+          <w:rFonts w:ascii="Calibri" w:hAnsi="Calibri"/>
+          <w:color w:val="1A1A1A"/>
+          <w:sz w:val="14"/>
+        </w:rPr>
+        <w:t xml:space="preserve">•  </w:t>
+      </w:r>
       <w:r>
         <w:rPr>
           <w:rFonts w:ascii="Calibri" w:hAnsi="Calibri"/>
@@ -2618,7 +2810,7 @@
           <w:color w:val="1A1A1A"/>
           <w:sz w:val="20"/>
         </w:rPr>
-        <w:t xml:space="preserve">Inspector Stage 1 as the standard pre-call research tool for all sellers and SEs. </w:t>
+        <w:t xml:space="preserve">The Inspector Case Board as the standard pre-call research tool for all sellers and SEs. </w:t>
       </w:r>
       <w:r>
         <w:rPr>
@@ -2628,14 +2820,22 @@
           <w:color w:val="1A1A1A"/>
           <w:sz w:val="20"/>
         </w:rPr>
-        <w:t>The ‘Run Inspector’ link on every Company and Deal record makes it a one-click motion. Stage 1 output gives every seller account intelligence they currently do not have before the first conversation.</w:t>
+        <w:t>The ‘Run Inspector’ link on every Company and Deal record makes it a one-click motion. The Case Board gives every seller account intelligence they currently do not have before the first conversation.</w:t>
       </w:r>
     </w:p>
     <w:p>
       <w:pPr>
-        <w:pStyle w:val="ListBullet"/>
         <w:spacing w:before="0" w:after="60"/>
+        <w:ind w:left="432" w:hanging="216"/>
       </w:pPr>
+      <w:r>
+        <w:rPr>
+          <w:rFonts w:ascii="Calibri" w:hAnsi="Calibri"/>
+          <w:color w:val="1A1A1A"/>
+          <w:sz w:val="14"/>
+        </w:rPr>
+        <w:t xml:space="preserve">•  </w:t>
+      </w:r>
       <w:r>
         <w:rPr>
           <w:rFonts w:ascii="Calibri" w:hAnsi="Calibri"/>
@@ -2654,7 +2854,7 @@
           <w:color w:val="1A1A1A"/>
           <w:sz w:val="20"/>
         </w:rPr>
-        <w:t>Skillable LC and PS should run every new customer through Designer in the first week — before the technical environment is ready. Program design and environment build run as parallel workstreams.</w:t>
+        <w:t>Skillable LC and PS should run every new customer through Designer in the first week — while the technical folks are working to get the technical details sorted. Program design and environment build run in parallel.</w:t>
       </w:r>
     </w:p>
     <w:p>
@@ -2954,7 +3154,7 @@
                 <w:color w:val="1A1A1A"/>
                 <w:sz w:val="20"/>
               </w:rPr>
-              <w:t>Stage 2 multi-product question</w:t>
+              <w:t>Dossier multi-product question</w:t>
             </w:r>
           </w:p>
         </w:tc>

</xml_diff>

<commit_message>
Add proclamation pivot lines to all three Section 2 subsections
Each subsection now follows the full problem→proclamation→solution pattern:
- Designer closes that gap.
- Inspector proves labability and impact.
- Prospector finds the right companies.

Proclamation() helper added to generator — bold, extra spacing before/after.

Co-Authored-By: Claude Sonnet 4.6 <noreply@anthropic.com>
</commit_message>
<xml_diff>
--- a/docs/Skillable-Intelligence-Platform.docx
+++ b/docs/Skillable-Intelligence-Platform.docx
@@ -304,6 +304,21 @@
     </w:p>
     <w:p>
       <w:pPr>
+        <w:spacing w:before="80" w:after="80"/>
+      </w:pPr>
+      <w:r>
+        <w:rPr>
+          <w:rFonts w:ascii="Calibri" w:hAnsi="Calibri"/>
+          <w:b/>
+          <w:i w:val="0"/>
+          <w:color w:val="1A1A1A"/>
+          <w:sz w:val="20"/>
+        </w:rPr>
+        <w:t>Designer closes that gap.</w:t>
+      </w:r>
+    </w:p>
+    <w:p>
+      <w:pPr>
         <w:spacing w:before="0" w:after="60"/>
       </w:pPr>
       <w:r>
@@ -562,6 +577,21 @@
           <w:sz w:val="20"/>
         </w:rPr>
         <w:t>The result is that qualification depth is rationed. It flows to deals already far enough along to justify the time. Early-stage prospects get a general conversation. The technical questions that would surface a Workday pattern early (before marketing dollars are spent, before SE time is committed) often go unasked until it is too late.</w:t>
+      </w:r>
+    </w:p>
+    <w:p>
+      <w:pPr>
+        <w:spacing w:before="80" w:after="80"/>
+      </w:pPr>
+      <w:r>
+        <w:rPr>
+          <w:rFonts w:ascii="Calibri" w:hAnsi="Calibri"/>
+          <w:b/>
+          <w:i w:val="0"/>
+          <w:color w:val="1A1A1A"/>
+          <w:sz w:val="20"/>
+        </w:rPr>
+        <w:t>Inspector proves labability and impact.</w:t>
       </w:r>
     </w:p>
     <w:p>
@@ -1045,6 +1075,21 @@
           <w:sz w:val="20"/>
         </w:rPr>
         <w:t>The same logic runs in the other direction. When Fortinet is a strong fit, it’s not because Fortinet resembles other good customers as a company. It’s because Fortinet’s products have specific technical characteristics — multi-VM topology, deep administrative workflows, strong API surface, real consequence of misconfiguration — that make them ideal for hands-on labs. Every company selling products with those same characteristics is a strong fit for the same reasons. The competitive map of a strong-fit customer is a pre-qualified prospect list.</w:t>
+      </w:r>
+    </w:p>
+    <w:p>
+      <w:pPr>
+        <w:spacing w:before="80" w:after="80"/>
+      </w:pPr>
+      <w:r>
+        <w:rPr>
+          <w:rFonts w:ascii="Calibri" w:hAnsi="Calibri"/>
+          <w:b/>
+          <w:i w:val="0"/>
+          <w:color w:val="1A1A1A"/>
+          <w:sz w:val="20"/>
+        </w:rPr>
+        <w:t>Prospector finds the right companies.</w:t>
       </w:r>
     </w:p>
     <w:p>

</xml_diff>

<commit_message>
Tighten bullet indent — nearly flush with body paragraphs
Reduced left indent from 432 to 160 twips, hanging from 216 to 160,
single space after bullet character. Bullets now sit close to the
left margin rather than indenting away from body text.

Co-Authored-By: Claude Sonnet 4.6 <noreply@anthropic.com>
</commit_message>
<xml_diff>
--- a/docs/Skillable-Intelligence-Platform.docx
+++ b/docs/Skillable-Intelligence-Platform.docx
@@ -68,7 +68,7 @@
     <w:p>
       <w:pPr>
         <w:spacing w:before="0" w:after="40"/>
-        <w:ind w:left="432" w:hanging="216"/>
+        <w:ind w:left="160" w:hanging="160"/>
       </w:pPr>
       <w:r>
         <w:rPr>
@@ -76,7 +76,7 @@
           <w:color w:val="1A1A1A"/>
           <w:sz w:val="14"/>
         </w:rPr>
-        <w:t xml:space="preserve">•  </w:t>
+        <w:t xml:space="preserve">• </w:t>
       </w:r>
       <w:r>
         <w:rPr>
@@ -92,7 +92,7 @@
     <w:p>
       <w:pPr>
         <w:spacing w:before="0" w:after="40"/>
-        <w:ind w:left="432" w:hanging="216"/>
+        <w:ind w:left="160" w:hanging="160"/>
       </w:pPr>
       <w:r>
         <w:rPr>
@@ -100,7 +100,7 @@
           <w:color w:val="1A1A1A"/>
           <w:sz w:val="14"/>
         </w:rPr>
-        <w:t xml:space="preserve">•  </w:t>
+        <w:t xml:space="preserve">• </w:t>
       </w:r>
       <w:r>
         <w:rPr>
@@ -116,7 +116,7 @@
     <w:p>
       <w:pPr>
         <w:spacing w:before="0" w:after="60"/>
-        <w:ind w:left="432" w:hanging="216"/>
+        <w:ind w:left="160" w:hanging="160"/>
       </w:pPr>
       <w:r>
         <w:rPr>
@@ -124,7 +124,7 @@
           <w:color w:val="1A1A1A"/>
           <w:sz w:val="14"/>
         </w:rPr>
-        <w:t xml:space="preserve">•  </w:t>
+        <w:t xml:space="preserve">• </w:t>
       </w:r>
       <w:r>
         <w:rPr>
@@ -335,7 +335,7 @@
     <w:p>
       <w:pPr>
         <w:spacing w:before="0" w:after="40"/>
-        <w:ind w:left="432" w:hanging="216"/>
+        <w:ind w:left="160" w:hanging="160"/>
       </w:pPr>
       <w:r>
         <w:rPr>
@@ -343,7 +343,7 @@
           <w:color w:val="1A1A1A"/>
           <w:sz w:val="14"/>
         </w:rPr>
-        <w:t xml:space="preserve">•  </w:t>
+        <w:t xml:space="preserve">• </w:t>
       </w:r>
       <w:r>
         <w:rPr>
@@ -359,7 +359,7 @@
     <w:p>
       <w:pPr>
         <w:spacing w:before="0" w:after="40"/>
-        <w:ind w:left="432" w:hanging="216"/>
+        <w:ind w:left="160" w:hanging="160"/>
       </w:pPr>
       <w:r>
         <w:rPr>
@@ -367,7 +367,7 @@
           <w:color w:val="1A1A1A"/>
           <w:sz w:val="14"/>
         </w:rPr>
-        <w:t xml:space="preserve">•  </w:t>
+        <w:t xml:space="preserve">• </w:t>
       </w:r>
       <w:r>
         <w:rPr>
@@ -383,7 +383,7 @@
     <w:p>
       <w:pPr>
         <w:spacing w:before="0" w:after="40"/>
-        <w:ind w:left="432" w:hanging="216"/>
+        <w:ind w:left="160" w:hanging="160"/>
       </w:pPr>
       <w:r>
         <w:rPr>
@@ -391,7 +391,7 @@
           <w:color w:val="1A1A1A"/>
           <w:sz w:val="14"/>
         </w:rPr>
-        <w:t xml:space="preserve">•  </w:t>
+        <w:t xml:space="preserve">• </w:t>
       </w:r>
       <w:r>
         <w:rPr>
@@ -407,7 +407,7 @@
     <w:p>
       <w:pPr>
         <w:spacing w:before="0" w:after="60"/>
-        <w:ind w:left="432" w:hanging="216"/>
+        <w:ind w:left="160" w:hanging="160"/>
       </w:pPr>
       <w:r>
         <w:rPr>
@@ -415,7 +415,7 @@
           <w:color w:val="1A1A1A"/>
           <w:sz w:val="14"/>
         </w:rPr>
-        <w:t xml:space="preserve">•  </w:t>
+        <w:t xml:space="preserve">• </w:t>
       </w:r>
       <w:r>
         <w:rPr>
@@ -612,7 +612,7 @@
     <w:p>
       <w:pPr>
         <w:spacing w:before="0" w:after="40"/>
-        <w:ind w:left="432" w:hanging="216"/>
+        <w:ind w:left="160" w:hanging="160"/>
       </w:pPr>
       <w:r>
         <w:rPr>
@@ -620,7 +620,7 @@
           <w:color w:val="1A1A1A"/>
           <w:sz w:val="14"/>
         </w:rPr>
-        <w:t xml:space="preserve">•  </w:t>
+        <w:t xml:space="preserve">• </w:t>
       </w:r>
       <w:r>
         <w:rPr>
@@ -646,7 +646,7 @@
     <w:p>
       <w:pPr>
         <w:spacing w:before="0" w:after="60"/>
-        <w:ind w:left="432" w:hanging="216"/>
+        <w:ind w:left="160" w:hanging="160"/>
       </w:pPr>
       <w:r>
         <w:rPr>
@@ -654,7 +654,7 @@
           <w:color w:val="1A1A1A"/>
           <w:sz w:val="14"/>
         </w:rPr>
-        <w:t xml:space="preserve">•  </w:t>
+        <w:t xml:space="preserve">• </w:t>
       </w:r>
       <w:r>
         <w:rPr>
@@ -831,7 +831,7 @@
     <w:p>
       <w:pPr>
         <w:spacing w:before="0" w:after="40"/>
-        <w:ind w:left="432" w:hanging="216"/>
+        <w:ind w:left="160" w:hanging="160"/>
       </w:pPr>
       <w:r>
         <w:rPr>
@@ -839,7 +839,7 @@
           <w:color w:val="1A1A1A"/>
           <w:sz w:val="14"/>
         </w:rPr>
-        <w:t xml:space="preserve">•  </w:t>
+        <w:t xml:space="preserve">• </w:t>
       </w:r>
       <w:r>
         <w:rPr>
@@ -865,7 +865,7 @@
     <w:p>
       <w:pPr>
         <w:spacing w:before="0" w:after="40"/>
-        <w:ind w:left="432" w:hanging="216"/>
+        <w:ind w:left="160" w:hanging="160"/>
       </w:pPr>
       <w:r>
         <w:rPr>
@@ -873,7 +873,7 @@
           <w:color w:val="1A1A1A"/>
           <w:sz w:val="14"/>
         </w:rPr>
-        <w:t xml:space="preserve">•  </w:t>
+        <w:t xml:space="preserve">• </w:t>
       </w:r>
       <w:r>
         <w:rPr>
@@ -899,7 +899,7 @@
     <w:p>
       <w:pPr>
         <w:spacing w:before="0" w:after="60"/>
-        <w:ind w:left="432" w:hanging="216"/>
+        <w:ind w:left="160" w:hanging="160"/>
       </w:pPr>
       <w:r>
         <w:rPr>
@@ -907,7 +907,7 @@
           <w:color w:val="1A1A1A"/>
           <w:sz w:val="14"/>
         </w:rPr>
-        <w:t xml:space="preserve">•  </w:t>
+        <w:t xml:space="preserve">• </w:t>
       </w:r>
       <w:r>
         <w:rPr>
@@ -948,7 +948,7 @@
     <w:p>
       <w:pPr>
         <w:spacing w:before="0" w:after="40"/>
-        <w:ind w:left="432" w:hanging="216"/>
+        <w:ind w:left="160" w:hanging="160"/>
       </w:pPr>
       <w:r>
         <w:rPr>
@@ -956,7 +956,7 @@
           <w:color w:val="1A1A1A"/>
           <w:sz w:val="14"/>
         </w:rPr>
-        <w:t xml:space="preserve">•  </w:t>
+        <w:t xml:space="preserve">• </w:t>
       </w:r>
       <w:r>
         <w:rPr>
@@ -982,7 +982,7 @@
     <w:p>
       <w:pPr>
         <w:spacing w:before="0" w:after="40"/>
-        <w:ind w:left="432" w:hanging="216"/>
+        <w:ind w:left="160" w:hanging="160"/>
       </w:pPr>
       <w:r>
         <w:rPr>
@@ -990,7 +990,7 @@
           <w:color w:val="1A1A1A"/>
           <w:sz w:val="14"/>
         </w:rPr>
-        <w:t xml:space="preserve">•  </w:t>
+        <w:t xml:space="preserve">• </w:t>
       </w:r>
       <w:r>
         <w:rPr>
@@ -1016,7 +1016,7 @@
     <w:p>
       <w:pPr>
         <w:spacing w:before="0" w:after="60"/>
-        <w:ind w:left="432" w:hanging="216"/>
+        <w:ind w:left="160" w:hanging="160"/>
       </w:pPr>
       <w:r>
         <w:rPr>
@@ -1024,7 +1024,7 @@
           <w:color w:val="1A1A1A"/>
           <w:sz w:val="14"/>
         </w:rPr>
-        <w:t xml:space="preserve">•  </w:t>
+        <w:t xml:space="preserve">• </w:t>
       </w:r>
       <w:r>
         <w:rPr>
@@ -2803,7 +2803,7 @@
     <w:p>
       <w:pPr>
         <w:spacing w:before="0" w:after="40"/>
-        <w:ind w:left="432" w:hanging="216"/>
+        <w:ind w:left="160" w:hanging="160"/>
       </w:pPr>
       <w:r>
         <w:rPr>
@@ -2811,7 +2811,7 @@
           <w:color w:val="1A1A1A"/>
           <w:sz w:val="14"/>
         </w:rPr>
-        <w:t xml:space="preserve">•  </w:t>
+        <w:t xml:space="preserve">• </w:t>
       </w:r>
       <w:r>
         <w:rPr>
@@ -2837,7 +2837,7 @@
     <w:p>
       <w:pPr>
         <w:spacing w:before="0" w:after="40"/>
-        <w:ind w:left="432" w:hanging="216"/>
+        <w:ind w:left="160" w:hanging="160"/>
       </w:pPr>
       <w:r>
         <w:rPr>
@@ -2845,7 +2845,7 @@
           <w:color w:val="1A1A1A"/>
           <w:sz w:val="14"/>
         </w:rPr>
-        <w:t xml:space="preserve">•  </w:t>
+        <w:t xml:space="preserve">• </w:t>
       </w:r>
       <w:r>
         <w:rPr>
@@ -2871,7 +2871,7 @@
     <w:p>
       <w:pPr>
         <w:spacing w:before="0" w:after="60"/>
-        <w:ind w:left="432" w:hanging="216"/>
+        <w:ind w:left="160" w:hanging="160"/>
       </w:pPr>
       <w:r>
         <w:rPr>
@@ -2879,7 +2879,7 @@
           <w:color w:val="1A1A1A"/>
           <w:sz w:val="14"/>
         </w:rPr>
-        <w:t xml:space="preserve">•  </w:t>
+        <w:t xml:space="preserve">• </w:t>
       </w:r>
       <w:r>
         <w:rPr>

</xml_diff>

<commit_message>
Restore clear bullet indent — obviously indented from body text
Left indent back to 400 twips; hanging stays at 160 for tight
bullet-to-text gap. Bullets read as a distinct indented list.

Co-Authored-By: Claude Sonnet 4.6 <noreply@anthropic.com>
</commit_message>
<xml_diff>
--- a/docs/Skillable-Intelligence-Platform.docx
+++ b/docs/Skillable-Intelligence-Platform.docx
@@ -68,7 +68,7 @@
     <w:p>
       <w:pPr>
         <w:spacing w:before="0" w:after="40"/>
-        <w:ind w:left="160" w:hanging="160"/>
+        <w:ind w:left="400" w:hanging="160"/>
       </w:pPr>
       <w:r>
         <w:rPr>
@@ -92,7 +92,7 @@
     <w:p>
       <w:pPr>
         <w:spacing w:before="0" w:after="40"/>
-        <w:ind w:left="160" w:hanging="160"/>
+        <w:ind w:left="400" w:hanging="160"/>
       </w:pPr>
       <w:r>
         <w:rPr>
@@ -116,7 +116,7 @@
     <w:p>
       <w:pPr>
         <w:spacing w:before="0" w:after="60"/>
-        <w:ind w:left="160" w:hanging="160"/>
+        <w:ind w:left="400" w:hanging="160"/>
       </w:pPr>
       <w:r>
         <w:rPr>
@@ -335,7 +335,7 @@
     <w:p>
       <w:pPr>
         <w:spacing w:before="0" w:after="40"/>
-        <w:ind w:left="160" w:hanging="160"/>
+        <w:ind w:left="400" w:hanging="160"/>
       </w:pPr>
       <w:r>
         <w:rPr>
@@ -359,7 +359,7 @@
     <w:p>
       <w:pPr>
         <w:spacing w:before="0" w:after="40"/>
-        <w:ind w:left="160" w:hanging="160"/>
+        <w:ind w:left="400" w:hanging="160"/>
       </w:pPr>
       <w:r>
         <w:rPr>
@@ -383,7 +383,7 @@
     <w:p>
       <w:pPr>
         <w:spacing w:before="0" w:after="40"/>
-        <w:ind w:left="160" w:hanging="160"/>
+        <w:ind w:left="400" w:hanging="160"/>
       </w:pPr>
       <w:r>
         <w:rPr>
@@ -407,7 +407,7 @@
     <w:p>
       <w:pPr>
         <w:spacing w:before="0" w:after="60"/>
-        <w:ind w:left="160" w:hanging="160"/>
+        <w:ind w:left="400" w:hanging="160"/>
       </w:pPr>
       <w:r>
         <w:rPr>
@@ -612,7 +612,7 @@
     <w:p>
       <w:pPr>
         <w:spacing w:before="0" w:after="40"/>
-        <w:ind w:left="160" w:hanging="160"/>
+        <w:ind w:left="400" w:hanging="160"/>
       </w:pPr>
       <w:r>
         <w:rPr>
@@ -646,7 +646,7 @@
     <w:p>
       <w:pPr>
         <w:spacing w:before="0" w:after="60"/>
-        <w:ind w:left="160" w:hanging="160"/>
+        <w:ind w:left="400" w:hanging="160"/>
       </w:pPr>
       <w:r>
         <w:rPr>
@@ -831,7 +831,7 @@
     <w:p>
       <w:pPr>
         <w:spacing w:before="0" w:after="40"/>
-        <w:ind w:left="160" w:hanging="160"/>
+        <w:ind w:left="400" w:hanging="160"/>
       </w:pPr>
       <w:r>
         <w:rPr>
@@ -865,7 +865,7 @@
     <w:p>
       <w:pPr>
         <w:spacing w:before="0" w:after="40"/>
-        <w:ind w:left="160" w:hanging="160"/>
+        <w:ind w:left="400" w:hanging="160"/>
       </w:pPr>
       <w:r>
         <w:rPr>
@@ -899,7 +899,7 @@
     <w:p>
       <w:pPr>
         <w:spacing w:before="0" w:after="60"/>
-        <w:ind w:left="160" w:hanging="160"/>
+        <w:ind w:left="400" w:hanging="160"/>
       </w:pPr>
       <w:r>
         <w:rPr>
@@ -948,7 +948,7 @@
     <w:p>
       <w:pPr>
         <w:spacing w:before="0" w:after="40"/>
-        <w:ind w:left="160" w:hanging="160"/>
+        <w:ind w:left="400" w:hanging="160"/>
       </w:pPr>
       <w:r>
         <w:rPr>
@@ -982,7 +982,7 @@
     <w:p>
       <w:pPr>
         <w:spacing w:before="0" w:after="40"/>
-        <w:ind w:left="160" w:hanging="160"/>
+        <w:ind w:left="400" w:hanging="160"/>
       </w:pPr>
       <w:r>
         <w:rPr>
@@ -1016,7 +1016,7 @@
     <w:p>
       <w:pPr>
         <w:spacing w:before="0" w:after="60"/>
-        <w:ind w:left="160" w:hanging="160"/>
+        <w:ind w:left="400" w:hanging="160"/>
       </w:pPr>
       <w:r>
         <w:rPr>
@@ -2803,7 +2803,7 @@
     <w:p>
       <w:pPr>
         <w:spacing w:before="0" w:after="40"/>
-        <w:ind w:left="160" w:hanging="160"/>
+        <w:ind w:left="400" w:hanging="160"/>
       </w:pPr>
       <w:r>
         <w:rPr>
@@ -2837,7 +2837,7 @@
     <w:p>
       <w:pPr>
         <w:spacing w:before="0" w:after="40"/>
-        <w:ind w:left="160" w:hanging="160"/>
+        <w:ind w:left="400" w:hanging="160"/>
       </w:pPr>
       <w:r>
         <w:rPr>
@@ -2871,7 +2871,7 @@
     <w:p>
       <w:pPr>
         <w:spacing w:before="0" w:after="60"/>
-        <w:ind w:left="160" w:hanging="160"/>
+        <w:ind w:left="400" w:hanging="160"/>
       </w:pPr>
       <w:r>
         <w:rPr>

</xml_diff>

<commit_message>
Remove page break before Section 3; add keepWithNext to h1/h2; widen bullet gap
- Page break between write_what() and write_how() removed
- h1 and h2 get keepWithNext so headings stay with their first paragraph
- Bullet left=480, hanging=240 — more space between bullet char and text

Co-Authored-By: Claude Sonnet 4.6 <noreply@anthropic.com>
</commit_message>
<xml_diff>
--- a/docs/Skillable-Intelligence-Platform.docx
+++ b/docs/Skillable-Intelligence-Platform.docx
@@ -38,6 +38,7 @@
     <w:p>
       <w:pPr>
         <w:spacing w:before="120" w:after="40"/>
+        <w:keepWithNext w:val="1"/>
       </w:pPr>
       <w:r>
         <w:rPr>
@@ -68,7 +69,7 @@
     <w:p>
       <w:pPr>
         <w:spacing w:before="0" w:after="40"/>
-        <w:ind w:left="400" w:hanging="160"/>
+        <w:ind w:left="480" w:hanging="240"/>
       </w:pPr>
       <w:r>
         <w:rPr>
@@ -92,7 +93,7 @@
     <w:p>
       <w:pPr>
         <w:spacing w:before="0" w:after="40"/>
-        <w:ind w:left="400" w:hanging="160"/>
+        <w:ind w:left="480" w:hanging="240"/>
       </w:pPr>
       <w:r>
         <w:rPr>
@@ -116,7 +117,7 @@
     <w:p>
       <w:pPr>
         <w:spacing w:before="0" w:after="60"/>
-        <w:ind w:left="400" w:hanging="160"/>
+        <w:ind w:left="480" w:hanging="240"/>
       </w:pPr>
       <w:r>
         <w:rPr>
@@ -140,6 +141,7 @@
     <w:p>
       <w:pPr>
         <w:spacing w:before="100" w:after="30"/>
+        <w:keepWithNext w:val="1"/>
       </w:pPr>
       <w:r>
         <w:rPr>
@@ -215,6 +217,7 @@
     <w:p>
       <w:pPr>
         <w:spacing w:before="120" w:after="40"/>
+        <w:keepWithNext w:val="1"/>
       </w:pPr>
       <w:r>
         <w:rPr>
@@ -245,6 +248,7 @@
     <w:p>
       <w:pPr>
         <w:spacing w:before="100" w:after="30"/>
+        <w:keepWithNext w:val="1"/>
       </w:pPr>
       <w:r>
         <w:rPr>
@@ -335,7 +339,7 @@
     <w:p>
       <w:pPr>
         <w:spacing w:before="0" w:after="40"/>
-        <w:ind w:left="400" w:hanging="160"/>
+        <w:ind w:left="480" w:hanging="240"/>
       </w:pPr>
       <w:r>
         <w:rPr>
@@ -359,7 +363,7 @@
     <w:p>
       <w:pPr>
         <w:spacing w:before="0" w:after="40"/>
-        <w:ind w:left="400" w:hanging="160"/>
+        <w:ind w:left="480" w:hanging="240"/>
       </w:pPr>
       <w:r>
         <w:rPr>
@@ -383,7 +387,7 @@
     <w:p>
       <w:pPr>
         <w:spacing w:before="0" w:after="40"/>
-        <w:ind w:left="400" w:hanging="160"/>
+        <w:ind w:left="480" w:hanging="240"/>
       </w:pPr>
       <w:r>
         <w:rPr>
@@ -407,7 +411,7 @@
     <w:p>
       <w:pPr>
         <w:spacing w:before="0" w:after="60"/>
-        <w:ind w:left="400" w:hanging="160"/>
+        <w:ind w:left="480" w:hanging="240"/>
       </w:pPr>
       <w:r>
         <w:rPr>
@@ -522,6 +526,7 @@
     <w:p>
       <w:pPr>
         <w:spacing w:before="100" w:after="30"/>
+        <w:keepWithNext w:val="1"/>
       </w:pPr>
       <w:r>
         <w:rPr>
@@ -612,7 +617,7 @@
     <w:p>
       <w:pPr>
         <w:spacing w:before="0" w:after="40"/>
-        <w:ind w:left="400" w:hanging="160"/>
+        <w:ind w:left="480" w:hanging="240"/>
       </w:pPr>
       <w:r>
         <w:rPr>
@@ -646,7 +651,7 @@
     <w:p>
       <w:pPr>
         <w:spacing w:before="0" w:after="60"/>
-        <w:ind w:left="400" w:hanging="160"/>
+        <w:ind w:left="480" w:hanging="240"/>
       </w:pPr>
       <w:r>
         <w:rPr>
@@ -786,6 +791,7 @@
     <w:p>
       <w:pPr>
         <w:spacing w:before="100" w:after="30"/>
+        <w:keepWithNext w:val="1"/>
       </w:pPr>
       <w:r>
         <w:rPr>
@@ -831,7 +837,7 @@
     <w:p>
       <w:pPr>
         <w:spacing w:before="0" w:after="40"/>
-        <w:ind w:left="400" w:hanging="160"/>
+        <w:ind w:left="480" w:hanging="240"/>
       </w:pPr>
       <w:r>
         <w:rPr>
@@ -865,7 +871,7 @@
     <w:p>
       <w:pPr>
         <w:spacing w:before="0" w:after="40"/>
-        <w:ind w:left="400" w:hanging="160"/>
+        <w:ind w:left="480" w:hanging="240"/>
       </w:pPr>
       <w:r>
         <w:rPr>
@@ -899,7 +905,7 @@
     <w:p>
       <w:pPr>
         <w:spacing w:before="0" w:after="60"/>
-        <w:ind w:left="400" w:hanging="160"/>
+        <w:ind w:left="480" w:hanging="240"/>
       </w:pPr>
       <w:r>
         <w:rPr>
@@ -948,7 +954,7 @@
     <w:p>
       <w:pPr>
         <w:spacing w:before="0" w:after="40"/>
-        <w:ind w:left="400" w:hanging="160"/>
+        <w:ind w:left="480" w:hanging="240"/>
       </w:pPr>
       <w:r>
         <w:rPr>
@@ -982,7 +988,7 @@
     <w:p>
       <w:pPr>
         <w:spacing w:before="0" w:after="40"/>
-        <w:ind w:left="400" w:hanging="160"/>
+        <w:ind w:left="480" w:hanging="240"/>
       </w:pPr>
       <w:r>
         <w:rPr>
@@ -1016,7 +1022,7 @@
     <w:p>
       <w:pPr>
         <w:spacing w:before="0" w:after="60"/>
-        <w:ind w:left="400" w:hanging="160"/>
+        <w:ind w:left="480" w:hanging="240"/>
       </w:pPr>
       <w:r>
         <w:rPr>
@@ -1215,15 +1221,8 @@
     </w:p>
     <w:p>
       <w:pPr>
-        <w:spacing w:before="0" w:after="0"/>
-      </w:pPr>
-      <w:r>
-        <w:br w:type="page"/>
-      </w:r>
-    </w:p>
-    <w:p>
-      <w:pPr>
         <w:spacing w:before="120" w:after="40"/>
+        <w:keepWithNext w:val="1"/>
       </w:pPr>
       <w:r>
         <w:rPr>
@@ -1254,6 +1253,7 @@
     <w:p>
       <w:pPr>
         <w:spacing w:before="100" w:after="30"/>
+        <w:keepWithNext w:val="1"/>
       </w:pPr>
       <w:r>
         <w:rPr>
@@ -1284,6 +1284,7 @@
     <w:p>
       <w:pPr>
         <w:spacing w:before="100" w:after="30"/>
+        <w:keepWithNext w:val="1"/>
       </w:pPr>
       <w:r>
         <w:rPr>
@@ -1882,6 +1883,7 @@
     <w:p>
       <w:pPr>
         <w:spacing w:before="100" w:after="30"/>
+        <w:keepWithNext w:val="1"/>
       </w:pPr>
       <w:r>
         <w:rPr>
@@ -2728,6 +2730,7 @@
     <w:p>
       <w:pPr>
         <w:spacing w:before="100" w:after="30"/>
+        <w:keepWithNext w:val="1"/>
       </w:pPr>
       <w:r>
         <w:rPr>
@@ -2773,6 +2776,7 @@
     <w:p>
       <w:pPr>
         <w:spacing w:before="120" w:after="40"/>
+        <w:keepWithNext w:val="1"/>
       </w:pPr>
       <w:r>
         <w:rPr>
@@ -2788,6 +2792,7 @@
     <w:p>
       <w:pPr>
         <w:spacing w:before="100" w:after="30"/>
+        <w:keepWithNext w:val="1"/>
       </w:pPr>
       <w:r>
         <w:rPr>
@@ -2803,7 +2808,7 @@
     <w:p>
       <w:pPr>
         <w:spacing w:before="0" w:after="40"/>
-        <w:ind w:left="400" w:hanging="160"/>
+        <w:ind w:left="480" w:hanging="240"/>
       </w:pPr>
       <w:r>
         <w:rPr>
@@ -2837,7 +2842,7 @@
     <w:p>
       <w:pPr>
         <w:spacing w:before="0" w:after="40"/>
-        <w:ind w:left="400" w:hanging="160"/>
+        <w:ind w:left="480" w:hanging="240"/>
       </w:pPr>
       <w:r>
         <w:rPr>
@@ -2871,7 +2876,7 @@
     <w:p>
       <w:pPr>
         <w:spacing w:before="0" w:after="60"/>
-        <w:ind w:left="400" w:hanging="160"/>
+        <w:ind w:left="480" w:hanging="240"/>
       </w:pPr>
       <w:r>
         <w:rPr>
@@ -2905,6 +2910,7 @@
     <w:p>
       <w:pPr>
         <w:spacing w:before="100" w:after="30"/>
+        <w:keepWithNext w:val="1"/>
       </w:pPr>
       <w:r>
         <w:rPr>

</xml_diff>

<commit_message>
Elegance pass — spacing, line height, proclamation color, title size
- Body paragraphs: 1.1x line spacing (264), after=72 twips
- h1: before=180, thin green rule below — clear section anchors
- h2: before=140, after=40
- Proclamation lines: 11pt bold dark green (from dark text)
- Title: 20pt (from 18pt)
- ai_para and body_bold match body line spacing

Co-Authored-By: Claude Sonnet 4.6 <noreply@anthropic.com>
</commit_message>
<xml_diff>
--- a/docs/Skillable-Intelligence-Platform.docx
+++ b/docs/Skillable-Intelligence-Platform.docx
@@ -12,14 +12,14 @@
           <w:b/>
           <w:i w:val="0"/>
           <w:color w:val="136945"/>
-          <w:sz w:val="36"/>
+          <w:sz w:val="40"/>
         </w:rPr>
         <w:t>Skillable Intelligence Platform</w:t>
       </w:r>
     </w:p>
     <w:p>
       <w:pPr>
-        <w:spacing w:before="0" w:after="80"/>
+        <w:spacing w:before="0" w:after="100"/>
         <w:pBdr>
           <w:bottom w:val="single" w:sz="8" w:space="1" w:color="136945"/>
         </w:pBdr>
@@ -37,8 +37,11 @@
     </w:p>
     <w:p>
       <w:pPr>
-        <w:spacing w:before="120" w:after="40"/>
+        <w:spacing w:before="180" w:after="50"/>
         <w:keepWithNext w:val="1"/>
+        <w:pBdr>
+          <w:bottom w:val="single" w:sz="4" w:space="1" w:color="136945"/>
+        </w:pBdr>
       </w:pPr>
       <w:r>
         <w:rPr>
@@ -53,7 +56,7 @@
     </w:p>
     <w:p>
       <w:pPr>
-        <w:spacing w:before="0" w:after="60"/>
+        <w:spacing w:before="0" w:after="72" w:line="264" w:lineRule="auto"/>
       </w:pPr>
       <w:r>
         <w:rPr>
@@ -140,7 +143,7 @@
     </w:p>
     <w:p>
       <w:pPr>
-        <w:spacing w:before="100" w:after="30"/>
+        <w:spacing w:before="140" w:after="40"/>
         <w:keepWithNext w:val="1"/>
       </w:pPr>
       <w:r>
@@ -156,7 +159,7 @@
     </w:p>
     <w:p>
       <w:pPr>
-        <w:spacing w:before="0" w:after="60"/>
+        <w:spacing w:before="0" w:after="72" w:line="264" w:lineRule="auto"/>
       </w:pPr>
       <w:r>
         <w:rPr>
@@ -171,7 +174,7 @@
     </w:p>
     <w:p>
       <w:pPr>
-        <w:spacing w:before="0" w:after="60"/>
+        <w:spacing w:before="0" w:after="72" w:line="264" w:lineRule="auto"/>
       </w:pPr>
       <w:r>
         <w:rPr>
@@ -186,7 +189,7 @@
     </w:p>
     <w:p>
       <w:pPr>
-        <w:spacing w:before="0" w:after="60"/>
+        <w:spacing w:before="0" w:after="72" w:line="264" w:lineRule="auto"/>
       </w:pPr>
       <w:r>
         <w:rPr>
@@ -201,7 +204,7 @@
     </w:p>
     <w:p>
       <w:pPr>
-        <w:spacing w:before="0" w:after="60"/>
+        <w:spacing w:before="0" w:after="72" w:line="264" w:lineRule="auto"/>
       </w:pPr>
       <w:r>
         <w:rPr>
@@ -216,8 +219,11 @@
     </w:p>
     <w:p>
       <w:pPr>
-        <w:spacing w:before="120" w:after="40"/>
+        <w:spacing w:before="180" w:after="50"/>
         <w:keepWithNext w:val="1"/>
+        <w:pBdr>
+          <w:bottom w:val="single" w:sz="4" w:space="1" w:color="136945"/>
+        </w:pBdr>
       </w:pPr>
       <w:r>
         <w:rPr>
@@ -232,7 +238,7 @@
     </w:p>
     <w:p>
       <w:pPr>
-        <w:spacing w:before="0" w:after="60"/>
+        <w:spacing w:before="0" w:after="72" w:line="264" w:lineRule="auto"/>
       </w:pPr>
       <w:r>
         <w:rPr>
@@ -247,7 +253,7 @@
     </w:p>
     <w:p>
       <w:pPr>
-        <w:spacing w:before="100" w:after="30"/>
+        <w:spacing w:before="140" w:after="40"/>
         <w:keepWithNext w:val="1"/>
       </w:pPr>
       <w:r>
@@ -263,7 +269,7 @@
     </w:p>
     <w:p>
       <w:pPr>
-        <w:spacing w:before="0" w:after="60"/>
+        <w:spacing w:before="0" w:after="72" w:line="264" w:lineRule="auto"/>
       </w:pPr>
       <w:r>
         <w:rPr>
@@ -278,7 +284,7 @@
     </w:p>
     <w:p>
       <w:pPr>
-        <w:spacing w:before="0" w:after="60"/>
+        <w:spacing w:before="0" w:after="72" w:line="264" w:lineRule="auto"/>
       </w:pPr>
       <w:r>
         <w:rPr>
@@ -293,7 +299,7 @@
     </w:p>
     <w:p>
       <w:pPr>
-        <w:spacing w:before="0" w:after="60"/>
+        <w:spacing w:before="0" w:after="72" w:line="264" w:lineRule="auto"/>
       </w:pPr>
       <w:r>
         <w:rPr>
@@ -308,22 +314,22 @@
     </w:p>
     <w:p>
       <w:pPr>
-        <w:spacing w:before="80" w:after="80"/>
+        <w:spacing w:before="90" w:after="90"/>
       </w:pPr>
       <w:r>
         <w:rPr>
           <w:rFonts w:ascii="Calibri" w:hAnsi="Calibri"/>
           <w:b/>
           <w:i w:val="0"/>
-          <w:color w:val="1A1A1A"/>
-          <w:sz w:val="20"/>
+          <w:color w:val="136945"/>
+          <w:sz w:val="22"/>
         </w:rPr>
         <w:t>Designer closes that gap.</w:t>
       </w:r>
     </w:p>
     <w:p>
       <w:pPr>
-        <w:spacing w:before="0" w:after="60"/>
+        <w:spacing w:before="0" w:after="72" w:line="264" w:lineRule="auto"/>
       </w:pPr>
       <w:r>
         <w:rPr>
@@ -434,7 +440,7 @@
     </w:p>
     <w:p>
       <w:pPr>
-        <w:spacing w:before="0" w:after="60"/>
+        <w:spacing w:before="0" w:after="72" w:line="264" w:lineRule="auto"/>
       </w:pPr>
       <w:r>
         <w:rPr>
@@ -500,7 +506,7 @@
     </w:p>
     <w:p>
       <w:pPr>
-        <w:spacing w:before="0" w:after="60"/>
+        <w:spacing w:before="0" w:after="72" w:line="264" w:lineRule="auto"/>
       </w:pPr>
       <w:r>
         <w:rPr>
@@ -525,7 +531,7 @@
     </w:p>
     <w:p>
       <w:pPr>
-        <w:spacing w:before="100" w:after="30"/>
+        <w:spacing w:before="140" w:after="40"/>
         <w:keepWithNext w:val="1"/>
       </w:pPr>
       <w:r>
@@ -541,7 +547,7 @@
     </w:p>
     <w:p>
       <w:pPr>
-        <w:spacing w:before="0" w:after="60"/>
+        <w:spacing w:before="0" w:after="72" w:line="264" w:lineRule="auto"/>
       </w:pPr>
       <w:r>
         <w:rPr>
@@ -556,7 +562,7 @@
     </w:p>
     <w:p>
       <w:pPr>
-        <w:spacing w:before="0" w:after="60"/>
+        <w:spacing w:before="0" w:after="72" w:line="264" w:lineRule="auto"/>
       </w:pPr>
       <w:r>
         <w:rPr>
@@ -571,7 +577,7 @@
     </w:p>
     <w:p>
       <w:pPr>
-        <w:spacing w:before="0" w:after="60"/>
+        <w:spacing w:before="0" w:after="72" w:line="264" w:lineRule="auto"/>
       </w:pPr>
       <w:r>
         <w:rPr>
@@ -586,22 +592,22 @@
     </w:p>
     <w:p>
       <w:pPr>
-        <w:spacing w:before="80" w:after="80"/>
+        <w:spacing w:before="90" w:after="90"/>
       </w:pPr>
       <w:r>
         <w:rPr>
           <w:rFonts w:ascii="Calibri" w:hAnsi="Calibri"/>
           <w:b/>
           <w:i w:val="0"/>
-          <w:color w:val="1A1A1A"/>
-          <w:sz w:val="20"/>
+          <w:color w:val="136945"/>
+          <w:sz w:val="22"/>
         </w:rPr>
         <w:t>Inspector proves labability and impact.</w:t>
       </w:r>
     </w:p>
     <w:p>
       <w:pPr>
-        <w:spacing w:before="0" w:after="60"/>
+        <w:spacing w:before="0" w:after="72" w:line="264" w:lineRule="auto"/>
       </w:pPr>
       <w:r>
         <w:rPr>
@@ -684,7 +690,7 @@
     </w:p>
     <w:p>
       <w:pPr>
-        <w:spacing w:before="0" w:after="60"/>
+        <w:spacing w:before="0" w:after="72" w:line="264" w:lineRule="auto"/>
       </w:pPr>
       <w:r>
         <w:rPr>
@@ -750,7 +756,7 @@
     </w:p>
     <w:p>
       <w:pPr>
-        <w:spacing w:before="0" w:after="60"/>
+        <w:spacing w:before="0" w:after="72" w:line="264" w:lineRule="auto"/>
       </w:pPr>
       <w:r>
         <w:rPr>
@@ -765,7 +771,7 @@
     </w:p>
     <w:p>
       <w:pPr>
-        <w:spacing w:before="0" w:after="60"/>
+        <w:spacing w:before="0" w:after="72" w:line="264" w:lineRule="auto"/>
       </w:pPr>
       <w:r>
         <w:rPr>
@@ -790,7 +796,7 @@
     </w:p>
     <w:p>
       <w:pPr>
-        <w:spacing w:before="100" w:after="30"/>
+        <w:spacing w:before="140" w:after="40"/>
         <w:keepWithNext w:val="1"/>
       </w:pPr>
       <w:r>
@@ -806,7 +812,7 @@
     </w:p>
     <w:p>
       <w:pPr>
-        <w:spacing w:before="0" w:after="60"/>
+        <w:spacing w:before="0" w:after="72" w:line="264" w:lineRule="auto"/>
       </w:pPr>
       <w:r>
         <w:rPr>
@@ -821,7 +827,7 @@
     </w:p>
     <w:p>
       <w:pPr>
-        <w:spacing w:before="0" w:after="60"/>
+        <w:spacing w:before="0" w:after="72" w:line="264" w:lineRule="auto"/>
       </w:pPr>
       <w:r>
         <w:rPr>
@@ -938,7 +944,7 @@
     </w:p>
     <w:p>
       <w:pPr>
-        <w:spacing w:before="0" w:after="60"/>
+        <w:spacing w:before="0" w:after="72" w:line="264" w:lineRule="auto"/>
       </w:pPr>
       <w:r>
         <w:rPr>
@@ -1055,7 +1061,7 @@
     </w:p>
     <w:p>
       <w:pPr>
-        <w:spacing w:before="0" w:after="60"/>
+        <w:spacing w:before="0" w:after="72" w:line="264" w:lineRule="auto"/>
       </w:pPr>
       <w:r>
         <w:rPr>
@@ -1070,7 +1076,7 @@
     </w:p>
     <w:p>
       <w:pPr>
-        <w:spacing w:before="0" w:after="60"/>
+        <w:spacing w:before="0" w:after="72" w:line="264" w:lineRule="auto"/>
       </w:pPr>
       <w:r>
         <w:rPr>
@@ -1085,22 +1091,22 @@
     </w:p>
     <w:p>
       <w:pPr>
-        <w:spacing w:before="80" w:after="80"/>
+        <w:spacing w:before="90" w:after="90"/>
       </w:pPr>
       <w:r>
         <w:rPr>
           <w:rFonts w:ascii="Calibri" w:hAnsi="Calibri"/>
           <w:b/>
           <w:i w:val="0"/>
-          <w:color w:val="1A1A1A"/>
-          <w:sz w:val="20"/>
+          <w:color w:val="136945"/>
+          <w:sz w:val="22"/>
         </w:rPr>
         <w:t>Prospector finds the right companies.</w:t>
       </w:r>
     </w:p>
     <w:p>
       <w:pPr>
-        <w:spacing w:before="0" w:after="60"/>
+        <w:spacing w:before="0" w:after="72" w:line="264" w:lineRule="auto"/>
       </w:pPr>
       <w:r>
         <w:rPr>
@@ -1115,7 +1121,7 @@
     </w:p>
     <w:p>
       <w:pPr>
-        <w:spacing w:before="0" w:after="60"/>
+        <w:spacing w:before="0" w:after="72" w:line="264" w:lineRule="auto"/>
       </w:pPr>
       <w:r>
         <w:rPr>
@@ -1181,7 +1187,7 @@
     </w:p>
     <w:p>
       <w:pPr>
-        <w:spacing w:before="0" w:after="60"/>
+        <w:spacing w:before="0" w:after="72" w:line="264" w:lineRule="auto"/>
       </w:pPr>
       <w:r>
         <w:rPr>
@@ -1206,7 +1212,7 @@
     </w:p>
     <w:p>
       <w:pPr>
-        <w:spacing w:before="0" w:after="60"/>
+        <w:spacing w:before="0" w:after="72" w:line="264" w:lineRule="auto"/>
       </w:pPr>
       <w:r>
         <w:rPr>
@@ -1221,8 +1227,11 @@
     </w:p>
     <w:p>
       <w:pPr>
-        <w:spacing w:before="120" w:after="40"/>
+        <w:spacing w:before="180" w:after="50"/>
         <w:keepWithNext w:val="1"/>
+        <w:pBdr>
+          <w:bottom w:val="single" w:sz="4" w:space="1" w:color="136945"/>
+        </w:pBdr>
       </w:pPr>
       <w:r>
         <w:rPr>
@@ -1237,7 +1246,7 @@
     </w:p>
     <w:p>
       <w:pPr>
-        <w:spacing w:before="0" w:after="60"/>
+        <w:spacing w:before="0" w:after="72" w:line="264" w:lineRule="auto"/>
       </w:pPr>
       <w:r>
         <w:rPr>
@@ -1252,7 +1261,7 @@
     </w:p>
     <w:p>
       <w:pPr>
-        <w:spacing w:before="100" w:after="30"/>
+        <w:spacing w:before="140" w:after="40"/>
         <w:keepWithNext w:val="1"/>
       </w:pPr>
       <w:r>
@@ -1268,7 +1277,7 @@
     </w:p>
     <w:p>
       <w:pPr>
-        <w:spacing w:before="0" w:after="60"/>
+        <w:spacing w:before="0" w:after="72" w:line="264" w:lineRule="auto"/>
       </w:pPr>
       <w:r>
         <w:rPr>
@@ -1283,7 +1292,7 @@
     </w:p>
     <w:p>
       <w:pPr>
-        <w:spacing w:before="100" w:after="30"/>
+        <w:spacing w:before="140" w:after="40"/>
         <w:keepWithNext w:val="1"/>
       </w:pPr>
       <w:r>
@@ -1299,7 +1308,7 @@
     </w:p>
     <w:p>
       <w:pPr>
-        <w:spacing w:before="0" w:after="60"/>
+        <w:spacing w:before="0" w:after="72" w:line="264" w:lineRule="auto"/>
       </w:pPr>
       <w:r>
         <w:rPr>
@@ -1314,7 +1323,7 @@
     </w:p>
     <w:p>
       <w:pPr>
-        <w:spacing w:before="0" w:after="60"/>
+        <w:spacing w:before="0" w:after="72" w:line="264" w:lineRule="auto"/>
       </w:pPr>
       <w:r>
         <w:rPr>
@@ -1867,7 +1876,7 @@
     </w:p>
     <w:p>
       <w:pPr>
-        <w:spacing w:before="0" w:after="60"/>
+        <w:spacing w:before="0" w:after="72" w:line="264" w:lineRule="auto"/>
       </w:pPr>
       <w:r>
         <w:rPr>
@@ -1882,7 +1891,7 @@
     </w:p>
     <w:p>
       <w:pPr>
-        <w:spacing w:before="100" w:after="30"/>
+        <w:spacing w:before="140" w:after="40"/>
         <w:keepWithNext w:val="1"/>
       </w:pPr>
       <w:r>
@@ -1898,7 +1907,7 @@
     </w:p>
     <w:p>
       <w:pPr>
-        <w:spacing w:before="0" w:after="60"/>
+        <w:spacing w:before="0" w:after="72" w:line="264" w:lineRule="auto"/>
       </w:pPr>
       <w:r>
         <w:rPr>
@@ -1913,7 +1922,7 @@
     </w:p>
     <w:p>
       <w:pPr>
-        <w:spacing w:before="0" w:after="60"/>
+        <w:spacing w:before="0" w:after="72" w:line="264" w:lineRule="auto"/>
       </w:pPr>
       <w:r>
         <w:rPr>
@@ -2292,7 +2301,7 @@
     </w:p>
     <w:p>
       <w:pPr>
-        <w:spacing w:before="0" w:after="60"/>
+        <w:spacing w:before="0" w:after="72" w:line="264" w:lineRule="auto"/>
       </w:pPr>
       <w:r>
         <w:rPr>
@@ -2729,7 +2738,7 @@
     </w:p>
     <w:p>
       <w:pPr>
-        <w:spacing w:before="100" w:after="30"/>
+        <w:spacing w:before="140" w:after="40"/>
         <w:keepWithNext w:val="1"/>
       </w:pPr>
       <w:r>
@@ -2745,7 +2754,7 @@
     </w:p>
     <w:p>
       <w:pPr>
-        <w:spacing w:before="0" w:after="60"/>
+        <w:spacing w:before="0" w:after="72" w:line="264" w:lineRule="auto"/>
       </w:pPr>
       <w:r>
         <w:rPr>
@@ -2760,7 +2769,7 @@
     </w:p>
     <w:p>
       <w:pPr>
-        <w:spacing w:before="0" w:after="60"/>
+        <w:spacing w:before="0" w:after="72" w:line="264" w:lineRule="auto"/>
       </w:pPr>
       <w:r>
         <w:rPr>
@@ -2775,8 +2784,11 @@
     </w:p>
     <w:p>
       <w:pPr>
-        <w:spacing w:before="120" w:after="40"/>
+        <w:spacing w:before="180" w:after="50"/>
         <w:keepWithNext w:val="1"/>
+        <w:pBdr>
+          <w:bottom w:val="single" w:sz="4" w:space="1" w:color="136945"/>
+        </w:pBdr>
       </w:pPr>
       <w:r>
         <w:rPr>
@@ -2791,7 +2803,7 @@
     </w:p>
     <w:p>
       <w:pPr>
-        <w:spacing w:before="100" w:after="30"/>
+        <w:spacing w:before="140" w:after="40"/>
         <w:keepWithNext w:val="1"/>
       </w:pPr>
       <w:r>
@@ -2909,7 +2921,7 @@
     </w:p>
     <w:p>
       <w:pPr>
-        <w:spacing w:before="100" w:after="30"/>
+        <w:spacing w:before="140" w:after="40"/>
         <w:keepWithNext w:val="1"/>
       </w:pPr>
       <w:r>
@@ -2925,7 +2937,7 @@
     </w:p>
     <w:p>
       <w:pPr>
-        <w:spacing w:before="0" w:after="60"/>
+        <w:spacing w:before="0" w:after="72" w:line="264" w:lineRule="auto"/>
       </w:pPr>
       <w:r>
         <w:rPr>

</xml_diff>

<commit_message>
Fix bullets, keepNext, last table column width
- Bullet: tab character + explicit tab stop at 480 twips — wrapped lines
  now align with text, not bullet character
- keepWithNext → keepNext (correct OOXML element name) — headings now
  stay with their first paragraph across page breaks
- Last table col1_dxa: 2600 → 3800 — reduces word wrap in Decision column

Co-Authored-By: Claude Sonnet 4.6 <noreply@anthropic.com>
</commit_message>
<xml_diff>
--- a/docs/Skillable-Intelligence-Platform.docx
+++ b/docs/Skillable-Intelligence-Platform.docx
@@ -38,7 +38,7 @@
     <w:p>
       <w:pPr>
         <w:spacing w:before="180" w:after="50"/>
-        <w:keepWithNext w:val="1"/>
+        <w:keepNext w:val="1"/>
         <w:pBdr>
           <w:bottom w:val="single" w:sz="4" w:space="1" w:color="136945"/>
         </w:pBdr>
@@ -73,6 +73,9 @@
       <w:pPr>
         <w:spacing w:before="0" w:after="40"/>
         <w:ind w:left="480" w:hanging="240"/>
+        <w:tabs>
+          <w:tab w:val="left" w:pos="480"/>
+        </w:tabs>
       </w:pPr>
       <w:r>
         <w:rPr>
@@ -80,7 +83,8 @@
           <w:color w:val="1A1A1A"/>
           <w:sz w:val="14"/>
         </w:rPr>
-        <w:t xml:space="preserve">• </w:t>
+        <w:t>•</w:t>
+        <w:tab/>
       </w:r>
       <w:r>
         <w:rPr>
@@ -97,6 +101,9 @@
       <w:pPr>
         <w:spacing w:before="0" w:after="40"/>
         <w:ind w:left="480" w:hanging="240"/>
+        <w:tabs>
+          <w:tab w:val="left" w:pos="480"/>
+        </w:tabs>
       </w:pPr>
       <w:r>
         <w:rPr>
@@ -104,7 +111,8 @@
           <w:color w:val="1A1A1A"/>
           <w:sz w:val="14"/>
         </w:rPr>
-        <w:t xml:space="preserve">• </w:t>
+        <w:t>•</w:t>
+        <w:tab/>
       </w:r>
       <w:r>
         <w:rPr>
@@ -121,6 +129,9 @@
       <w:pPr>
         <w:spacing w:before="0" w:after="60"/>
         <w:ind w:left="480" w:hanging="240"/>
+        <w:tabs>
+          <w:tab w:val="left" w:pos="480"/>
+        </w:tabs>
       </w:pPr>
       <w:r>
         <w:rPr>
@@ -128,7 +139,8 @@
           <w:color w:val="1A1A1A"/>
           <w:sz w:val="14"/>
         </w:rPr>
-        <w:t xml:space="preserve">• </w:t>
+        <w:t>•</w:t>
+        <w:tab/>
       </w:r>
       <w:r>
         <w:rPr>
@@ -144,7 +156,7 @@
     <w:p>
       <w:pPr>
         <w:spacing w:before="140" w:after="40"/>
-        <w:keepWithNext w:val="1"/>
+        <w:keepNext w:val="1"/>
       </w:pPr>
       <w:r>
         <w:rPr>
@@ -220,7 +232,7 @@
     <w:p>
       <w:pPr>
         <w:spacing w:before="180" w:after="50"/>
-        <w:keepWithNext w:val="1"/>
+        <w:keepNext w:val="1"/>
         <w:pBdr>
           <w:bottom w:val="single" w:sz="4" w:space="1" w:color="136945"/>
         </w:pBdr>
@@ -254,7 +266,7 @@
     <w:p>
       <w:pPr>
         <w:spacing w:before="140" w:after="40"/>
-        <w:keepWithNext w:val="1"/>
+        <w:keepNext w:val="1"/>
       </w:pPr>
       <w:r>
         <w:rPr>
@@ -346,6 +358,9 @@
       <w:pPr>
         <w:spacing w:before="0" w:after="40"/>
         <w:ind w:left="480" w:hanging="240"/>
+        <w:tabs>
+          <w:tab w:val="left" w:pos="480"/>
+        </w:tabs>
       </w:pPr>
       <w:r>
         <w:rPr>
@@ -353,7 +368,8 @@
           <w:color w:val="1A1A1A"/>
           <w:sz w:val="14"/>
         </w:rPr>
-        <w:t xml:space="preserve">• </w:t>
+        <w:t>•</w:t>
+        <w:tab/>
       </w:r>
       <w:r>
         <w:rPr>
@@ -370,6 +386,9 @@
       <w:pPr>
         <w:spacing w:before="0" w:after="40"/>
         <w:ind w:left="480" w:hanging="240"/>
+        <w:tabs>
+          <w:tab w:val="left" w:pos="480"/>
+        </w:tabs>
       </w:pPr>
       <w:r>
         <w:rPr>
@@ -377,7 +396,8 @@
           <w:color w:val="1A1A1A"/>
           <w:sz w:val="14"/>
         </w:rPr>
-        <w:t xml:space="preserve">• </w:t>
+        <w:t>•</w:t>
+        <w:tab/>
       </w:r>
       <w:r>
         <w:rPr>
@@ -394,6 +414,9 @@
       <w:pPr>
         <w:spacing w:before="0" w:after="40"/>
         <w:ind w:left="480" w:hanging="240"/>
+        <w:tabs>
+          <w:tab w:val="left" w:pos="480"/>
+        </w:tabs>
       </w:pPr>
       <w:r>
         <w:rPr>
@@ -401,7 +424,8 @@
           <w:color w:val="1A1A1A"/>
           <w:sz w:val="14"/>
         </w:rPr>
-        <w:t xml:space="preserve">• </w:t>
+        <w:t>•</w:t>
+        <w:tab/>
       </w:r>
       <w:r>
         <w:rPr>
@@ -418,6 +442,9 @@
       <w:pPr>
         <w:spacing w:before="0" w:after="60"/>
         <w:ind w:left="480" w:hanging="240"/>
+        <w:tabs>
+          <w:tab w:val="left" w:pos="480"/>
+        </w:tabs>
       </w:pPr>
       <w:r>
         <w:rPr>
@@ -425,7 +452,8 @@
           <w:color w:val="1A1A1A"/>
           <w:sz w:val="14"/>
         </w:rPr>
-        <w:t xml:space="preserve">• </w:t>
+        <w:t>•</w:t>
+        <w:tab/>
       </w:r>
       <w:r>
         <w:rPr>
@@ -532,7 +560,7 @@
     <w:p>
       <w:pPr>
         <w:spacing w:before="140" w:after="40"/>
-        <w:keepWithNext w:val="1"/>
+        <w:keepNext w:val="1"/>
       </w:pPr>
       <w:r>
         <w:rPr>
@@ -624,6 +652,9 @@
       <w:pPr>
         <w:spacing w:before="0" w:after="40"/>
         <w:ind w:left="480" w:hanging="240"/>
+        <w:tabs>
+          <w:tab w:val="left" w:pos="480"/>
+        </w:tabs>
       </w:pPr>
       <w:r>
         <w:rPr>
@@ -631,7 +662,8 @@
           <w:color w:val="1A1A1A"/>
           <w:sz w:val="14"/>
         </w:rPr>
-        <w:t xml:space="preserve">• </w:t>
+        <w:t>•</w:t>
+        <w:tab/>
       </w:r>
       <w:r>
         <w:rPr>
@@ -658,6 +690,9 @@
       <w:pPr>
         <w:spacing w:before="0" w:after="60"/>
         <w:ind w:left="480" w:hanging="240"/>
+        <w:tabs>
+          <w:tab w:val="left" w:pos="480"/>
+        </w:tabs>
       </w:pPr>
       <w:r>
         <w:rPr>
@@ -665,7 +700,8 @@
           <w:color w:val="1A1A1A"/>
           <w:sz w:val="14"/>
         </w:rPr>
-        <w:t xml:space="preserve">• </w:t>
+        <w:t>•</w:t>
+        <w:tab/>
       </w:r>
       <w:r>
         <w:rPr>
@@ -797,7 +833,7 @@
     <w:p>
       <w:pPr>
         <w:spacing w:before="140" w:after="40"/>
-        <w:keepWithNext w:val="1"/>
+        <w:keepNext w:val="1"/>
       </w:pPr>
       <w:r>
         <w:rPr>
@@ -844,6 +880,9 @@
       <w:pPr>
         <w:spacing w:before="0" w:after="40"/>
         <w:ind w:left="480" w:hanging="240"/>
+        <w:tabs>
+          <w:tab w:val="left" w:pos="480"/>
+        </w:tabs>
       </w:pPr>
       <w:r>
         <w:rPr>
@@ -851,7 +890,8 @@
           <w:color w:val="1A1A1A"/>
           <w:sz w:val="14"/>
         </w:rPr>
-        <w:t xml:space="preserve">• </w:t>
+        <w:t>•</w:t>
+        <w:tab/>
       </w:r>
       <w:r>
         <w:rPr>
@@ -878,6 +918,9 @@
       <w:pPr>
         <w:spacing w:before="0" w:after="40"/>
         <w:ind w:left="480" w:hanging="240"/>
+        <w:tabs>
+          <w:tab w:val="left" w:pos="480"/>
+        </w:tabs>
       </w:pPr>
       <w:r>
         <w:rPr>
@@ -885,7 +928,8 @@
           <w:color w:val="1A1A1A"/>
           <w:sz w:val="14"/>
         </w:rPr>
-        <w:t xml:space="preserve">• </w:t>
+        <w:t>•</w:t>
+        <w:tab/>
       </w:r>
       <w:r>
         <w:rPr>
@@ -912,6 +956,9 @@
       <w:pPr>
         <w:spacing w:before="0" w:after="60"/>
         <w:ind w:left="480" w:hanging="240"/>
+        <w:tabs>
+          <w:tab w:val="left" w:pos="480"/>
+        </w:tabs>
       </w:pPr>
       <w:r>
         <w:rPr>
@@ -919,7 +966,8 @@
           <w:color w:val="1A1A1A"/>
           <w:sz w:val="14"/>
         </w:rPr>
-        <w:t xml:space="preserve">• </w:t>
+        <w:t>•</w:t>
+        <w:tab/>
       </w:r>
       <w:r>
         <w:rPr>
@@ -961,6 +1009,9 @@
       <w:pPr>
         <w:spacing w:before="0" w:after="40"/>
         <w:ind w:left="480" w:hanging="240"/>
+        <w:tabs>
+          <w:tab w:val="left" w:pos="480"/>
+        </w:tabs>
       </w:pPr>
       <w:r>
         <w:rPr>
@@ -968,7 +1019,8 @@
           <w:color w:val="1A1A1A"/>
           <w:sz w:val="14"/>
         </w:rPr>
-        <w:t xml:space="preserve">• </w:t>
+        <w:t>•</w:t>
+        <w:tab/>
       </w:r>
       <w:r>
         <w:rPr>
@@ -995,6 +1047,9 @@
       <w:pPr>
         <w:spacing w:before="0" w:after="40"/>
         <w:ind w:left="480" w:hanging="240"/>
+        <w:tabs>
+          <w:tab w:val="left" w:pos="480"/>
+        </w:tabs>
       </w:pPr>
       <w:r>
         <w:rPr>
@@ -1002,7 +1057,8 @@
           <w:color w:val="1A1A1A"/>
           <w:sz w:val="14"/>
         </w:rPr>
-        <w:t xml:space="preserve">• </w:t>
+        <w:t>•</w:t>
+        <w:tab/>
       </w:r>
       <w:r>
         <w:rPr>
@@ -1029,6 +1085,9 @@
       <w:pPr>
         <w:spacing w:before="0" w:after="60"/>
         <w:ind w:left="480" w:hanging="240"/>
+        <w:tabs>
+          <w:tab w:val="left" w:pos="480"/>
+        </w:tabs>
       </w:pPr>
       <w:r>
         <w:rPr>
@@ -1036,7 +1095,8 @@
           <w:color w:val="1A1A1A"/>
           <w:sz w:val="14"/>
         </w:rPr>
-        <w:t xml:space="preserve">• </w:t>
+        <w:t>•</w:t>
+        <w:tab/>
       </w:r>
       <w:r>
         <w:rPr>
@@ -1228,7 +1288,7 @@
     <w:p>
       <w:pPr>
         <w:spacing w:before="180" w:after="50"/>
-        <w:keepWithNext w:val="1"/>
+        <w:keepNext w:val="1"/>
         <w:pBdr>
           <w:bottom w:val="single" w:sz="4" w:space="1" w:color="136945"/>
         </w:pBdr>
@@ -1262,7 +1322,7 @@
     <w:p>
       <w:pPr>
         <w:spacing w:before="140" w:after="40"/>
-        <w:keepWithNext w:val="1"/>
+        <w:keepNext w:val="1"/>
       </w:pPr>
       <w:r>
         <w:rPr>
@@ -1293,7 +1353,7 @@
     <w:p>
       <w:pPr>
         <w:spacing w:before="140" w:after="40"/>
-        <w:keepWithNext w:val="1"/>
+        <w:keepNext w:val="1"/>
       </w:pPr>
       <w:r>
         <w:rPr>
@@ -1892,7 +1952,7 @@
     <w:p>
       <w:pPr>
         <w:spacing w:before="140" w:after="40"/>
-        <w:keepWithNext w:val="1"/>
+        <w:keepNext w:val="1"/>
       </w:pPr>
       <w:r>
         <w:rPr>
@@ -2739,7 +2799,7 @@
     <w:p>
       <w:pPr>
         <w:spacing w:before="140" w:after="40"/>
-        <w:keepWithNext w:val="1"/>
+        <w:keepNext w:val="1"/>
       </w:pPr>
       <w:r>
         <w:rPr>
@@ -2785,7 +2845,7 @@
     <w:p>
       <w:pPr>
         <w:spacing w:before="180" w:after="50"/>
-        <w:keepWithNext w:val="1"/>
+        <w:keepNext w:val="1"/>
         <w:pBdr>
           <w:bottom w:val="single" w:sz="4" w:space="1" w:color="136945"/>
         </w:pBdr>
@@ -2804,7 +2864,7 @@
     <w:p>
       <w:pPr>
         <w:spacing w:before="140" w:after="40"/>
-        <w:keepWithNext w:val="1"/>
+        <w:keepNext w:val="1"/>
       </w:pPr>
       <w:r>
         <w:rPr>
@@ -2821,6 +2881,9 @@
       <w:pPr>
         <w:spacing w:before="0" w:after="40"/>
         <w:ind w:left="480" w:hanging="240"/>
+        <w:tabs>
+          <w:tab w:val="left" w:pos="480"/>
+        </w:tabs>
       </w:pPr>
       <w:r>
         <w:rPr>
@@ -2828,7 +2891,8 @@
           <w:color w:val="1A1A1A"/>
           <w:sz w:val="14"/>
         </w:rPr>
-        <w:t xml:space="preserve">• </w:t>
+        <w:t>•</w:t>
+        <w:tab/>
       </w:r>
       <w:r>
         <w:rPr>
@@ -2855,6 +2919,9 @@
       <w:pPr>
         <w:spacing w:before="0" w:after="40"/>
         <w:ind w:left="480" w:hanging="240"/>
+        <w:tabs>
+          <w:tab w:val="left" w:pos="480"/>
+        </w:tabs>
       </w:pPr>
       <w:r>
         <w:rPr>
@@ -2862,7 +2929,8 @@
           <w:color w:val="1A1A1A"/>
           <w:sz w:val="14"/>
         </w:rPr>
-        <w:t xml:space="preserve">• </w:t>
+        <w:t>•</w:t>
+        <w:tab/>
       </w:r>
       <w:r>
         <w:rPr>
@@ -2889,6 +2957,9 @@
       <w:pPr>
         <w:spacing w:before="0" w:after="60"/>
         <w:ind w:left="480" w:hanging="240"/>
+        <w:tabs>
+          <w:tab w:val="left" w:pos="480"/>
+        </w:tabs>
       </w:pPr>
       <w:r>
         <w:rPr>
@@ -2896,7 +2967,8 @@
           <w:color w:val="1A1A1A"/>
           <w:sz w:val="14"/>
         </w:rPr>
-        <w:t xml:space="preserve">• </w:t>
+        <w:t>•</w:t>
+        <w:tab/>
       </w:r>
       <w:r>
         <w:rPr>
@@ -2922,7 +2994,7 @@
     <w:p>
       <w:pPr>
         <w:spacing w:before="140" w:after="40"/>
-        <w:keepWithNext w:val="1"/>
+        <w:keepNext w:val="1"/>
       </w:pPr>
       <w:r>
         <w:rPr>
@@ -2971,7 +3043,7 @@
               <w:bottom w:w="50" w:type="dxa"/>
               <w:right w:w="50" w:type="dxa"/>
             </w:tcMar>
-            <w:tcW w:w="2600" w:type="dxa"/>
+            <w:tcW w:w="3800" w:type="dxa"/>
           </w:tcPr>
           <w:p>
             <w:pPr>
@@ -2999,7 +3071,7 @@
               <w:bottom w:w="50" w:type="dxa"/>
               <w:right w:w="50" w:type="dxa"/>
             </w:tcMar>
-            <w:tcW w:w="7192" w:type="dxa"/>
+            <w:tcW w:w="5992" w:type="dxa"/>
           </w:tcPr>
           <w:p>
             <w:pPr>
@@ -3029,7 +3101,7 @@
               <w:bottom w:w="50" w:type="dxa"/>
               <w:right w:w="50" w:type="dxa"/>
             </w:tcMar>
-            <w:tcW w:w="2600" w:type="dxa"/>
+            <w:tcW w:w="3800" w:type="dxa"/>
           </w:tcPr>
           <w:p>
             <w:pPr>
@@ -3057,7 +3129,7 @@
               <w:bottom w:w="50" w:type="dxa"/>
               <w:right w:w="50" w:type="dxa"/>
             </w:tcMar>
-            <w:tcW w:w="7192" w:type="dxa"/>
+            <w:tcW w:w="5992" w:type="dxa"/>
           </w:tcPr>
           <w:p>
             <w:pPr>
@@ -3087,7 +3159,7 @@
               <w:bottom w:w="50" w:type="dxa"/>
               <w:right w:w="50" w:type="dxa"/>
             </w:tcMar>
-            <w:tcW w:w="2600" w:type="dxa"/>
+            <w:tcW w:w="3800" w:type="dxa"/>
           </w:tcPr>
           <w:p>
             <w:pPr>
@@ -3115,7 +3187,7 @@
               <w:bottom w:w="50" w:type="dxa"/>
               <w:right w:w="50" w:type="dxa"/>
             </w:tcMar>
-            <w:tcW w:w="7192" w:type="dxa"/>
+            <w:tcW w:w="5992" w:type="dxa"/>
           </w:tcPr>
           <w:p>
             <w:pPr>
@@ -3145,7 +3217,7 @@
               <w:bottom w:w="50" w:type="dxa"/>
               <w:right w:w="50" w:type="dxa"/>
             </w:tcMar>
-            <w:tcW w:w="2600" w:type="dxa"/>
+            <w:tcW w:w="3800" w:type="dxa"/>
           </w:tcPr>
           <w:p>
             <w:pPr>
@@ -3173,7 +3245,7 @@
               <w:bottom w:w="50" w:type="dxa"/>
               <w:right w:w="50" w:type="dxa"/>
             </w:tcMar>
-            <w:tcW w:w="7192" w:type="dxa"/>
+            <w:tcW w:w="5992" w:type="dxa"/>
           </w:tcPr>
           <w:p>
             <w:pPr>
@@ -3203,7 +3275,7 @@
               <w:bottom w:w="50" w:type="dxa"/>
               <w:right w:w="50" w:type="dxa"/>
             </w:tcMar>
-            <w:tcW w:w="2600" w:type="dxa"/>
+            <w:tcW w:w="3800" w:type="dxa"/>
           </w:tcPr>
           <w:p>
             <w:pPr>
@@ -3231,7 +3303,7 @@
               <w:bottom w:w="50" w:type="dxa"/>
               <w:right w:w="50" w:type="dxa"/>
             </w:tcMar>
-            <w:tcW w:w="7192" w:type="dxa"/>
+            <w:tcW w:w="5992" w:type="dxa"/>
           </w:tcPr>
           <w:p>
             <w:pPr>
@@ -3261,7 +3333,7 @@
               <w:bottom w:w="50" w:type="dxa"/>
               <w:right w:w="50" w:type="dxa"/>
             </w:tcMar>
-            <w:tcW w:w="2600" w:type="dxa"/>
+            <w:tcW w:w="3800" w:type="dxa"/>
           </w:tcPr>
           <w:p>
             <w:pPr>
@@ -3289,7 +3361,7 @@
               <w:bottom w:w="50" w:type="dxa"/>
               <w:right w:w="50" w:type="dxa"/>
             </w:tcMar>
-            <w:tcW w:w="7192" w:type="dxa"/>
+            <w:tcW w:w="5992" w:type="dxa"/>
           </w:tcPr>
           <w:p>
             <w:pPr>
@@ -3319,7 +3391,7 @@
               <w:bottom w:w="50" w:type="dxa"/>
               <w:right w:w="50" w:type="dxa"/>
             </w:tcMar>
-            <w:tcW w:w="2600" w:type="dxa"/>
+            <w:tcW w:w="3800" w:type="dxa"/>
           </w:tcPr>
           <w:p>
             <w:pPr>
@@ -3347,7 +3419,7 @@
               <w:bottom w:w="50" w:type="dxa"/>
               <w:right w:w="50" w:type="dxa"/>
             </w:tcMar>
-            <w:tcW w:w="7192" w:type="dxa"/>
+            <w:tcW w:w="5992" w:type="dxa"/>
           </w:tcPr>
           <w:p>
             <w:pPr>
@@ -3377,7 +3449,7 @@
               <w:bottom w:w="50" w:type="dxa"/>
               <w:right w:w="50" w:type="dxa"/>
             </w:tcMar>
-            <w:tcW w:w="2600" w:type="dxa"/>
+            <w:tcW w:w="3800" w:type="dxa"/>
           </w:tcPr>
           <w:p>
             <w:pPr>
@@ -3405,7 +3477,7 @@
               <w:bottom w:w="50" w:type="dxa"/>
               <w:right w:w="50" w:type="dxa"/>
             </w:tcMar>
-            <w:tcW w:w="7192" w:type="dxa"/>
+            <w:tcW w:w="5992" w:type="dxa"/>
           </w:tcPr>
           <w:p>
             <w:pPr>
@@ -3435,7 +3507,7 @@
               <w:bottom w:w="50" w:type="dxa"/>
               <w:right w:w="50" w:type="dxa"/>
             </w:tcMar>
-            <w:tcW w:w="2600" w:type="dxa"/>
+            <w:tcW w:w="3800" w:type="dxa"/>
           </w:tcPr>
           <w:p>
             <w:pPr>
@@ -3463,7 +3535,7 @@
               <w:bottom w:w="50" w:type="dxa"/>
               <w:right w:w="50" w:type="dxa"/>
             </w:tcMar>
-            <w:tcW w:w="7192" w:type="dxa"/>
+            <w:tcW w:w="5992" w:type="dxa"/>
           </w:tcPr>
           <w:p>
             <w:pPr>

</xml_diff>

<commit_message>
Expand AI moments to 9; fix proclamation keepNext; h2 after=0
- AI moments: intro compounding effect, Designer asks/BOM/adoption gap,
  Inspector sales conversation/competitive map/pre-call prep,
  Prospector finds/qualifies
- proclamation() gets keepNext so pivot lines stay with solution text
- h2 after spacing set to 0 — headings connect tightly to body copy

Co-Authored-By: Claude Sonnet 4.6 <noreply@anthropic.com>
</commit_message>
<xml_diff>
--- a/docs/Skillable-Intelligence-Platform.docx
+++ b/docs/Skillable-Intelligence-Platform.docx
@@ -152,7 +152,7 @@
     </w:p>
     <w:p>
       <w:pPr>
-        <w:spacing w:before="140" w:after="40"/>
+        <w:spacing w:before="140" w:after="0"/>
         <w:keepNext w:val="1"/>
       </w:pPr>
       <w:r>
@@ -253,16 +253,67 @@
         <w:rPr>
           <w:rFonts w:ascii="Calibri" w:hAnsi="Calibri"/>
           <w:b w:val="0"/>
-          <w:i w:val="0"/>
           <w:color w:val="1A1A1A"/>
           <w:sz w:val="20"/>
         </w:rPr>
-        <w:t>Each tool addresses one of the three challenges directly. All three share the same research and scoring engine — which means every analysis makes the entire platform smarter. A company Prospector evaluates is available to Inspector without re-running research. An Inspector analysis seeds Designer with the product context it needs from day one. The intelligence compounds with every use.</w:t>
+        <w:t xml:space="preserve">Each tool addresses one of the three challenges directly. All three share the same research and scoring engine — which means every analysis makes the entire platform smarter. A company Prospector evaluates is available to Inspector without re-running research. An Inspector analysis seeds Designer with the product context it needs from day one. </w:t>
+      </w:r>
+      <w:r>
+        <w:rPr>
+          <w:rFonts w:ascii="Calibri" w:hAnsi="Calibri"/>
+          <w:b/>
+          <w:color w:val="7000FF"/>
+          <w:sz w:val="20"/>
+        </w:rPr>
+        <w:t>The intelligence compounds with every use.</w:t>
+      </w:r>
+      <w:r>
+        <w:drawing>
+          <wp:anchor distT="0" distB="0" distL="114300" distR="114300" simplePos="0" relativeHeight="251658240" behindDoc="0" locked="0" layoutInCell="1" allowOverlap="1">
+            <wp:simplePos x="0" y="0"/>
+            <wp:positionH relativeFrom="page">
+              <wp:posOffset>7068312</wp:posOffset>
+            </wp:positionH>
+            <wp:positionV relativeFrom="paragraph">
+              <wp:posOffset>9144</wp:posOffset>
+            </wp:positionV>
+            <wp:extent cx="210312" cy="210312"/>
+            <wp:effectExtent l="0" t="0" r="0" b="0"/>
+            <wp:wrapNone/>
+            <wp:docPr id="1" name="Picture 1"/>
+            <wp:cNvGraphicFramePr xmlns:a="http://schemas.openxmlformats.org/drawingml/2006/main">
+              <a:graphicFrameLocks noChangeAspect="1"/>
+            </wp:cNvGraphicFramePr>
+            <a:graphic xmlns:a="http://schemas.openxmlformats.org/drawingml/2006/main" xmlns:pic="http://schemas.openxmlformats.org/drawingml/2006/picture">
+              <a:graphicData uri="http://schemas.openxmlformats.org/drawingml/2006/picture">
+                <pic:pic>
+                  <pic:nvPicPr>
+                    <pic:cNvPr id="0" name="ai-moment-icon.png"/>
+                    <pic:cNvPicPr/>
+                  </pic:nvPicPr>
+                  <pic:blipFill>
+                    <a:blip r:embed="rId11"/>
+                    <a:stretch>
+                      <a:fillRect/>
+                    </a:stretch>
+                  </pic:blipFill>
+                  <pic:spPr>
+                    <a:xfrm>
+                      <a:off x="0" y="0"/>
+                      <a:ext cx="210312" cy="210312"/>
+                    </a:xfrm>
+                    <a:prstGeom prst="rect"/>
+                  </pic:spPr>
+                </pic:pic>
+              </a:graphicData>
+            </a:graphic>
+          </wp:anchor>
+        </w:drawing>
       </w:r>
     </w:p>
     <w:p>
       <w:pPr>
-        <w:spacing w:before="140" w:after="40"/>
+        <w:spacing w:before="140" w:after="0"/>
         <w:keepNext w:val="1"/>
       </w:pPr>
       <w:r>
@@ -324,6 +375,7 @@
     <w:p>
       <w:pPr>
         <w:spacing w:before="90" w:after="90"/>
+        <w:keepNext w:val="1"/>
       </w:pPr>
       <w:r>
         <w:rPr>
@@ -344,11 +396,77 @@
         <w:rPr>
           <w:rFonts w:ascii="Calibri" w:hAnsi="Calibri"/>
           <w:b w:val="0"/>
+          <w:color w:val="1A1A1A"/>
+          <w:sz w:val="20"/>
+        </w:rPr>
+        <w:t xml:space="preserve">Designer guides program owners, instructional designers, and subject matter experts through the full process — from learning objectives and intended audience through every decision a program requires. It doesn’t require the customer to know how to design a lab program. </w:t>
+      </w:r>
+      <w:r>
+        <w:rPr>
+          <w:rFonts w:ascii="Calibri" w:hAnsi="Calibri"/>
+          <w:b/>
+          <w:color w:val="7000FF"/>
+          <w:sz w:val="20"/>
+        </w:rPr>
+        <w:t>Designer asks the right questions and sequences the decisions correctly.</w:t>
+      </w:r>
+      <w:r>
+        <w:drawing>
+          <wp:anchor distT="0" distB="0" distL="114300" distR="114300" simplePos="0" relativeHeight="251658240" behindDoc="0" locked="0" layoutInCell="1" allowOverlap="1">
+            <wp:simplePos x="0" y="0"/>
+            <wp:positionH relativeFrom="page">
+              <wp:posOffset>7068312</wp:posOffset>
+            </wp:positionH>
+            <wp:positionV relativeFrom="paragraph">
+              <wp:posOffset>9144</wp:posOffset>
+            </wp:positionV>
+            <wp:extent cx="210312" cy="210312"/>
+            <wp:effectExtent l="0" t="0" r="0" b="0"/>
+            <wp:wrapNone/>
+            <wp:docPr id="2" name="Picture 2"/>
+            <wp:cNvGraphicFramePr xmlns:a="http://schemas.openxmlformats.org/drawingml/2006/main">
+              <a:graphicFrameLocks noChangeAspect="1"/>
+            </wp:cNvGraphicFramePr>
+            <a:graphic xmlns:a="http://schemas.openxmlformats.org/drawingml/2006/main" xmlns:pic="http://schemas.openxmlformats.org/drawingml/2006/picture">
+              <a:graphicData uri="http://schemas.openxmlformats.org/drawingml/2006/picture">
+                <pic:pic>
+                  <pic:nvPicPr>
+                    <pic:cNvPr id="0" name="ai-moment-icon.png"/>
+                    <pic:cNvPicPr/>
+                  </pic:nvPicPr>
+                  <pic:blipFill>
+                    <a:blip r:embed="rId11"/>
+                    <a:stretch>
+                      <a:fillRect/>
+                    </a:stretch>
+                  </pic:blipFill>
+                  <pic:spPr>
+                    <a:xfrm>
+                      <a:off x="0" y="0"/>
+                      <a:ext cx="210312" cy="210312"/>
+                    </a:xfrm>
+                    <a:prstGeom prst="rect"/>
+                  </pic:spPr>
+                </pic:pic>
+              </a:graphicData>
+            </a:graphic>
+          </wp:anchor>
+        </w:drawing>
+      </w:r>
+    </w:p>
+    <w:p>
+      <w:pPr>
+        <w:spacing w:before="0" w:after="40" w:line="264" w:lineRule="auto"/>
+      </w:pPr>
+      <w:r>
+        <w:rPr>
+          <w:rFonts w:ascii="Calibri" w:hAnsi="Calibri"/>
+          <w:b w:val="0"/>
           <w:i w:val="0"/>
           <w:color w:val="1A1A1A"/>
           <w:sz w:val="20"/>
         </w:rPr>
-        <w:t>Designer guides program owners, instructional designers, and subject matter experts through the full process — from learning objectives and intended audience through every decision a program requires. It doesn’t require the customer to know how to design a lab program. Designer asks the right questions and sequences the decisions correctly. Every program produces:</w:t>
+        <w:t>Every program produces:</w:t>
       </w:r>
     </w:p>
     <w:p>
@@ -498,7 +616,7 @@
             <wp:extent cx="210312" cy="210312"/>
             <wp:effectExtent l="0" t="0" r="0" b="0"/>
             <wp:wrapNone/>
-            <wp:docPr id="1" name="Picture 1"/>
+            <wp:docPr id="3" name="Picture 3"/>
             <wp:cNvGraphicFramePr xmlns:a="http://schemas.openxmlformats.org/drawingml/2006/main">
               <a:graphicFrameLocks noChangeAspect="1"/>
             </wp:cNvGraphicFramePr>
@@ -536,8 +654,7 @@
       <w:r>
         <w:rPr>
           <w:rFonts w:ascii="Calibri" w:hAnsi="Calibri"/>
-          <w:b/>
-          <w:i w:val="0"/>
+          <w:b w:val="0"/>
           <w:color w:val="1A1A1A"/>
           <w:sz w:val="20"/>
         </w:rPr>
@@ -547,16 +664,67 @@
         <w:rPr>
           <w:rFonts w:ascii="Calibri" w:hAnsi="Calibri"/>
           <w:b w:val="0"/>
-          <w:i w:val="0"/>
           <w:color w:val="1A1A1A"/>
           <w:sz w:val="20"/>
         </w:rPr>
-        <w:t>Every new customer engagement starts with Designer in the first week — while the technical folks are working to get the technical details sorted. Program design and environment build run in parallel. Day one is productive for the program owner. The adoption gap closes before it has a chance to form.</w:t>
+        <w:t xml:space="preserve">Every new customer engagement starts with Designer in the first week — while the technical folks are working to get the technical details sorted. Program design and environment build run in parallel. Day one is productive for the program owner. </w:t>
+      </w:r>
+      <w:r>
+        <w:rPr>
+          <w:rFonts w:ascii="Calibri" w:hAnsi="Calibri"/>
+          <w:b/>
+          <w:color w:val="7000FF"/>
+          <w:sz w:val="20"/>
+        </w:rPr>
+        <w:t>The adoption gap closes before it has a chance to form.</w:t>
+      </w:r>
+      <w:r>
+        <w:drawing>
+          <wp:anchor distT="0" distB="0" distL="114300" distR="114300" simplePos="0" relativeHeight="251658240" behindDoc="0" locked="0" layoutInCell="1" allowOverlap="1">
+            <wp:simplePos x="0" y="0"/>
+            <wp:positionH relativeFrom="page">
+              <wp:posOffset>7068312</wp:posOffset>
+            </wp:positionH>
+            <wp:positionV relativeFrom="paragraph">
+              <wp:posOffset>9144</wp:posOffset>
+            </wp:positionV>
+            <wp:extent cx="210312" cy="210312"/>
+            <wp:effectExtent l="0" t="0" r="0" b="0"/>
+            <wp:wrapNone/>
+            <wp:docPr id="4" name="Picture 4"/>
+            <wp:cNvGraphicFramePr xmlns:a="http://schemas.openxmlformats.org/drawingml/2006/main">
+              <a:graphicFrameLocks noChangeAspect="1"/>
+            </wp:cNvGraphicFramePr>
+            <a:graphic xmlns:a="http://schemas.openxmlformats.org/drawingml/2006/main" xmlns:pic="http://schemas.openxmlformats.org/drawingml/2006/picture">
+              <a:graphicData uri="http://schemas.openxmlformats.org/drawingml/2006/picture">
+                <pic:pic>
+                  <pic:nvPicPr>
+                    <pic:cNvPr id="0" name="ai-moment-icon.png"/>
+                    <pic:cNvPicPr/>
+                  </pic:nvPicPr>
+                  <pic:blipFill>
+                    <a:blip r:embed="rId11"/>
+                    <a:stretch>
+                      <a:fillRect/>
+                    </a:stretch>
+                  </pic:blipFill>
+                  <pic:spPr>
+                    <a:xfrm>
+                      <a:off x="0" y="0"/>
+                      <a:ext cx="210312" cy="210312"/>
+                    </a:xfrm>
+                    <a:prstGeom prst="rect"/>
+                  </pic:spPr>
+                </pic:pic>
+              </a:graphicData>
+            </a:graphic>
+          </wp:anchor>
+        </w:drawing>
       </w:r>
     </w:p>
     <w:p>
       <w:pPr>
-        <w:spacing w:before="140" w:after="40"/>
+        <w:spacing w:before="140" w:after="0"/>
         <w:keepNext w:val="1"/>
       </w:pPr>
       <w:r>
@@ -618,6 +786,7 @@
     <w:p>
       <w:pPr>
         <w:spacing w:before="90" w:after="90"/>
+        <w:keepNext w:val="1"/>
       </w:pPr>
       <w:r>
         <w:rPr>
@@ -756,7 +925,7 @@
             <wp:extent cx="210312" cy="210312"/>
             <wp:effectExtent l="0" t="0" r="0" b="0"/>
             <wp:wrapNone/>
-            <wp:docPr id="2" name="Picture 2"/>
+            <wp:docPr id="5" name="Picture 5"/>
             <wp:cNvGraphicFramePr xmlns:a="http://schemas.openxmlformats.org/drawingml/2006/main">
               <a:graphicFrameLocks noChangeAspect="1"/>
             </wp:cNvGraphicFramePr>
@@ -795,11 +964,62 @@
         <w:rPr>
           <w:rFonts w:ascii="Calibri" w:hAnsi="Calibri"/>
           <w:b w:val="0"/>
-          <w:i w:val="0"/>
           <w:color w:val="1A1A1A"/>
           <w:sz w:val="20"/>
         </w:rPr>
-        <w:t>Inspector also surfaces the competitive map for every analyzed company, which feeds directly into Prospector’s lookalike targeting.</w:t>
+        <w:t xml:space="preserve">Inspector also surfaces the competitive map for every analyzed company — </w:t>
+      </w:r>
+      <w:r>
+        <w:rPr>
+          <w:rFonts w:ascii="Calibri" w:hAnsi="Calibri"/>
+          <w:b/>
+          <w:color w:val="7000FF"/>
+          <w:sz w:val="20"/>
+        </w:rPr>
+        <w:t>which feeds directly into Prospector’s lookalike targeting.</w:t>
+      </w:r>
+      <w:r>
+        <w:drawing>
+          <wp:anchor distT="0" distB="0" distL="114300" distR="114300" simplePos="0" relativeHeight="251658240" behindDoc="0" locked="0" layoutInCell="1" allowOverlap="1">
+            <wp:simplePos x="0" y="0"/>
+            <wp:positionH relativeFrom="page">
+              <wp:posOffset>7068312</wp:posOffset>
+            </wp:positionH>
+            <wp:positionV relativeFrom="paragraph">
+              <wp:posOffset>9144</wp:posOffset>
+            </wp:positionV>
+            <wp:extent cx="210312" cy="210312"/>
+            <wp:effectExtent l="0" t="0" r="0" b="0"/>
+            <wp:wrapNone/>
+            <wp:docPr id="6" name="Picture 6"/>
+            <wp:cNvGraphicFramePr xmlns:a="http://schemas.openxmlformats.org/drawingml/2006/main">
+              <a:graphicFrameLocks noChangeAspect="1"/>
+            </wp:cNvGraphicFramePr>
+            <a:graphic xmlns:a="http://schemas.openxmlformats.org/drawingml/2006/main" xmlns:pic="http://schemas.openxmlformats.org/drawingml/2006/picture">
+              <a:graphicData uri="http://schemas.openxmlformats.org/drawingml/2006/picture">
+                <pic:pic>
+                  <pic:nvPicPr>
+                    <pic:cNvPr id="0" name="ai-moment-icon.png"/>
+                    <pic:cNvPicPr/>
+                  </pic:nvPicPr>
+                  <pic:blipFill>
+                    <a:blip r:embed="rId11"/>
+                    <a:stretch>
+                      <a:fillRect/>
+                    </a:stretch>
+                  </pic:blipFill>
+                  <pic:spPr>
+                    <a:xfrm>
+                      <a:off x="0" y="0"/>
+                      <a:ext cx="210312" cy="210312"/>
+                    </a:xfrm>
+                    <a:prstGeom prst="rect"/>
+                  </pic:spPr>
+                </pic:pic>
+              </a:graphicData>
+            </a:graphic>
+          </wp:anchor>
+        </w:drawing>
       </w:r>
     </w:p>
     <w:p>
@@ -809,8 +1029,7 @@
       <w:r>
         <w:rPr>
           <w:rFonts w:ascii="Calibri" w:hAnsi="Calibri"/>
-          <w:b/>
-          <w:i w:val="0"/>
+          <w:b w:val="0"/>
           <w:color w:val="1A1A1A"/>
           <w:sz w:val="20"/>
         </w:rPr>
@@ -819,17 +1038,68 @@
       <w:r>
         <w:rPr>
           <w:rFonts w:ascii="Calibri" w:hAnsi="Calibri"/>
+          <w:b/>
+          <w:color w:val="7000FF"/>
+          <w:sz w:val="20"/>
+        </w:rPr>
+        <w:t>Pre-call preparation that was previously impossible at scale is now standard.</w:t>
+      </w:r>
+      <w:r>
+        <w:rPr>
+          <w:rFonts w:ascii="Calibri" w:hAnsi="Calibri"/>
           <w:b w:val="0"/>
-          <w:i w:val="0"/>
           <w:color w:val="1A1A1A"/>
           <w:sz w:val="20"/>
         </w:rPr>
-        <w:t>Pre-call preparation that was previously impossible at scale is now standard. Every seller and SE enters every conversation with the technical depth that used to require hours of individual research, applied automatically to every product before the first meeting.</w:t>
+        <w:t xml:space="preserve"> Every seller and SE enters every conversation with the technical depth that used to require hours of individual research, applied automatically to every product before the first meeting.</w:t>
+      </w:r>
+      <w:r>
+        <w:drawing>
+          <wp:anchor distT="0" distB="0" distL="114300" distR="114300" simplePos="0" relativeHeight="251658240" behindDoc="0" locked="0" layoutInCell="1" allowOverlap="1">
+            <wp:simplePos x="0" y="0"/>
+            <wp:positionH relativeFrom="page">
+              <wp:posOffset>7068312</wp:posOffset>
+            </wp:positionH>
+            <wp:positionV relativeFrom="paragraph">
+              <wp:posOffset>9144</wp:posOffset>
+            </wp:positionV>
+            <wp:extent cx="210312" cy="210312"/>
+            <wp:effectExtent l="0" t="0" r="0" b="0"/>
+            <wp:wrapNone/>
+            <wp:docPr id="7" name="Picture 7"/>
+            <wp:cNvGraphicFramePr xmlns:a="http://schemas.openxmlformats.org/drawingml/2006/main">
+              <a:graphicFrameLocks noChangeAspect="1"/>
+            </wp:cNvGraphicFramePr>
+            <a:graphic xmlns:a="http://schemas.openxmlformats.org/drawingml/2006/main" xmlns:pic="http://schemas.openxmlformats.org/drawingml/2006/picture">
+              <a:graphicData uri="http://schemas.openxmlformats.org/drawingml/2006/picture">
+                <pic:pic>
+                  <pic:nvPicPr>
+                    <pic:cNvPr id="0" name="ai-moment-icon.png"/>
+                    <pic:cNvPicPr/>
+                  </pic:nvPicPr>
+                  <pic:blipFill>
+                    <a:blip r:embed="rId11"/>
+                    <a:stretch>
+                      <a:fillRect/>
+                    </a:stretch>
+                  </pic:blipFill>
+                  <pic:spPr>
+                    <a:xfrm>
+                      <a:off x="0" y="0"/>
+                      <a:ext cx="210312" cy="210312"/>
+                    </a:xfrm>
+                    <a:prstGeom prst="rect"/>
+                  </pic:spPr>
+                </pic:pic>
+              </a:graphicData>
+            </a:graphic>
+          </wp:anchor>
+        </w:drawing>
       </w:r>
     </w:p>
     <w:p>
       <w:pPr>
-        <w:spacing w:before="140" w:after="40"/>
+        <w:spacing w:before="140" w:after="0"/>
         <w:keepNext w:val="1"/>
       </w:pPr>
       <w:r>
@@ -1148,17 +1418,59 @@
     </w:p>
     <w:p>
       <w:pPr>
-        <w:spacing w:before="90" w:after="90"/>
+        <w:spacing w:before="0" w:after="72" w:line="264" w:lineRule="auto"/>
       </w:pPr>
       <w:r>
         <w:rPr>
           <w:rFonts w:ascii="Calibri" w:hAnsi="Calibri"/>
           <w:b/>
-          <w:i w:val="0"/>
-          <w:color w:val="136945"/>
-          <w:sz w:val="22"/>
+          <w:color w:val="7000FF"/>
+          <w:sz w:val="20"/>
         </w:rPr>
         <w:t>Prospector finds the right companies.</w:t>
+      </w:r>
+      <w:r>
+        <w:drawing>
+          <wp:anchor distT="0" distB="0" distL="114300" distR="114300" simplePos="0" relativeHeight="251658240" behindDoc="0" locked="0" layoutInCell="1" allowOverlap="1">
+            <wp:simplePos x="0" y="0"/>
+            <wp:positionH relativeFrom="page">
+              <wp:posOffset>7068312</wp:posOffset>
+            </wp:positionH>
+            <wp:positionV relativeFrom="paragraph">
+              <wp:posOffset>9144</wp:posOffset>
+            </wp:positionV>
+            <wp:extent cx="210312" cy="210312"/>
+            <wp:effectExtent l="0" t="0" r="0" b="0"/>
+            <wp:wrapNone/>
+            <wp:docPr id="8" name="Picture 8"/>
+            <wp:cNvGraphicFramePr xmlns:a="http://schemas.openxmlformats.org/drawingml/2006/main">
+              <a:graphicFrameLocks noChangeAspect="1"/>
+            </wp:cNvGraphicFramePr>
+            <a:graphic xmlns:a="http://schemas.openxmlformats.org/drawingml/2006/main" xmlns:pic="http://schemas.openxmlformats.org/drawingml/2006/picture">
+              <a:graphicData uri="http://schemas.openxmlformats.org/drawingml/2006/picture">
+                <pic:pic>
+                  <pic:nvPicPr>
+                    <pic:cNvPr id="0" name="ai-moment-icon.png"/>
+                    <pic:cNvPicPr/>
+                  </pic:nvPicPr>
+                  <pic:blipFill>
+                    <a:blip r:embed="rId11"/>
+                    <a:stretch>
+                      <a:fillRect/>
+                    </a:stretch>
+                  </pic:blipFill>
+                  <pic:spPr>
+                    <a:xfrm>
+                      <a:off x="0" y="0"/>
+                      <a:ext cx="210312" cy="210312"/>
+                    </a:xfrm>
+                    <a:prstGeom prst="rect"/>
+                  </pic:spPr>
+                </pic:pic>
+              </a:graphicData>
+            </a:graphic>
+          </wp:anchor>
+        </w:drawing>
       </w:r>
     </w:p>
     <w:p>
@@ -1211,7 +1523,7 @@
             <wp:extent cx="210312" cy="210312"/>
             <wp:effectExtent l="0" t="0" r="0" b="0"/>
             <wp:wrapNone/>
-            <wp:docPr id="3" name="Picture 3"/>
+            <wp:docPr id="9" name="Picture 9"/>
             <wp:cNvGraphicFramePr xmlns:a="http://schemas.openxmlformats.org/drawingml/2006/main">
               <a:graphicFrameLocks noChangeAspect="1"/>
             </wp:cNvGraphicFramePr>
@@ -1318,7 +1630,7 @@
     </w:p>
     <w:p>
       <w:pPr>
-        <w:spacing w:before="140" w:after="40"/>
+        <w:spacing w:before="140" w:after="0"/>
         <w:keepNext w:val="1"/>
       </w:pPr>
       <w:r>
@@ -1349,7 +1661,7 @@
     </w:p>
     <w:p>
       <w:pPr>
-        <w:spacing w:before="140" w:after="40"/>
+        <w:spacing w:before="140" w:after="0"/>
         <w:keepNext w:val="1"/>
       </w:pPr>
       <w:r>
@@ -1948,7 +2260,7 @@
     </w:p>
     <w:p>
       <w:pPr>
-        <w:spacing w:before="140" w:after="40"/>
+        <w:spacing w:before="140" w:after="0"/>
         <w:keepNext w:val="1"/>
       </w:pPr>
       <w:r>
@@ -2795,7 +3107,7 @@
     </w:p>
     <w:p>
       <w:pPr>
-        <w:spacing w:before="140" w:after="40"/>
+        <w:spacing w:before="140" w:after="0"/>
         <w:keepNext w:val="1"/>
       </w:pPr>
       <w:r>
@@ -2860,7 +3172,7 @@
     </w:p>
     <w:p>
       <w:pPr>
-        <w:spacing w:before="140" w:after="40"/>
+        <w:spacing w:before="140" w:after="0"/>
         <w:keepNext w:val="1"/>
       </w:pPr>
       <w:r>
@@ -2990,7 +3302,7 @@
     </w:p>
     <w:p>
       <w:pPr>
-        <w:spacing w:before="140" w:after="40"/>
+        <w:spacing w:before="140" w:after="0"/>
         <w:keepNext w:val="1"/>
       </w:pPr>
       <w:r>

</xml_diff>

<commit_message>
Coordinate Section 2 headings, proclamations, AI moments, and content
- Section 1 bullets reordered (Enabling/Proving/Identifying) and bolded
- h2 titles: Designer/Inspector/Prospector updated to problem-solution framing
- Proclamations rewritten: each states how the tool solves the problem
- Prospector proclamation converted back from ai_para to proclamation()
- AI moments expanded: intro compounding, Designer asks/BOM/adoption gap,
  Inspector conversation/competitive map/pre-call, Prospector qualifies
- Soft return before "The intelligence compounds with every use."
- AI icons centered in right margin
- Designer lead-in: "Powered by AI, Designer collaborates..."
- Content fix: "lab blueprint" paragraph updated per feedback

Co-Authored-By: Claude Sonnet 4.6 <noreply@anthropic.com>
</commit_message>
<xml_diff>
--- a/docs/Skillable-Intelligence-Platform.docx
+++ b/docs/Skillable-Intelligence-Platform.docx
@@ -86,12 +86,21 @@
       <w:r>
         <w:rPr>
           <w:rFonts w:ascii="Calibri" w:hAnsi="Calibri"/>
+          <w:b/>
+          <w:i w:val="0"/>
+          <w:color w:val="1A1A1A"/>
+          <w:sz w:val="20"/>
+        </w:rPr>
+        <w:t>Enabling bought-in customers to adopt labs</w:t>
+      </w:r>
+      <w:r>
+        <w:rPr>
+          <w:rFonts w:ascii="Calibri" w:hAnsi="Calibri"/>
           <w:b w:val="0"/>
           <w:i w:val="0"/>
           <w:color w:val="1A1A1A"/>
           <w:sz w:val="20"/>
         </w:rPr>
-        <w:t>Identifying companies in our ICP</w:t>
       </w:r>
     </w:p>
     <w:p>
@@ -114,12 +123,21 @@
       <w:r>
         <w:rPr>
           <w:rFonts w:ascii="Calibri" w:hAnsi="Calibri"/>
+          <w:b/>
+          <w:i w:val="0"/>
+          <w:color w:val="1A1A1A"/>
+          <w:sz w:val="20"/>
+        </w:rPr>
+        <w:t>Proving labability and lab impact</w:t>
+      </w:r>
+      <w:r>
+        <w:rPr>
+          <w:rFonts w:ascii="Calibri" w:hAnsi="Calibri"/>
           <w:b w:val="0"/>
           <w:i w:val="0"/>
           <w:color w:val="1A1A1A"/>
           <w:sz w:val="20"/>
         </w:rPr>
-        <w:t>Proving labability and lab impact</w:t>
       </w:r>
     </w:p>
     <w:p>
@@ -142,12 +160,21 @@
       <w:r>
         <w:rPr>
           <w:rFonts w:ascii="Calibri" w:hAnsi="Calibri"/>
+          <w:b/>
+          <w:i w:val="0"/>
+          <w:color w:val="1A1A1A"/>
+          <w:sz w:val="20"/>
+        </w:rPr>
+        <w:t>Identifying companies in our ICP</w:t>
+      </w:r>
+      <w:r>
+        <w:rPr>
+          <w:rFonts w:ascii="Calibri" w:hAnsi="Calibri"/>
           <w:b w:val="0"/>
           <w:i w:val="0"/>
           <w:color w:val="1A1A1A"/>
           <w:sz w:val="20"/>
         </w:rPr>
-        <w:t>Enabling bought-in customers to adopt labs</w:t>
       </w:r>
     </w:p>
     <w:p>
@@ -256,7 +283,10 @@
           <w:color w:val="1A1A1A"/>
           <w:sz w:val="20"/>
         </w:rPr>
-        <w:t xml:space="preserve">Each tool addresses one of the three challenges directly. All three share the same research and scoring engine — which means every analysis makes the entire platform smarter. A company Prospector evaluates is available to Inspector without re-running research. An Inspector analysis seeds Designer with the product context it needs from day one. </w:t>
+        <w:t>Each tool addresses one of the three challenges directly. All three share the same research and scoring engine — which means every analysis makes the entire platform smarter. A company Prospector evaluates is available to Inspector without re-running research. An Inspector analysis seeds Designer with the product context it needs from day one.</w:t>
+      </w:r>
+      <w:r>
+        <w:br/>
       </w:r>
       <w:r>
         <w:rPr>
@@ -272,7 +302,7 @@
           <wp:anchor distT="0" distB="0" distL="114300" distR="114300" simplePos="0" relativeHeight="251658240" behindDoc="0" locked="0" layoutInCell="1" allowOverlap="1">
             <wp:simplePos x="0" y="0"/>
             <wp:positionH relativeFrom="page">
-              <wp:posOffset>7068312</wp:posOffset>
+              <wp:posOffset>7278624</wp:posOffset>
             </wp:positionH>
             <wp:positionV relativeFrom="paragraph">
               <wp:posOffset>9144</wp:posOffset>
@@ -324,7 +354,7 @@
           <w:color w:val="136945"/>
           <w:sz w:val="22"/>
         </w:rPr>
-        <w:t>Designer: Closing the adoption gap</w:t>
+        <w:t>Designer: Closes the Adoption Gap</w:t>
       </w:r>
     </w:p>
     <w:p>
@@ -369,7 +399,7 @@
           <w:color w:val="1A1A1A"/>
           <w:sz w:val="20"/>
         </w:rPr>
-        <w:t>Without a process that takes them from goals and audience to a complete, buildable program architecture, customers stall at the design phase. In a consumption model, a stalled customer is not just a missed upsell opportunity; it is a churn risk. A customer who has not built a program has not realized value. A customer who has not realized value does not renew.</w:t>
+        <w:t>Without a process that takes them from solid learning objectives and a clear intended audience to a solid “lab blueprint” and program architecture, most every content team stalls at the design phase. In a consumption model, a stalled customer is not just a missed upsell opportunity; it is a churn risk. A customer who has not built a program has not realized value. A customer who has not realized value does not renew.</w:t>
       </w:r>
     </w:p>
     <w:p>
@@ -385,7 +415,7 @@
           <w:color w:val="136945"/>
           <w:sz w:val="22"/>
         </w:rPr>
-        <w:t>Designer closes that gap.</w:t>
+        <w:t>Designer collaboratively builds lab programs with Instructional Designers &amp; SMEs.</w:t>
       </w:r>
     </w:p>
     <w:p>
@@ -415,7 +445,7 @@
           <wp:anchor distT="0" distB="0" distL="114300" distR="114300" simplePos="0" relativeHeight="251658240" behindDoc="0" locked="0" layoutInCell="1" allowOverlap="1">
             <wp:simplePos x="0" y="0"/>
             <wp:positionH relativeFrom="page">
-              <wp:posOffset>7068312</wp:posOffset>
+              <wp:posOffset>7278624</wp:posOffset>
             </wp:positionH>
             <wp:positionV relativeFrom="paragraph">
               <wp:posOffset>9144</wp:posOffset>
@@ -466,7 +496,7 @@
           <w:color w:val="1A1A1A"/>
           <w:sz w:val="20"/>
         </w:rPr>
-        <w:t>Every program produces:</w:t>
+        <w:t>Powered by AI, Designer collaborates with program owners and Instructional Designers to create:</w:t>
       </w:r>
     </w:p>
     <w:p>
@@ -608,7 +638,7 @@
           <wp:anchor distT="0" distB="0" distL="114300" distR="114300" simplePos="0" relativeHeight="251658240" behindDoc="0" locked="0" layoutInCell="1" allowOverlap="1">
             <wp:simplePos x="0" y="0"/>
             <wp:positionH relativeFrom="page">
-              <wp:posOffset>7068312</wp:posOffset>
+              <wp:posOffset>7278624</wp:posOffset>
             </wp:positionH>
             <wp:positionV relativeFrom="paragraph">
               <wp:posOffset>9144</wp:posOffset>
@@ -683,7 +713,7 @@
           <wp:anchor distT="0" distB="0" distL="114300" distR="114300" simplePos="0" relativeHeight="251658240" behindDoc="0" locked="0" layoutInCell="1" allowOverlap="1">
             <wp:simplePos x="0" y="0"/>
             <wp:positionH relativeFrom="page">
-              <wp:posOffset>7068312</wp:posOffset>
+              <wp:posOffset>7278624</wp:posOffset>
             </wp:positionH>
             <wp:positionV relativeFrom="paragraph">
               <wp:posOffset>9144</wp:posOffset>
@@ -735,7 +765,7 @@
           <w:color w:val="136945"/>
           <w:sz w:val="22"/>
         </w:rPr>
-        <w:t>Inspector: Proving labability and impact</w:t>
+        <w:t>Inspector: Proves Labability and Lab Impact</w:t>
       </w:r>
     </w:p>
     <w:p>
@@ -796,7 +826,7 @@
           <w:color w:val="136945"/>
           <w:sz w:val="22"/>
         </w:rPr>
-        <w:t>Inspector proves labability and impact.</w:t>
+        <w:t>Inspector applies unique Skillable capabilities with customer products.</w:t>
       </w:r>
     </w:p>
     <w:p>
@@ -917,7 +947,7 @@
           <wp:anchor distT="0" distB="0" distL="114300" distR="114300" simplePos="0" relativeHeight="251658240" behindDoc="0" locked="0" layoutInCell="1" allowOverlap="1">
             <wp:simplePos x="0" y="0"/>
             <wp:positionH relativeFrom="page">
-              <wp:posOffset>7068312</wp:posOffset>
+              <wp:posOffset>7278624</wp:posOffset>
             </wp:positionH>
             <wp:positionV relativeFrom="paragraph">
               <wp:posOffset>9144</wp:posOffset>
@@ -983,7 +1013,7 @@
           <wp:anchor distT="0" distB="0" distL="114300" distR="114300" simplePos="0" relativeHeight="251658240" behindDoc="0" locked="0" layoutInCell="1" allowOverlap="1">
             <wp:simplePos x="0" y="0"/>
             <wp:positionH relativeFrom="page">
-              <wp:posOffset>7068312</wp:posOffset>
+              <wp:posOffset>7278624</wp:posOffset>
             </wp:positionH>
             <wp:positionV relativeFrom="paragraph">
               <wp:posOffset>9144</wp:posOffset>
@@ -1058,7 +1088,7 @@
           <wp:anchor distT="0" distB="0" distL="114300" distR="114300" simplePos="0" relativeHeight="251658240" behindDoc="0" locked="0" layoutInCell="1" allowOverlap="1">
             <wp:simplePos x="0" y="0"/>
             <wp:positionH relativeFrom="page">
-              <wp:posOffset>7068312</wp:posOffset>
+              <wp:posOffset>7278624</wp:posOffset>
             </wp:positionH>
             <wp:positionV relativeFrom="paragraph">
               <wp:posOffset>9144</wp:posOffset>
@@ -1110,7 +1140,7 @@
           <w:color w:val="136945"/>
           <w:sz w:val="22"/>
         </w:rPr>
-        <w:t>Prospector: Finding the right companies</w:t>
+        <w:t>Prospector: Finds Companies Squarely in Our ICP</w:t>
       </w:r>
     </w:p>
     <w:p>
@@ -1418,59 +1448,18 @@
     </w:p>
     <w:p>
       <w:pPr>
-        <w:spacing w:before="0" w:after="72" w:line="264" w:lineRule="auto"/>
+        <w:spacing w:before="90" w:after="90"/>
+        <w:keepNext w:val="1"/>
       </w:pPr>
       <w:r>
         <w:rPr>
           <w:rFonts w:ascii="Calibri" w:hAnsi="Calibri"/>
           <w:b/>
-          <w:color w:val="7000FF"/>
-          <w:sz w:val="20"/>
+          <w:i w:val="0"/>
+          <w:color w:val="136945"/>
+          <w:sz w:val="22"/>
         </w:rPr>
-        <w:t>Prospector finds the right companies.</w:t>
-      </w:r>
-      <w:r>
-        <w:drawing>
-          <wp:anchor distT="0" distB="0" distL="114300" distR="114300" simplePos="0" relativeHeight="251658240" behindDoc="0" locked="0" layoutInCell="1" allowOverlap="1">
-            <wp:simplePos x="0" y="0"/>
-            <wp:positionH relativeFrom="page">
-              <wp:posOffset>7068312</wp:posOffset>
-            </wp:positionH>
-            <wp:positionV relativeFrom="paragraph">
-              <wp:posOffset>9144</wp:posOffset>
-            </wp:positionV>
-            <wp:extent cx="210312" cy="210312"/>
-            <wp:effectExtent l="0" t="0" r="0" b="0"/>
-            <wp:wrapNone/>
-            <wp:docPr id="8" name="Picture 8"/>
-            <wp:cNvGraphicFramePr xmlns:a="http://schemas.openxmlformats.org/drawingml/2006/main">
-              <a:graphicFrameLocks noChangeAspect="1"/>
-            </wp:cNvGraphicFramePr>
-            <a:graphic xmlns:a="http://schemas.openxmlformats.org/drawingml/2006/main" xmlns:pic="http://schemas.openxmlformats.org/drawingml/2006/picture">
-              <a:graphicData uri="http://schemas.openxmlformats.org/drawingml/2006/picture">
-                <pic:pic>
-                  <pic:nvPicPr>
-                    <pic:cNvPr id="0" name="ai-moment-icon.png"/>
-                    <pic:cNvPicPr/>
-                  </pic:nvPicPr>
-                  <pic:blipFill>
-                    <a:blip r:embed="rId11"/>
-                    <a:stretch>
-                      <a:fillRect/>
-                    </a:stretch>
-                  </pic:blipFill>
-                  <pic:spPr>
-                    <a:xfrm>
-                      <a:off x="0" y="0"/>
-                      <a:ext cx="210312" cy="210312"/>
-                    </a:xfrm>
-                    <a:prstGeom prst="rect"/>
-                  </pic:spPr>
-                </pic:pic>
-              </a:graphicData>
-            </a:graphic>
-          </wp:anchor>
-        </w:drawing>
+        <w:t>Prospector uses deep company and product research to align with Skillable capabilities.</w:t>
       </w:r>
     </w:p>
     <w:p>
@@ -1515,7 +1504,7 @@
           <wp:anchor distT="0" distB="0" distL="114300" distR="114300" simplePos="0" relativeHeight="251658240" behindDoc="0" locked="0" layoutInCell="1" allowOverlap="1">
             <wp:simplePos x="0" y="0"/>
             <wp:positionH relativeFrom="page">
-              <wp:posOffset>7068312</wp:posOffset>
+              <wp:posOffset>7278624</wp:posOffset>
             </wp:positionH>
             <wp:positionV relativeFrom="paragraph">
               <wp:posOffset>9144</wp:posOffset>
@@ -1523,7 +1512,7 @@
             <wp:extent cx="210312" cy="210312"/>
             <wp:effectExtent l="0" t="0" r="0" b="0"/>
             <wp:wrapNone/>
-            <wp:docPr id="9" name="Picture 9"/>
+            <wp:docPr id="8" name="Picture 8"/>
             <wp:cNvGraphicFramePr xmlns:a="http://schemas.openxmlformats.org/drawingml/2006/main">
               <a:graphicFrameLocks noChangeAspect="1"/>
             </wp:cNvGraphicFramePr>

</xml_diff>

<commit_message>
Add platform doc and logo assets
Co-Authored-By: Claude Sonnet 4.6 <noreply@anthropic.com>
</commit_message>
<xml_diff>
--- a/docs/Skillable-Intelligence-Platform.docx
+++ b/docs/Skillable-Intelligence-Platform.docx
@@ -125,7 +125,27 @@
           <w:color w:val="1A1A1A"/>
           <w:sz w:val="20"/>
         </w:rPr>
-        <w:t>Proving labability and lab impact</w:t>
+        <w:t xml:space="preserve">Proving </w:t>
+      </w:r>
+      <w:proofErr w:type="spellStart"/>
+      <w:r>
+        <w:rPr>
+          <w:rFonts w:ascii="Calibri" w:hAnsi="Calibri"/>
+          <w:b/>
+          <w:color w:val="1A1A1A"/>
+          <w:sz w:val="20"/>
+        </w:rPr>
+        <w:t>labability</w:t>
+      </w:r>
+      <w:proofErr w:type="spellEnd"/>
+      <w:r>
+        <w:rPr>
+          <w:rFonts w:ascii="Calibri" w:hAnsi="Calibri"/>
+          <w:b/>
+          <w:color w:val="1A1A1A"/>
+          <w:sz w:val="20"/>
+        </w:rPr>
+        <w:t xml:space="preserve"> and lab impact</w:t>
       </w:r>
     </w:p>
     <w:p>
@@ -255,7 +275,7 @@
           <w:noProof/>
         </w:rPr>
         <w:drawing>
-          <wp:anchor distT="0" distB="0" distL="114300" distR="114300" simplePos="0" relativeHeight="251654144" behindDoc="0" locked="0" layoutInCell="1" allowOverlap="1" wp14:anchorId="781D04AB" wp14:editId="0D36C756">
+          <wp:anchor distT="0" distB="0" distL="114300" distR="114300" simplePos="0" relativeHeight="251658240" behindDoc="0" locked="0" layoutInCell="1" allowOverlap="1" wp14:anchorId="781D04AB" wp14:editId="0D36C756">
             <wp:simplePos x="0" y="0"/>
             <wp:positionH relativeFrom="page">
               <wp:posOffset>7278370</wp:posOffset>
@@ -401,7 +421,7 @@
           <w:noProof/>
         </w:rPr>
         <w:drawing>
-          <wp:anchor distT="0" distB="0" distL="114300" distR="114300" simplePos="0" relativeHeight="251655168" behindDoc="0" locked="0" layoutInCell="1" allowOverlap="1" wp14:anchorId="0C4907F7" wp14:editId="725F126F">
+          <wp:anchor distT="0" distB="0" distL="114300" distR="114300" simplePos="0" relativeHeight="251658241" behindDoc="0" locked="0" layoutInCell="1" allowOverlap="1" wp14:anchorId="0C4907F7" wp14:editId="725F126F">
             <wp:simplePos x="0" y="0"/>
             <wp:positionH relativeFrom="page">
               <wp:posOffset>7278370</wp:posOffset>
@@ -593,7 +613,7 @@
           <w:noProof/>
         </w:rPr>
         <w:drawing>
-          <wp:anchor distT="0" distB="0" distL="114300" distR="114300" simplePos="0" relativeHeight="251656192" behindDoc="0" locked="0" layoutInCell="1" allowOverlap="1" wp14:anchorId="68C33B50" wp14:editId="070DDE04">
+          <wp:anchor distT="0" distB="0" distL="114300" distR="114300" simplePos="0" relativeHeight="251658242" behindDoc="0" locked="0" layoutInCell="1" allowOverlap="1" wp14:anchorId="68C33B50" wp14:editId="070DDE04">
             <wp:simplePos x="0" y="0"/>
             <wp:positionH relativeFrom="page">
               <wp:posOffset>7278370</wp:posOffset>
@@ -698,7 +718,7 @@
           <w:noProof/>
         </w:rPr>
         <w:drawing>
-          <wp:anchor distT="0" distB="0" distL="114300" distR="114300" simplePos="0" relativeHeight="251657216" behindDoc="0" locked="0" layoutInCell="1" allowOverlap="1" wp14:anchorId="24C748D3" wp14:editId="3823F0DC">
+          <wp:anchor distT="0" distB="0" distL="114300" distR="114300" simplePos="0" relativeHeight="251658243" behindDoc="0" locked="0" layoutInCell="1" allowOverlap="1" wp14:anchorId="24C748D3" wp14:editId="3823F0DC">
             <wp:simplePos x="0" y="0"/>
             <wp:positionH relativeFrom="page">
               <wp:posOffset>7278370</wp:posOffset>
@@ -776,7 +796,25 @@
           <w:b/>
           <w:color w:val="136945"/>
         </w:rPr>
-        <w:t>Inspector: Proves Labability and Lab Impact</w:t>
+        <w:t xml:space="preserve">Inspector: Proves </w:t>
+      </w:r>
+      <w:proofErr w:type="spellStart"/>
+      <w:r>
+        <w:rPr>
+          <w:rFonts w:ascii="Calibri" w:hAnsi="Calibri"/>
+          <w:b/>
+          <w:color w:val="136945"/>
+        </w:rPr>
+        <w:t>Labability</w:t>
+      </w:r>
+      <w:proofErr w:type="spellEnd"/>
+      <w:r>
+        <w:rPr>
+          <w:rFonts w:ascii="Calibri" w:hAnsi="Calibri"/>
+          <w:b/>
+          <w:color w:val="136945"/>
+        </w:rPr>
+        <w:t xml:space="preserve"> and Lab Impact</w:t>
       </w:r>
     </w:p>
     <w:p>
@@ -884,7 +922,25 @@
           <w:color w:val="1A1A1A"/>
           <w:sz w:val="20"/>
         </w:rPr>
-        <w:t>A broad scan that surfaces all of a company’s products, ranked by labability, with competitive pairings, company-level signals, and an overall fit score. You walk in the room and get the picture at a glance.</w:t>
+        <w:t xml:space="preserve">A broad scan that surfaces all of a company’s products, ranked by </w:t>
+      </w:r>
+      <w:proofErr w:type="spellStart"/>
+      <w:r>
+        <w:rPr>
+          <w:rFonts w:ascii="Calibri" w:hAnsi="Calibri"/>
+          <w:color w:val="1A1A1A"/>
+          <w:sz w:val="20"/>
+        </w:rPr>
+        <w:t>labability</w:t>
+      </w:r>
+      <w:proofErr w:type="spellEnd"/>
+      <w:r>
+        <w:rPr>
+          <w:rFonts w:ascii="Calibri" w:hAnsi="Calibri"/>
+          <w:color w:val="1A1A1A"/>
+          <w:sz w:val="20"/>
+        </w:rPr>
+        <w:t>, with competitive pairings, company-level signals, and an overall fit score. You walk in the room and get the picture at a glance.</w:t>
       </w:r>
     </w:p>
     <w:p>
@@ -926,7 +982,25 @@
           <w:color w:val="1A1A1A"/>
           <w:sz w:val="20"/>
         </w:rPr>
-        <w:t>The seller or SE selects three to four products from the Case Board for exhaustive analysis — full technical orchestrability evidence, delivery path recommendation with rationale, scoring approach, consumption potential estimate, and program scope.</w:t>
+        <w:t xml:space="preserve">The seller or SE selects three to four products from the Case Board for exhaustive analysis — full technical </w:t>
+      </w:r>
+      <w:proofErr w:type="spellStart"/>
+      <w:r>
+        <w:rPr>
+          <w:rFonts w:ascii="Calibri" w:hAnsi="Calibri"/>
+          <w:color w:val="1A1A1A"/>
+          <w:sz w:val="20"/>
+        </w:rPr>
+        <w:t>orchestrability</w:t>
+      </w:r>
+      <w:proofErr w:type="spellEnd"/>
+      <w:r>
+        <w:rPr>
+          <w:rFonts w:ascii="Calibri" w:hAnsi="Calibri"/>
+          <w:color w:val="1A1A1A"/>
+          <w:sz w:val="20"/>
+        </w:rPr>
+        <w:t xml:space="preserve"> evidence, delivery path recommendation with rationale, scoring approach, consumption potential estimate, and program scope.</w:t>
       </w:r>
     </w:p>
     <w:p>
@@ -955,7 +1029,7 @@
           <w:noProof/>
         </w:rPr>
         <w:drawing>
-          <wp:anchor distT="0" distB="0" distL="114300" distR="114300" simplePos="0" relativeHeight="251658240" behindDoc="0" locked="0" layoutInCell="1" allowOverlap="1" wp14:anchorId="0C419B8D" wp14:editId="4BF91BFB">
+          <wp:anchor distT="0" distB="0" distL="114300" distR="114300" simplePos="0" relativeHeight="251658244" behindDoc="0" locked="0" layoutInCell="1" allowOverlap="1" wp14:anchorId="0C419B8D" wp14:editId="4BF91BFB">
             <wp:simplePos x="0" y="0"/>
             <wp:positionH relativeFrom="page">
               <wp:posOffset>7278624</wp:posOffset>
@@ -1031,7 +1105,7 @@
           <w:noProof/>
         </w:rPr>
         <w:drawing>
-          <wp:anchor distT="0" distB="0" distL="114300" distR="114300" simplePos="0" relativeHeight="251659264" behindDoc="0" locked="0" layoutInCell="1" allowOverlap="1" wp14:anchorId="2EB34905" wp14:editId="2F0520AE">
+          <wp:anchor distT="0" distB="0" distL="114300" distR="114300" simplePos="0" relativeHeight="251658245" behindDoc="0" locked="0" layoutInCell="1" allowOverlap="1" wp14:anchorId="2EB34905" wp14:editId="2F0520AE">
             <wp:simplePos x="0" y="0"/>
             <wp:positionH relativeFrom="page">
               <wp:posOffset>7278624</wp:posOffset>
@@ -1115,7 +1189,7 @@
           <w:noProof/>
         </w:rPr>
         <w:drawing>
-          <wp:anchor distT="0" distB="0" distL="114300" distR="114300" simplePos="0" relativeHeight="251660288" behindDoc="0" locked="0" layoutInCell="1" allowOverlap="1" wp14:anchorId="72C38135" wp14:editId="5140D1D4">
+          <wp:anchor distT="0" distB="0" distL="114300" distR="114300" simplePos="0" relativeHeight="251658246" behindDoc="0" locked="0" layoutInCell="1" allowOverlap="1" wp14:anchorId="72C38135" wp14:editId="5140D1D4">
             <wp:simplePos x="0" y="0"/>
             <wp:positionH relativeFrom="page">
               <wp:posOffset>7278624</wp:posOffset>
@@ -1425,7 +1499,25 @@
           <w:color w:val="1A1A1A"/>
           <w:sz w:val="20"/>
         </w:rPr>
-        <w:t>No mechanism to spin up an individual environment programmatically. Skillable’s entire delivery model depends on this capability.</w:t>
+        <w:t xml:space="preserve">No mechanism to spin up an individual environment programmatically. </w:t>
+      </w:r>
+      <w:proofErr w:type="spellStart"/>
+      <w:r>
+        <w:rPr>
+          <w:rFonts w:ascii="Calibri" w:hAnsi="Calibri"/>
+          <w:color w:val="1A1A1A"/>
+          <w:sz w:val="20"/>
+        </w:rPr>
+        <w:t>Skillable’s</w:t>
+      </w:r>
+      <w:proofErr w:type="spellEnd"/>
+      <w:r>
+        <w:rPr>
+          <w:rFonts w:ascii="Calibri" w:hAnsi="Calibri"/>
+          <w:color w:val="1A1A1A"/>
+          <w:sz w:val="20"/>
+        </w:rPr>
+        <w:t xml:space="preserve"> entire delivery model depends on this capability.</w:t>
       </w:r>
     </w:p>
     <w:p>
@@ -1519,7 +1611,7 @@
           <w:noProof/>
         </w:rPr>
         <w:drawing>
-          <wp:anchor distT="0" distB="0" distL="114300" distR="114300" simplePos="0" relativeHeight="251661312" behindDoc="0" locked="0" layoutInCell="1" allowOverlap="1" wp14:anchorId="3EBE8A5B" wp14:editId="1F0C575F">
+          <wp:anchor distT="0" distB="0" distL="114300" distR="114300" simplePos="0" relativeHeight="251658247" behindDoc="0" locked="0" layoutInCell="1" allowOverlap="1" wp14:anchorId="3EBE8A5B" wp14:editId="1F0C575F">
             <wp:simplePos x="0" y="0"/>
             <wp:positionH relativeFrom="page">
               <wp:posOffset>7278370</wp:posOffset>
@@ -1574,7 +1666,25 @@
           <w:color w:val="1A1A1A"/>
           <w:sz w:val="20"/>
         </w:rPr>
-        <w:t>Prospector is the go-to-market tool for Marketing and RevOps. It takes a list of companies and returns a ranked assessment of ICP fit — with product-level evidence, composite scores, verdicts, delivery path signals, and key contacts for every company on the list.</w:t>
+        <w:t xml:space="preserve">Prospector is the go-to-market tool for Marketing and </w:t>
+      </w:r>
+      <w:proofErr w:type="spellStart"/>
+      <w:r>
+        <w:rPr>
+          <w:rFonts w:ascii="Calibri" w:hAnsi="Calibri"/>
+          <w:color w:val="1A1A1A"/>
+          <w:sz w:val="20"/>
+        </w:rPr>
+        <w:t>RevOps</w:t>
+      </w:r>
+      <w:proofErr w:type="spellEnd"/>
+      <w:r>
+        <w:rPr>
+          <w:rFonts w:ascii="Calibri" w:hAnsi="Calibri"/>
+          <w:color w:val="1A1A1A"/>
+          <w:sz w:val="20"/>
+        </w:rPr>
+        <w:t>. It takes a list of companies and returns a ranked assessment of ICP fit — with product-level evidence, composite scores, verdicts, delivery path signals, and key contacts for every company on the list.</w:t>
       </w:r>
     </w:p>
     <w:p>
@@ -1663,7 +1773,27 @@
           <w:sz w:val="20"/>
           <w:highlight w:val="yellow"/>
         </w:rPr>
-        <w:t>The balance of this document outlines the decisions for RevOps to make with Marketing and Security. It includes more context, several recommendations, and a list of decisions to be made. If you’re not in one of those groups, feel free to stop reading if you choose.</w:t>
+        <w:t xml:space="preserve">The balance of this document outlines the decisions for </w:t>
+      </w:r>
+      <w:proofErr w:type="spellStart"/>
+      <w:r>
+        <w:rPr>
+          <w:rFonts w:ascii="Calibri" w:hAnsi="Calibri"/>
+          <w:color w:val="1A1A1A"/>
+          <w:sz w:val="20"/>
+          <w:highlight w:val="yellow"/>
+        </w:rPr>
+        <w:t>RevOps</w:t>
+      </w:r>
+      <w:proofErr w:type="spellEnd"/>
+      <w:r>
+        <w:rPr>
+          <w:rFonts w:ascii="Calibri" w:hAnsi="Calibri"/>
+          <w:color w:val="1A1A1A"/>
+          <w:sz w:val="20"/>
+          <w:highlight w:val="yellow"/>
+        </w:rPr>
+        <w:t xml:space="preserve"> to make with Marketing and Security. It includes more context, several recommendations, and a list of decisions to be made. If you’re not in one of those groups, feel free to stop reading if you choose.</w:t>
       </w:r>
     </w:p>
     <w:p>
@@ -1683,21 +1813,86 @@
     <w:p>
       <w:pPr>
         <w:spacing w:after="72" w:line="264" w:lineRule="auto"/>
-      </w:pPr>
-      <w:r>
         <w:rPr>
           <w:rFonts w:ascii="Calibri" w:hAnsi="Calibri"/>
           <w:color w:val="1A1A1A"/>
           <w:sz w:val="20"/>
-        </w:rPr>
-        <w:t>HubSpot is the seller and marketer’s workspace. Intelligence is the specialist workspace. The integration surfaces the right intelligence, to the right people, in the right places, with the right context — without requiring sellers to live in another tool or RevOps to build a parallel system.</w:t>
+          <w:szCs w:val="20"/>
+        </w:rPr>
+      </w:pPr>
+      <w:r>
+        <w:rPr>
+          <w:rFonts w:ascii="Calibri" w:hAnsi="Calibri"/>
+          <w:color w:val="1A1A1A"/>
+          <w:sz w:val="20"/>
+          <w:szCs w:val="20"/>
+        </w:rPr>
+        <w:t xml:space="preserve">HubSpot is the seller and marketer’s workspace. Intelligence is the </w:t>
+      </w:r>
+      <w:commentRangeStart w:id="0"/>
+      <w:r>
+        <w:rPr>
+          <w:rFonts w:ascii="Calibri" w:hAnsi="Calibri"/>
+          <w:color w:val="1A1A1A"/>
+          <w:sz w:val="20"/>
+          <w:szCs w:val="20"/>
+        </w:rPr>
+        <w:t>specialist workspace</w:t>
+      </w:r>
+      <w:commentRangeEnd w:id="0"/>
+      <w:r>
+        <w:rPr>
+          <w:rStyle w:val="CommentReference"/>
+          <w:rFonts w:ascii="Calibri" w:hAnsi="Calibri"/>
+          <w:color w:val="1A1A1A"/>
+          <w:sz w:val="20"/>
+          <w:szCs w:val="20"/>
+        </w:rPr>
+        <w:commentReference w:id="0"/>
+      </w:r>
+      <w:r>
+        <w:rPr>
+          <w:rFonts w:ascii="Calibri" w:hAnsi="Calibri"/>
+          <w:color w:val="1A1A1A"/>
+          <w:sz w:val="20"/>
+          <w:szCs w:val="20"/>
+        </w:rPr>
+        <w:t xml:space="preserve">. The integration surfaces the right intelligence, to the right people, in the right places, with the right context — </w:t>
+      </w:r>
+      <w:commentRangeStart w:id="1"/>
+      <w:r>
+        <w:rPr>
+          <w:rFonts w:ascii="Calibri" w:hAnsi="Calibri"/>
+          <w:color w:val="1A1A1A"/>
+          <w:sz w:val="20"/>
+          <w:szCs w:val="20"/>
+        </w:rPr>
+        <w:t>without requiring sellers to live in another tool or RevOps to build a parallel system.</w:t>
+      </w:r>
+      <w:commentRangeEnd w:id="1"/>
+      <w:r>
+        <w:rPr>
+          <w:rStyle w:val="CommentReference"/>
+          <w:rFonts w:ascii="Calibri" w:hAnsi="Calibri"/>
+          <w:color w:val="1A1A1A"/>
+          <w:sz w:val="20"/>
+          <w:szCs w:val="20"/>
+        </w:rPr>
+        <w:commentReference w:id="1"/>
       </w:r>
     </w:p>
     <w:p>
       <w:pPr>
         <w:keepNext/>
         <w:spacing w:before="140" w:after="0"/>
+        <w:rPr>
+          <w:rFonts w:ascii="Calibri" w:hAnsi="Calibri"/>
+          <w:b/>
+          <w:bCs/>
+          <w:color w:val="136945"/>
+        </w:rPr>
       </w:pPr>
+      <w:commentRangeStart w:id="2"/>
       <w:r>
         <w:rPr>
           <w:rFonts w:ascii="Calibri" w:hAnsi="Calibri"/>
@@ -1710,14 +1905,31 @@
     <w:p>
       <w:pPr>
         <w:spacing w:after="72" w:line="264" w:lineRule="auto"/>
-      </w:pPr>
-      <w:r>
         <w:rPr>
           <w:rFonts w:ascii="Calibri" w:hAnsi="Calibri"/>
           <w:color w:val="1A1A1A"/>
           <w:sz w:val="20"/>
+          <w:szCs w:val="20"/>
+        </w:rPr>
+      </w:pPr>
+      <w:r>
+        <w:rPr>
+          <w:rFonts w:ascii="Calibri" w:hAnsi="Calibri"/>
+          <w:color w:val="1A1A1A"/>
+          <w:sz w:val="20"/>
         </w:rPr>
         <w:t>Marketing triggers Prospector from inside HubSpot — selecting a ZoomInfo list or defining criteria and sending them to Prospector for analysis. Prospector writes enriched data back to HubSpot Company records, Contact records, and Deals. HubSpot is Prospector’s primary output destination.</w:t>
+      </w:r>
+      <w:commentRangeEnd w:id="2"/>
+      <w:r>
+        <w:rPr>
+          <w:rStyle w:val="CommentReference"/>
+          <w:rFonts w:ascii="Calibri" w:hAnsi="Calibri"/>
+          <w:color w:val="1A1A1A"/>
+          <w:sz w:val="20"/>
+          <w:szCs w:val="20"/>
+        </w:rPr>
+        <w:commentReference w:id="2"/>
       </w:r>
     </w:p>
     <w:p>
@@ -1872,13 +2084,23 @@
             </w:tcMar>
           </w:tcPr>
           <w:p>
+            <w:proofErr w:type="spellStart"/>
             <w:r>
               <w:rPr>
                 <w:rFonts w:ascii="Calibri" w:hAnsi="Calibri"/>
                 <w:color w:val="1A1A1A"/>
                 <w:sz w:val="20"/>
               </w:rPr>
-              <w:t>Labable / Simulation Candidate / Do Not Pursue; enables filtered views and enrollment triggers</w:t>
+              <w:t>Labable</w:t>
+            </w:r>
+            <w:proofErr w:type="spellEnd"/>
+            <w:r>
+              <w:rPr>
+                <w:rFonts w:ascii="Calibri" w:hAnsi="Calibri"/>
+                <w:color w:val="1A1A1A"/>
+                <w:sz w:val="20"/>
+              </w:rPr>
+              <w:t xml:space="preserve"> / Simulation Candidate / Do Not Pursue; enables filtered views and enrollment triggers</w:t>
             </w:r>
           </w:p>
         </w:tc>
@@ -2295,7 +2517,25 @@
                 <w:color w:val="1A1A1A"/>
                 <w:sz w:val="20"/>
               </w:rPr>
-              <w:t>Product list with labability scores</w:t>
+              <w:t xml:space="preserve">Product list with </w:t>
+            </w:r>
+            <w:proofErr w:type="spellStart"/>
+            <w:r>
+              <w:rPr>
+                <w:rFonts w:ascii="Calibri" w:hAnsi="Calibri"/>
+                <w:color w:val="1A1A1A"/>
+                <w:sz w:val="20"/>
+              </w:rPr>
+              <w:t>labability</w:t>
+            </w:r>
+            <w:proofErr w:type="spellEnd"/>
+            <w:r>
+              <w:rPr>
+                <w:rFonts w:ascii="Calibri" w:hAnsi="Calibri"/>
+                <w:color w:val="1A1A1A"/>
+                <w:sz w:val="20"/>
+              </w:rPr>
+              <w:t xml:space="preserve"> scores</w:t>
             </w:r>
           </w:p>
         </w:tc>
@@ -2317,7 +2557,25 @@
                 <w:color w:val="1A1A1A"/>
                 <w:sz w:val="20"/>
               </w:rPr>
-              <w:t>What this company sells and how labable each product is</w:t>
+              <w:t xml:space="preserve">What this company sells and how </w:t>
+            </w:r>
+            <w:proofErr w:type="spellStart"/>
+            <w:r>
+              <w:rPr>
+                <w:rFonts w:ascii="Calibri" w:hAnsi="Calibri"/>
+                <w:color w:val="1A1A1A"/>
+                <w:sz w:val="20"/>
+              </w:rPr>
+              <w:t>labable</w:t>
+            </w:r>
+            <w:proofErr w:type="spellEnd"/>
+            <w:r>
+              <w:rPr>
+                <w:rFonts w:ascii="Calibri" w:hAnsi="Calibri"/>
+                <w:color w:val="1A1A1A"/>
+                <w:sz w:val="20"/>
+              </w:rPr>
+              <w:t xml:space="preserve"> each product is</w:t>
             </w:r>
           </w:p>
         </w:tc>
@@ -2740,7 +2998,25 @@
                 <w:color w:val="1A1A1A"/>
                 <w:sz w:val="20"/>
               </w:rPr>
-              <w:t>Technical orchestrability evidence</w:t>
+              <w:t xml:space="preserve">Technical </w:t>
+            </w:r>
+            <w:proofErr w:type="spellStart"/>
+            <w:r>
+              <w:rPr>
+                <w:rFonts w:ascii="Calibri" w:hAnsi="Calibri"/>
+                <w:color w:val="1A1A1A"/>
+                <w:sz w:val="20"/>
+              </w:rPr>
+              <w:t>orchestrability</w:t>
+            </w:r>
+            <w:proofErr w:type="spellEnd"/>
+            <w:r>
+              <w:rPr>
+                <w:rFonts w:ascii="Calibri" w:hAnsi="Calibri"/>
+                <w:color w:val="1A1A1A"/>
+                <w:sz w:val="20"/>
+              </w:rPr>
+              <w:t xml:space="preserve"> evidence</w:t>
             </w:r>
           </w:p>
         </w:tc>
@@ -2971,7 +3247,25 @@
           <w:color w:val="1A1A1A"/>
           <w:sz w:val="20"/>
         </w:rPr>
-        <w:t>Replace or supplement the current ZoomInfo-only scoring motion with Intelligence-qualified lists. Companies that fail the technical orchestrability assessment come off the list before sequences are built. Companies that clear all three dimensions get prioritized outreach with seller-ready context already in HubSpot.</w:t>
+        <w:t xml:space="preserve">Replace or supplement the current ZoomInfo-only scoring motion with Intelligence-qualified lists. Companies that fail the technical </w:t>
+      </w:r>
+      <w:proofErr w:type="spellStart"/>
+      <w:r>
+        <w:rPr>
+          <w:rFonts w:ascii="Calibri" w:hAnsi="Calibri"/>
+          <w:color w:val="1A1A1A"/>
+          <w:sz w:val="20"/>
+        </w:rPr>
+        <w:t>orchestrability</w:t>
+      </w:r>
+      <w:proofErr w:type="spellEnd"/>
+      <w:r>
+        <w:rPr>
+          <w:rFonts w:ascii="Calibri" w:hAnsi="Calibri"/>
+          <w:color w:val="1A1A1A"/>
+          <w:sz w:val="20"/>
+        </w:rPr>
+        <w:t xml:space="preserve"> assessment come off the list before sequences are built. Companies that clear all three dimensions get prioritized outreach with seller-ready context already in HubSpot.</w:t>
       </w:r>
     </w:p>
     <w:p>
@@ -3069,7 +3363,25 @@
           <w:b/>
           <w:color w:val="136945"/>
         </w:rPr>
-        <w:t>Decisions required from RevOps and Marketing</w:t>
+        <w:t xml:space="preserve">Decisions required from </w:t>
+      </w:r>
+      <w:proofErr w:type="spellStart"/>
+      <w:r>
+        <w:rPr>
+          <w:rFonts w:ascii="Calibri" w:hAnsi="Calibri"/>
+          <w:b/>
+          <w:color w:val="136945"/>
+        </w:rPr>
+        <w:t>RevOps</w:t>
+      </w:r>
+      <w:proofErr w:type="spellEnd"/>
+      <w:r>
+        <w:rPr>
+          <w:rFonts w:ascii="Calibri" w:hAnsi="Calibri"/>
+          <w:b/>
+          <w:color w:val="136945"/>
+        </w:rPr>
+        <w:t xml:space="preserve"> and Marketing</w:t>
       </w:r>
     </w:p>
     <w:p>
@@ -3082,7 +3394,25 @@
           <w:color w:val="1A1A1A"/>
           <w:sz w:val="20"/>
         </w:rPr>
-        <w:t>The following require RevOps and Marketing input before the HubSpot integration can be built:</w:t>
+        <w:t xml:space="preserve">The following require </w:t>
+      </w:r>
+      <w:proofErr w:type="spellStart"/>
+      <w:r>
+        <w:rPr>
+          <w:rFonts w:ascii="Calibri" w:hAnsi="Calibri"/>
+          <w:color w:val="1A1A1A"/>
+          <w:sz w:val="20"/>
+        </w:rPr>
+        <w:t>RevOps</w:t>
+      </w:r>
+      <w:proofErr w:type="spellEnd"/>
+      <w:r>
+        <w:rPr>
+          <w:rFonts w:ascii="Calibri" w:hAnsi="Calibri"/>
+          <w:color w:val="1A1A1A"/>
+          <w:sz w:val="20"/>
+        </w:rPr>
+        <w:t xml:space="preserve"> and Marketing input before the HubSpot integration can be built:</w:t>
       </w:r>
     </w:p>
     <w:tbl>
@@ -3514,7 +3844,7 @@
                 <w:color w:val="1A1A1A"/>
                 <w:sz w:val="20"/>
               </w:rPr>
-              <w:t>auto-</w:t>
+              <w:t>auto enriched</w:t>
             </w:r>
             <w:r>
               <w:rPr>
@@ -3522,7 +3852,7 @@
                 <w:color w:val="1A1A1A"/>
                 <w:sz w:val="20"/>
               </w:rPr>
-              <w:t>enriched vs. queued for review?</w:t>
+              <w:t xml:space="preserve"> vs. queued for review?</w:t>
             </w:r>
           </w:p>
         </w:tc>
@@ -3534,10 +3864,10 @@
       </w:pPr>
     </w:p>
     <w:sectPr>
-      <w:headerReference w:type="default" r:id="rId8"/>
-      <w:footerReference w:type="even" r:id="rId9"/>
-      <w:footerReference w:type="default" r:id="rId10"/>
-      <w:footerReference w:type="first" r:id="rId11"/>
+      <w:headerReference w:type="default" r:id="rId12"/>
+      <w:footerReference w:type="even" r:id="rId13"/>
+      <w:footerReference w:type="default" r:id="rId14"/>
+      <w:footerReference w:type="first" r:id="rId15"/>
       <w:pgSz w:w="12240" w:h="15840"/>
       <w:pgMar w:top="1296" w:right="1224" w:bottom="1296" w:left="1224" w:header="504" w:footer="504" w:gutter="0"/>
       <w:cols w:space="720"/>
@@ -3545,6 +3875,77 @@
     </w:sectPr>
   </w:body>
 </w:document>
+</file>
+
+<file path=word/comments.xml><?xml version="1.0" encoding="utf-8"?>
+<w:comments xmlns:wpc="http://schemas.microsoft.com/office/word/2010/wordprocessingCanvas" xmlns:cx="http://schemas.microsoft.com/office/drawing/2014/chartex" xmlns:cx1="http://schemas.microsoft.com/office/drawing/2015/9/8/chartex" xmlns:cx2="http://schemas.microsoft.com/office/drawing/2015/10/21/chartex" xmlns:cx3="http://schemas.microsoft.com/office/drawing/2016/5/9/chartex" xmlns:cx4="http://schemas.microsoft.com/office/drawing/2016/5/10/chartex" xmlns:cx5="http://schemas.microsoft.com/office/drawing/2016/5/11/chartex" xmlns:cx6="http://schemas.microsoft.com/office/drawing/2016/5/12/chartex" xmlns:cx7="http://schemas.microsoft.com/office/drawing/2016/5/13/chartex" xmlns:cx8="http://schemas.microsoft.com/office/drawing/2016/5/14/chartex" xmlns:mc="http://schemas.openxmlformats.org/markup-compatibility/2006" xmlns:aink="http://schemas.microsoft.com/office/drawing/2016/ink" xmlns:am3d="http://schemas.microsoft.com/office/drawing/2017/model3d" xmlns:o="urn:schemas-microsoft-com:office:office" xmlns:oel="http://schemas.microsoft.com/office/2019/extlst" xmlns:r="http://schemas.openxmlformats.org/officeDocument/2006/relationships" xmlns:m="http://schemas.openxmlformats.org/officeDocument/2006/math" xmlns:v="urn:schemas-microsoft-com:vml" xmlns:wp14="http://schemas.microsoft.com/office/word/2010/wordprocessingDrawing" xmlns:wp="http://schemas.openxmlformats.org/drawingml/2006/wordprocessingDrawing" xmlns:w10="urn:schemas-microsoft-com:office:word" xmlns:w="http://schemas.openxmlformats.org/wordprocessingml/2006/main" xmlns:w14="http://schemas.microsoft.com/office/word/2010/wordml" xmlns:w15="http://schemas.microsoft.com/office/word/2012/wordml" xmlns:w16cex="http://schemas.microsoft.com/office/word/2018/wordml/cex" xmlns:w16cid="http://schemas.microsoft.com/office/word/2016/wordml/cid" xmlns:w16="http://schemas.microsoft.com/office/word/2018/wordml" xmlns:w16du="http://schemas.microsoft.com/office/word/2023/wordml/word16du" xmlns:w16sdtdh="http://schemas.microsoft.com/office/word/2020/wordml/sdtdatahash" xmlns:w16sdtfl="http://schemas.microsoft.com/office/word/2024/wordml/sdtformatlock" xmlns:w16se="http://schemas.microsoft.com/office/word/2015/wordml/symex" xmlns:wpg="http://schemas.microsoft.com/office/word/2010/wordprocessingGroup" xmlns:wpi="http://schemas.microsoft.com/office/word/2010/wordprocessingInk" xmlns:wne="http://schemas.microsoft.com/office/word/2006/wordml" xmlns:wps="http://schemas.microsoft.com/office/word/2010/wordprocessingShape" mc:Ignorable="w14 w15 w16se w16cid w16 w16cex w16sdtdh w16sdtfl w16du wp14">
+  <w:comment w:id="0" w:author="Jeff Lamb" w:date="2026-04-02T08:22:00Z" w:initials="JL">
+    <w:p>
+      <w:pPr>
+        <w:pStyle w:val="CommentText"/>
+      </w:pPr>
+      <w:r>
+        <w:rPr>
+          <w:rStyle w:val="CommentReference"/>
+        </w:rPr>
+        <w:annotationRef/>
+      </w:r>
+      <w:r>
+        <w:t>Sorry if i missed this, who is the specialist?</w:t>
+      </w:r>
+    </w:p>
+  </w:comment>
+  <w:comment w:id="1" w:author="Jeff Lamb" w:date="2026-04-02T08:23:00Z" w:initials="JL">
+    <w:p>
+      <w:pPr>
+        <w:pStyle w:val="CommentText"/>
+      </w:pPr>
+      <w:r>
+        <w:rPr>
+          <w:rStyle w:val="CommentReference"/>
+        </w:rPr>
+        <w:annotationRef/>
+      </w:r>
+      <w:r>
+        <w:t>Praise be</w:t>
+      </w:r>
+    </w:p>
+  </w:comment>
+  <w:comment w:id="2" w:author="Jeff Lamb" w:date="2026-04-02T08:21:00Z" w:initials="JL">
+    <w:p>
+      <w:r>
+        <w:annotationRef/>
+      </w:r>
+      <w:r>
+        <w:t>marking to discuss. I think i like this but want to be sure :)</w:t>
+      </w:r>
+    </w:p>
+  </w:comment>
+</w:comments>
+</file>
+
+<file path=word/commentsExtended.xml><?xml version="1.0" encoding="utf-8"?>
+<w15:commentsEx xmlns:wpc="http://schemas.microsoft.com/office/word/2010/wordprocessingCanvas" xmlns:cx="http://schemas.microsoft.com/office/drawing/2014/chartex" xmlns:cx1="http://schemas.microsoft.com/office/drawing/2015/9/8/chartex" xmlns:cx2="http://schemas.microsoft.com/office/drawing/2015/10/21/chartex" xmlns:cx3="http://schemas.microsoft.com/office/drawing/2016/5/9/chartex" xmlns:cx4="http://schemas.microsoft.com/office/drawing/2016/5/10/chartex" xmlns:cx5="http://schemas.microsoft.com/office/drawing/2016/5/11/chartex" xmlns:cx6="http://schemas.microsoft.com/office/drawing/2016/5/12/chartex" xmlns:cx7="http://schemas.microsoft.com/office/drawing/2016/5/13/chartex" xmlns:cx8="http://schemas.microsoft.com/office/drawing/2016/5/14/chartex" xmlns:mc="http://schemas.openxmlformats.org/markup-compatibility/2006" xmlns:aink="http://schemas.microsoft.com/office/drawing/2016/ink" xmlns:am3d="http://schemas.microsoft.com/office/drawing/2017/model3d" xmlns:o="urn:schemas-microsoft-com:office:office" xmlns:oel="http://schemas.microsoft.com/office/2019/extlst" xmlns:r="http://schemas.openxmlformats.org/officeDocument/2006/relationships" xmlns:m="http://schemas.openxmlformats.org/officeDocument/2006/math" xmlns:v="urn:schemas-microsoft-com:vml" xmlns:wp14="http://schemas.microsoft.com/office/word/2010/wordprocessingDrawing" xmlns:wp="http://schemas.openxmlformats.org/drawingml/2006/wordprocessingDrawing" xmlns:w10="urn:schemas-microsoft-com:office:word" xmlns:w="http://schemas.openxmlformats.org/wordprocessingml/2006/main" xmlns:w14="http://schemas.microsoft.com/office/word/2010/wordml" xmlns:w15="http://schemas.microsoft.com/office/word/2012/wordml" xmlns:w16cex="http://schemas.microsoft.com/office/word/2018/wordml/cex" xmlns:w16cid="http://schemas.microsoft.com/office/word/2016/wordml/cid" xmlns:w16="http://schemas.microsoft.com/office/word/2018/wordml" xmlns:w16du="http://schemas.microsoft.com/office/word/2023/wordml/word16du" xmlns:w16sdtdh="http://schemas.microsoft.com/office/word/2020/wordml/sdtdatahash" xmlns:w16sdtfl="http://schemas.microsoft.com/office/word/2024/wordml/sdtformatlock" xmlns:w16se="http://schemas.microsoft.com/office/word/2015/wordml/symex" xmlns:wpg="http://schemas.microsoft.com/office/word/2010/wordprocessingGroup" xmlns:wpi="http://schemas.microsoft.com/office/word/2010/wordprocessingInk" xmlns:wne="http://schemas.microsoft.com/office/word/2006/wordml" xmlns:wps="http://schemas.microsoft.com/office/word/2010/wordprocessingShape" mc:Ignorable="w14 w15 w16se w16cid w16 w16cex w16sdtdh w16sdtfl w16du wp14">
+  <w15:commentEx w15:paraId="73B3C4B1" w15:done="0"/>
+  <w15:commentEx w15:paraId="2AD9B35D" w15:done="0"/>
+  <w15:commentEx w15:paraId="3B409F17" w15:done="0"/>
+</w15:commentsEx>
+</file>
+
+<file path=word/commentsExtensible.xml><?xml version="1.0" encoding="utf-8"?>
+<w16cex:commentsExtensible xmlns:wpc="http://schemas.microsoft.com/office/word/2010/wordprocessingCanvas" xmlns:cx="http://schemas.microsoft.com/office/drawing/2014/chartex" xmlns:cx1="http://schemas.microsoft.com/office/drawing/2015/9/8/chartex" xmlns:cx2="http://schemas.microsoft.com/office/drawing/2015/10/21/chartex" xmlns:cx3="http://schemas.microsoft.com/office/drawing/2016/5/9/chartex" xmlns:cx4="http://schemas.microsoft.com/office/drawing/2016/5/10/chartex" xmlns:cx5="http://schemas.microsoft.com/office/drawing/2016/5/11/chartex" xmlns:cx6="http://schemas.microsoft.com/office/drawing/2016/5/12/chartex" xmlns:cx7="http://schemas.microsoft.com/office/drawing/2016/5/13/chartex" xmlns:cx8="http://schemas.microsoft.com/office/drawing/2016/5/14/chartex" xmlns:cr="http://schemas.microsoft.com/office/comments/2020/reactions" xmlns:mc="http://schemas.openxmlformats.org/markup-compatibility/2006" xmlns:aink="http://schemas.microsoft.com/office/drawing/2016/ink" xmlns:am3d="http://schemas.microsoft.com/office/drawing/2017/model3d" xmlns:o="urn:schemas-microsoft-com:office:office" xmlns:oel="http://schemas.microsoft.com/office/2019/extlst" xmlns:r="http://schemas.openxmlformats.org/officeDocument/2006/relationships" xmlns:m="http://schemas.openxmlformats.org/officeDocument/2006/math" xmlns:v="urn:schemas-microsoft-com:vml" xmlns:wp14="http://schemas.microsoft.com/office/word/2010/wordprocessingDrawing" xmlns:wp="http://schemas.openxmlformats.org/drawingml/2006/wordprocessingDrawing" xmlns:w10="urn:schemas-microsoft-com:office:word" xmlns:w="http://schemas.openxmlformats.org/wordprocessingml/2006/main" xmlns:w14="http://schemas.microsoft.com/office/word/2010/wordml" xmlns:w15="http://schemas.microsoft.com/office/word/2012/wordml" xmlns:w16cex="http://schemas.microsoft.com/office/word/2018/wordml/cex" xmlns:w16cid="http://schemas.microsoft.com/office/word/2016/wordml/cid" xmlns:w16="http://schemas.microsoft.com/office/word/2018/wordml" xmlns:w16du="http://schemas.microsoft.com/office/word/2023/wordml/word16du" xmlns:w16sdtdh="http://schemas.microsoft.com/office/word/2020/wordml/sdtdatahash" xmlns:w16sdtfl="http://schemas.microsoft.com/office/word/2024/wordml/sdtformatlock" xmlns:w16se="http://schemas.microsoft.com/office/word/2015/wordml/symex" xmlns:wpg="http://schemas.microsoft.com/office/word/2010/wordprocessingGroup" xmlns:wpi="http://schemas.microsoft.com/office/word/2010/wordprocessingInk" xmlns:wne="http://schemas.microsoft.com/office/word/2006/wordml" xmlns:wps="http://schemas.microsoft.com/office/word/2010/wordprocessingShape" mc:Ignorable="w14 w15 w16se w16cid w16 w16cex w16sdtdh w16sdtfl cr w16du wp14">
+  <w16cex:commentExtensible w16cex:durableId="48339FA0" w16cex:dateUtc="2026-04-02T14:22:00Z"/>
+  <w16cex:commentExtensible w16cex:durableId="3900C229" w16cex:dateUtc="2026-04-02T14:23:00Z"/>
+  <w16cex:commentExtensible w16cex:durableId="4263609C" w16cex:dateUtc="2026-04-02T14:21:00Z"/>
+</w16cex:commentsExtensible>
+</file>
+
+<file path=word/commentsIds.xml><?xml version="1.0" encoding="utf-8"?>
+<w16cid:commentsIds xmlns:wpc="http://schemas.microsoft.com/office/word/2010/wordprocessingCanvas" xmlns:cx="http://schemas.microsoft.com/office/drawing/2014/chartex" xmlns:cx1="http://schemas.microsoft.com/office/drawing/2015/9/8/chartex" xmlns:cx2="http://schemas.microsoft.com/office/drawing/2015/10/21/chartex" xmlns:cx3="http://schemas.microsoft.com/office/drawing/2016/5/9/chartex" xmlns:cx4="http://schemas.microsoft.com/office/drawing/2016/5/10/chartex" xmlns:cx5="http://schemas.microsoft.com/office/drawing/2016/5/11/chartex" xmlns:cx6="http://schemas.microsoft.com/office/drawing/2016/5/12/chartex" xmlns:cx7="http://schemas.microsoft.com/office/drawing/2016/5/13/chartex" xmlns:cx8="http://schemas.microsoft.com/office/drawing/2016/5/14/chartex" xmlns:mc="http://schemas.openxmlformats.org/markup-compatibility/2006" xmlns:aink="http://schemas.microsoft.com/office/drawing/2016/ink" xmlns:am3d="http://schemas.microsoft.com/office/drawing/2017/model3d" xmlns:o="urn:schemas-microsoft-com:office:office" xmlns:oel="http://schemas.microsoft.com/office/2019/extlst" xmlns:r="http://schemas.openxmlformats.org/officeDocument/2006/relationships" xmlns:m="http://schemas.openxmlformats.org/officeDocument/2006/math" xmlns:v="urn:schemas-microsoft-com:vml" xmlns:wp14="http://schemas.microsoft.com/office/word/2010/wordprocessingDrawing" xmlns:wp="http://schemas.openxmlformats.org/drawingml/2006/wordprocessingDrawing" xmlns:w10="urn:schemas-microsoft-com:office:word" xmlns:w="http://schemas.openxmlformats.org/wordprocessingml/2006/main" xmlns:w14="http://schemas.microsoft.com/office/word/2010/wordml" xmlns:w15="http://schemas.microsoft.com/office/word/2012/wordml" xmlns:w16cex="http://schemas.microsoft.com/office/word/2018/wordml/cex" xmlns:w16cid="http://schemas.microsoft.com/office/word/2016/wordml/cid" xmlns:w16="http://schemas.microsoft.com/office/word/2018/wordml" xmlns:w16du="http://schemas.microsoft.com/office/word/2023/wordml/word16du" xmlns:w16sdtdh="http://schemas.microsoft.com/office/word/2020/wordml/sdtdatahash" xmlns:w16sdtfl="http://schemas.microsoft.com/office/word/2024/wordml/sdtformatlock" xmlns:w16se="http://schemas.microsoft.com/office/word/2015/wordml/symex" xmlns:wpg="http://schemas.microsoft.com/office/word/2010/wordprocessingGroup" xmlns:wpi="http://schemas.microsoft.com/office/word/2010/wordprocessingInk" xmlns:wne="http://schemas.microsoft.com/office/word/2006/wordml" xmlns:wps="http://schemas.microsoft.com/office/word/2010/wordprocessingShape" mc:Ignorable="w14 w15 w16se w16cid w16 w16cex w16sdtdh w16sdtfl w16du wp14">
+  <w16cid:commentId w16cid:paraId="73B3C4B1" w16cid:durableId="48339FA0"/>
+  <w16cid:commentId w16cid:paraId="2AD9B35D" w16cid:durableId="3900C229"/>
+  <w16cid:commentId w16cid:paraId="3B409F17" w16cid:durableId="4263609C"/>
+</w16cid:commentsIds>
 </file>
 
 <file path=word/endnotes.xml><?xml version="1.0" encoding="utf-8"?>
@@ -3585,7 +3986,7 @@
       <mc:AlternateContent>
         <mc:Choice Requires="wps">
           <w:drawing>
-            <wp:anchor distT="0" distB="0" distL="0" distR="0" simplePos="0" relativeHeight="251659264" behindDoc="0" locked="0" layoutInCell="1" allowOverlap="1" wp14:anchorId="50BEB1C6" wp14:editId="2011E850">
+            <wp:anchor distT="0" distB="0" distL="0" distR="0" simplePos="0" relativeHeight="251658241" behindDoc="0" locked="0" layoutInCell="1" allowOverlap="1" wp14:anchorId="50BEB1C6" wp14:editId="2011E850">
               <wp:simplePos x="635" y="635"/>
               <wp:positionH relativeFrom="page">
                 <wp:align>center</wp:align>
@@ -3662,20 +4063,20 @@
             </wp:anchor>
           </w:drawing>
         </mc:Choice>
-        <mc:Fallback>
+        <mc:Fallback xmlns:arto="http://schemas.microsoft.com/office/word/2006/arto" xmlns:aclsh="http://schemas.microsoft.com/office/drawing/2020/classificationShape" xmlns:a16="http://schemas.microsoft.com/office/drawing/2014/main" xmlns:a="http://schemas.openxmlformats.org/drawingml/2006/main">
           <w:pict>
-            <v:shapetype w14:anchorId="50BEB1C6" id="_x0000_t202" coordsize="21600,21600" o:spt="202" path="m,l,21600r21600,l21600,xe">
+            <v:shapetype id="_x0000_t202" coordsize="21600,21600" o:spt="202" path="m,l,21600r21600,l21600,xe" w14:anchorId="50BEB1C6">
               <v:stroke joinstyle="miter"/>
               <v:path gradientshapeok="t" o:connecttype="rect"/>
             </v:shapetype>
-            <v:shape id="Text Box 2" o:spid="_x0000_s1026" type="#_x0000_t202" alt="Skillable INTERNAL" style="position:absolute;margin-left:0;margin-top:0;width:82.9pt;height:29.95pt;z-index:251659264;visibility:visible;mso-wrap-style:none;mso-wrap-distance-left:0;mso-wrap-distance-top:0;mso-wrap-distance-right:0;mso-wrap-distance-bottom:0;mso-position-horizontal:center;mso-position-horizontal-relative:page;mso-position-vertical:bottom;mso-position-vertical-relative:page;v-text-anchor:bottom" o:gfxdata="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" filled="f" stroked="f">
+            <v:shape id="Text Box 2" style="position:absolute;margin-left:0;margin-top:0;width:82.9pt;height:29.95pt;z-index:251659264;visibility:visible;mso-wrap-style:none;mso-wrap-distance-left:0;mso-wrap-distance-top:0;mso-wrap-distance-right:0;mso-wrap-distance-bottom:0;mso-position-horizontal:center;mso-position-horizontal-relative:page;mso-position-vertical:bottom;mso-position-vertical-relative:page;v-text-anchor:bottom" alt="Skillable INTERNAL" o:spid="_x0000_s1026" filled="f" stroked="f" type="#_x0000_t202" o:gfxdata="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">
               <v:textbox style="mso-fit-shape-to-text:t" inset="0,0,0,15pt">
                 <w:txbxContent>
                   <w:p>
                     <w:pPr>
                       <w:spacing w:after="0"/>
                       <w:rPr>
-                        <w:rFonts w:ascii="Aptos" w:eastAsia="Aptos" w:hAnsi="Aptos" w:cs="Aptos"/>
+                        <w:rFonts w:ascii="Aptos" w:hAnsi="Aptos" w:eastAsia="Aptos" w:cs="Aptos"/>
                         <w:noProof/>
                         <w:color w:val="000000"/>
                         <w:sz w:val="20"/>
@@ -3684,7 +4085,7 @@
                     </w:pPr>
                     <w:r>
                       <w:rPr>
-                        <w:rFonts w:ascii="Aptos" w:eastAsia="Aptos" w:hAnsi="Aptos" w:cs="Aptos"/>
+                        <w:rFonts w:ascii="Aptos" w:hAnsi="Aptos" w:eastAsia="Aptos" w:cs="Aptos"/>
                         <w:noProof/>
                         <w:color w:val="000000"/>
                         <w:sz w:val="20"/>
@@ -3722,7 +4123,7 @@
       <mc:AlternateContent>
         <mc:Choice Requires="wps">
           <w:drawing>
-            <wp:anchor distT="0" distB="0" distL="0" distR="0" simplePos="0" relativeHeight="251660288" behindDoc="0" locked="0" layoutInCell="1" allowOverlap="1" wp14:anchorId="4D5C6F0A" wp14:editId="26963958">
+            <wp:anchor distT="0" distB="0" distL="0" distR="0" simplePos="0" relativeHeight="251658242" behindDoc="0" locked="0" layoutInCell="1" allowOverlap="1" wp14:anchorId="4D5C6F0A" wp14:editId="26963958">
               <wp:simplePos x="635" y="635"/>
               <wp:positionH relativeFrom="page">
                 <wp:align>center</wp:align>
@@ -3799,20 +4200,20 @@
             </wp:anchor>
           </w:drawing>
         </mc:Choice>
-        <mc:Fallback>
+        <mc:Fallback xmlns:arto="http://schemas.microsoft.com/office/word/2006/arto" xmlns:aclsh="http://schemas.microsoft.com/office/drawing/2020/classificationShape" xmlns:a16="http://schemas.microsoft.com/office/drawing/2014/main" xmlns:a="http://schemas.openxmlformats.org/drawingml/2006/main">
           <w:pict>
-            <v:shapetype w14:anchorId="4D5C6F0A" id="_x0000_t202" coordsize="21600,21600" o:spt="202" path="m,l,21600r21600,l21600,xe">
+            <v:shapetype id="_x0000_t202" coordsize="21600,21600" o:spt="202" path="m,l,21600r21600,l21600,xe" w14:anchorId="4D5C6F0A">
               <v:stroke joinstyle="miter"/>
               <v:path gradientshapeok="t" o:connecttype="rect"/>
             </v:shapetype>
-            <v:shape id="Text Box 3" o:spid="_x0000_s1027" type="#_x0000_t202" alt="Skillable INTERNAL" style="position:absolute;left:0;text-align:left;margin-left:0;margin-top:0;width:82.9pt;height:29.95pt;z-index:251660288;visibility:visible;mso-wrap-style:none;mso-wrap-distance-left:0;mso-wrap-distance-top:0;mso-wrap-distance-right:0;mso-wrap-distance-bottom:0;mso-position-horizontal:center;mso-position-horizontal-relative:page;mso-position-vertical:bottom;mso-position-vertical-relative:page;v-text-anchor:bottom" o:gfxdata="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" filled="f" stroked="f">
+            <v:shape id="Text Box 3" style="position:absolute;left:0;text-align:left;margin-left:0;margin-top:0;width:82.9pt;height:29.95pt;z-index:251660288;visibility:visible;mso-wrap-style:none;mso-wrap-distance-left:0;mso-wrap-distance-top:0;mso-wrap-distance-right:0;mso-wrap-distance-bottom:0;mso-position-horizontal:center;mso-position-horizontal-relative:page;mso-position-vertical:bottom;mso-position-vertical-relative:page;v-text-anchor:bottom" alt="Skillable INTERNAL" o:spid="_x0000_s1027" filled="f" stroked="f" type="#_x0000_t202" o:gfxdata="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">
               <v:textbox style="mso-fit-shape-to-text:t" inset="0,0,0,15pt">
                 <w:txbxContent>
                   <w:p>
                     <w:pPr>
                       <w:spacing w:after="0"/>
                       <w:rPr>
-                        <w:rFonts w:ascii="Aptos" w:eastAsia="Aptos" w:hAnsi="Aptos" w:cs="Aptos"/>
+                        <w:rFonts w:ascii="Aptos" w:hAnsi="Aptos" w:eastAsia="Aptos" w:cs="Aptos"/>
                         <w:noProof/>
                         <w:color w:val="000000"/>
                         <w:sz w:val="20"/>
@@ -3821,7 +4222,7 @@
                     </w:pPr>
                     <w:r>
                       <w:rPr>
-                        <w:rFonts w:ascii="Aptos" w:eastAsia="Aptos" w:hAnsi="Aptos" w:cs="Aptos"/>
+                        <w:rFonts w:ascii="Aptos" w:hAnsi="Aptos" w:eastAsia="Aptos" w:cs="Aptos"/>
                         <w:noProof/>
                         <w:color w:val="000000"/>
                         <w:sz w:val="20"/>
@@ -4030,20 +4431,20 @@
             </wp:anchor>
           </w:drawing>
         </mc:Choice>
-        <mc:Fallback>
+        <mc:Fallback xmlns:arto="http://schemas.microsoft.com/office/word/2006/arto" xmlns:aclsh="http://schemas.microsoft.com/office/drawing/2020/classificationShape" xmlns:a16="http://schemas.microsoft.com/office/drawing/2014/main" xmlns:a="http://schemas.openxmlformats.org/drawingml/2006/main">
           <w:pict>
-            <v:shapetype w14:anchorId="0AB2305D" id="_x0000_t202" coordsize="21600,21600" o:spt="202" path="m,l,21600r21600,l21600,xe">
+            <v:shapetype id="_x0000_t202" coordsize="21600,21600" o:spt="202" path="m,l,21600r21600,l21600,xe" w14:anchorId="0AB2305D">
               <v:stroke joinstyle="miter"/>
               <v:path gradientshapeok="t" o:connecttype="rect"/>
             </v:shapetype>
-            <v:shape id="Text Box 1" o:spid="_x0000_s1028" type="#_x0000_t202" alt="Skillable INTERNAL" style="position:absolute;margin-left:0;margin-top:0;width:82.9pt;height:29.95pt;z-index:251658240;visibility:visible;mso-wrap-style:none;mso-wrap-distance-left:0;mso-wrap-distance-top:0;mso-wrap-distance-right:0;mso-wrap-distance-bottom:0;mso-position-horizontal:center;mso-position-horizontal-relative:page;mso-position-vertical:bottom;mso-position-vertical-relative:page;v-text-anchor:bottom" o:gfxdata="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" filled="f" stroked="f">
+            <v:shape id="Text Box 1" style="position:absolute;margin-left:0;margin-top:0;width:82.9pt;height:29.95pt;z-index:251658240;visibility:visible;mso-wrap-style:none;mso-wrap-distance-left:0;mso-wrap-distance-top:0;mso-wrap-distance-right:0;mso-wrap-distance-bottom:0;mso-position-horizontal:center;mso-position-horizontal-relative:page;mso-position-vertical:bottom;mso-position-vertical-relative:page;v-text-anchor:bottom" alt="Skillable INTERNAL" o:spid="_x0000_s1028" filled="f" stroked="f" type="#_x0000_t202" o:gfxdata="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">
               <v:textbox style="mso-fit-shape-to-text:t" inset="0,0,0,15pt">
                 <w:txbxContent>
                   <w:p>
                     <w:pPr>
                       <w:spacing w:after="0"/>
                       <w:rPr>
-                        <w:rFonts w:ascii="Aptos" w:eastAsia="Aptos" w:hAnsi="Aptos" w:cs="Aptos"/>
+                        <w:rFonts w:ascii="Aptos" w:hAnsi="Aptos" w:eastAsia="Aptos" w:cs="Aptos"/>
                         <w:noProof/>
                         <w:color w:val="000000"/>
                         <w:sz w:val="20"/>
@@ -4052,7 +4453,7 @@
                     </w:pPr>
                     <w:r>
                       <w:rPr>
-                        <w:rFonts w:ascii="Aptos" w:eastAsia="Aptos" w:hAnsi="Aptos" w:cs="Aptos"/>
+                        <w:rFonts w:ascii="Aptos" w:hAnsi="Aptos" w:eastAsia="Aptos" w:cs="Aptos"/>
                         <w:noProof/>
                         <w:color w:val="000000"/>
                         <w:sz w:val="20"/>
@@ -4356,6 +4757,14 @@
     <w:abstractNumId w:val="2"/>
   </w:num>
 </w:numbering>
+</file>
+
+<file path=word/people.xml><?xml version="1.0" encoding="utf-8"?>
+<w15:people xmlns:wpc="http://schemas.microsoft.com/office/word/2010/wordprocessingCanvas" xmlns:cx="http://schemas.microsoft.com/office/drawing/2014/chartex" xmlns:cx1="http://schemas.microsoft.com/office/drawing/2015/9/8/chartex" xmlns:cx2="http://schemas.microsoft.com/office/drawing/2015/10/21/chartex" xmlns:cx3="http://schemas.microsoft.com/office/drawing/2016/5/9/chartex" xmlns:cx4="http://schemas.microsoft.com/office/drawing/2016/5/10/chartex" xmlns:cx5="http://schemas.microsoft.com/office/drawing/2016/5/11/chartex" xmlns:cx6="http://schemas.microsoft.com/office/drawing/2016/5/12/chartex" xmlns:cx7="http://schemas.microsoft.com/office/drawing/2016/5/13/chartex" xmlns:cx8="http://schemas.microsoft.com/office/drawing/2016/5/14/chartex" xmlns:mc="http://schemas.openxmlformats.org/markup-compatibility/2006" xmlns:aink="http://schemas.microsoft.com/office/drawing/2016/ink" xmlns:am3d="http://schemas.microsoft.com/office/drawing/2017/model3d" xmlns:o="urn:schemas-microsoft-com:office:office" xmlns:oel="http://schemas.microsoft.com/office/2019/extlst" xmlns:r="http://schemas.openxmlformats.org/officeDocument/2006/relationships" xmlns:m="http://schemas.openxmlformats.org/officeDocument/2006/math" xmlns:v="urn:schemas-microsoft-com:vml" xmlns:wp14="http://schemas.microsoft.com/office/word/2010/wordprocessingDrawing" xmlns:wp="http://schemas.openxmlformats.org/drawingml/2006/wordprocessingDrawing" xmlns:w10="urn:schemas-microsoft-com:office:word" xmlns:w="http://schemas.openxmlformats.org/wordprocessingml/2006/main" xmlns:w14="http://schemas.microsoft.com/office/word/2010/wordml" xmlns:w15="http://schemas.microsoft.com/office/word/2012/wordml" xmlns:w16cex="http://schemas.microsoft.com/office/word/2018/wordml/cex" xmlns:w16cid="http://schemas.microsoft.com/office/word/2016/wordml/cid" xmlns:w16="http://schemas.microsoft.com/office/word/2018/wordml" xmlns:w16du="http://schemas.microsoft.com/office/word/2023/wordml/word16du" xmlns:w16sdtdh="http://schemas.microsoft.com/office/word/2020/wordml/sdtdatahash" xmlns:w16sdtfl="http://schemas.microsoft.com/office/word/2024/wordml/sdtformatlock" xmlns:w16se="http://schemas.microsoft.com/office/word/2015/wordml/symex" xmlns:wpg="http://schemas.microsoft.com/office/word/2010/wordprocessingGroup" xmlns:wpi="http://schemas.microsoft.com/office/word/2010/wordprocessingInk" xmlns:wne="http://schemas.microsoft.com/office/word/2006/wordml" xmlns:wps="http://schemas.microsoft.com/office/word/2010/wordprocessingShape" mc:Ignorable="w14 w15 w16se w16cid w16 w16cex w16sdtdh w16sdtfl w16du wp14">
+  <w15:person w15:author="Jeff Lamb">
+    <w15:presenceInfo w15:providerId="AD" w15:userId="S::jeff.lamb@skillable.com::a688261b-8099-4bd2-b51d-79b6b258f0b5"/>
+  </w15:person>
+</w15:people>
 </file>
 
 <file path=word/styles.xml><?xml version="1.0" encoding="utf-8"?>
@@ -15738,6 +16147,43 @@
       </w:tcPr>
     </w:tblStylePr>
   </w:style>
+  <w:style w:type="paragraph" w:styleId="CommentText">
+    <w:name w:val="annotation text"/>
+    <w:basedOn w:val="Normal"/>
+    <w:link w:val="CommentTextChar"/>
+    <w:uiPriority w:val="99"/>
+    <w:semiHidden/>
+    <w:unhideWhenUsed/>
+    <w:pPr>
+      <w:spacing w:line="240" w:lineRule="auto"/>
+    </w:pPr>
+    <w:rPr>
+      <w:sz w:val="20"/>
+      <w:szCs w:val="20"/>
+    </w:rPr>
+  </w:style>
+  <w:style w:type="character" w:customStyle="1" w:styleId="CommentTextChar">
+    <w:name w:val="Comment Text Char"/>
+    <w:basedOn w:val="DefaultParagraphFont"/>
+    <w:link w:val="CommentText"/>
+    <w:uiPriority w:val="99"/>
+    <w:semiHidden/>
+    <w:rPr>
+      <w:sz w:val="20"/>
+      <w:szCs w:val="20"/>
+    </w:rPr>
+  </w:style>
+  <w:style w:type="character" w:styleId="CommentReference">
+    <w:name w:val="annotation reference"/>
+    <w:basedOn w:val="DefaultParagraphFont"/>
+    <w:uiPriority w:val="99"/>
+    <w:semiHidden/>
+    <w:unhideWhenUsed/>
+    <w:rPr>
+      <w:sz w:val="16"/>
+      <w:szCs w:val="16"/>
+    </w:rPr>
+  </w:style>
 </w:styles>
 </file>
 

</xml_diff>

<commit_message>
Dead code cleanup: remove 5 orphaned templates + legacy /marketing redirect
Templates removed (routes are all 301 redirects, never rendered):
- select.html, results.html → /select, /results redirect to caseboard/dossier
- marketing.html, marketing_running.html, marketing_results.html → /marketing
  redirects to prospector

Also removed the /marketing legacy redirect route from inspector_routes.py —
Prospector is now accessed directly at /prospector.

Co-Authored-By: Claude Sonnet 4.6 <noreply@anthropic.com>
</commit_message>
<xml_diff>
--- a/docs/Skillable-Intelligence-Platform.docx
+++ b/docs/Skillable-Intelligence-Platform.docx
@@ -125,27 +125,7 @@
           <w:color w:val="1A1A1A"/>
           <w:sz w:val="20"/>
         </w:rPr>
-        <w:t xml:space="preserve">Proving </w:t>
-      </w:r>
-      <w:proofErr w:type="spellStart"/>
-      <w:r>
-        <w:rPr>
-          <w:rFonts w:ascii="Calibri" w:hAnsi="Calibri"/>
-          <w:b/>
-          <w:color w:val="1A1A1A"/>
-          <w:sz w:val="20"/>
-        </w:rPr>
-        <w:t>labability</w:t>
-      </w:r>
-      <w:proofErr w:type="spellEnd"/>
-      <w:r>
-        <w:rPr>
-          <w:rFonts w:ascii="Calibri" w:hAnsi="Calibri"/>
-          <w:b/>
-          <w:color w:val="1A1A1A"/>
-          <w:sz w:val="20"/>
-        </w:rPr>
-        <w:t xml:space="preserve"> and lab impact</w:t>
+        <w:t>Proving labability and lab impact</w:t>
       </w:r>
     </w:p>
     <w:p>
@@ -289,7 +269,7 @@
             <wp:docPr id="1" name="Picture 1">
               <a:extLst xmlns:a="http://schemas.openxmlformats.org/drawingml/2006/main">
                 <a:ext uri="{FF2B5EF4-FFF2-40B4-BE49-F238E27FC236}">
-                  <a16:creationId xmlns:a16="http://schemas.microsoft.com/office/drawing/2014/main" id="{45CC4F52-DF5A-422C-A4B5-4A886F3EE76C}"/>
+                  <a16:creationId xmlns:a16="http://schemas.microsoft.com/office/drawing/2014/main" id="{FCC2DF34-7CB3-4AF6-BB95-ED15DD0B3B3A}"/>
                 </a:ext>
               </a:extLst>
             </wp:docPr>
@@ -435,7 +415,7 @@
             <wp:docPr id="2" name="Picture 2">
               <a:extLst xmlns:a="http://schemas.openxmlformats.org/drawingml/2006/main">
                 <a:ext uri="{FF2B5EF4-FFF2-40B4-BE49-F238E27FC236}">
-                  <a16:creationId xmlns:a16="http://schemas.microsoft.com/office/drawing/2014/main" id="{6EB01F6F-BBD1-4179-98F0-0ABC9F6BA330}"/>
+                  <a16:creationId xmlns:a16="http://schemas.microsoft.com/office/drawing/2014/main" id="{E0E54F1A-7405-4183-B251-F976CC4BD20B}"/>
                 </a:ext>
               </a:extLst>
             </wp:docPr>
@@ -627,7 +607,7 @@
             <wp:docPr id="3" name="Picture 3">
               <a:extLst xmlns:a="http://schemas.openxmlformats.org/drawingml/2006/main">
                 <a:ext uri="{FF2B5EF4-FFF2-40B4-BE49-F238E27FC236}">
-                  <a16:creationId xmlns:a16="http://schemas.microsoft.com/office/drawing/2014/main" id="{DE511453-E203-4B06-A67C-B2BFDE8AD1BD}"/>
+                  <a16:creationId xmlns:a16="http://schemas.microsoft.com/office/drawing/2014/main" id="{2D071268-8A15-4406-9AB0-892C2C9D9EF0}"/>
                 </a:ext>
               </a:extLst>
             </wp:docPr>
@@ -732,7 +712,7 @@
             <wp:docPr id="4" name="Picture 4">
               <a:extLst xmlns:a="http://schemas.openxmlformats.org/drawingml/2006/main">
                 <a:ext uri="{FF2B5EF4-FFF2-40B4-BE49-F238E27FC236}">
-                  <a16:creationId xmlns:a16="http://schemas.microsoft.com/office/drawing/2014/main" id="{1C7B4680-3627-46F8-AFCA-2FFBF68322BC}"/>
+                  <a16:creationId xmlns:a16="http://schemas.microsoft.com/office/drawing/2014/main" id="{5F764F0B-058F-4459-815D-D83505971985}"/>
                 </a:ext>
               </a:extLst>
             </wp:docPr>
@@ -796,25 +776,7 @@
           <w:b/>
           <w:color w:val="136945"/>
         </w:rPr>
-        <w:t xml:space="preserve">Inspector: Proves </w:t>
-      </w:r>
-      <w:proofErr w:type="spellStart"/>
-      <w:r>
-        <w:rPr>
-          <w:rFonts w:ascii="Calibri" w:hAnsi="Calibri"/>
-          <w:b/>
-          <w:color w:val="136945"/>
-        </w:rPr>
-        <w:t>Labability</w:t>
-      </w:r>
-      <w:proofErr w:type="spellEnd"/>
-      <w:r>
-        <w:rPr>
-          <w:rFonts w:ascii="Calibri" w:hAnsi="Calibri"/>
-          <w:b/>
-          <w:color w:val="136945"/>
-        </w:rPr>
-        <w:t xml:space="preserve"> and Lab Impact</w:t>
+        <w:t>Inspector: Proves Labability and Lab Impact</w:t>
       </w:r>
     </w:p>
     <w:p>
@@ -922,25 +884,7 @@
           <w:color w:val="1A1A1A"/>
           <w:sz w:val="20"/>
         </w:rPr>
-        <w:t xml:space="preserve">A broad scan that surfaces all of a company’s products, ranked by </w:t>
-      </w:r>
-      <w:proofErr w:type="spellStart"/>
-      <w:r>
-        <w:rPr>
-          <w:rFonts w:ascii="Calibri" w:hAnsi="Calibri"/>
-          <w:color w:val="1A1A1A"/>
-          <w:sz w:val="20"/>
-        </w:rPr>
-        <w:t>labability</w:t>
-      </w:r>
-      <w:proofErr w:type="spellEnd"/>
-      <w:r>
-        <w:rPr>
-          <w:rFonts w:ascii="Calibri" w:hAnsi="Calibri"/>
-          <w:color w:val="1A1A1A"/>
-          <w:sz w:val="20"/>
-        </w:rPr>
-        <w:t>, with competitive pairings, company-level signals, and an overall fit score. You walk in the room and get the picture at a glance.</w:t>
+        <w:t>A broad scan that surfaces all of a company’s products, ranked by labability, with competitive pairings, company-level signals, and an overall fit score. You walk in the room and get the picture at a glance.</w:t>
       </w:r>
     </w:p>
     <w:p>
@@ -982,25 +926,7 @@
           <w:color w:val="1A1A1A"/>
           <w:sz w:val="20"/>
         </w:rPr>
-        <w:t xml:space="preserve">The seller or SE selects three to four products from the Case Board for exhaustive analysis — full technical </w:t>
-      </w:r>
-      <w:proofErr w:type="spellStart"/>
-      <w:r>
-        <w:rPr>
-          <w:rFonts w:ascii="Calibri" w:hAnsi="Calibri"/>
-          <w:color w:val="1A1A1A"/>
-          <w:sz w:val="20"/>
-        </w:rPr>
-        <w:t>orchestrability</w:t>
-      </w:r>
-      <w:proofErr w:type="spellEnd"/>
-      <w:r>
-        <w:rPr>
-          <w:rFonts w:ascii="Calibri" w:hAnsi="Calibri"/>
-          <w:color w:val="1A1A1A"/>
-          <w:sz w:val="20"/>
-        </w:rPr>
-        <w:t xml:space="preserve"> evidence, delivery path recommendation with rationale, scoring approach, consumption potential estimate, and program scope.</w:t>
+        <w:t>The seller or SE selects three to four products from the Case Board for exhaustive analysis — full technical orchestrability evidence, delivery path recommendation with rationale, scoring approach, consumption potential estimate, and program scope.</w:t>
       </w:r>
     </w:p>
     <w:p>
@@ -1043,7 +969,7 @@
             <wp:docPr id="5" name="Picture 5">
               <a:extLst xmlns:a="http://schemas.openxmlformats.org/drawingml/2006/main">
                 <a:ext uri="{FF2B5EF4-FFF2-40B4-BE49-F238E27FC236}">
-                  <a16:creationId xmlns:a16="http://schemas.microsoft.com/office/drawing/2014/main" id="{C6477806-31EF-4F6A-89C6-B2C00324EFB7}"/>
+                  <a16:creationId xmlns:a16="http://schemas.microsoft.com/office/drawing/2014/main" id="{04803D8C-3531-43CE-923B-5F2C439EBA0C}"/>
                 </a:ext>
               </a:extLst>
             </wp:docPr>
@@ -1119,7 +1045,7 @@
             <wp:docPr id="6" name="Picture 6">
               <a:extLst xmlns:a="http://schemas.openxmlformats.org/drawingml/2006/main">
                 <a:ext uri="{FF2B5EF4-FFF2-40B4-BE49-F238E27FC236}">
-                  <a16:creationId xmlns:a16="http://schemas.microsoft.com/office/drawing/2014/main" id="{B673F1C9-DE0E-46FC-B1CC-DD1A80204487}"/>
+                  <a16:creationId xmlns:a16="http://schemas.microsoft.com/office/drawing/2014/main" id="{5A49E512-FA2F-4706-826C-7844902FC107}"/>
                 </a:ext>
               </a:extLst>
             </wp:docPr>
@@ -1203,7 +1129,7 @@
             <wp:docPr id="7" name="Picture 7">
               <a:extLst xmlns:a="http://schemas.openxmlformats.org/drawingml/2006/main">
                 <a:ext uri="{FF2B5EF4-FFF2-40B4-BE49-F238E27FC236}">
-                  <a16:creationId xmlns:a16="http://schemas.microsoft.com/office/drawing/2014/main" id="{F6B6C56C-1740-4C8C-9C00-D8BA13881CAC}"/>
+                  <a16:creationId xmlns:a16="http://schemas.microsoft.com/office/drawing/2014/main" id="{C87F1C95-BFB4-45A0-8CAF-D0B8EAD66E0D}"/>
                 </a:ext>
               </a:extLst>
             </wp:docPr>
@@ -1499,25 +1425,7 @@
           <w:color w:val="1A1A1A"/>
           <w:sz w:val="20"/>
         </w:rPr>
-        <w:t xml:space="preserve">No mechanism to spin up an individual environment programmatically. </w:t>
-      </w:r>
-      <w:proofErr w:type="spellStart"/>
-      <w:r>
-        <w:rPr>
-          <w:rFonts w:ascii="Calibri" w:hAnsi="Calibri"/>
-          <w:color w:val="1A1A1A"/>
-          <w:sz w:val="20"/>
-        </w:rPr>
-        <w:t>Skillable’s</w:t>
-      </w:r>
-      <w:proofErr w:type="spellEnd"/>
-      <w:r>
-        <w:rPr>
-          <w:rFonts w:ascii="Calibri" w:hAnsi="Calibri"/>
-          <w:color w:val="1A1A1A"/>
-          <w:sz w:val="20"/>
-        </w:rPr>
-        <w:t xml:space="preserve"> entire delivery model depends on this capability.</w:t>
+        <w:t>No mechanism to spin up an individual environment programmatically. Skillable’s entire delivery model depends on this capability.</w:t>
       </w:r>
     </w:p>
     <w:p>
@@ -1625,7 +1533,7 @@
             <wp:docPr id="8" name="Picture 8">
               <a:extLst xmlns:a="http://schemas.openxmlformats.org/drawingml/2006/main">
                 <a:ext uri="{FF2B5EF4-FFF2-40B4-BE49-F238E27FC236}">
-                  <a16:creationId xmlns:a16="http://schemas.microsoft.com/office/drawing/2014/main" id="{90730DE7-7306-474D-90A0-1EE2D5F9C8AF}"/>
+                  <a16:creationId xmlns:a16="http://schemas.microsoft.com/office/drawing/2014/main" id="{63395D5B-2504-415F-A3A8-5DDA5BDE449A}"/>
                 </a:ext>
               </a:extLst>
             </wp:docPr>
@@ -1666,25 +1574,7 @@
           <w:color w:val="1A1A1A"/>
           <w:sz w:val="20"/>
         </w:rPr>
-        <w:t xml:space="preserve">Prospector is the go-to-market tool for Marketing and </w:t>
-      </w:r>
-      <w:proofErr w:type="spellStart"/>
-      <w:r>
-        <w:rPr>
-          <w:rFonts w:ascii="Calibri" w:hAnsi="Calibri"/>
-          <w:color w:val="1A1A1A"/>
-          <w:sz w:val="20"/>
-        </w:rPr>
-        <w:t>RevOps</w:t>
-      </w:r>
-      <w:proofErr w:type="spellEnd"/>
-      <w:r>
-        <w:rPr>
-          <w:rFonts w:ascii="Calibri" w:hAnsi="Calibri"/>
-          <w:color w:val="1A1A1A"/>
-          <w:sz w:val="20"/>
-        </w:rPr>
-        <w:t>. It takes a list of companies and returns a ranked assessment of ICP fit — with product-level evidence, composite scores, verdicts, delivery path signals, and key contacts for every company on the list.</w:t>
+        <w:t>Prospector is the go-to-market tool for Marketing and RevOps. It takes a list of companies and returns a ranked assessment of ICP fit — with product-level evidence, composite scores, verdicts, delivery path signals, and key contacts for every company on the list.</w:t>
       </w:r>
     </w:p>
     <w:p>
@@ -1773,27 +1663,7 @@
           <w:sz w:val="20"/>
           <w:highlight w:val="yellow"/>
         </w:rPr>
-        <w:t xml:space="preserve">The balance of this document outlines the decisions for </w:t>
-      </w:r>
-      <w:proofErr w:type="spellStart"/>
-      <w:r>
-        <w:rPr>
-          <w:rFonts w:ascii="Calibri" w:hAnsi="Calibri"/>
-          <w:color w:val="1A1A1A"/>
-          <w:sz w:val="20"/>
-          <w:highlight w:val="yellow"/>
-        </w:rPr>
-        <w:t>RevOps</w:t>
-      </w:r>
-      <w:proofErr w:type="spellEnd"/>
-      <w:r>
-        <w:rPr>
-          <w:rFonts w:ascii="Calibri" w:hAnsi="Calibri"/>
-          <w:color w:val="1A1A1A"/>
-          <w:sz w:val="20"/>
-          <w:highlight w:val="yellow"/>
-        </w:rPr>
-        <w:t xml:space="preserve"> to make with Marketing and Security. It includes more context, several recommendations, and a list of decisions to be made. If you’re not in one of those groups, feel free to stop reading if you choose.</w:t>
+        <w:t>The balance of this document outlines the decisions for RevOps to make with Marketing and Security. It includes more context, several recommendations, and a list of decisions to be made. If you’re not in one of those groups, feel free to stop reading if you choose.</w:t>
       </w:r>
     </w:p>
     <w:p>
@@ -2084,23 +1954,13 @@
             </w:tcMar>
           </w:tcPr>
           <w:p>
-            <w:proofErr w:type="spellStart"/>
             <w:r>
               <w:rPr>
                 <w:rFonts w:ascii="Calibri" w:hAnsi="Calibri"/>
                 <w:color w:val="1A1A1A"/>
                 <w:sz w:val="20"/>
               </w:rPr>
-              <w:t>Labable</w:t>
-            </w:r>
-            <w:proofErr w:type="spellEnd"/>
-            <w:r>
-              <w:rPr>
-                <w:rFonts w:ascii="Calibri" w:hAnsi="Calibri"/>
-                <w:color w:val="1A1A1A"/>
-                <w:sz w:val="20"/>
-              </w:rPr>
-              <w:t xml:space="preserve"> / Simulation Candidate / Do Not Pursue; enables filtered views and enrollment triggers</w:t>
+              <w:t>Labable / Simulation Candidate / Do Not Pursue; enables filtered views and enrollment triggers</w:t>
             </w:r>
           </w:p>
         </w:tc>
@@ -2517,25 +2377,7 @@
                 <w:color w:val="1A1A1A"/>
                 <w:sz w:val="20"/>
               </w:rPr>
-              <w:t xml:space="preserve">Product list with </w:t>
-            </w:r>
-            <w:proofErr w:type="spellStart"/>
-            <w:r>
-              <w:rPr>
-                <w:rFonts w:ascii="Calibri" w:hAnsi="Calibri"/>
-                <w:color w:val="1A1A1A"/>
-                <w:sz w:val="20"/>
-              </w:rPr>
-              <w:t>labability</w:t>
-            </w:r>
-            <w:proofErr w:type="spellEnd"/>
-            <w:r>
-              <w:rPr>
-                <w:rFonts w:ascii="Calibri" w:hAnsi="Calibri"/>
-                <w:color w:val="1A1A1A"/>
-                <w:sz w:val="20"/>
-              </w:rPr>
-              <w:t xml:space="preserve"> scores</w:t>
+              <w:t>Product list with labability scores</w:t>
             </w:r>
           </w:p>
         </w:tc>
@@ -2557,25 +2399,7 @@
                 <w:color w:val="1A1A1A"/>
                 <w:sz w:val="20"/>
               </w:rPr>
-              <w:t xml:space="preserve">What this company sells and how </w:t>
-            </w:r>
-            <w:proofErr w:type="spellStart"/>
-            <w:r>
-              <w:rPr>
-                <w:rFonts w:ascii="Calibri" w:hAnsi="Calibri"/>
-                <w:color w:val="1A1A1A"/>
-                <w:sz w:val="20"/>
-              </w:rPr>
-              <w:t>labable</w:t>
-            </w:r>
-            <w:proofErr w:type="spellEnd"/>
-            <w:r>
-              <w:rPr>
-                <w:rFonts w:ascii="Calibri" w:hAnsi="Calibri"/>
-                <w:color w:val="1A1A1A"/>
-                <w:sz w:val="20"/>
-              </w:rPr>
-              <w:t xml:space="preserve"> each product is</w:t>
+              <w:t>What this company sells and how labable each product is</w:t>
             </w:r>
           </w:p>
         </w:tc>
@@ -2998,25 +2822,7 @@
                 <w:color w:val="1A1A1A"/>
                 <w:sz w:val="20"/>
               </w:rPr>
-              <w:t xml:space="preserve">Technical </w:t>
-            </w:r>
-            <w:proofErr w:type="spellStart"/>
-            <w:r>
-              <w:rPr>
-                <w:rFonts w:ascii="Calibri" w:hAnsi="Calibri"/>
-                <w:color w:val="1A1A1A"/>
-                <w:sz w:val="20"/>
-              </w:rPr>
-              <w:t>orchestrability</w:t>
-            </w:r>
-            <w:proofErr w:type="spellEnd"/>
-            <w:r>
-              <w:rPr>
-                <w:rFonts w:ascii="Calibri" w:hAnsi="Calibri"/>
-                <w:color w:val="1A1A1A"/>
-                <w:sz w:val="20"/>
-              </w:rPr>
-              <w:t xml:space="preserve"> evidence</w:t>
+              <w:t>Technical orchestrability evidence</w:t>
             </w:r>
           </w:p>
         </w:tc>
@@ -3247,25 +3053,7 @@
           <w:color w:val="1A1A1A"/>
           <w:sz w:val="20"/>
         </w:rPr>
-        <w:t xml:space="preserve">Replace or supplement the current ZoomInfo-only scoring motion with Intelligence-qualified lists. Companies that fail the technical </w:t>
-      </w:r>
-      <w:proofErr w:type="spellStart"/>
-      <w:r>
-        <w:rPr>
-          <w:rFonts w:ascii="Calibri" w:hAnsi="Calibri"/>
-          <w:color w:val="1A1A1A"/>
-          <w:sz w:val="20"/>
-        </w:rPr>
-        <w:t>orchestrability</w:t>
-      </w:r>
-      <w:proofErr w:type="spellEnd"/>
-      <w:r>
-        <w:rPr>
-          <w:rFonts w:ascii="Calibri" w:hAnsi="Calibri"/>
-          <w:color w:val="1A1A1A"/>
-          <w:sz w:val="20"/>
-        </w:rPr>
-        <w:t xml:space="preserve"> assessment come off the list before sequences are built. Companies that clear all three dimensions get prioritized outreach with seller-ready context already in HubSpot.</w:t>
+        <w:t>Replace or supplement the current ZoomInfo-only scoring motion with Intelligence-qualified lists. Companies that fail the technical orchestrability assessment come off the list before sequences are built. Companies that clear all three dimensions get prioritized outreach with seller-ready context already in HubSpot.</w:t>
       </w:r>
     </w:p>
     <w:p>
@@ -3363,25 +3151,7 @@
           <w:b/>
           <w:color w:val="136945"/>
         </w:rPr>
-        <w:t xml:space="preserve">Decisions required from </w:t>
-      </w:r>
-      <w:proofErr w:type="spellStart"/>
-      <w:r>
-        <w:rPr>
-          <w:rFonts w:ascii="Calibri" w:hAnsi="Calibri"/>
-          <w:b/>
-          <w:color w:val="136945"/>
-        </w:rPr>
-        <w:t>RevOps</w:t>
-      </w:r>
-      <w:proofErr w:type="spellEnd"/>
-      <w:r>
-        <w:rPr>
-          <w:rFonts w:ascii="Calibri" w:hAnsi="Calibri"/>
-          <w:b/>
-          <w:color w:val="136945"/>
-        </w:rPr>
-        <w:t xml:space="preserve"> and Marketing</w:t>
+        <w:t>Decisions required from RevOps and Marketing</w:t>
       </w:r>
     </w:p>
     <w:p>
@@ -3394,25 +3164,7 @@
           <w:color w:val="1A1A1A"/>
           <w:sz w:val="20"/>
         </w:rPr>
-        <w:t xml:space="preserve">The following require </w:t>
-      </w:r>
-      <w:proofErr w:type="spellStart"/>
-      <w:r>
-        <w:rPr>
-          <w:rFonts w:ascii="Calibri" w:hAnsi="Calibri"/>
-          <w:color w:val="1A1A1A"/>
-          <w:sz w:val="20"/>
-        </w:rPr>
-        <w:t>RevOps</w:t>
-      </w:r>
-      <w:proofErr w:type="spellEnd"/>
-      <w:r>
-        <w:rPr>
-          <w:rFonts w:ascii="Calibri" w:hAnsi="Calibri"/>
-          <w:color w:val="1A1A1A"/>
-          <w:sz w:val="20"/>
-        </w:rPr>
-        <w:t xml:space="preserve"> and Marketing input before the HubSpot integration can be built:</w:t>
+        <w:t>The following require RevOps and Marketing input before the HubSpot integration can be built:</w:t>
       </w:r>
     </w:p>
     <w:tbl>
@@ -3986,7 +3738,7 @@
       <mc:AlternateContent>
         <mc:Choice Requires="wps">
           <w:drawing>
-            <wp:anchor distT="0" distB="0" distL="0" distR="0" simplePos="0" relativeHeight="251658241" behindDoc="0" locked="0" layoutInCell="1" allowOverlap="1" wp14:anchorId="50BEB1C6" wp14:editId="2011E850">
+            <wp:anchor distT="0" distB="0" distL="0" distR="0" simplePos="0" relativeHeight="251661314" behindDoc="0" locked="0" layoutInCell="1" allowOverlap="1" wp14:anchorId="50BEB1C6" wp14:editId="2011E850">
               <wp:simplePos x="635" y="635"/>
               <wp:positionH relativeFrom="page">
                 <wp:align>center</wp:align>
@@ -4000,7 +3752,7 @@
               <wp:docPr id="462396284" name="Text Box 2" descr="Skillable INTERNAL">
                 <a:extLst xmlns:a="http://schemas.openxmlformats.org/drawingml/2006/main">
                   <a:ext uri="{FF2B5EF4-FFF2-40B4-BE49-F238E27FC236}">
-                    <a16:creationId xmlns:a16="http://schemas.microsoft.com/office/drawing/2014/main" id="{8C9AB34A-912D-4F07-9635-B5ED0223C8D0}"/>
+                    <a16:creationId xmlns:a16="http://schemas.microsoft.com/office/drawing/2014/main" id="{C76DAB1D-49A8-4E44-A901-82D2C7398885}"/>
                   </a:ext>
                   <a:ext uri="{5AE41FA2-C0FF-4470-9BD4-5FADCA87CBE2}">
                     <aclsh:classification xmlns:aclsh="http://schemas.microsoft.com/office/drawing/2020/classificationShape" classificationOutcomeType="ftr"/>
@@ -4063,20 +3815,20 @@
             </wp:anchor>
           </w:drawing>
         </mc:Choice>
-        <mc:Fallback xmlns:arto="http://schemas.microsoft.com/office/word/2006/arto" xmlns:aclsh="http://schemas.microsoft.com/office/drawing/2020/classificationShape" xmlns:a16="http://schemas.microsoft.com/office/drawing/2014/main" xmlns:a="http://schemas.openxmlformats.org/drawingml/2006/main">
+        <mc:Fallback>
           <w:pict>
-            <v:shapetype id="_x0000_t202" coordsize="21600,21600" o:spt="202" path="m,l,21600r21600,l21600,xe" w14:anchorId="50BEB1C6">
+            <v:shapetype w14:anchorId="50BEB1C6" id="_x0000_t202" coordsize="21600,21600" o:spt="202" path="m,l,21600r21600,l21600,xe">
               <v:stroke joinstyle="miter"/>
               <v:path gradientshapeok="t" o:connecttype="rect"/>
             </v:shapetype>
-            <v:shape id="Text Box 2" style="position:absolute;margin-left:0;margin-top:0;width:82.9pt;height:29.95pt;z-index:251659264;visibility:visible;mso-wrap-style:none;mso-wrap-distance-left:0;mso-wrap-distance-top:0;mso-wrap-distance-right:0;mso-wrap-distance-bottom:0;mso-position-horizontal:center;mso-position-horizontal-relative:page;mso-position-vertical:bottom;mso-position-vertical-relative:page;v-text-anchor:bottom" alt="Skillable INTERNAL" o:spid="_x0000_s1026" filled="f" stroked="f" type="#_x0000_t202" o:gfxdata="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">
+            <v:shape id="Text Box 2" o:spid="_x0000_s1026" type="#_x0000_t202" alt="Skillable INTERNAL" style="position:absolute;margin-left:0;margin-top:0;width:82.9pt;height:29.95pt;z-index:251661314;visibility:visible;mso-wrap-style:none;mso-wrap-distance-left:0;mso-wrap-distance-top:0;mso-wrap-distance-right:0;mso-wrap-distance-bottom:0;mso-position-horizontal:center;mso-position-horizontal-relative:page;mso-position-vertical:bottom;mso-position-vertical-relative:page;v-text-anchor:bottom" o:gfxdata="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" filled="f" stroked="f">
               <v:textbox style="mso-fit-shape-to-text:t" inset="0,0,0,15pt">
                 <w:txbxContent>
                   <w:p>
                     <w:pPr>
                       <w:spacing w:after="0"/>
                       <w:rPr>
-                        <w:rFonts w:ascii="Aptos" w:hAnsi="Aptos" w:eastAsia="Aptos" w:cs="Aptos"/>
+                        <w:rFonts w:ascii="Aptos" w:eastAsia="Aptos" w:hAnsi="Aptos" w:cs="Aptos"/>
                         <w:noProof/>
                         <w:color w:val="000000"/>
                         <w:sz w:val="20"/>
@@ -4085,7 +3837,7 @@
                     </w:pPr>
                     <w:r>
                       <w:rPr>
-                        <w:rFonts w:ascii="Aptos" w:hAnsi="Aptos" w:eastAsia="Aptos" w:cs="Aptos"/>
+                        <w:rFonts w:ascii="Aptos" w:eastAsia="Aptos" w:hAnsi="Aptos" w:cs="Aptos"/>
                         <w:noProof/>
                         <w:color w:val="000000"/>
                         <w:sz w:val="20"/>
@@ -4123,7 +3875,7 @@
       <mc:AlternateContent>
         <mc:Choice Requires="wps">
           <w:drawing>
-            <wp:anchor distT="0" distB="0" distL="0" distR="0" simplePos="0" relativeHeight="251658242" behindDoc="0" locked="0" layoutInCell="1" allowOverlap="1" wp14:anchorId="4D5C6F0A" wp14:editId="26963958">
+            <wp:anchor distT="0" distB="0" distL="0" distR="0" simplePos="0" relativeHeight="251662338" behindDoc="0" locked="0" layoutInCell="1" allowOverlap="1" wp14:anchorId="4D5C6F0A" wp14:editId="26963958">
               <wp:simplePos x="635" y="635"/>
               <wp:positionH relativeFrom="page">
                 <wp:align>center</wp:align>
@@ -4137,7 +3889,7 @@
               <wp:docPr id="395650625" name="Text Box 3" descr="Skillable INTERNAL">
                 <a:extLst xmlns:a="http://schemas.openxmlformats.org/drawingml/2006/main">
                   <a:ext uri="{FF2B5EF4-FFF2-40B4-BE49-F238E27FC236}">
-                    <a16:creationId xmlns:a16="http://schemas.microsoft.com/office/drawing/2014/main" id="{831515AE-3975-453E-8762-63418E5A48AB}"/>
+                    <a16:creationId xmlns:a16="http://schemas.microsoft.com/office/drawing/2014/main" id="{92A653ED-9EE0-433E-81EA-8848847DFF7D}"/>
                   </a:ext>
                   <a:ext uri="{5AE41FA2-C0FF-4470-9BD4-5FADCA87CBE2}">
                     <aclsh:classification xmlns:aclsh="http://schemas.microsoft.com/office/drawing/2020/classificationShape" classificationOutcomeType="ftr"/>
@@ -4200,20 +3952,20 @@
             </wp:anchor>
           </w:drawing>
         </mc:Choice>
-        <mc:Fallback xmlns:arto="http://schemas.microsoft.com/office/word/2006/arto" xmlns:aclsh="http://schemas.microsoft.com/office/drawing/2020/classificationShape" xmlns:a16="http://schemas.microsoft.com/office/drawing/2014/main" xmlns:a="http://schemas.openxmlformats.org/drawingml/2006/main">
+        <mc:Fallback>
           <w:pict>
-            <v:shapetype id="_x0000_t202" coordsize="21600,21600" o:spt="202" path="m,l,21600r21600,l21600,xe" w14:anchorId="4D5C6F0A">
+            <v:shapetype w14:anchorId="4D5C6F0A" id="_x0000_t202" coordsize="21600,21600" o:spt="202" path="m,l,21600r21600,l21600,xe">
               <v:stroke joinstyle="miter"/>
               <v:path gradientshapeok="t" o:connecttype="rect"/>
             </v:shapetype>
-            <v:shape id="Text Box 3" style="position:absolute;left:0;text-align:left;margin-left:0;margin-top:0;width:82.9pt;height:29.95pt;z-index:251660288;visibility:visible;mso-wrap-style:none;mso-wrap-distance-left:0;mso-wrap-distance-top:0;mso-wrap-distance-right:0;mso-wrap-distance-bottom:0;mso-position-horizontal:center;mso-position-horizontal-relative:page;mso-position-vertical:bottom;mso-position-vertical-relative:page;v-text-anchor:bottom" alt="Skillable INTERNAL" o:spid="_x0000_s1027" filled="f" stroked="f" type="#_x0000_t202" o:gfxdata="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">
+            <v:shape id="Text Box 3" o:spid="_x0000_s1027" type="#_x0000_t202" alt="Skillable INTERNAL" style="position:absolute;left:0;text-align:left;margin-left:0;margin-top:0;width:82.9pt;height:29.95pt;z-index:251662338;visibility:visible;mso-wrap-style:none;mso-wrap-distance-left:0;mso-wrap-distance-top:0;mso-wrap-distance-right:0;mso-wrap-distance-bottom:0;mso-position-horizontal:center;mso-position-horizontal-relative:page;mso-position-vertical:bottom;mso-position-vertical-relative:page;v-text-anchor:bottom" o:gfxdata="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" filled="f" stroked="f">
               <v:textbox style="mso-fit-shape-to-text:t" inset="0,0,0,15pt">
                 <w:txbxContent>
                   <w:p>
                     <w:pPr>
                       <w:spacing w:after="0"/>
                       <w:rPr>
-                        <w:rFonts w:ascii="Aptos" w:hAnsi="Aptos" w:eastAsia="Aptos" w:cs="Aptos"/>
+                        <w:rFonts w:ascii="Aptos" w:eastAsia="Aptos" w:hAnsi="Aptos" w:cs="Aptos"/>
                         <w:noProof/>
                         <w:color w:val="000000"/>
                         <w:sz w:val="20"/>
@@ -4222,7 +3974,7 @@
                     </w:pPr>
                     <w:r>
                       <w:rPr>
-                        <w:rFonts w:ascii="Aptos" w:hAnsi="Aptos" w:eastAsia="Aptos" w:cs="Aptos"/>
+                        <w:rFonts w:ascii="Aptos" w:eastAsia="Aptos" w:hAnsi="Aptos" w:cs="Aptos"/>
                         <w:noProof/>
                         <w:color w:val="000000"/>
                         <w:sz w:val="20"/>
@@ -4354,7 +4106,7 @@
       <mc:AlternateContent>
         <mc:Choice Requires="wps">
           <w:drawing>
-            <wp:anchor distT="0" distB="0" distL="0" distR="0" simplePos="0" relativeHeight="251658240" behindDoc="0" locked="0" layoutInCell="1" allowOverlap="1" wp14:anchorId="0AB2305D" wp14:editId="681A16EF">
+            <wp:anchor distT="0" distB="0" distL="0" distR="0" simplePos="0" relativeHeight="251660290" behindDoc="0" locked="0" layoutInCell="1" allowOverlap="1" wp14:anchorId="0AB2305D" wp14:editId="681A16EF">
               <wp:simplePos x="635" y="635"/>
               <wp:positionH relativeFrom="page">
                 <wp:align>center</wp:align>
@@ -4368,7 +4120,7 @@
               <wp:docPr id="806171785" name="Text Box 1" descr="Skillable INTERNAL">
                 <a:extLst xmlns:a="http://schemas.openxmlformats.org/drawingml/2006/main">
                   <a:ext uri="{FF2B5EF4-FFF2-40B4-BE49-F238E27FC236}">
-                    <a16:creationId xmlns:a16="http://schemas.microsoft.com/office/drawing/2014/main" id="{711FBC2F-BA30-4E3A-8F59-B8BAEBED6554}"/>
+                    <a16:creationId xmlns:a16="http://schemas.microsoft.com/office/drawing/2014/main" id="{677CE580-EA2B-4134-B2BC-44B7765CED17}"/>
                   </a:ext>
                   <a:ext uri="{5AE41FA2-C0FF-4470-9BD4-5FADCA87CBE2}">
                     <aclsh:classification xmlns:aclsh="http://schemas.microsoft.com/office/drawing/2020/classificationShape" classificationOutcomeType="ftr"/>
@@ -4431,20 +4183,20 @@
             </wp:anchor>
           </w:drawing>
         </mc:Choice>
-        <mc:Fallback xmlns:arto="http://schemas.microsoft.com/office/word/2006/arto" xmlns:aclsh="http://schemas.microsoft.com/office/drawing/2020/classificationShape" xmlns:a16="http://schemas.microsoft.com/office/drawing/2014/main" xmlns:a="http://schemas.openxmlformats.org/drawingml/2006/main">
+        <mc:Fallback>
           <w:pict>
-            <v:shapetype id="_x0000_t202" coordsize="21600,21600" o:spt="202" path="m,l,21600r21600,l21600,xe" w14:anchorId="0AB2305D">
+            <v:shapetype w14:anchorId="0AB2305D" id="_x0000_t202" coordsize="21600,21600" o:spt="202" path="m,l,21600r21600,l21600,xe">
               <v:stroke joinstyle="miter"/>
               <v:path gradientshapeok="t" o:connecttype="rect"/>
             </v:shapetype>
-            <v:shape id="Text Box 1" style="position:absolute;margin-left:0;margin-top:0;width:82.9pt;height:29.95pt;z-index:251658240;visibility:visible;mso-wrap-style:none;mso-wrap-distance-left:0;mso-wrap-distance-top:0;mso-wrap-distance-right:0;mso-wrap-distance-bottom:0;mso-position-horizontal:center;mso-position-horizontal-relative:page;mso-position-vertical:bottom;mso-position-vertical-relative:page;v-text-anchor:bottom" alt="Skillable INTERNAL" o:spid="_x0000_s1028" filled="f" stroked="f" type="#_x0000_t202" o:gfxdata="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">
+            <v:shape id="Text Box 1" o:spid="_x0000_s1028" type="#_x0000_t202" alt="Skillable INTERNAL" style="position:absolute;margin-left:0;margin-top:0;width:82.9pt;height:29.95pt;z-index:251660290;visibility:visible;mso-wrap-style:none;mso-wrap-distance-left:0;mso-wrap-distance-top:0;mso-wrap-distance-right:0;mso-wrap-distance-bottom:0;mso-position-horizontal:center;mso-position-horizontal-relative:page;mso-position-vertical:bottom;mso-position-vertical-relative:page;v-text-anchor:bottom" o:gfxdata="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" filled="f" stroked="f">
               <v:textbox style="mso-fit-shape-to-text:t" inset="0,0,0,15pt">
                 <w:txbxContent>
                   <w:p>
                     <w:pPr>
                       <w:spacing w:after="0"/>
                       <w:rPr>
-                        <w:rFonts w:ascii="Aptos" w:hAnsi="Aptos" w:eastAsia="Aptos" w:cs="Aptos"/>
+                        <w:rFonts w:ascii="Aptos" w:eastAsia="Aptos" w:hAnsi="Aptos" w:cs="Aptos"/>
                         <w:noProof/>
                         <w:color w:val="000000"/>
                         <w:sz w:val="20"/>
@@ -4453,7 +4205,7 @@
                     </w:pPr>
                     <w:r>
                       <w:rPr>
-                        <w:rFonts w:ascii="Aptos" w:hAnsi="Aptos" w:eastAsia="Aptos" w:cs="Aptos"/>
+                        <w:rFonts w:ascii="Aptos" w:eastAsia="Aptos" w:hAnsi="Aptos" w:cs="Aptos"/>
                         <w:noProof/>
                         <w:color w:val="000000"/>
                         <w:sz w:val="20"/>
@@ -4517,7 +4269,7 @@
           <wp:docPr id="2095243587" name="Picture 2095243587">
             <a:extLst xmlns:a="http://schemas.openxmlformats.org/drawingml/2006/main">
               <a:ext uri="{FF2B5EF4-FFF2-40B4-BE49-F238E27FC236}">
-                <a16:creationId xmlns:a16="http://schemas.microsoft.com/office/drawing/2014/main" id="{49B6508A-B8C4-4047-A41B-DE295A6E96FA}"/>
+                <a16:creationId xmlns:a16="http://schemas.microsoft.com/office/drawing/2014/main" id="{B19C679F-FAFD-4DB2-BEF8-ED633D7844A1}"/>
               </a:ext>
             </a:extLst>
           </wp:docPr>

</xml_diff>